<commit_message>
DOC(Rapport): Ajout des users stories restantes + distribution dans la planification initiale selon ce qui était prévu + Modification de l'objectif du produit et pédagogique.
[40][DONE]

Commit basé sur les remarques de la release.
</commit_message>
<xml_diff>
--- a/DOC/RAPPORT PROJET.docx
+++ b/DOC/RAPPORT PROJET.docx
@@ -123,7 +123,13 @@
     <w:sdt>
       <w:sdtPr>
         <w:rPr>
-          <w:lang w:val="fr-FR"/>
+          <w:rFonts w:asciiTheme="minorHAnsi" w:eastAsiaTheme="minorHAnsi" w:hAnsiTheme="minorHAnsi" w:cstheme="minorBidi"/>
+          <w:color w:val="auto"/>
+          <w:kern w:val="2"/>
+          <w:sz w:val="24"/>
+          <w:szCs w:val="24"/>
+          <w:lang w:val="fr-FR" w:eastAsia="en-US"/>
+          <w14:ligatures w14:val="standardContextual"/>
         </w:rPr>
         <w:id w:val="1387538711"/>
         <w:docPartObj>
@@ -133,15 +139,8 @@
       </w:sdtPr>
       <w:sdtEndPr>
         <w:rPr>
-          <w:rFonts w:asciiTheme="minorHAnsi" w:eastAsiaTheme="minorHAnsi" w:hAnsiTheme="minorHAnsi" w:cstheme="minorBidi"/>
           <w:b/>
           <w:bCs/>
-          <w:color w:val="auto"/>
-          <w:kern w:val="2"/>
-          <w:sz w:val="24"/>
-          <w:szCs w:val="24"/>
-          <w:lang w:eastAsia="en-US"/>
-          <w14:ligatures w14:val="standardContextual"/>
         </w:rPr>
       </w:sdtEndPr>
       <w:sdtContent>
@@ -163,7 +162,9 @@
               <w:tab w:val="right" w:leader="dot" w:pos="9060"/>
             </w:tabs>
             <w:rPr>
+              <w:rFonts w:eastAsiaTheme="minorEastAsia"/>
               <w:noProof/>
+              <w:lang w:eastAsia="fr-CH"/>
             </w:rPr>
           </w:pPr>
           <w:r>
@@ -175,7 +176,7 @@
           <w:r>
             <w:fldChar w:fldCharType="separate"/>
           </w:r>
-          <w:hyperlink w:anchor="_Toc239432011" w:history="1">
+          <w:hyperlink w:anchor="_Toc241435676" w:history="1">
             <w:r>
               <w:rPr>
                 <w:rStyle w:val="Lienhypertexte"/>
@@ -202,7 +203,7 @@
                 <w:noProof/>
                 <w:webHidden/>
               </w:rPr>
-              <w:instrText xml:space="preserve"> PAGEREF _Toc239432011 \h </w:instrText>
+              <w:instrText xml:space="preserve"> PAGEREF _Toc241435676 \h </w:instrText>
             </w:r>
             <w:r>
               <w:rPr>
@@ -240,10 +241,12 @@
               <w:tab w:val="right" w:leader="dot" w:pos="9060"/>
             </w:tabs>
             <w:rPr>
+              <w:rFonts w:eastAsiaTheme="minorEastAsia"/>
               <w:noProof/>
+              <w:lang w:eastAsia="fr-CH"/>
             </w:rPr>
           </w:pPr>
-          <w:hyperlink w:anchor="_Toc239432012" w:history="1">
+          <w:hyperlink w:anchor="_Toc241435677" w:history="1">
             <w:r>
               <w:rPr>
                 <w:rStyle w:val="Lienhypertexte"/>
@@ -270,7 +273,7 @@
                 <w:noProof/>
                 <w:webHidden/>
               </w:rPr>
-              <w:instrText xml:space="preserve"> PAGEREF _Toc239432012 \h </w:instrText>
+              <w:instrText xml:space="preserve"> PAGEREF _Toc241435677 \h </w:instrText>
             </w:r>
             <w:r>
               <w:rPr>
@@ -308,10 +311,12 @@
               <w:tab w:val="right" w:leader="dot" w:pos="9060"/>
             </w:tabs>
             <w:rPr>
+              <w:rFonts w:eastAsiaTheme="minorEastAsia"/>
               <w:noProof/>
+              <w:lang w:eastAsia="fr-CH"/>
             </w:rPr>
           </w:pPr>
-          <w:hyperlink w:anchor="_Toc239432013" w:history="1">
+          <w:hyperlink w:anchor="_Toc241435678" w:history="1">
             <w:r>
               <w:rPr>
                 <w:rStyle w:val="Lienhypertexte"/>
@@ -338,7 +343,7 @@
                 <w:noProof/>
                 <w:webHidden/>
               </w:rPr>
-              <w:instrText xml:space="preserve"> PAGEREF _Toc239432013 \h </w:instrText>
+              <w:instrText xml:space="preserve"> PAGEREF _Toc241435678 \h </w:instrText>
             </w:r>
             <w:r>
               <w:rPr>
@@ -376,10 +381,12 @@
               <w:tab w:val="right" w:leader="dot" w:pos="9060"/>
             </w:tabs>
             <w:rPr>
+              <w:rFonts w:eastAsiaTheme="minorEastAsia"/>
               <w:noProof/>
+              <w:lang w:eastAsia="fr-CH"/>
             </w:rPr>
           </w:pPr>
-          <w:hyperlink w:anchor="_Toc239432014" w:history="1">
+          <w:hyperlink w:anchor="_Toc241435679" w:history="1">
             <w:r>
               <w:rPr>
                 <w:rStyle w:val="Lienhypertexte"/>
@@ -406,7 +413,7 @@
                 <w:noProof/>
                 <w:webHidden/>
               </w:rPr>
-              <w:instrText xml:space="preserve"> PAGEREF _Toc239432014 \h </w:instrText>
+              <w:instrText xml:space="preserve"> PAGEREF _Toc241435679 \h </w:instrText>
             </w:r>
             <w:r>
               <w:rPr>
@@ -444,10 +451,12 @@
               <w:tab w:val="right" w:leader="dot" w:pos="9060"/>
             </w:tabs>
             <w:rPr>
+              <w:rFonts w:eastAsiaTheme="minorEastAsia"/>
               <w:noProof/>
+              <w:lang w:eastAsia="fr-CH"/>
             </w:rPr>
           </w:pPr>
-          <w:hyperlink w:anchor="_Toc239432015" w:history="1">
+          <w:hyperlink w:anchor="_Toc241435680" w:history="1">
             <w:r>
               <w:rPr>
                 <w:rStyle w:val="Lienhypertexte"/>
@@ -474,7 +483,7 @@
                 <w:noProof/>
                 <w:webHidden/>
               </w:rPr>
-              <w:instrText xml:space="preserve"> PAGEREF _Toc239432015 \h </w:instrText>
+              <w:instrText xml:space="preserve"> PAGEREF _Toc241435680 \h </w:instrText>
             </w:r>
             <w:r>
               <w:rPr>
@@ -512,10 +521,12 @@
               <w:tab w:val="right" w:leader="dot" w:pos="9060"/>
             </w:tabs>
             <w:rPr>
+              <w:rFonts w:eastAsiaTheme="minorEastAsia"/>
               <w:noProof/>
+              <w:lang w:eastAsia="fr-CH"/>
             </w:rPr>
           </w:pPr>
-          <w:hyperlink w:anchor="_Toc239432016" w:history="1">
+          <w:hyperlink w:anchor="_Toc241435681" w:history="1">
             <w:r>
               <w:rPr>
                 <w:rStyle w:val="Lienhypertexte"/>
@@ -542,7 +553,7 @@
                 <w:noProof/>
                 <w:webHidden/>
               </w:rPr>
-              <w:instrText xml:space="preserve"> PAGEREF _Toc239432016 \h </w:instrText>
+              <w:instrText xml:space="preserve"> PAGEREF _Toc241435681 \h </w:instrText>
             </w:r>
             <w:r>
               <w:rPr>
@@ -580,10 +591,12 @@
               <w:tab w:val="right" w:leader="dot" w:pos="9060"/>
             </w:tabs>
             <w:rPr>
+              <w:rFonts w:eastAsiaTheme="minorEastAsia"/>
               <w:noProof/>
+              <w:lang w:eastAsia="fr-CH"/>
             </w:rPr>
           </w:pPr>
-          <w:hyperlink w:anchor="_Toc239432017" w:history="1">
+          <w:hyperlink w:anchor="_Toc241435682" w:history="1">
             <w:r>
               <w:rPr>
                 <w:rStyle w:val="Lienhypertexte"/>
@@ -610,7 +623,7 @@
                 <w:noProof/>
                 <w:webHidden/>
               </w:rPr>
-              <w:instrText xml:space="preserve"> PAGEREF _Toc239432017 \h </w:instrText>
+              <w:instrText xml:space="preserve"> PAGEREF _Toc241435682 \h </w:instrText>
             </w:r>
             <w:r>
               <w:rPr>
@@ -631,6 +644,636 @@
                 <w:webHidden/>
               </w:rPr>
               <w:t>4</w:t>
+            </w:r>
+            <w:r>
+              <w:rPr>
+                <w:noProof/>
+                <w:webHidden/>
+              </w:rPr>
+              <w:fldChar w:fldCharType="end"/>
+            </w:r>
+          </w:hyperlink>
+        </w:p>
+        <w:p>
+          <w:pPr>
+            <w:pStyle w:val="TM3"/>
+            <w:tabs>
+              <w:tab w:val="right" w:leader="dot" w:pos="9060"/>
+            </w:tabs>
+            <w:rPr>
+              <w:rFonts w:eastAsiaTheme="minorEastAsia"/>
+              <w:noProof/>
+              <w:lang w:eastAsia="fr-CH"/>
+            </w:rPr>
+          </w:pPr>
+          <w:hyperlink w:anchor="_Toc241435683" w:history="1">
+            <w:r>
+              <w:rPr>
+                <w:rStyle w:val="Lienhypertexte"/>
+                <w:noProof/>
+              </w:rPr>
+              <w:t>US03 - Affichage et déplacement des ennemis</w:t>
+            </w:r>
+            <w:r>
+              <w:rPr>
+                <w:noProof/>
+                <w:webHidden/>
+              </w:rPr>
+              <w:tab/>
+            </w:r>
+            <w:r>
+              <w:rPr>
+                <w:noProof/>
+                <w:webHidden/>
+              </w:rPr>
+              <w:fldChar w:fldCharType="begin"/>
+            </w:r>
+            <w:r>
+              <w:rPr>
+                <w:noProof/>
+                <w:webHidden/>
+              </w:rPr>
+              <w:instrText xml:space="preserve"> PAGEREF _Toc241435683 \h </w:instrText>
+            </w:r>
+            <w:r>
+              <w:rPr>
+                <w:noProof/>
+                <w:webHidden/>
+              </w:rPr>
+            </w:r>
+            <w:r>
+              <w:rPr>
+                <w:noProof/>
+                <w:webHidden/>
+              </w:rPr>
+              <w:fldChar w:fldCharType="separate"/>
+            </w:r>
+            <w:r>
+              <w:rPr>
+                <w:noProof/>
+                <w:webHidden/>
+              </w:rPr>
+              <w:t>4</w:t>
+            </w:r>
+            <w:r>
+              <w:rPr>
+                <w:noProof/>
+                <w:webHidden/>
+              </w:rPr>
+              <w:fldChar w:fldCharType="end"/>
+            </w:r>
+          </w:hyperlink>
+        </w:p>
+        <w:p>
+          <w:pPr>
+            <w:pStyle w:val="TM3"/>
+            <w:tabs>
+              <w:tab w:val="right" w:leader="dot" w:pos="9060"/>
+            </w:tabs>
+            <w:rPr>
+              <w:rFonts w:eastAsiaTheme="minorEastAsia"/>
+              <w:noProof/>
+              <w:lang w:eastAsia="fr-CH"/>
+            </w:rPr>
+          </w:pPr>
+          <w:hyperlink w:anchor="_Toc241435684" w:history="1">
+            <w:r>
+              <w:rPr>
+                <w:rStyle w:val="Lienhypertexte"/>
+                <w:noProof/>
+              </w:rPr>
+              <w:t>US04 - tir des munitions ennemis</w:t>
+            </w:r>
+            <w:r>
+              <w:rPr>
+                <w:noProof/>
+                <w:webHidden/>
+              </w:rPr>
+              <w:tab/>
+            </w:r>
+            <w:r>
+              <w:rPr>
+                <w:noProof/>
+                <w:webHidden/>
+              </w:rPr>
+              <w:fldChar w:fldCharType="begin"/>
+            </w:r>
+            <w:r>
+              <w:rPr>
+                <w:noProof/>
+                <w:webHidden/>
+              </w:rPr>
+              <w:instrText xml:space="preserve"> PAGEREF _Toc241435684 \h </w:instrText>
+            </w:r>
+            <w:r>
+              <w:rPr>
+                <w:noProof/>
+                <w:webHidden/>
+              </w:rPr>
+            </w:r>
+            <w:r>
+              <w:rPr>
+                <w:noProof/>
+                <w:webHidden/>
+              </w:rPr>
+              <w:fldChar w:fldCharType="separate"/>
+            </w:r>
+            <w:r>
+              <w:rPr>
+                <w:noProof/>
+                <w:webHidden/>
+              </w:rPr>
+              <w:t>5</w:t>
+            </w:r>
+            <w:r>
+              <w:rPr>
+                <w:noProof/>
+                <w:webHidden/>
+              </w:rPr>
+              <w:fldChar w:fldCharType="end"/>
+            </w:r>
+          </w:hyperlink>
+        </w:p>
+        <w:p>
+          <w:pPr>
+            <w:pStyle w:val="TM3"/>
+            <w:tabs>
+              <w:tab w:val="right" w:leader="dot" w:pos="9060"/>
+            </w:tabs>
+            <w:rPr>
+              <w:rFonts w:eastAsiaTheme="minorEastAsia"/>
+              <w:noProof/>
+              <w:lang w:eastAsia="fr-CH"/>
+            </w:rPr>
+          </w:pPr>
+          <w:hyperlink w:anchor="_Toc241435685" w:history="1">
+            <w:r>
+              <w:rPr>
+                <w:rStyle w:val="Lienhypertexte"/>
+                <w:noProof/>
+              </w:rPr>
+              <w:t>US05 - Tir munitions joueur</w:t>
+            </w:r>
+            <w:r>
+              <w:rPr>
+                <w:noProof/>
+                <w:webHidden/>
+              </w:rPr>
+              <w:tab/>
+            </w:r>
+            <w:r>
+              <w:rPr>
+                <w:noProof/>
+                <w:webHidden/>
+              </w:rPr>
+              <w:fldChar w:fldCharType="begin"/>
+            </w:r>
+            <w:r>
+              <w:rPr>
+                <w:noProof/>
+                <w:webHidden/>
+              </w:rPr>
+              <w:instrText xml:space="preserve"> PAGEREF _Toc241435685 \h </w:instrText>
+            </w:r>
+            <w:r>
+              <w:rPr>
+                <w:noProof/>
+                <w:webHidden/>
+              </w:rPr>
+            </w:r>
+            <w:r>
+              <w:rPr>
+                <w:noProof/>
+                <w:webHidden/>
+              </w:rPr>
+              <w:fldChar w:fldCharType="separate"/>
+            </w:r>
+            <w:r>
+              <w:rPr>
+                <w:noProof/>
+                <w:webHidden/>
+              </w:rPr>
+              <w:t>5</w:t>
+            </w:r>
+            <w:r>
+              <w:rPr>
+                <w:noProof/>
+                <w:webHidden/>
+              </w:rPr>
+              <w:fldChar w:fldCharType="end"/>
+            </w:r>
+          </w:hyperlink>
+        </w:p>
+        <w:p>
+          <w:pPr>
+            <w:pStyle w:val="TM3"/>
+            <w:tabs>
+              <w:tab w:val="right" w:leader="dot" w:pos="9060"/>
+            </w:tabs>
+            <w:rPr>
+              <w:rFonts w:eastAsiaTheme="minorEastAsia"/>
+              <w:noProof/>
+              <w:lang w:eastAsia="fr-CH"/>
+            </w:rPr>
+          </w:pPr>
+          <w:hyperlink w:anchor="_Toc241435686" w:history="1">
+            <w:r>
+              <w:rPr>
+                <w:rStyle w:val="Lienhypertexte"/>
+                <w:noProof/>
+              </w:rPr>
+              <w:t>US06 - Effet munitions Joueur</w:t>
+            </w:r>
+            <w:r>
+              <w:rPr>
+                <w:noProof/>
+                <w:webHidden/>
+              </w:rPr>
+              <w:tab/>
+            </w:r>
+            <w:r>
+              <w:rPr>
+                <w:noProof/>
+                <w:webHidden/>
+              </w:rPr>
+              <w:fldChar w:fldCharType="begin"/>
+            </w:r>
+            <w:r>
+              <w:rPr>
+                <w:noProof/>
+                <w:webHidden/>
+              </w:rPr>
+              <w:instrText xml:space="preserve"> PAGEREF _Toc241435686 \h </w:instrText>
+            </w:r>
+            <w:r>
+              <w:rPr>
+                <w:noProof/>
+                <w:webHidden/>
+              </w:rPr>
+            </w:r>
+            <w:r>
+              <w:rPr>
+                <w:noProof/>
+                <w:webHidden/>
+              </w:rPr>
+              <w:fldChar w:fldCharType="separate"/>
+            </w:r>
+            <w:r>
+              <w:rPr>
+                <w:noProof/>
+                <w:webHidden/>
+              </w:rPr>
+              <w:t>6</w:t>
+            </w:r>
+            <w:r>
+              <w:rPr>
+                <w:noProof/>
+                <w:webHidden/>
+              </w:rPr>
+              <w:fldChar w:fldCharType="end"/>
+            </w:r>
+          </w:hyperlink>
+        </w:p>
+        <w:p>
+          <w:pPr>
+            <w:pStyle w:val="TM3"/>
+            <w:tabs>
+              <w:tab w:val="right" w:leader="dot" w:pos="9060"/>
+            </w:tabs>
+            <w:rPr>
+              <w:rFonts w:eastAsiaTheme="minorEastAsia"/>
+              <w:noProof/>
+              <w:lang w:eastAsia="fr-CH"/>
+            </w:rPr>
+          </w:pPr>
+          <w:hyperlink w:anchor="_Toc241435687" w:history="1">
+            <w:r>
+              <w:rPr>
+                <w:rStyle w:val="Lienhypertexte"/>
+                <w:noProof/>
+              </w:rPr>
+              <w:t>US07- Effet munitions ennemis</w:t>
+            </w:r>
+            <w:r>
+              <w:rPr>
+                <w:noProof/>
+                <w:webHidden/>
+              </w:rPr>
+              <w:tab/>
+            </w:r>
+            <w:r>
+              <w:rPr>
+                <w:noProof/>
+                <w:webHidden/>
+              </w:rPr>
+              <w:fldChar w:fldCharType="begin"/>
+            </w:r>
+            <w:r>
+              <w:rPr>
+                <w:noProof/>
+                <w:webHidden/>
+              </w:rPr>
+              <w:instrText xml:space="preserve"> PAGEREF _Toc241435687 \h </w:instrText>
+            </w:r>
+            <w:r>
+              <w:rPr>
+                <w:noProof/>
+                <w:webHidden/>
+              </w:rPr>
+            </w:r>
+            <w:r>
+              <w:rPr>
+                <w:noProof/>
+                <w:webHidden/>
+              </w:rPr>
+              <w:fldChar w:fldCharType="separate"/>
+            </w:r>
+            <w:r>
+              <w:rPr>
+                <w:noProof/>
+                <w:webHidden/>
+              </w:rPr>
+              <w:t>6</w:t>
+            </w:r>
+            <w:r>
+              <w:rPr>
+                <w:noProof/>
+                <w:webHidden/>
+              </w:rPr>
+              <w:fldChar w:fldCharType="end"/>
+            </w:r>
+          </w:hyperlink>
+        </w:p>
+        <w:p>
+          <w:pPr>
+            <w:pStyle w:val="TM3"/>
+            <w:tabs>
+              <w:tab w:val="right" w:leader="dot" w:pos="9060"/>
+            </w:tabs>
+            <w:rPr>
+              <w:rFonts w:eastAsiaTheme="minorEastAsia"/>
+              <w:noProof/>
+              <w:lang w:eastAsia="fr-CH"/>
+            </w:rPr>
+          </w:pPr>
+          <w:hyperlink w:anchor="_Toc241435688" w:history="1">
+            <w:r>
+              <w:rPr>
+                <w:rStyle w:val="Lienhypertexte"/>
+                <w:noProof/>
+              </w:rPr>
+              <w:t>US08 - Score partie</w:t>
+            </w:r>
+            <w:r>
+              <w:rPr>
+                <w:noProof/>
+                <w:webHidden/>
+              </w:rPr>
+              <w:tab/>
+            </w:r>
+            <w:r>
+              <w:rPr>
+                <w:noProof/>
+                <w:webHidden/>
+              </w:rPr>
+              <w:fldChar w:fldCharType="begin"/>
+            </w:r>
+            <w:r>
+              <w:rPr>
+                <w:noProof/>
+                <w:webHidden/>
+              </w:rPr>
+              <w:instrText xml:space="preserve"> PAGEREF _Toc241435688 \h </w:instrText>
+            </w:r>
+            <w:r>
+              <w:rPr>
+                <w:noProof/>
+                <w:webHidden/>
+              </w:rPr>
+            </w:r>
+            <w:r>
+              <w:rPr>
+                <w:noProof/>
+                <w:webHidden/>
+              </w:rPr>
+              <w:fldChar w:fldCharType="separate"/>
+            </w:r>
+            <w:r>
+              <w:rPr>
+                <w:noProof/>
+                <w:webHidden/>
+              </w:rPr>
+              <w:t>7</w:t>
+            </w:r>
+            <w:r>
+              <w:rPr>
+                <w:noProof/>
+                <w:webHidden/>
+              </w:rPr>
+              <w:fldChar w:fldCharType="end"/>
+            </w:r>
+          </w:hyperlink>
+        </w:p>
+        <w:p>
+          <w:pPr>
+            <w:pStyle w:val="TM3"/>
+            <w:tabs>
+              <w:tab w:val="right" w:leader="dot" w:pos="9060"/>
+            </w:tabs>
+            <w:rPr>
+              <w:rFonts w:eastAsiaTheme="minorEastAsia"/>
+              <w:noProof/>
+              <w:lang w:eastAsia="fr-CH"/>
+            </w:rPr>
+          </w:pPr>
+          <w:hyperlink w:anchor="_Toc241435689" w:history="1">
+            <w:r>
+              <w:rPr>
+                <w:rStyle w:val="Lienhypertexte"/>
+                <w:noProof/>
+              </w:rPr>
+              <w:t>US09 – Obstacles</w:t>
+            </w:r>
+            <w:r>
+              <w:rPr>
+                <w:noProof/>
+                <w:webHidden/>
+              </w:rPr>
+              <w:tab/>
+            </w:r>
+            <w:r>
+              <w:rPr>
+                <w:noProof/>
+                <w:webHidden/>
+              </w:rPr>
+              <w:fldChar w:fldCharType="begin"/>
+            </w:r>
+            <w:r>
+              <w:rPr>
+                <w:noProof/>
+                <w:webHidden/>
+              </w:rPr>
+              <w:instrText xml:space="preserve"> PAGEREF _Toc241435689 \h </w:instrText>
+            </w:r>
+            <w:r>
+              <w:rPr>
+                <w:noProof/>
+                <w:webHidden/>
+              </w:rPr>
+            </w:r>
+            <w:r>
+              <w:rPr>
+                <w:noProof/>
+                <w:webHidden/>
+              </w:rPr>
+              <w:fldChar w:fldCharType="separate"/>
+            </w:r>
+            <w:r>
+              <w:rPr>
+                <w:noProof/>
+                <w:webHidden/>
+              </w:rPr>
+              <w:t>7</w:t>
+            </w:r>
+            <w:r>
+              <w:rPr>
+                <w:noProof/>
+                <w:webHidden/>
+              </w:rPr>
+              <w:fldChar w:fldCharType="end"/>
+            </w:r>
+          </w:hyperlink>
+        </w:p>
+        <w:p>
+          <w:pPr>
+            <w:pStyle w:val="TM3"/>
+            <w:tabs>
+              <w:tab w:val="right" w:leader="dot" w:pos="9060"/>
+            </w:tabs>
+            <w:rPr>
+              <w:rFonts w:eastAsiaTheme="minorEastAsia"/>
+              <w:noProof/>
+              <w:lang w:eastAsia="fr-CH"/>
+            </w:rPr>
+          </w:pPr>
+          <w:hyperlink w:anchor="_Toc241435690" w:history="1">
+            <w:r>
+              <w:rPr>
+                <w:rStyle w:val="Lienhypertexte"/>
+                <w:noProof/>
+              </w:rPr>
+              <w:t>US10 – Éliminations</w:t>
+            </w:r>
+            <w:r>
+              <w:rPr>
+                <w:noProof/>
+                <w:webHidden/>
+              </w:rPr>
+              <w:tab/>
+            </w:r>
+            <w:r>
+              <w:rPr>
+                <w:noProof/>
+                <w:webHidden/>
+              </w:rPr>
+              <w:fldChar w:fldCharType="begin"/>
+            </w:r>
+            <w:r>
+              <w:rPr>
+                <w:noProof/>
+                <w:webHidden/>
+              </w:rPr>
+              <w:instrText xml:space="preserve"> PAGEREF _Toc241435690 \h </w:instrText>
+            </w:r>
+            <w:r>
+              <w:rPr>
+                <w:noProof/>
+                <w:webHidden/>
+              </w:rPr>
+            </w:r>
+            <w:r>
+              <w:rPr>
+                <w:noProof/>
+                <w:webHidden/>
+              </w:rPr>
+              <w:fldChar w:fldCharType="separate"/>
+            </w:r>
+            <w:r>
+              <w:rPr>
+                <w:noProof/>
+                <w:webHidden/>
+              </w:rPr>
+              <w:t>8</w:t>
+            </w:r>
+            <w:r>
+              <w:rPr>
+                <w:noProof/>
+                <w:webHidden/>
+              </w:rPr>
+              <w:fldChar w:fldCharType="end"/>
+            </w:r>
+          </w:hyperlink>
+        </w:p>
+        <w:p>
+          <w:pPr>
+            <w:pStyle w:val="TM3"/>
+            <w:tabs>
+              <w:tab w:val="right" w:leader="dot" w:pos="9060"/>
+            </w:tabs>
+            <w:rPr>
+              <w:rFonts w:eastAsiaTheme="minorEastAsia"/>
+              <w:noProof/>
+              <w:lang w:eastAsia="fr-CH"/>
+            </w:rPr>
+          </w:pPr>
+          <w:hyperlink w:anchor="_Toc241435691" w:history="1">
+            <w:r>
+              <w:rPr>
+                <w:rStyle w:val="Lienhypertexte"/>
+                <w:noProof/>
+              </w:rPr>
+              <w:t>US11 - Écran de fin</w:t>
+            </w:r>
+            <w:r>
+              <w:rPr>
+                <w:noProof/>
+                <w:webHidden/>
+              </w:rPr>
+              <w:tab/>
+            </w:r>
+            <w:r>
+              <w:rPr>
+                <w:noProof/>
+                <w:webHidden/>
+              </w:rPr>
+              <w:fldChar w:fldCharType="begin"/>
+            </w:r>
+            <w:r>
+              <w:rPr>
+                <w:noProof/>
+                <w:webHidden/>
+              </w:rPr>
+              <w:instrText xml:space="preserve"> PAGEREF _Toc241435691 \h </w:instrText>
+            </w:r>
+            <w:r>
+              <w:rPr>
+                <w:noProof/>
+                <w:webHidden/>
+              </w:rPr>
+            </w:r>
+            <w:r>
+              <w:rPr>
+                <w:noProof/>
+                <w:webHidden/>
+              </w:rPr>
+              <w:fldChar w:fldCharType="separate"/>
+            </w:r>
+            <w:r>
+              <w:rPr>
+                <w:noProof/>
+                <w:webHidden/>
+              </w:rPr>
+              <w:t>8</w:t>
             </w:r>
             <w:r>
               <w:rPr>
@@ -648,10 +1291,12 @@
               <w:tab w:val="right" w:leader="dot" w:pos="9060"/>
             </w:tabs>
             <w:rPr>
+              <w:rFonts w:eastAsiaTheme="minorEastAsia"/>
               <w:noProof/>
+              <w:lang w:eastAsia="fr-CH"/>
             </w:rPr>
           </w:pPr>
-          <w:hyperlink w:anchor="_Toc239432018" w:history="1">
+          <w:hyperlink w:anchor="_Toc241435692" w:history="1">
             <w:r>
               <w:rPr>
                 <w:rStyle w:val="Lienhypertexte"/>
@@ -678,7 +1323,7 @@
                 <w:noProof/>
                 <w:webHidden/>
               </w:rPr>
-              <w:instrText xml:space="preserve"> PAGEREF _Toc239432018 \h </w:instrText>
+              <w:instrText xml:space="preserve"> PAGEREF _Toc241435692 \h </w:instrText>
             </w:r>
             <w:r>
               <w:rPr>
@@ -698,7 +1343,7 @@
                 <w:noProof/>
                 <w:webHidden/>
               </w:rPr>
-              <w:t>4</w:t>
+              <w:t>10</w:t>
             </w:r>
             <w:r>
               <w:rPr>
@@ -716,10 +1361,12 @@
               <w:tab w:val="right" w:leader="dot" w:pos="9060"/>
             </w:tabs>
             <w:rPr>
+              <w:rFonts w:eastAsiaTheme="minorEastAsia"/>
               <w:noProof/>
+              <w:lang w:eastAsia="fr-CH"/>
             </w:rPr>
           </w:pPr>
-          <w:hyperlink w:anchor="_Toc239432019" w:history="1">
+          <w:hyperlink w:anchor="_Toc241435693" w:history="1">
             <w:r>
               <w:rPr>
                 <w:rStyle w:val="Lienhypertexte"/>
@@ -746,7 +1393,7 @@
                 <w:noProof/>
                 <w:webHidden/>
               </w:rPr>
-              <w:instrText xml:space="preserve"> PAGEREF _Toc239432019 \h </w:instrText>
+              <w:instrText xml:space="preserve"> PAGEREF _Toc241435693 \h </w:instrText>
             </w:r>
             <w:r>
               <w:rPr>
@@ -766,7 +1413,7 @@
                 <w:noProof/>
                 <w:webHidden/>
               </w:rPr>
-              <w:t>4</w:t>
+              <w:t>10</w:t>
             </w:r>
             <w:r>
               <w:rPr>
@@ -784,10 +1431,12 @@
               <w:tab w:val="right" w:leader="dot" w:pos="9060"/>
             </w:tabs>
             <w:rPr>
+              <w:rFonts w:eastAsiaTheme="minorEastAsia"/>
               <w:noProof/>
+              <w:lang w:eastAsia="fr-CH"/>
             </w:rPr>
           </w:pPr>
-          <w:hyperlink w:anchor="_Toc239432020" w:history="1">
+          <w:hyperlink w:anchor="_Toc241435694" w:history="1">
             <w:r>
               <w:rPr>
                 <w:rStyle w:val="Lienhypertexte"/>
@@ -814,7 +1463,7 @@
                 <w:noProof/>
                 <w:webHidden/>
               </w:rPr>
-              <w:instrText xml:space="preserve"> PAGEREF _Toc239432020 \h </w:instrText>
+              <w:instrText xml:space="preserve"> PAGEREF _Toc241435694 \h </w:instrText>
             </w:r>
             <w:r>
               <w:rPr>
@@ -834,7 +1483,7 @@
                 <w:noProof/>
                 <w:webHidden/>
               </w:rPr>
-              <w:t>4</w:t>
+              <w:t>10</w:t>
             </w:r>
             <w:r>
               <w:rPr>
@@ -852,10 +1501,12 @@
               <w:tab w:val="right" w:leader="dot" w:pos="9060"/>
             </w:tabs>
             <w:rPr>
+              <w:rFonts w:eastAsiaTheme="minorEastAsia"/>
               <w:noProof/>
+              <w:lang w:eastAsia="fr-CH"/>
             </w:rPr>
           </w:pPr>
-          <w:hyperlink w:anchor="_Toc239432021" w:history="1">
+          <w:hyperlink w:anchor="_Toc241435695" w:history="1">
             <w:r>
               <w:rPr>
                 <w:rStyle w:val="Lienhypertexte"/>
@@ -882,7 +1533,7 @@
                 <w:noProof/>
                 <w:webHidden/>
               </w:rPr>
-              <w:instrText xml:space="preserve"> PAGEREF _Toc239432021 \h </w:instrText>
+              <w:instrText xml:space="preserve"> PAGEREF _Toc241435695 \h </w:instrText>
             </w:r>
             <w:r>
               <w:rPr>
@@ -902,7 +1553,7 @@
                 <w:noProof/>
                 <w:webHidden/>
               </w:rPr>
-              <w:t>4</w:t>
+              <w:t>10</w:t>
             </w:r>
             <w:r>
               <w:rPr>
@@ -920,14 +1571,17 @@
               <w:tab w:val="right" w:leader="dot" w:pos="9060"/>
             </w:tabs>
             <w:rPr>
+              <w:rFonts w:eastAsiaTheme="minorEastAsia"/>
               <w:noProof/>
+              <w:lang w:eastAsia="fr-CH"/>
             </w:rPr>
           </w:pPr>
-          <w:hyperlink w:anchor="_Toc239432022" w:history="1">
+          <w:hyperlink w:anchor="_Toc241435696" w:history="1">
             <w:r>
               <w:rPr>
                 <w:rStyle w:val="Lienhypertexte"/>
                 <w:noProof/>
+                <w:lang w:val="en-US"/>
               </w:rPr>
               <w:t>Semaine 4</w:t>
             </w:r>
@@ -950,7 +1604,7 @@
                 <w:noProof/>
                 <w:webHidden/>
               </w:rPr>
-              <w:instrText xml:space="preserve"> PAGEREF _Toc239432022 \h </w:instrText>
+              <w:instrText xml:space="preserve"> PAGEREF _Toc241435696 \h </w:instrText>
             </w:r>
             <w:r>
               <w:rPr>
@@ -970,7 +1624,7 @@
                 <w:noProof/>
                 <w:webHidden/>
               </w:rPr>
-              <w:t>4</w:t>
+              <w:t>10</w:t>
             </w:r>
             <w:r>
               <w:rPr>
@@ -988,14 +1642,17 @@
               <w:tab w:val="right" w:leader="dot" w:pos="9060"/>
             </w:tabs>
             <w:rPr>
+              <w:rFonts w:eastAsiaTheme="minorEastAsia"/>
               <w:noProof/>
+              <w:lang w:eastAsia="fr-CH"/>
             </w:rPr>
           </w:pPr>
-          <w:hyperlink w:anchor="_Toc239432023" w:history="1">
+          <w:hyperlink w:anchor="_Toc241435697" w:history="1">
             <w:r>
               <w:rPr>
                 <w:rStyle w:val="Lienhypertexte"/>
                 <w:noProof/>
+                <w:lang w:val="en-US"/>
               </w:rPr>
               <w:t>Semaine 5</w:t>
             </w:r>
@@ -1018,7 +1675,7 @@
                 <w:noProof/>
                 <w:webHidden/>
               </w:rPr>
-              <w:instrText xml:space="preserve"> PAGEREF _Toc239432023 \h </w:instrText>
+              <w:instrText xml:space="preserve"> PAGEREF _Toc241435697 \h </w:instrText>
             </w:r>
             <w:r>
               <w:rPr>
@@ -1038,7 +1695,7 @@
                 <w:noProof/>
                 <w:webHidden/>
               </w:rPr>
-              <w:t>4</w:t>
+              <w:t>10</w:t>
             </w:r>
             <w:r>
               <w:rPr>
@@ -1056,10 +1713,12 @@
               <w:tab w:val="right" w:leader="dot" w:pos="9060"/>
             </w:tabs>
             <w:rPr>
+              <w:rFonts w:eastAsiaTheme="minorEastAsia"/>
               <w:noProof/>
+              <w:lang w:eastAsia="fr-CH"/>
             </w:rPr>
           </w:pPr>
-          <w:hyperlink w:anchor="_Toc239432024" w:history="1">
+          <w:hyperlink w:anchor="_Toc241435698" w:history="1">
             <w:r>
               <w:rPr>
                 <w:rStyle w:val="Lienhypertexte"/>
@@ -1086,7 +1745,7 @@
                 <w:noProof/>
                 <w:webHidden/>
               </w:rPr>
-              <w:instrText xml:space="preserve"> PAGEREF _Toc239432024 \h </w:instrText>
+              <w:instrText xml:space="preserve"> PAGEREF _Toc241435698 \h </w:instrText>
             </w:r>
             <w:r>
               <w:rPr>
@@ -1106,7 +1765,7 @@
                 <w:noProof/>
                 <w:webHidden/>
               </w:rPr>
-              <w:t>4</w:t>
+              <w:t>10</w:t>
             </w:r>
             <w:r>
               <w:rPr>
@@ -1124,10 +1783,12 @@
               <w:tab w:val="right" w:leader="dot" w:pos="9060"/>
             </w:tabs>
             <w:rPr>
+              <w:rFonts w:eastAsiaTheme="minorEastAsia"/>
               <w:noProof/>
+              <w:lang w:eastAsia="fr-CH"/>
             </w:rPr>
           </w:pPr>
-          <w:hyperlink w:anchor="_Toc239432025" w:history="1">
+          <w:hyperlink w:anchor="_Toc241435699" w:history="1">
             <w:r>
               <w:rPr>
                 <w:rStyle w:val="Lienhypertexte"/>
@@ -1154,7 +1815,7 @@
                 <w:noProof/>
                 <w:webHidden/>
               </w:rPr>
-              <w:instrText xml:space="preserve"> PAGEREF _Toc239432025 \h </w:instrText>
+              <w:instrText xml:space="preserve"> PAGEREF _Toc241435699 \h </w:instrText>
             </w:r>
             <w:r>
               <w:rPr>
@@ -1174,7 +1835,7 @@
                 <w:noProof/>
                 <w:webHidden/>
               </w:rPr>
-              <w:t>4</w:t>
+              <w:t>10</w:t>
             </w:r>
             <w:r>
               <w:rPr>
@@ -1192,10 +1853,12 @@
               <w:tab w:val="right" w:leader="dot" w:pos="9060"/>
             </w:tabs>
             <w:rPr>
+              <w:rFonts w:eastAsiaTheme="minorEastAsia"/>
               <w:noProof/>
+              <w:lang w:eastAsia="fr-CH"/>
             </w:rPr>
           </w:pPr>
-          <w:hyperlink w:anchor="_Toc239432026" w:history="1">
+          <w:hyperlink w:anchor="_Toc241435700" w:history="1">
             <w:r>
               <w:rPr>
                 <w:rStyle w:val="Lienhypertexte"/>
@@ -1222,7 +1885,7 @@
                 <w:noProof/>
                 <w:webHidden/>
               </w:rPr>
-              <w:instrText xml:space="preserve"> PAGEREF _Toc239432026 \h </w:instrText>
+              <w:instrText xml:space="preserve"> PAGEREF _Toc241435700 \h </w:instrText>
             </w:r>
             <w:r>
               <w:rPr>
@@ -1242,7 +1905,7 @@
                 <w:noProof/>
                 <w:webHidden/>
               </w:rPr>
-              <w:t>4</w:t>
+              <w:t>10</w:t>
             </w:r>
             <w:r>
               <w:rPr>
@@ -1274,7 +1937,7 @@
       <w:pPr>
         <w:pStyle w:val="Titre1"/>
       </w:pPr>
-      <w:bookmarkStart w:id="0" w:name="_Toc239432011"/>
+      <w:bookmarkStart w:id="0" w:name="_Toc241435676"/>
       <w:r>
         <w:lastRenderedPageBreak/>
         <w:t>INTRODUCTION</w:t>
@@ -1285,7 +1948,7 @@
       <w:pPr>
         <w:pStyle w:val="Titre2"/>
       </w:pPr>
-      <w:bookmarkStart w:id="1" w:name="_Toc239432012"/>
+      <w:bookmarkStart w:id="1" w:name="_Toc241435677"/>
       <w:r>
         <w:t>Objectif produit</w:t>
       </w:r>
@@ -1293,91 +1956,185 @@
     </w:p>
     <w:p>
       <w:r>
-        <w:t xml:space="preserve">Ce produit a pour but de ressembler à un </w:t>
+        <w:t xml:space="preserve">Ce produit a pour but de ressembler à un Space invader mais en dérivé. Il sera réalisé en 2D modulaire et on suivra </w:t>
+      </w:r>
+      <w:r>
+        <w:t>le joueur principal</w:t>
+      </w:r>
+      <w:r>
+        <w:t xml:space="preserve"> en 3ème personne. Nous avons pour la partie graphique le choix de le produire selon nos idées contrairement à l’aspect programmation qui sera en programmation orienté</w:t>
+      </w:r>
+      <w:r>
+        <w:t xml:space="preserve"> objets.</w:t>
+      </w:r>
+    </w:p>
+    <w:p>
+      <w:r>
+        <w:t xml:space="preserve">Pour mon projet, j’ai choisi de reproduire une scène de concert </w:t>
+      </w:r>
+      <w:r>
+        <w:t>où</w:t>
+      </w:r>
+      <w:r>
+        <w:t xml:space="preserve"> se produit un guitariste</w:t>
+      </w:r>
+      <w:r>
+        <w:t xml:space="preserve">. Mais comme complication il y’a une foule pas très respectueuse qui tente de le décourager avec des phrases méchantes qui représentes les munitions ennemies tiré en direction de la scène où se trouve le musicien qui devra faire de manière à ne pas se faire toucher car le moindre dégât vaut une élimination. Le joueur principal pourra également être éliminé s’il rentre en contact avec un des ennemis car ils ont une particularité c’est qu’ils se déplacent en direction de la scène où se trouve le guitariste. Il y’a également une particularité concernant le joueur c’est qu’il peut également tirer des munitions qui sont des accords de musique qui se déplacent en direction des ennemis qui servent à contrer </w:t>
+      </w:r>
+      <w:r>
+        <w:t>les attaques ennemies</w:t>
+      </w:r>
+      <w:r>
+        <w:t xml:space="preserve"> ainsi que les personnes de la foule.</w:t>
+      </w:r>
+    </w:p>
+    <w:p>
+      <w:pPr>
+        <w:pStyle w:val="Titre2"/>
+      </w:pPr>
+      <w:bookmarkStart w:id="2" w:name="_Toc241435678"/>
+      <w:r>
+        <w:t>Objectif pédagogique</w:t>
+      </w:r>
+      <w:bookmarkEnd w:id="2"/>
+    </w:p>
+    <w:p>
+      <w:r>
+        <w:t xml:space="preserve">Ce produit a été fait dans le cadre de notre projet de programmation orienté objet du module 320 de la section informatique de l’école des métiers. En dehors de notre niveau de maitrise de la programmation que nous pouvons avoir il nous sera aussi nécessaire de maitriser les aspects suivants : </w:t>
+      </w:r>
+    </w:p>
+    <w:p>
+      <w:pPr>
+        <w:pStyle w:val="Paragraphedeliste"/>
+        <w:numPr>
+          <w:ilvl w:val="0"/>
+          <w:numId w:val="12"/>
+        </w:numPr>
+      </w:pPr>
+      <w:r>
+        <w:t>Montrer que l’on est capable de gérer un projet de manière sérieuse et responsable.</w:t>
+      </w:r>
+    </w:p>
+    <w:p>
+      <w:pPr>
+        <w:pStyle w:val="Paragraphedeliste"/>
+        <w:numPr>
+          <w:ilvl w:val="0"/>
+          <w:numId w:val="12"/>
+        </w:numPr>
+      </w:pPr>
+      <w:r>
+        <w:t>Tenir un suivi régulier de l’avancement du projet et des tâches réalisées.</w:t>
+      </w:r>
+    </w:p>
+    <w:p>
+      <w:pPr>
+        <w:pStyle w:val="Paragraphedeliste"/>
+        <w:numPr>
+          <w:ilvl w:val="0"/>
+          <w:numId w:val="12"/>
+        </w:numPr>
+      </w:pPr>
+      <w:r>
+        <w:t>Prendre des initiatives sans attendre qu’on nous dise quoi faire.</w:t>
+      </w:r>
+    </w:p>
+    <w:p>
+      <w:pPr>
+        <w:pStyle w:val="Paragraphedeliste"/>
+        <w:numPr>
+          <w:ilvl w:val="0"/>
+          <w:numId w:val="12"/>
+        </w:numPr>
+      </w:pPr>
+      <w:r>
+        <w:t>Communiquer avec le client afin de mieux comprendre ses besoins et ses attentes.</w:t>
+      </w:r>
+    </w:p>
+    <w:p>
+      <w:pPr>
+        <w:pStyle w:val="Paragraphedeliste"/>
+        <w:numPr>
+          <w:ilvl w:val="0"/>
+          <w:numId w:val="12"/>
+        </w:numPr>
+      </w:pPr>
+      <w:r>
+        <w:t>Présenter régulièrement l’avancement du projet pour obtenir des retours et valider le travail effectué.</w:t>
+      </w:r>
+    </w:p>
+    <w:p>
+      <w:pPr>
+        <w:pStyle w:val="Paragraphedeliste"/>
+        <w:numPr>
+          <w:ilvl w:val="0"/>
+          <w:numId w:val="12"/>
+        </w:numPr>
+      </w:pPr>
+      <w:r>
+        <w:t>Gérer les différentes versions du code à l’aide de Git afin de suivre les modifications et faciliter le travail de développement.</w:t>
+      </w:r>
+    </w:p>
+    <w:p>
+      <w:r>
+        <w:t xml:space="preserve">En ce qui concerne le code nous devons également démontrer une </w:t>
+      </w:r>
+      <w:r>
+        <w:t>certaine</w:t>
+      </w:r>
+      <w:r>
+        <w:t xml:space="preserve"> structure au niveau de notre code.</w:t>
+      </w:r>
+    </w:p>
+    <w:p>
+      <w:pPr>
+        <w:pStyle w:val="Titre1"/>
+      </w:pPr>
+      <w:bookmarkStart w:id="3" w:name="_Toc241435679"/>
+      <w:r>
+        <w:lastRenderedPageBreak/>
+        <w:t>ANALYSE</w:t>
+      </w:r>
+      <w:bookmarkEnd w:id="3"/>
+    </w:p>
+    <w:p>
+      <w:pPr>
+        <w:pStyle w:val="Titre2"/>
+      </w:pPr>
+      <w:bookmarkStart w:id="4" w:name="_Toc241435680"/>
+      <w:r>
+        <w:t>User stories</w:t>
+      </w:r>
+      <w:bookmarkEnd w:id="4"/>
+    </w:p>
+    <w:p>
+      <w:pPr>
+        <w:pStyle w:val="Titre3"/>
+      </w:pPr>
+      <w:bookmarkStart w:id="5" w:name="_Toc241435681"/>
+      <w:r>
+        <w:t>US01</w:t>
+      </w:r>
+      <w:r>
+        <w:t xml:space="preserve"> - </w:t>
+      </w:r>
+      <w:r>
+        <w:t>AFFICHER LA SALLE DE CONCERT</w:t>
+      </w:r>
+      <w:bookmarkEnd w:id="5"/>
+    </w:p>
+    <w:p>
+      <w:r>
+        <w:t>En tant que développeur du jeu je souhaite afficher l'</w:t>
       </w:r>
       <w:proofErr w:type="spellStart"/>
       <w:r>
-        <w:t>space</w:t>
+        <w:t>arrière plan</w:t>
       </w:r>
       <w:proofErr w:type="spellEnd"/>
       <w:r>
         <w:t xml:space="preserve"> </w:t>
       </w:r>
-      <w:proofErr w:type="spellStart"/>
-      <w:r>
-        <w:t>invader</w:t>
-      </w:r>
-      <w:proofErr w:type="spellEnd"/>
-      <w:r>
-        <w:t xml:space="preserve"> mais en dérivé. </w:t>
-      </w:r>
-    </w:p>
-    <w:p>
-      <w:pPr>
-        <w:pStyle w:val="Titre2"/>
-      </w:pPr>
-      <w:bookmarkStart w:id="2" w:name="_Toc239432013"/>
-      <w:r>
-        <w:t>Objectif pédagogique</w:t>
-      </w:r>
-      <w:bookmarkEnd w:id="2"/>
-    </w:p>
-    <w:p>
-      <w:r>
-        <w:t xml:space="preserve">Ce produit a été fait dans le cadre de notre projet de programmation orienté objet </w:t>
-      </w:r>
-      <w:r>
-        <w:t>du module 320 de la section informatique de l’école des métiers.</w:t>
-      </w:r>
-    </w:p>
-    <w:p>
-      <w:pPr>
-        <w:pStyle w:val="Titre1"/>
-      </w:pPr>
-      <w:bookmarkStart w:id="3" w:name="_Toc239432014"/>
-      <w:r>
-        <w:t>ANALYSE</w:t>
-      </w:r>
-      <w:bookmarkEnd w:id="3"/>
-    </w:p>
-    <w:p>
-      <w:pPr>
-        <w:pStyle w:val="Titre2"/>
-      </w:pPr>
-      <w:bookmarkStart w:id="4" w:name="_Toc239432015"/>
-      <w:r>
-        <w:t>User stories</w:t>
-      </w:r>
-      <w:bookmarkEnd w:id="4"/>
-    </w:p>
-    <w:p>
-      <w:pPr>
-        <w:pStyle w:val="Titre3"/>
-      </w:pPr>
-      <w:bookmarkStart w:id="5" w:name="_Toc239432016"/>
-      <w:r>
-        <w:t>US01</w:t>
-      </w:r>
-      <w:r>
-        <w:t xml:space="preserve"> - </w:t>
-      </w:r>
-      <w:r>
-        <w:t>AFFICHER LA SALLE DE CONCERT</w:t>
-      </w:r>
-      <w:bookmarkEnd w:id="5"/>
-    </w:p>
-    <w:p>
-      <w:r>
-        <w:t>En tant que développeur du jeu je souhaite afficher l'</w:t>
-      </w:r>
-      <w:proofErr w:type="spellStart"/>
-      <w:r>
-        <w:t>arrière plan</w:t>
-      </w:r>
-      <w:proofErr w:type="spellEnd"/>
-      <w:r>
-        <w:t xml:space="preserve"> </w:t>
-      </w:r>
       <w:proofErr w:type="gramStart"/>
       <w:r>
         <w:t>( salle</w:t>
@@ -1400,6 +2157,9 @@
         <w:jc w:val="center"/>
       </w:pPr>
       <w:r>
+        <w:rPr>
+          <w:noProof/>
+        </w:rPr>
         <w:drawing>
           <wp:inline distT="0" distB="0" distL="0" distR="0" wp14:anchorId="5627E9D7" wp14:editId="51B86670">
             <wp:extent cx="1674420" cy="1115788"/>
@@ -1500,71 +2260,56 @@
       </w:r>
       <w:proofErr w:type="gramEnd"/>
     </w:p>
-    <w:p/>
-    <w:p>
-      <w:pPr>
+    <w:p>
+      <w:pPr>
+        <w:pStyle w:val="Titre3"/>
+      </w:pPr>
+      <w:bookmarkStart w:id="6" w:name="_Toc241435682"/>
+      <w:r>
+        <w:t xml:space="preserve">US02 </w:t>
+      </w:r>
+      <w:proofErr w:type="gramStart"/>
+      <w:r>
+        <w:t xml:space="preserve">- </w:t>
+      </w:r>
+      <w:r>
+        <w:t> Affichage</w:t>
+      </w:r>
+      <w:proofErr w:type="gramEnd"/>
+      <w:r>
+        <w:t xml:space="preserve"> et déplacement du joueur</w:t>
+      </w:r>
+      <w:bookmarkEnd w:id="6"/>
+    </w:p>
+    <w:p>
+      <w:r>
+        <w:t xml:space="preserve">En tant que développeur je souhaite faire apparaitre </w:t>
+      </w:r>
+      <w:proofErr w:type="gramStart"/>
+      <w:r>
+        <w:t>le joueur principale</w:t>
+      </w:r>
+      <w:proofErr w:type="gramEnd"/>
+      <w:r>
+        <w:t xml:space="preserve"> afin de pouvoir </w:t>
+      </w:r>
+      <w:proofErr w:type="spellStart"/>
+      <w:r>
+        <w:t>intéragir</w:t>
+      </w:r>
+      <w:proofErr w:type="spellEnd"/>
+      <w:r>
+        <w:t xml:space="preserve"> avec lui et le faire se déplacer de gauche à droite.</w:t>
+      </w:r>
+    </w:p>
+    <w:p>
+      <w:pPr>
+        <w:jc w:val="center"/>
+      </w:pPr>
+      <w:r>
         <w:rPr>
-          <w:rFonts w:eastAsiaTheme="majorEastAsia" w:cstheme="majorBidi"/>
-          <w:color w:val="0F4761" w:themeColor="accent1" w:themeShade="BF"/>
-          <w:sz w:val="28"/>
-          <w:szCs w:val="28"/>
+          <w:noProof/>
         </w:rPr>
-      </w:pPr>
-      <w:r>
-        <w:br w:type="page"/>
-      </w:r>
-    </w:p>
-    <w:p>
-      <w:pPr>
-        <w:pStyle w:val="Titre3"/>
-      </w:pPr>
-      <w:bookmarkStart w:id="6" w:name="_Toc239432017"/>
-      <w:r>
-        <w:lastRenderedPageBreak/>
-        <w:t>US0</w:t>
-      </w:r>
-      <w:r>
-        <w:t xml:space="preserve">2 </w:t>
-      </w:r>
-      <w:proofErr w:type="gramStart"/>
-      <w:r>
-        <w:t xml:space="preserve">- </w:t>
-      </w:r>
-      <w:r>
-        <w:t> Affichage</w:t>
-      </w:r>
-      <w:proofErr w:type="gramEnd"/>
-      <w:r>
-        <w:t xml:space="preserve"> et déplacement du joueur</w:t>
-      </w:r>
-      <w:bookmarkEnd w:id="6"/>
-    </w:p>
-    <w:p>
-      <w:r>
-        <w:t xml:space="preserve">En tant que développeur je souhaite faire apparaitre </w:t>
-      </w:r>
-      <w:proofErr w:type="gramStart"/>
-      <w:r>
-        <w:t>le joueur principale</w:t>
-      </w:r>
-      <w:proofErr w:type="gramEnd"/>
-      <w:r>
-        <w:t xml:space="preserve"> afin de pouvoir </w:t>
-      </w:r>
-      <w:proofErr w:type="spellStart"/>
-      <w:r>
-        <w:t>intéragir</w:t>
-      </w:r>
-      <w:proofErr w:type="spellEnd"/>
-      <w:r>
-        <w:t xml:space="preserve"> avec lui et le faire se déplacer de gauche à droite.</w:t>
-      </w:r>
-    </w:p>
-    <w:p>
-      <w:pPr>
-        <w:jc w:val="center"/>
-      </w:pPr>
-      <w:r>
         <w:drawing>
           <wp:inline distT="0" distB="0" distL="0" distR="0" wp14:anchorId="3527E578" wp14:editId="5D390D5C">
             <wp:extent cx="2523884" cy="1686297"/>
@@ -1687,12 +2432,20 @@
       </w:r>
     </w:p>
     <w:p>
+      <w:r>
+        <w:br w:type="page"/>
+      </w:r>
+    </w:p>
+    <w:p>
       <w:pPr>
         <w:pStyle w:val="Titre3"/>
       </w:pPr>
-      <w:r>
+      <w:bookmarkStart w:id="7" w:name="_Toc241435683"/>
+      <w:r>
+        <w:lastRenderedPageBreak/>
         <w:t>US03 - Affichage et déplacement des ennemis</w:t>
       </w:r>
+      <w:bookmarkEnd w:id="7"/>
     </w:p>
     <w:p>
       <w:r>
@@ -1704,6 +2457,9 @@
         <w:jc w:val="center"/>
       </w:pPr>
       <w:r>
+        <w:rPr>
+          <w:noProof/>
+        </w:rPr>
         <w:drawing>
           <wp:inline distT="0" distB="0" distL="0" distR="0" wp14:anchorId="18D11697" wp14:editId="2BA111EA">
             <wp:extent cx="2743200" cy="1827993"/>
@@ -1836,17 +2592,1156 @@
       </w:r>
     </w:p>
     <w:p/>
+    <w:p>
+      <w:pPr>
+        <w:pStyle w:val="Titre3"/>
+      </w:pPr>
+      <w:bookmarkStart w:id="8" w:name="_Toc241435684"/>
+      <w:r>
+        <w:t>US04 - tir des munitions ennemis</w:t>
+      </w:r>
+      <w:bookmarkEnd w:id="8"/>
+    </w:p>
+    <w:p>
+      <w:r>
+        <w:t xml:space="preserve">En tant que joueur je souhaite que les ennemis </w:t>
+      </w:r>
+      <w:proofErr w:type="gramStart"/>
+      <w:r>
+        <w:t>puisse</w:t>
+      </w:r>
+      <w:proofErr w:type="gramEnd"/>
+      <w:r>
+        <w:t xml:space="preserve"> tirer des munitions afin de rajouter de la difficulté au jeu.</w:t>
+      </w:r>
+    </w:p>
+    <w:p>
+      <w:pPr>
+        <w:jc w:val="center"/>
+      </w:pPr>
+      <w:r>
+        <w:drawing>
+          <wp:inline distT="0" distB="0" distL="0" distR="0" wp14:anchorId="772F3B06" wp14:editId="3B29CC66">
+            <wp:extent cx="3414942" cy="2275624"/>
+            <wp:effectExtent l="0" t="0" r="0" b="0"/>
+            <wp:docPr id="1153137656" name="Image 2" descr="Image">
+              <a:hlinkClick xmlns:a="http://schemas.openxmlformats.org/drawingml/2006/main" r:id="rId16" tgtFrame="&quot;_blank&quot;"/>
+            </wp:docPr>
+            <wp:cNvGraphicFramePr>
+              <a:graphicFrameLocks xmlns:a="http://schemas.openxmlformats.org/drawingml/2006/main" noChangeAspect="1"/>
+            </wp:cNvGraphicFramePr>
+            <a:graphic xmlns:a="http://schemas.openxmlformats.org/drawingml/2006/main">
+              <a:graphicData uri="http://schemas.openxmlformats.org/drawingml/2006/picture">
+                <pic:pic xmlns:pic="http://schemas.openxmlformats.org/drawingml/2006/picture">
+                  <pic:nvPicPr>
+                    <pic:cNvPr id="0" name="Picture 6" descr="Image">
+                      <a:hlinkClick r:id="rId16" tgtFrame="&quot;_blank&quot;"/>
+                    </pic:cNvPr>
+                    <pic:cNvPicPr>
+                      <a:picLocks noChangeAspect="1" noChangeArrowheads="1"/>
+                    </pic:cNvPicPr>
+                  </pic:nvPicPr>
+                  <pic:blipFill>
+                    <a:blip r:embed="rId17" cstate="print">
+                      <a:extLst>
+                        <a:ext uri="{28A0092B-C50C-407E-A947-70E740481C1C}">
+                          <a14:useLocalDpi xmlns:a14="http://schemas.microsoft.com/office/drawing/2010/main" val="0"/>
+                        </a:ext>
+                      </a:extLst>
+                    </a:blip>
+                    <a:srcRect/>
+                    <a:stretch>
+                      <a:fillRect/>
+                    </a:stretch>
+                  </pic:blipFill>
+                  <pic:spPr bwMode="auto">
+                    <a:xfrm>
+                      <a:off x="0" y="0"/>
+                      <a:ext cx="3440168" cy="2292434"/>
+                    </a:xfrm>
+                    <a:prstGeom prst="rect">
+                      <a:avLst/>
+                    </a:prstGeom>
+                    <a:noFill/>
+                    <a:ln>
+                      <a:noFill/>
+                    </a:ln>
+                  </pic:spPr>
+                </pic:pic>
+              </a:graphicData>
+            </a:graphic>
+          </wp:inline>
+        </w:drawing>
+      </w:r>
+    </w:p>
+    <w:p>
+      <w:pPr>
+        <w:numPr>
+          <w:ilvl w:val="0"/>
+          <w:numId w:val="4"/>
+        </w:numPr>
+        <w:spacing w:after="0"/>
+      </w:pPr>
+      <w:r>
+        <w:t>Les munitions apparaissent en sortant des ennemis.</w:t>
+      </w:r>
+    </w:p>
+    <w:p>
+      <w:pPr>
+        <w:numPr>
+          <w:ilvl w:val="0"/>
+          <w:numId w:val="4"/>
+        </w:numPr>
+        <w:spacing w:after="0"/>
+      </w:pPr>
+      <w:r>
+        <w:t>Les munitions vont plus vite que les ennemis.</w:t>
+      </w:r>
+    </w:p>
+    <w:p>
+      <w:pPr>
+        <w:numPr>
+          <w:ilvl w:val="0"/>
+          <w:numId w:val="4"/>
+        </w:numPr>
+        <w:spacing w:after="0"/>
+      </w:pPr>
+      <w:r>
+        <w:t>Les munitions vont de haut en bas.</w:t>
+      </w:r>
+    </w:p>
+    <w:p>
+      <w:pPr>
+        <w:numPr>
+          <w:ilvl w:val="0"/>
+          <w:numId w:val="4"/>
+        </w:numPr>
+      </w:pPr>
+      <w:proofErr w:type="gramStart"/>
+      <w:r>
+        <w:t>les</w:t>
+      </w:r>
+      <w:proofErr w:type="gramEnd"/>
+      <w:r>
+        <w:t xml:space="preserve"> munitions </w:t>
+      </w:r>
+      <w:proofErr w:type="spellStart"/>
+      <w:r>
+        <w:t>disparraissent</w:t>
+      </w:r>
+      <w:proofErr w:type="spellEnd"/>
+      <w:r>
+        <w:t xml:space="preserve"> en sortant de l'écran en bas de l'écran.</w:t>
+      </w:r>
+    </w:p>
     <w:p/>
     <w:p>
       <w:pPr>
+        <w:pStyle w:val="Titre3"/>
+      </w:pPr>
+      <w:bookmarkStart w:id="9" w:name="_Toc241435685"/>
+      <w:r>
+        <w:lastRenderedPageBreak/>
+        <w:t>US05 - Tir munitions joueur</w:t>
+      </w:r>
+      <w:bookmarkEnd w:id="9"/>
+    </w:p>
+    <w:p>
+      <w:r>
+        <w:t>En</w:t>
+      </w:r>
+      <w:r>
+        <w:t xml:space="preserve"> tant que joueur je souhaite que mon joueur puisse tirer des accords de guitare afin de pouvoir par la suite contrer les ennemis et leurs attaques.</w:t>
+      </w:r>
+    </w:p>
+    <w:p>
+      <w:pPr>
+        <w:jc w:val="center"/>
+      </w:pPr>
+      <w:r>
+        <w:drawing>
+          <wp:inline distT="0" distB="0" distL="0" distR="0" wp14:anchorId="6F5F0478" wp14:editId="511559FB">
+            <wp:extent cx="3425738" cy="2277530"/>
+            <wp:effectExtent l="0" t="0" r="3810" b="8890"/>
+            <wp:docPr id="243298970" name="Image 4" descr="Image">
+              <a:hlinkClick xmlns:a="http://schemas.openxmlformats.org/drawingml/2006/main" r:id="rId18" tgtFrame="&quot;_blank&quot;"/>
+            </wp:docPr>
+            <wp:cNvGraphicFramePr>
+              <a:graphicFrameLocks xmlns:a="http://schemas.openxmlformats.org/drawingml/2006/main" noChangeAspect="1"/>
+            </wp:cNvGraphicFramePr>
+            <a:graphic xmlns:a="http://schemas.openxmlformats.org/drawingml/2006/main">
+              <a:graphicData uri="http://schemas.openxmlformats.org/drawingml/2006/picture">
+                <pic:pic xmlns:pic="http://schemas.openxmlformats.org/drawingml/2006/picture">
+                  <pic:nvPicPr>
+                    <pic:cNvPr id="0" name="Picture 13" descr="Image">
+                      <a:hlinkClick r:id="rId18" tgtFrame="&quot;_blank&quot;"/>
+                    </pic:cNvPr>
+                    <pic:cNvPicPr>
+                      <a:picLocks noChangeAspect="1" noChangeArrowheads="1"/>
+                    </pic:cNvPicPr>
+                  </pic:nvPicPr>
+                  <pic:blipFill>
+                    <a:blip r:embed="rId19" cstate="print">
+                      <a:extLst>
+                        <a:ext uri="{28A0092B-C50C-407E-A947-70E740481C1C}">
+                          <a14:useLocalDpi xmlns:a14="http://schemas.microsoft.com/office/drawing/2010/main" val="0"/>
+                        </a:ext>
+                      </a:extLst>
+                    </a:blip>
+                    <a:srcRect/>
+                    <a:stretch>
+                      <a:fillRect/>
+                    </a:stretch>
+                  </pic:blipFill>
+                  <pic:spPr bwMode="auto">
+                    <a:xfrm>
+                      <a:off x="0" y="0"/>
+                      <a:ext cx="3437433" cy="2285305"/>
+                    </a:xfrm>
+                    <a:prstGeom prst="rect">
+                      <a:avLst/>
+                    </a:prstGeom>
+                    <a:noFill/>
+                    <a:ln>
+                      <a:noFill/>
+                    </a:ln>
+                  </pic:spPr>
+                </pic:pic>
+              </a:graphicData>
+            </a:graphic>
+          </wp:inline>
+        </w:drawing>
+      </w:r>
+    </w:p>
+    <w:p>
+      <w:pPr>
+        <w:numPr>
+          <w:ilvl w:val="0"/>
+          <w:numId w:val="5"/>
+        </w:numPr>
+        <w:spacing w:after="0"/>
+      </w:pPr>
+      <w:r>
+        <w:t xml:space="preserve">Les munitions du joueur </w:t>
+      </w:r>
+      <w:proofErr w:type="spellStart"/>
+      <w:r>
+        <w:t>apparraissent</w:t>
+      </w:r>
+      <w:proofErr w:type="spellEnd"/>
+      <w:r>
+        <w:t xml:space="preserve"> à son niveau dans le </w:t>
+      </w:r>
+      <w:proofErr w:type="spellStart"/>
+      <w:r>
+        <w:t>form</w:t>
+      </w:r>
+      <w:proofErr w:type="spellEnd"/>
+      <w:r>
+        <w:t>.</w:t>
+      </w:r>
+    </w:p>
+    <w:p>
+      <w:pPr>
+        <w:numPr>
+          <w:ilvl w:val="0"/>
+          <w:numId w:val="5"/>
+        </w:numPr>
+        <w:spacing w:after="0"/>
+      </w:pPr>
+      <w:r>
+        <w:t>Les munitions vont de bas en haut.</w:t>
+      </w:r>
+    </w:p>
+    <w:p>
+      <w:pPr>
+        <w:numPr>
+          <w:ilvl w:val="0"/>
+          <w:numId w:val="5"/>
+        </w:numPr>
+        <w:spacing w:after="0"/>
+      </w:pPr>
+      <w:r>
+        <w:t xml:space="preserve">Les munitions </w:t>
+      </w:r>
+      <w:proofErr w:type="spellStart"/>
+      <w:r>
+        <w:t>disparraissent</w:t>
+      </w:r>
+      <w:proofErr w:type="spellEnd"/>
+      <w:r>
+        <w:t xml:space="preserve"> en sortant de l'écran contre le haut.</w:t>
+      </w:r>
+    </w:p>
+    <w:p>
+      <w:pPr>
+        <w:numPr>
+          <w:ilvl w:val="0"/>
+          <w:numId w:val="5"/>
+        </w:numPr>
+      </w:pPr>
+      <w:proofErr w:type="gramStart"/>
+      <w:r>
+        <w:t>les</w:t>
+      </w:r>
+      <w:proofErr w:type="gramEnd"/>
+      <w:r>
+        <w:t xml:space="preserve"> munitions </w:t>
+      </w:r>
+      <w:proofErr w:type="gramStart"/>
+      <w:r>
+        <w:t>affiche</w:t>
+      </w:r>
+      <w:proofErr w:type="gramEnd"/>
+      <w:r>
+        <w:t xml:space="preserve"> différents accords.</w:t>
+      </w:r>
+    </w:p>
+    <w:p>
+      <w:pPr>
+        <w:pStyle w:val="Titre3"/>
+      </w:pPr>
+      <w:bookmarkStart w:id="10" w:name="_Toc241435686"/>
+      <w:r>
+        <w:t>US06 - Effet munitions Joueur</w:t>
+      </w:r>
+      <w:bookmarkEnd w:id="10"/>
+    </w:p>
+    <w:p>
+      <w:r>
+        <w:t xml:space="preserve">En tant que joueur je souhaite que mes munitions </w:t>
+      </w:r>
+      <w:proofErr w:type="spellStart"/>
+      <w:r>
+        <w:t>puisser</w:t>
+      </w:r>
+      <w:proofErr w:type="spellEnd"/>
+      <w:r>
+        <w:t xml:space="preserve"> faire des </w:t>
+      </w:r>
+      <w:proofErr w:type="spellStart"/>
+      <w:r>
+        <w:t>degats</w:t>
+      </w:r>
+      <w:proofErr w:type="spellEnd"/>
+      <w:r>
+        <w:t xml:space="preserve"> afin de pouvoir </w:t>
+      </w:r>
+      <w:proofErr w:type="spellStart"/>
+      <w:r>
+        <w:t>eliminer</w:t>
+      </w:r>
+      <w:proofErr w:type="spellEnd"/>
+      <w:r>
+        <w:t xml:space="preserve"> les ennemis et détruire </w:t>
+      </w:r>
+      <w:proofErr w:type="gramStart"/>
+      <w:r>
+        <w:t>leur attaques</w:t>
+      </w:r>
+      <w:proofErr w:type="gramEnd"/>
+      <w:r>
+        <w:t>.</w:t>
+      </w:r>
+    </w:p>
+    <w:p>
+      <w:pPr>
+        <w:jc w:val="center"/>
+      </w:pPr>
+      <w:r>
+        <w:drawing>
+          <wp:inline distT="0" distB="0" distL="0" distR="0" wp14:anchorId="5887A5FE" wp14:editId="011300E1">
+            <wp:extent cx="3921125" cy="2614227"/>
+            <wp:effectExtent l="0" t="0" r="3175" b="0"/>
+            <wp:docPr id="173038047" name="Image 8" descr="Image">
+              <a:hlinkClick xmlns:a="http://schemas.openxmlformats.org/drawingml/2006/main" r:id="rId20" tgtFrame="&quot;_blank&quot;"/>
+            </wp:docPr>
+            <wp:cNvGraphicFramePr>
+              <a:graphicFrameLocks xmlns:a="http://schemas.openxmlformats.org/drawingml/2006/main" noChangeAspect="1"/>
+            </wp:cNvGraphicFramePr>
+            <a:graphic xmlns:a="http://schemas.openxmlformats.org/drawingml/2006/main">
+              <a:graphicData uri="http://schemas.openxmlformats.org/drawingml/2006/picture">
+                <pic:pic xmlns:pic="http://schemas.openxmlformats.org/drawingml/2006/picture">
+                  <pic:nvPicPr>
+                    <pic:cNvPr id="0" name="Picture 30" descr="Image">
+                      <a:hlinkClick r:id="rId20" tgtFrame="&quot;_blank&quot;"/>
+                    </pic:cNvPr>
+                    <pic:cNvPicPr>
+                      <a:picLocks noChangeAspect="1" noChangeArrowheads="1"/>
+                    </pic:cNvPicPr>
+                  </pic:nvPicPr>
+                  <pic:blipFill>
+                    <a:blip r:embed="rId21" cstate="print">
+                      <a:extLst>
+                        <a:ext uri="{28A0092B-C50C-407E-A947-70E740481C1C}">
+                          <a14:useLocalDpi xmlns:a14="http://schemas.microsoft.com/office/drawing/2010/main" val="0"/>
+                        </a:ext>
+                      </a:extLst>
+                    </a:blip>
+                    <a:srcRect/>
+                    <a:stretch>
+                      <a:fillRect/>
+                    </a:stretch>
+                  </pic:blipFill>
+                  <pic:spPr bwMode="auto">
+                    <a:xfrm>
+                      <a:off x="0" y="0"/>
+                      <a:ext cx="3945998" cy="2630810"/>
+                    </a:xfrm>
+                    <a:prstGeom prst="rect">
+                      <a:avLst/>
+                    </a:prstGeom>
+                    <a:noFill/>
+                    <a:ln>
+                      <a:noFill/>
+                    </a:ln>
+                  </pic:spPr>
+                </pic:pic>
+              </a:graphicData>
+            </a:graphic>
+          </wp:inline>
+        </w:drawing>
+      </w:r>
+    </w:p>
+    <w:p>
+      <w:pPr>
+        <w:numPr>
+          <w:ilvl w:val="0"/>
+          <w:numId w:val="6"/>
+        </w:numPr>
+        <w:spacing w:after="0"/>
+      </w:pPr>
+      <w:r>
+        <w:t xml:space="preserve">La munition du joueur </w:t>
+      </w:r>
+      <w:proofErr w:type="spellStart"/>
+      <w:r>
+        <w:t>detruit</w:t>
+      </w:r>
+      <w:proofErr w:type="spellEnd"/>
+      <w:r>
+        <w:t xml:space="preserve"> une munition ennemie entrant en contact avec elle</w:t>
+      </w:r>
+      <w:r>
+        <w:t>.</w:t>
+      </w:r>
+    </w:p>
+    <w:p>
+      <w:pPr>
+        <w:numPr>
+          <w:ilvl w:val="0"/>
+          <w:numId w:val="6"/>
+        </w:numPr>
+        <w:spacing w:after="0"/>
+      </w:pPr>
+      <w:r>
+        <w:t xml:space="preserve">La munition du joueur </w:t>
+      </w:r>
+      <w:proofErr w:type="spellStart"/>
+      <w:r>
+        <w:t>detruit</w:t>
+      </w:r>
+      <w:proofErr w:type="spellEnd"/>
+      <w:r>
+        <w:t xml:space="preserve"> un ennemi entrant en contact avec elle</w:t>
+      </w:r>
+      <w:r>
+        <w:t>.</w:t>
+      </w:r>
+    </w:p>
+    <w:p>
+      <w:pPr>
+        <w:numPr>
+          <w:ilvl w:val="0"/>
+          <w:numId w:val="6"/>
+        </w:numPr>
+        <w:spacing w:after="0"/>
+      </w:pPr>
+      <w:r>
+        <w:t xml:space="preserve">La munition du joueur disparait également après la </w:t>
+      </w:r>
+      <w:proofErr w:type="spellStart"/>
+      <w:r>
+        <w:t>colision</w:t>
+      </w:r>
+      <w:proofErr w:type="spellEnd"/>
+      <w:r>
+        <w:t xml:space="preserve"> avec une munition ou un ennemi.</w:t>
+      </w:r>
+    </w:p>
+    <w:p>
+      <w:pPr>
+        <w:spacing w:after="0"/>
+      </w:pPr>
+    </w:p>
+    <w:p>
+      <w:pPr>
+        <w:pStyle w:val="Titre3"/>
+      </w:pPr>
+      <w:bookmarkStart w:id="11" w:name="_Toc241435687"/>
+      <w:r>
+        <w:lastRenderedPageBreak/>
+        <w:t>US07- Effet munitions ennemis</w:t>
+      </w:r>
+      <w:bookmarkEnd w:id="11"/>
+    </w:p>
+    <w:p>
+      <w:r>
+        <w:t xml:space="preserve">En tant que joueur je souhaite que mes ennemis </w:t>
+      </w:r>
+      <w:proofErr w:type="gramStart"/>
+      <w:r>
+        <w:t>ait</w:t>
+      </w:r>
+      <w:proofErr w:type="gramEnd"/>
+      <w:r>
+        <w:t xml:space="preserve"> aussi le pouvoir d'éliminer </w:t>
+      </w:r>
+      <w:proofErr w:type="gramStart"/>
+      <w:r>
+        <w:t>le joueur principale</w:t>
+      </w:r>
+      <w:proofErr w:type="gramEnd"/>
+      <w:r>
+        <w:t xml:space="preserve"> afin de rajouter de la difficulté pour le joueur principale.</w:t>
+      </w:r>
+    </w:p>
+    <w:p>
+      <w:pPr>
+        <w:jc w:val="center"/>
+      </w:pPr>
+      <w:r>
+        <w:drawing>
+          <wp:inline distT="0" distB="0" distL="0" distR="0" wp14:anchorId="6D443E7A" wp14:editId="1474A05E">
+            <wp:extent cx="3381170" cy="2247900"/>
+            <wp:effectExtent l="0" t="0" r="0" b="0"/>
+            <wp:docPr id="487142402" name="Image 10" descr="Image">
+              <a:hlinkClick xmlns:a="http://schemas.openxmlformats.org/drawingml/2006/main" r:id="rId22" tgtFrame="&quot;_blank&quot;"/>
+            </wp:docPr>
+            <wp:cNvGraphicFramePr>
+              <a:graphicFrameLocks xmlns:a="http://schemas.openxmlformats.org/drawingml/2006/main" noChangeAspect="1"/>
+            </wp:cNvGraphicFramePr>
+            <a:graphic xmlns:a="http://schemas.openxmlformats.org/drawingml/2006/main">
+              <a:graphicData uri="http://schemas.openxmlformats.org/drawingml/2006/picture">
+                <pic:pic xmlns:pic="http://schemas.openxmlformats.org/drawingml/2006/picture">
+                  <pic:nvPicPr>
+                    <pic:cNvPr id="0" name="Picture 37" descr="Image">
+                      <a:hlinkClick r:id="rId22" tgtFrame="&quot;_blank&quot;"/>
+                    </pic:cNvPr>
+                    <pic:cNvPicPr>
+                      <a:picLocks noChangeAspect="1" noChangeArrowheads="1"/>
+                    </pic:cNvPicPr>
+                  </pic:nvPicPr>
+                  <pic:blipFill>
+                    <a:blip r:embed="rId23" cstate="print">
+                      <a:extLst>
+                        <a:ext uri="{28A0092B-C50C-407E-A947-70E740481C1C}">
+                          <a14:useLocalDpi xmlns:a14="http://schemas.microsoft.com/office/drawing/2010/main" val="0"/>
+                        </a:ext>
+                      </a:extLst>
+                    </a:blip>
+                    <a:srcRect/>
+                    <a:stretch>
+                      <a:fillRect/>
+                    </a:stretch>
+                  </pic:blipFill>
+                  <pic:spPr bwMode="auto">
+                    <a:xfrm>
+                      <a:off x="0" y="0"/>
+                      <a:ext cx="3392556" cy="2255470"/>
+                    </a:xfrm>
+                    <a:prstGeom prst="rect">
+                      <a:avLst/>
+                    </a:prstGeom>
+                    <a:noFill/>
+                    <a:ln>
+                      <a:noFill/>
+                    </a:ln>
+                  </pic:spPr>
+                </pic:pic>
+              </a:graphicData>
+            </a:graphic>
+          </wp:inline>
+        </w:drawing>
+      </w:r>
+    </w:p>
+    <w:p>
+      <w:pPr>
+        <w:numPr>
+          <w:ilvl w:val="0"/>
+          <w:numId w:val="7"/>
+        </w:numPr>
+        <w:spacing w:after="0"/>
+      </w:pPr>
+      <w:r>
+        <w:t>La munition ennemie détruit une munition du joueur entrant en contact avec elle</w:t>
+      </w:r>
+    </w:p>
+    <w:p>
+      <w:pPr>
+        <w:numPr>
+          <w:ilvl w:val="0"/>
+          <w:numId w:val="7"/>
+        </w:numPr>
+        <w:spacing w:after="0"/>
+      </w:pPr>
+      <w:r>
+        <w:t>La munition de l'ennemi détruit un joueur entrant en contact avec lui</w:t>
+      </w:r>
+    </w:p>
+    <w:p>
+      <w:pPr>
+        <w:numPr>
+          <w:ilvl w:val="0"/>
+          <w:numId w:val="7"/>
+        </w:numPr>
+      </w:pPr>
+      <w:r>
+        <w:t xml:space="preserve">La munition de l'ennemie disparait également après la collision avec une munition ou un </w:t>
+      </w:r>
+      <w:proofErr w:type="gramStart"/>
+      <w:r>
+        <w:t>joueur .</w:t>
+      </w:r>
+      <w:proofErr w:type="gramEnd"/>
+    </w:p>
+    <w:p>
+      <w:pPr>
+        <w:pStyle w:val="Titre3"/>
+      </w:pPr>
+      <w:bookmarkStart w:id="12" w:name="_Toc241435688"/>
+      <w:r>
+        <w:t>US08 - Score partie</w:t>
+      </w:r>
+      <w:bookmarkEnd w:id="12"/>
+    </w:p>
+    <w:p>
+      <w:r>
+        <w:t xml:space="preserve">En tant que joueur je souhaite avoir un score lorsque je joue afin d'avoir un </w:t>
+      </w:r>
+      <w:proofErr w:type="spellStart"/>
+      <w:r>
+        <w:t>apperçu</w:t>
+      </w:r>
+      <w:proofErr w:type="spellEnd"/>
+      <w:r>
+        <w:t xml:space="preserve"> de mon niveau de la partie et de savoir combien d'ennemis j'ai éliminé.</w:t>
+      </w:r>
+    </w:p>
+    <w:p>
+      <w:pPr>
+        <w:jc w:val="center"/>
+      </w:pPr>
+      <w:r>
+        <w:drawing>
+          <wp:inline distT="0" distB="0" distL="0" distR="0" wp14:anchorId="3D170D68" wp14:editId="04323053">
+            <wp:extent cx="3381043" cy="2246697"/>
+            <wp:effectExtent l="0" t="0" r="0" b="1270"/>
+            <wp:docPr id="1852672572" name="Image 12" descr="Image">
+              <a:hlinkClick xmlns:a="http://schemas.openxmlformats.org/drawingml/2006/main" r:id="rId24" tgtFrame="&quot;_blank&quot;"/>
+            </wp:docPr>
+            <wp:cNvGraphicFramePr>
+              <a:graphicFrameLocks xmlns:a="http://schemas.openxmlformats.org/drawingml/2006/main" noChangeAspect="1"/>
+            </wp:cNvGraphicFramePr>
+            <a:graphic xmlns:a="http://schemas.openxmlformats.org/drawingml/2006/main">
+              <a:graphicData uri="http://schemas.openxmlformats.org/drawingml/2006/picture">
+                <pic:pic xmlns:pic="http://schemas.openxmlformats.org/drawingml/2006/picture">
+                  <pic:nvPicPr>
+                    <pic:cNvPr id="0" name="Picture 44" descr="Image">
+                      <a:hlinkClick r:id="rId24" tgtFrame="&quot;_blank&quot;"/>
+                    </pic:cNvPr>
+                    <pic:cNvPicPr>
+                      <a:picLocks noChangeAspect="1" noChangeArrowheads="1"/>
+                    </pic:cNvPicPr>
+                  </pic:nvPicPr>
+                  <pic:blipFill>
+                    <a:blip r:embed="rId25" cstate="print">
+                      <a:extLst>
+                        <a:ext uri="{28A0092B-C50C-407E-A947-70E740481C1C}">
+                          <a14:useLocalDpi xmlns:a14="http://schemas.microsoft.com/office/drawing/2010/main" val="0"/>
+                        </a:ext>
+                      </a:extLst>
+                    </a:blip>
+                    <a:srcRect/>
+                    <a:stretch>
+                      <a:fillRect/>
+                    </a:stretch>
+                  </pic:blipFill>
+                  <pic:spPr bwMode="auto">
+                    <a:xfrm>
+                      <a:off x="0" y="0"/>
+                      <a:ext cx="3392388" cy="2254236"/>
+                    </a:xfrm>
+                    <a:prstGeom prst="rect">
+                      <a:avLst/>
+                    </a:prstGeom>
+                    <a:noFill/>
+                    <a:ln>
+                      <a:noFill/>
+                    </a:ln>
+                  </pic:spPr>
+                </pic:pic>
+              </a:graphicData>
+            </a:graphic>
+          </wp:inline>
+        </w:drawing>
+      </w:r>
+    </w:p>
+    <w:p>
+      <w:pPr>
+        <w:numPr>
+          <w:ilvl w:val="0"/>
+          <w:numId w:val="8"/>
+        </w:numPr>
+        <w:spacing w:after="0"/>
+      </w:pPr>
+      <w:r>
+        <w:t xml:space="preserve">Le score affiche </w:t>
+      </w:r>
+      <w:proofErr w:type="gramStart"/>
+      <w:r>
+        <w:t xml:space="preserve">les </w:t>
+      </w:r>
+      <w:r>
+        <w:t>éliminations</w:t>
+      </w:r>
+      <w:r>
+        <w:t xml:space="preserve"> totaux</w:t>
+      </w:r>
+      <w:proofErr w:type="gramEnd"/>
+      <w:r>
+        <w:t>.</w:t>
+      </w:r>
+    </w:p>
+    <w:p>
+      <w:pPr>
+        <w:numPr>
+          <w:ilvl w:val="0"/>
+          <w:numId w:val="8"/>
+        </w:numPr>
+        <w:spacing w:after="0"/>
+      </w:pPr>
+      <w:r>
+        <w:t>Le score s'implémente de 10 par éliminations de joueur et 5 par munition ennemies éliminé</w:t>
+      </w:r>
+      <w:r>
+        <w:t>.</w:t>
+      </w:r>
+    </w:p>
+    <w:p>
+      <w:pPr>
+        <w:numPr>
+          <w:ilvl w:val="0"/>
+          <w:numId w:val="8"/>
+        </w:numPr>
+        <w:spacing w:after="0"/>
+      </w:pPr>
+      <w:r>
+        <w:t>Le score s'affiche au centre en bas en rouge.</w:t>
+      </w:r>
+    </w:p>
+    <w:p/>
+    <w:p>
+      <w:pPr>
+        <w:pStyle w:val="Titre3"/>
+      </w:pPr>
+      <w:bookmarkStart w:id="13" w:name="_Toc241435689"/>
+      <w:r>
+        <w:lastRenderedPageBreak/>
+        <w:t xml:space="preserve">US09 </w:t>
+      </w:r>
+      <w:r>
+        <w:t>–</w:t>
+      </w:r>
+      <w:r>
+        <w:t xml:space="preserve"> Obstacles</w:t>
+      </w:r>
+      <w:bookmarkEnd w:id="13"/>
+    </w:p>
+    <w:p>
+      <w:r>
+        <w:t>En tant que joueur je souhaite que les ennemis aient des obstacles afin de pouvoir protéger mon joueur et qu'il puisse survivre plus longtemps</w:t>
+      </w:r>
+    </w:p>
+    <w:p>
+      <w:pPr>
+        <w:jc w:val="center"/>
+      </w:pPr>
+      <w:r>
+        <w:drawing>
+          <wp:inline distT="0" distB="0" distL="0" distR="0" wp14:anchorId="1A3F7CEF" wp14:editId="6F0A963A">
+            <wp:extent cx="3180916" cy="2113714"/>
+            <wp:effectExtent l="0" t="0" r="635" b="1270"/>
+            <wp:docPr id="1301416660" name="Image 14" descr="Image">
+              <a:hlinkClick xmlns:a="http://schemas.openxmlformats.org/drawingml/2006/main" r:id="rId26" tgtFrame="&quot;_blank&quot;"/>
+            </wp:docPr>
+            <wp:cNvGraphicFramePr>
+              <a:graphicFrameLocks xmlns:a="http://schemas.openxmlformats.org/drawingml/2006/main" noChangeAspect="1"/>
+            </wp:cNvGraphicFramePr>
+            <a:graphic xmlns:a="http://schemas.openxmlformats.org/drawingml/2006/main">
+              <a:graphicData uri="http://schemas.openxmlformats.org/drawingml/2006/picture">
+                <pic:pic xmlns:pic="http://schemas.openxmlformats.org/drawingml/2006/picture">
+                  <pic:nvPicPr>
+                    <pic:cNvPr id="0" name="Picture 51" descr="Image">
+                      <a:hlinkClick r:id="rId26" tgtFrame="&quot;_blank&quot;"/>
+                    </pic:cNvPr>
+                    <pic:cNvPicPr>
+                      <a:picLocks noChangeAspect="1" noChangeArrowheads="1"/>
+                    </pic:cNvPicPr>
+                  </pic:nvPicPr>
+                  <pic:blipFill>
+                    <a:blip r:embed="rId27" cstate="print">
+                      <a:extLst>
+                        <a:ext uri="{28A0092B-C50C-407E-A947-70E740481C1C}">
+                          <a14:useLocalDpi xmlns:a14="http://schemas.microsoft.com/office/drawing/2010/main" val="0"/>
+                        </a:ext>
+                      </a:extLst>
+                    </a:blip>
+                    <a:srcRect/>
+                    <a:stretch>
+                      <a:fillRect/>
+                    </a:stretch>
+                  </pic:blipFill>
+                  <pic:spPr bwMode="auto">
+                    <a:xfrm>
+                      <a:off x="0" y="0"/>
+                      <a:ext cx="3192917" cy="2121689"/>
+                    </a:xfrm>
+                    <a:prstGeom prst="rect">
+                      <a:avLst/>
+                    </a:prstGeom>
+                    <a:noFill/>
+                    <a:ln>
+                      <a:noFill/>
+                    </a:ln>
+                  </pic:spPr>
+                </pic:pic>
+              </a:graphicData>
+            </a:graphic>
+          </wp:inline>
+        </w:drawing>
+      </w:r>
+    </w:p>
+    <w:p>
+      <w:pPr>
+        <w:numPr>
+          <w:ilvl w:val="0"/>
+          <w:numId w:val="9"/>
+        </w:numPr>
+        <w:spacing w:after="0"/>
+      </w:pPr>
+      <w:r>
+        <w:t>Les obstacles sont disposés en ligne face au joueur à équidistance les uns des autres.</w:t>
+      </w:r>
+    </w:p>
+    <w:p>
+      <w:pPr>
+        <w:numPr>
+          <w:ilvl w:val="0"/>
+          <w:numId w:val="9"/>
+        </w:numPr>
+        <w:spacing w:after="0"/>
+      </w:pPr>
+      <w:proofErr w:type="gramStart"/>
+      <w:r>
+        <w:t>un</w:t>
+      </w:r>
+      <w:proofErr w:type="gramEnd"/>
+      <w:r>
+        <w:t xml:space="preserve"> obstacles perdent la moitié de leur vie au contact d'un ennemi et le tiers si c'est une de </w:t>
+      </w:r>
+      <w:proofErr w:type="gramStart"/>
+      <w:r>
+        <w:t>leur munitions</w:t>
+      </w:r>
+      <w:proofErr w:type="gramEnd"/>
+      <w:r>
+        <w:t>.</w:t>
+      </w:r>
+    </w:p>
+    <w:p>
+      <w:pPr>
+        <w:numPr>
+          <w:ilvl w:val="0"/>
+          <w:numId w:val="9"/>
+        </w:numPr>
+        <w:spacing w:after="0"/>
+      </w:pPr>
+      <w:r>
+        <w:t xml:space="preserve">Les ennemis ainsi que leurs munitions disparaissent après avoir infligé des </w:t>
+      </w:r>
+      <w:proofErr w:type="spellStart"/>
+      <w:r>
+        <w:t>dégats</w:t>
+      </w:r>
+      <w:proofErr w:type="spellEnd"/>
+      <w:r>
+        <w:t xml:space="preserve"> aux obstacles.</w:t>
+      </w:r>
+    </w:p>
+    <w:p>
+      <w:pPr>
+        <w:numPr>
+          <w:ilvl w:val="0"/>
+          <w:numId w:val="9"/>
+        </w:numPr>
+      </w:pPr>
+      <w:proofErr w:type="gramStart"/>
+      <w:r>
+        <w:t>les</w:t>
+      </w:r>
+      <w:proofErr w:type="gramEnd"/>
+      <w:r>
+        <w:t xml:space="preserve"> munitions du joueur principale passent à travers afin de toucher les ennemis</w:t>
+      </w:r>
+    </w:p>
+    <w:p>
+      <w:pPr>
+        <w:pStyle w:val="Titre3"/>
+      </w:pPr>
+      <w:bookmarkStart w:id="14" w:name="_Toc241435690"/>
+      <w:r>
+        <w:t xml:space="preserve">US10 </w:t>
+      </w:r>
+      <w:r>
+        <w:t>–</w:t>
+      </w:r>
+      <w:r>
+        <w:t xml:space="preserve"> Éliminations</w:t>
+      </w:r>
+      <w:bookmarkEnd w:id="14"/>
+    </w:p>
+    <w:p>
+      <w:r>
+        <w:t xml:space="preserve">En tant que joueur je souhaite que mon jeu contienne un système d'élimination afin de </w:t>
+      </w:r>
+      <w:proofErr w:type="spellStart"/>
+      <w:r>
+        <w:t>puvoir</w:t>
+      </w:r>
+      <w:proofErr w:type="spellEnd"/>
+      <w:r>
+        <w:t xml:space="preserve"> m'améliorer et redoubler de vigilance pour les parties avenir</w:t>
+      </w:r>
+    </w:p>
+    <w:p>
+      <w:pPr>
+        <w:jc w:val="center"/>
+      </w:pPr>
+      <w:r>
+        <w:drawing>
+          <wp:inline distT="0" distB="0" distL="0" distR="0" wp14:anchorId="3E48B80E" wp14:editId="646172B1">
+            <wp:extent cx="4479359" cy="2990850"/>
+            <wp:effectExtent l="0" t="0" r="0" b="0"/>
+            <wp:docPr id="1192139175" name="Image 16" descr="Image">
+              <a:hlinkClick xmlns:a="http://schemas.openxmlformats.org/drawingml/2006/main" r:id="rId28" tgtFrame="&quot;_blank&quot;"/>
+            </wp:docPr>
+            <wp:cNvGraphicFramePr>
+              <a:graphicFrameLocks xmlns:a="http://schemas.openxmlformats.org/drawingml/2006/main" noChangeAspect="1"/>
+            </wp:cNvGraphicFramePr>
+            <a:graphic xmlns:a="http://schemas.openxmlformats.org/drawingml/2006/main">
+              <a:graphicData uri="http://schemas.openxmlformats.org/drawingml/2006/picture">
+                <pic:pic xmlns:pic="http://schemas.openxmlformats.org/drawingml/2006/picture">
+                  <pic:nvPicPr>
+                    <pic:cNvPr id="0" name="Picture 58" descr="Image">
+                      <a:hlinkClick r:id="rId28" tgtFrame="&quot;_blank&quot;"/>
+                    </pic:cNvPr>
+                    <pic:cNvPicPr>
+                      <a:picLocks noChangeAspect="1" noChangeArrowheads="1"/>
+                    </pic:cNvPicPr>
+                  </pic:nvPicPr>
+                  <pic:blipFill>
+                    <a:blip r:embed="rId29">
+                      <a:extLst>
+                        <a:ext uri="{28A0092B-C50C-407E-A947-70E740481C1C}">
+                          <a14:useLocalDpi xmlns:a14="http://schemas.microsoft.com/office/drawing/2010/main" val="0"/>
+                        </a:ext>
+                      </a:extLst>
+                    </a:blip>
+                    <a:srcRect/>
+                    <a:stretch>
+                      <a:fillRect/>
+                    </a:stretch>
+                  </pic:blipFill>
+                  <pic:spPr bwMode="auto">
+                    <a:xfrm>
+                      <a:off x="0" y="0"/>
+                      <a:ext cx="4508239" cy="3010133"/>
+                    </a:xfrm>
+                    <a:prstGeom prst="rect">
+                      <a:avLst/>
+                    </a:prstGeom>
+                    <a:noFill/>
+                    <a:ln>
+                      <a:noFill/>
+                    </a:ln>
+                  </pic:spPr>
+                </pic:pic>
+              </a:graphicData>
+            </a:graphic>
+          </wp:inline>
+        </w:drawing>
+      </w:r>
+    </w:p>
+    <w:p>
+      <w:pPr>
+        <w:numPr>
+          <w:ilvl w:val="0"/>
+          <w:numId w:val="10"/>
+        </w:numPr>
+        <w:spacing w:after="0"/>
+      </w:pPr>
+      <w:r>
+        <w:t xml:space="preserve">Le joueur est éliminé au contact d'une munition </w:t>
+      </w:r>
+      <w:proofErr w:type="gramStart"/>
+      <w:r>
+        <w:t xml:space="preserve">( </w:t>
+      </w:r>
+      <w:proofErr w:type="spellStart"/>
+      <w:r>
+        <w:t>OneShot</w:t>
+      </w:r>
+      <w:proofErr w:type="spellEnd"/>
+      <w:proofErr w:type="gramEnd"/>
+      <w:r>
+        <w:t xml:space="preserve"> ).</w:t>
+      </w:r>
+    </w:p>
+    <w:p>
+      <w:pPr>
+        <w:numPr>
+          <w:ilvl w:val="0"/>
+          <w:numId w:val="10"/>
+        </w:numPr>
+      </w:pPr>
+      <w:r>
+        <w:t>Le joueur est éliminé au contact d'un ennemi.</w:t>
+      </w:r>
+    </w:p>
+    <w:p>
+      <w:pPr>
+        <w:pStyle w:val="Titre3"/>
+      </w:pPr>
+      <w:bookmarkStart w:id="15" w:name="_Toc241435691"/>
+      <w:r>
+        <w:lastRenderedPageBreak/>
+        <w:t>US11 - Écran de fin</w:t>
+      </w:r>
+      <w:bookmarkEnd w:id="15"/>
+    </w:p>
+    <w:p>
+      <w:r>
+        <w:t xml:space="preserve">En tant que joueur je souhaites avoir un Écran de fin indiquant mon score afin de savoir </w:t>
+      </w:r>
+      <w:proofErr w:type="gramStart"/>
+      <w:r>
+        <w:t>mes performance</w:t>
+      </w:r>
+      <w:proofErr w:type="gramEnd"/>
+      <w:r>
+        <w:t xml:space="preserve"> de la partie.</w:t>
+      </w:r>
+    </w:p>
+    <w:p>
+      <w:pPr>
+        <w:jc w:val="center"/>
+      </w:pPr>
+      <w:r>
+        <w:drawing>
+          <wp:inline distT="0" distB="0" distL="0" distR="0" wp14:anchorId="04792D1C" wp14:editId="4085DD95">
+            <wp:extent cx="3034665" cy="2003147"/>
+            <wp:effectExtent l="0" t="0" r="0" b="0"/>
+            <wp:docPr id="1448058587" name="Image 18" descr="Image">
+              <a:hlinkClick xmlns:a="http://schemas.openxmlformats.org/drawingml/2006/main" r:id="rId30" tgtFrame="&quot;_blank&quot;"/>
+            </wp:docPr>
+            <wp:cNvGraphicFramePr>
+              <a:graphicFrameLocks xmlns:a="http://schemas.openxmlformats.org/drawingml/2006/main" noChangeAspect="1"/>
+            </wp:cNvGraphicFramePr>
+            <a:graphic xmlns:a="http://schemas.openxmlformats.org/drawingml/2006/main">
+              <a:graphicData uri="http://schemas.openxmlformats.org/drawingml/2006/picture">
+                <pic:pic xmlns:pic="http://schemas.openxmlformats.org/drawingml/2006/picture">
+                  <pic:nvPicPr>
+                    <pic:cNvPr id="0" name="Picture 65" descr="Image">
+                      <a:hlinkClick r:id="rId30" tgtFrame="&quot;_blank&quot;"/>
+                    </pic:cNvPr>
+                    <pic:cNvPicPr>
+                      <a:picLocks noChangeAspect="1" noChangeArrowheads="1"/>
+                    </pic:cNvPicPr>
+                  </pic:nvPicPr>
+                  <pic:blipFill>
+                    <a:blip r:embed="rId31" cstate="print">
+                      <a:extLst>
+                        <a:ext uri="{28A0092B-C50C-407E-A947-70E740481C1C}">
+                          <a14:useLocalDpi xmlns:a14="http://schemas.microsoft.com/office/drawing/2010/main" val="0"/>
+                        </a:ext>
+                      </a:extLst>
+                    </a:blip>
+                    <a:srcRect/>
+                    <a:stretch>
+                      <a:fillRect/>
+                    </a:stretch>
+                  </pic:blipFill>
+                  <pic:spPr bwMode="auto">
+                    <a:xfrm>
+                      <a:off x="0" y="0"/>
+                      <a:ext cx="3072759" cy="2028292"/>
+                    </a:xfrm>
+                    <a:prstGeom prst="rect">
+                      <a:avLst/>
+                    </a:prstGeom>
+                    <a:noFill/>
+                    <a:ln>
+                      <a:noFill/>
+                    </a:ln>
+                  </pic:spPr>
+                </pic:pic>
+              </a:graphicData>
+            </a:graphic>
+          </wp:inline>
+        </w:drawing>
+      </w:r>
+    </w:p>
+    <w:p>
+      <w:pPr>
+        <w:numPr>
+          <w:ilvl w:val="0"/>
+          <w:numId w:val="11"/>
+        </w:numPr>
+        <w:spacing w:after="0"/>
+      </w:pPr>
+      <w:r>
+        <w:t xml:space="preserve">L'écran s'affiche </w:t>
+      </w:r>
+      <w:proofErr w:type="gramStart"/>
+      <w:r>
+        <w:t>suite à une</w:t>
+      </w:r>
+      <w:proofErr w:type="gramEnd"/>
+      <w:r>
+        <w:t xml:space="preserve"> élimination.</w:t>
+      </w:r>
+    </w:p>
+    <w:p>
+      <w:pPr>
+        <w:numPr>
+          <w:ilvl w:val="0"/>
+          <w:numId w:val="11"/>
+        </w:numPr>
+      </w:pPr>
+      <w:r>
+        <w:t>L'écran affiche le score de la partie.</w:t>
+      </w:r>
+    </w:p>
+    <w:p>
+      <w:pPr>
         <w:pStyle w:val="Titre1"/>
       </w:pPr>
-      <w:bookmarkStart w:id="7" w:name="_Toc239432018"/>
-      <w:r>
-        <w:lastRenderedPageBreak/>
+      <w:bookmarkStart w:id="16" w:name="_Toc241435692"/>
+      <w:r>
         <w:t>PLANNIFICATION INITIALE</w:t>
       </w:r>
-      <w:bookmarkEnd w:id="7"/>
+      <w:bookmarkEnd w:id="16"/>
     </w:p>
     <w:p>
       <w:r>
@@ -1857,37 +3752,31 @@
       <w:pPr>
         <w:pStyle w:val="Titre2"/>
       </w:pPr>
-      <w:bookmarkStart w:id="8" w:name="_Toc239432019"/>
+      <w:bookmarkStart w:id="17" w:name="_Toc241435693"/>
       <w:r>
         <w:t>Semaine 1</w:t>
       </w:r>
-      <w:bookmarkEnd w:id="8"/>
+      <w:bookmarkEnd w:id="17"/>
     </w:p>
     <w:p>
       <w:pPr>
         <w:pStyle w:val="Titre2"/>
       </w:pPr>
-      <w:bookmarkStart w:id="9" w:name="_Toc239432020"/>
-      <w:r>
-        <w:t>Semaine</w:t>
-      </w:r>
-      <w:r>
-        <w:t xml:space="preserve"> 2</w:t>
-      </w:r>
-      <w:bookmarkEnd w:id="9"/>
+      <w:bookmarkStart w:id="18" w:name="_Toc241435694"/>
+      <w:r>
+        <w:t>Semaine 2</w:t>
+      </w:r>
+      <w:bookmarkEnd w:id="18"/>
     </w:p>
     <w:p>
       <w:pPr>
         <w:pStyle w:val="Titre2"/>
       </w:pPr>
-      <w:bookmarkStart w:id="10" w:name="_Toc239432021"/>
-      <w:r>
-        <w:t>Semaine</w:t>
-      </w:r>
-      <w:r>
-        <w:t xml:space="preserve"> 3</w:t>
-      </w:r>
-      <w:bookmarkEnd w:id="10"/>
+      <w:bookmarkStart w:id="19" w:name="_Toc241435695"/>
+      <w:r>
+        <w:t>Semaine 3</w:t>
+      </w:r>
+      <w:bookmarkEnd w:id="19"/>
     </w:p>
     <w:p>
       <w:r>
@@ -1928,7 +3817,7 @@
           <w:lang w:val="en-US"/>
         </w:rPr>
       </w:pPr>
-      <w:bookmarkStart w:id="11" w:name="_Toc239432022"/>
+      <w:bookmarkStart w:id="20" w:name="_Toc241435696"/>
       <w:proofErr w:type="spellStart"/>
       <w:r>
         <w:rPr>
@@ -1943,7 +3832,20 @@
         </w:rPr>
         <w:t xml:space="preserve"> 4</w:t>
       </w:r>
-      <w:bookmarkEnd w:id="11"/>
+      <w:bookmarkEnd w:id="20"/>
+    </w:p>
+    <w:p>
+      <w:pPr>
+        <w:rPr>
+          <w:lang w:val="en-US"/>
+        </w:rPr>
+      </w:pPr>
+      <w:r>
+        <w:rPr>
+          <w:lang w:val="en-US"/>
+        </w:rPr>
+        <w:t>US04|US05|US06</w:t>
+      </w:r>
     </w:p>
     <w:p>
       <w:pPr>
@@ -1952,7 +3854,7 @@
           <w:lang w:val="en-US"/>
         </w:rPr>
       </w:pPr>
-      <w:bookmarkStart w:id="12" w:name="_Toc239432023"/>
+      <w:bookmarkStart w:id="21" w:name="_Toc241435697"/>
       <w:proofErr w:type="spellStart"/>
       <w:r>
         <w:rPr>
@@ -1967,58 +3869,85 @@
         </w:rPr>
         <w:t xml:space="preserve"> 5</w:t>
       </w:r>
-      <w:bookmarkEnd w:id="12"/>
+      <w:bookmarkEnd w:id="21"/>
+    </w:p>
+    <w:p>
+      <w:pPr>
+        <w:rPr>
+          <w:lang w:val="en-US"/>
+        </w:rPr>
+      </w:pPr>
+      <w:r>
+        <w:rPr>
+          <w:lang w:val="en-US"/>
+        </w:rPr>
+        <w:t>US07|US08|US09</w:t>
+      </w:r>
     </w:p>
     <w:p>
       <w:pPr>
         <w:pStyle w:val="Titre2"/>
       </w:pPr>
-      <w:bookmarkStart w:id="13" w:name="_Toc239432024"/>
-      <w:r>
-        <w:t>Semaine</w:t>
-      </w:r>
-      <w:r>
-        <w:t xml:space="preserve"> 6</w:t>
-      </w:r>
-      <w:bookmarkEnd w:id="13"/>
+      <w:bookmarkStart w:id="22" w:name="_Toc241435698"/>
+      <w:r>
+        <w:t>Semaine 6</w:t>
+      </w:r>
+      <w:bookmarkEnd w:id="22"/>
+    </w:p>
+    <w:p>
+      <w:r>
+        <w:t>US10|US11 ---- Remise 80%</w:t>
+      </w:r>
     </w:p>
     <w:p>
       <w:pPr>
         <w:pStyle w:val="Titre2"/>
       </w:pPr>
-      <w:bookmarkStart w:id="14" w:name="_Toc239432025"/>
-      <w:r>
-        <w:t>Semaine</w:t>
-      </w:r>
-      <w:r>
-        <w:t xml:space="preserve"> 7</w:t>
-      </w:r>
-      <w:bookmarkEnd w:id="14"/>
+      <w:bookmarkStart w:id="23" w:name="_Toc241435699"/>
+      <w:r>
+        <w:t>Semaine 7</w:t>
+      </w:r>
+      <w:bookmarkEnd w:id="23"/>
+    </w:p>
+    <w:p>
+      <w:r>
+        <w:t>Rectification des erreurs</w:t>
+      </w:r>
     </w:p>
     <w:p>
       <w:pPr>
         <w:pStyle w:val="Titre2"/>
       </w:pPr>
-      <w:bookmarkStart w:id="15" w:name="_Toc239432026"/>
-      <w:r>
-        <w:t>Semaine</w:t>
-      </w:r>
-      <w:r>
-        <w:t xml:space="preserve"> 8</w:t>
-      </w:r>
-      <w:bookmarkEnd w:id="15"/>
+      <w:bookmarkStart w:id="24" w:name="_Toc241435700"/>
+      <w:r>
+        <w:t>Semaine 8</w:t>
+      </w:r>
+      <w:bookmarkEnd w:id="24"/>
+    </w:p>
+    <w:p>
+      <w:r>
+        <w:t xml:space="preserve">Dernières </w:t>
+      </w:r>
+      <w:proofErr w:type="gramStart"/>
+      <w:r>
+        <w:t>corrections  --</w:t>
+      </w:r>
+      <w:proofErr w:type="gramEnd"/>
+      <w:r>
+        <w:t xml:space="preserve"> Remise 100%</w:t>
+      </w:r>
     </w:p>
     <w:p/>
     <w:p/>
     <w:sectPr>
-      <w:headerReference w:type="even" r:id="rId16"/>
-      <w:headerReference w:type="default" r:id="rId17"/>
-      <w:footerReference w:type="even" r:id="rId18"/>
-      <w:footerReference w:type="default" r:id="rId19"/>
-      <w:headerReference w:type="first" r:id="rId20"/>
-      <w:footerReference w:type="first" r:id="rId21"/>
+      <w:headerReference w:type="even" r:id="rId32"/>
+      <w:headerReference w:type="default" r:id="rId33"/>
+      <w:footerReference w:type="even" r:id="rId34"/>
+      <w:footerReference w:type="default" r:id="rId35"/>
+      <w:headerReference w:type="first" r:id="rId36"/>
+      <w:footerReference w:type="first" r:id="rId37"/>
       <w:pgSz w:w="11906" w:h="16838" w:code="9"/>
-      <w:pgMar w:top="1418" w:right="1418" w:bottom="1418" w:left="1418" w:header="709" w:footer="709" w:gutter="0"/>
+      <w:pgMar w:top="1418" w:right="1418" w:bottom="1135" w:left="1418" w:header="709" w:footer="709" w:gutter="0"/>
       <w:pgBorders w:offsetFrom="page">
         <w:top w:val="single" w:sz="4" w:space="24" w:color="auto"/>
         <w:left w:val="single" w:sz="4" w:space="24" w:color="auto"/>
@@ -2151,6 +4080,7 @@
         <v:shape id="PowerPlusWaterMarkObject287900907" o:spid="_x0000_s1026" type="#_x0000_t136" style="position:absolute;margin-left:0;margin-top:0;width:526.55pt;height:112.8pt;rotation:315;z-index:-251655168;mso-position-horizontal:center;mso-position-horizontal-relative:margin;mso-position-vertical:center;mso-position-vertical-relative:margin" o:allowincell="f" fillcolor="silver" stroked="f">
           <v:fill opacity=".5"/>
           <v:textpath style="font-family:&quot;Calibri&quot;;font-size:1pt" string="Carl-Jonathan Cali"/>
+          <w10:wrap anchorx="margin" anchory="margin"/>
         </v:shape>
       </w:pict>
     </w:r>
@@ -2268,6 +4198,7 @@
         <v:shape id="PowerPlusWaterMarkObject287900908" o:spid="_x0000_s1027" type="#_x0000_t136" style="position:absolute;margin-left:0;margin-top:0;width:526.55pt;height:112.8pt;rotation:315;z-index:-251653120;mso-position-horizontal:center;mso-position-horizontal-relative:margin;mso-position-vertical:center;mso-position-vertical-relative:margin" o:allowincell="f" fillcolor="silver" stroked="f">
           <v:fill opacity=".5"/>
           <v:textpath style="font-family:&quot;Calibri&quot;;font-size:1pt" string="Carl-Jonathan Cali"/>
+          <w10:wrap anchorx="margin" anchory="margin"/>
         </v:shape>
       </w:pict>
     </w:r>
@@ -2313,6 +4244,7 @@
         <v:shape id="PowerPlusWaterMarkObject287900906" o:spid="_x0000_s1025" type="#_x0000_t136" style="position:absolute;margin-left:0;margin-top:0;width:526.55pt;height:112.8pt;rotation:315;z-index:-251657216;mso-position-horizontal:center;mso-position-horizontal-relative:margin;mso-position-vertical:center;mso-position-vertical-relative:margin" o:allowincell="f" fillcolor="silver" stroked="f">
           <v:fill opacity=".5"/>
           <v:textpath style="font-family:&quot;Calibri&quot;;font-size:1pt" string="Carl-Jonathan Cali"/>
+          <w10:wrap anchorx="margin" anchory="margin"/>
         </v:shape>
       </w:pict>
     </w:r>
@@ -2323,6 +4255,715 @@
 <file path=word/numbering.xml><?xml version="1.0" encoding="utf-8"?>
 <w:numbering xmlns:wpc="http://schemas.microsoft.com/office/word/2010/wordprocessingCanvas" xmlns:cx="http://schemas.microsoft.com/office/drawing/2014/chartex" xmlns:cx1="http://schemas.microsoft.com/office/drawing/2015/9/8/chartex" xmlns:cx2="http://schemas.microsoft.com/office/drawing/2015/10/21/chartex" xmlns:cx3="http://schemas.microsoft.com/office/drawing/2016/5/9/chartex" xmlns:cx4="http://schemas.microsoft.com/office/drawing/2016/5/10/chartex" xmlns:cx5="http://schemas.microsoft.com/office/drawing/2016/5/11/chartex" xmlns:cx6="http://schemas.microsoft.com/office/drawing/2016/5/12/chartex" xmlns:cx7="http://schemas.microsoft.com/office/drawing/2016/5/13/chartex" xmlns:cx8="http://schemas.microsoft.com/office/drawing/2016/5/14/chartex" xmlns:mc="http://schemas.openxmlformats.org/markup-compatibility/2006" xmlns:aink="http://schemas.microsoft.com/office/drawing/2016/ink" xmlns:am3d="http://schemas.microsoft.com/office/drawing/2017/model3d" xmlns:o="urn:schemas-microsoft-com:office:office" xmlns:oel="http://schemas.microsoft.com/office/2019/extlst" xmlns:r="http://schemas.openxmlformats.org/officeDocument/2006/relationships" xmlns:m="http://schemas.openxmlformats.org/officeDocument/2006/math" xmlns:v="urn:schemas-microsoft-com:vml" xmlns:wp14="http://schemas.microsoft.com/office/word/2010/wordprocessingDrawing" xmlns:wp="http://schemas.openxmlformats.org/drawingml/2006/wordprocessingDrawing" xmlns:w10="urn:schemas-microsoft-com:office:word" xmlns:w="http://schemas.openxmlformats.org/wordprocessingml/2006/main" xmlns:w14="http://schemas.microsoft.com/office/word/2010/wordml" xmlns:w15="http://schemas.microsoft.com/office/word/2012/wordml" xmlns:w16cex="http://schemas.microsoft.com/office/word/2018/wordml/cex" xmlns:w16cid="http://schemas.microsoft.com/office/word/2016/wordml/cid" xmlns:w16="http://schemas.microsoft.com/office/word/2018/wordml" xmlns:w16du="http://schemas.microsoft.com/office/word/2023/wordml/word16du" xmlns:w16sdtdh="http://schemas.microsoft.com/office/word/2020/wordml/sdtdatahash" xmlns:w16sdtfl="http://schemas.microsoft.com/office/word/2024/wordml/sdtformatlock" xmlns:w16se="http://schemas.microsoft.com/office/word/2015/wordml/symex" xmlns:wpg="http://schemas.microsoft.com/office/word/2010/wordprocessingGroup" xmlns:wpi="http://schemas.microsoft.com/office/word/2010/wordprocessingInk" xmlns:wne="http://schemas.microsoft.com/office/word/2006/wordml" xmlns:wps="http://schemas.microsoft.com/office/word/2010/wordprocessingShape" mc:Ignorable="w14 w15 w16se w16cid w16 w16cex w16sdtdh w16sdtfl w16du wp14">
   <w:abstractNum w:abstractNumId="0" w15:restartNumberingAfterBreak="0">
+    <w:nsid w:val="06B863A5"/>
+    <w:multiLevelType w:val="hybridMultilevel"/>
+    <w:tmpl w:val="EE500302"/>
+    <w:lvl w:ilvl="0" w:tplc="100C0001">
+      <w:start w:val="1"/>
+      <w:numFmt w:val="bullet"/>
+      <w:lvlText w:val=""/>
+      <w:lvlJc w:val="left"/>
+      <w:pPr>
+        <w:ind w:left="720" w:hanging="360"/>
+      </w:pPr>
+      <w:rPr>
+        <w:rFonts w:ascii="Symbol" w:hAnsi="Symbol" w:hint="default"/>
+      </w:rPr>
+    </w:lvl>
+    <w:lvl w:ilvl="1" w:tplc="100C0003" w:tentative="1">
+      <w:start w:val="1"/>
+      <w:numFmt w:val="bullet"/>
+      <w:lvlText w:val="o"/>
+      <w:lvlJc w:val="left"/>
+      <w:pPr>
+        <w:ind w:left="1440" w:hanging="360"/>
+      </w:pPr>
+      <w:rPr>
+        <w:rFonts w:ascii="Courier New" w:hAnsi="Courier New" w:cs="Courier New" w:hint="default"/>
+      </w:rPr>
+    </w:lvl>
+    <w:lvl w:ilvl="2" w:tplc="100C0005" w:tentative="1">
+      <w:start w:val="1"/>
+      <w:numFmt w:val="bullet"/>
+      <w:lvlText w:val=""/>
+      <w:lvlJc w:val="left"/>
+      <w:pPr>
+        <w:ind w:left="2160" w:hanging="360"/>
+      </w:pPr>
+      <w:rPr>
+        <w:rFonts w:ascii="Wingdings" w:hAnsi="Wingdings" w:hint="default"/>
+      </w:rPr>
+    </w:lvl>
+    <w:lvl w:ilvl="3" w:tplc="100C0001" w:tentative="1">
+      <w:start w:val="1"/>
+      <w:numFmt w:val="bullet"/>
+      <w:lvlText w:val=""/>
+      <w:lvlJc w:val="left"/>
+      <w:pPr>
+        <w:ind w:left="2880" w:hanging="360"/>
+      </w:pPr>
+      <w:rPr>
+        <w:rFonts w:ascii="Symbol" w:hAnsi="Symbol" w:hint="default"/>
+      </w:rPr>
+    </w:lvl>
+    <w:lvl w:ilvl="4" w:tplc="100C0003" w:tentative="1">
+      <w:start w:val="1"/>
+      <w:numFmt w:val="bullet"/>
+      <w:lvlText w:val="o"/>
+      <w:lvlJc w:val="left"/>
+      <w:pPr>
+        <w:ind w:left="3600" w:hanging="360"/>
+      </w:pPr>
+      <w:rPr>
+        <w:rFonts w:ascii="Courier New" w:hAnsi="Courier New" w:cs="Courier New" w:hint="default"/>
+      </w:rPr>
+    </w:lvl>
+    <w:lvl w:ilvl="5" w:tplc="100C0005" w:tentative="1">
+      <w:start w:val="1"/>
+      <w:numFmt w:val="bullet"/>
+      <w:lvlText w:val=""/>
+      <w:lvlJc w:val="left"/>
+      <w:pPr>
+        <w:ind w:left="4320" w:hanging="360"/>
+      </w:pPr>
+      <w:rPr>
+        <w:rFonts w:ascii="Wingdings" w:hAnsi="Wingdings" w:hint="default"/>
+      </w:rPr>
+    </w:lvl>
+    <w:lvl w:ilvl="6" w:tplc="100C0001" w:tentative="1">
+      <w:start w:val="1"/>
+      <w:numFmt w:val="bullet"/>
+      <w:lvlText w:val=""/>
+      <w:lvlJc w:val="left"/>
+      <w:pPr>
+        <w:ind w:left="5040" w:hanging="360"/>
+      </w:pPr>
+      <w:rPr>
+        <w:rFonts w:ascii="Symbol" w:hAnsi="Symbol" w:hint="default"/>
+      </w:rPr>
+    </w:lvl>
+    <w:lvl w:ilvl="7" w:tplc="100C0003" w:tentative="1">
+      <w:start w:val="1"/>
+      <w:numFmt w:val="bullet"/>
+      <w:lvlText w:val="o"/>
+      <w:lvlJc w:val="left"/>
+      <w:pPr>
+        <w:ind w:left="5760" w:hanging="360"/>
+      </w:pPr>
+      <w:rPr>
+        <w:rFonts w:ascii="Courier New" w:hAnsi="Courier New" w:cs="Courier New" w:hint="default"/>
+      </w:rPr>
+    </w:lvl>
+    <w:lvl w:ilvl="8" w:tplc="100C0005" w:tentative="1">
+      <w:start w:val="1"/>
+      <w:numFmt w:val="bullet"/>
+      <w:lvlText w:val=""/>
+      <w:lvlJc w:val="left"/>
+      <w:pPr>
+        <w:ind w:left="6480" w:hanging="360"/>
+      </w:pPr>
+      <w:rPr>
+        <w:rFonts w:ascii="Wingdings" w:hAnsi="Wingdings" w:hint="default"/>
+      </w:rPr>
+    </w:lvl>
+  </w:abstractNum>
+  <w:abstractNum w:abstractNumId="1" w15:restartNumberingAfterBreak="0">
+    <w:nsid w:val="13793806"/>
+    <w:multiLevelType w:val="multilevel"/>
+    <w:tmpl w:val="1C32056C"/>
+    <w:lvl w:ilvl="0">
+      <w:start w:val="1"/>
+      <w:numFmt w:val="bullet"/>
+      <w:lvlText w:val=""/>
+      <w:lvlJc w:val="left"/>
+      <w:pPr>
+        <w:tabs>
+          <w:tab w:val="num" w:pos="720"/>
+        </w:tabs>
+        <w:ind w:left="720" w:hanging="360"/>
+      </w:pPr>
+      <w:rPr>
+        <w:rFonts w:ascii="Symbol" w:hAnsi="Symbol" w:hint="default"/>
+        <w:sz w:val="20"/>
+      </w:rPr>
+    </w:lvl>
+    <w:lvl w:ilvl="1" w:tentative="1">
+      <w:start w:val="1"/>
+      <w:numFmt w:val="bullet"/>
+      <w:lvlText w:val="o"/>
+      <w:lvlJc w:val="left"/>
+      <w:pPr>
+        <w:tabs>
+          <w:tab w:val="num" w:pos="1440"/>
+        </w:tabs>
+        <w:ind w:left="1440" w:hanging="360"/>
+      </w:pPr>
+      <w:rPr>
+        <w:rFonts w:ascii="Courier New" w:hAnsi="Courier New" w:hint="default"/>
+        <w:sz w:val="20"/>
+      </w:rPr>
+    </w:lvl>
+    <w:lvl w:ilvl="2" w:tentative="1">
+      <w:start w:val="1"/>
+      <w:numFmt w:val="bullet"/>
+      <w:lvlText w:val=""/>
+      <w:lvlJc w:val="left"/>
+      <w:pPr>
+        <w:tabs>
+          <w:tab w:val="num" w:pos="2160"/>
+        </w:tabs>
+        <w:ind w:left="2160" w:hanging="360"/>
+      </w:pPr>
+      <w:rPr>
+        <w:rFonts w:ascii="Wingdings" w:hAnsi="Wingdings" w:hint="default"/>
+        <w:sz w:val="20"/>
+      </w:rPr>
+    </w:lvl>
+    <w:lvl w:ilvl="3" w:tentative="1">
+      <w:start w:val="1"/>
+      <w:numFmt w:val="bullet"/>
+      <w:lvlText w:val=""/>
+      <w:lvlJc w:val="left"/>
+      <w:pPr>
+        <w:tabs>
+          <w:tab w:val="num" w:pos="2880"/>
+        </w:tabs>
+        <w:ind w:left="2880" w:hanging="360"/>
+      </w:pPr>
+      <w:rPr>
+        <w:rFonts w:ascii="Wingdings" w:hAnsi="Wingdings" w:hint="default"/>
+        <w:sz w:val="20"/>
+      </w:rPr>
+    </w:lvl>
+    <w:lvl w:ilvl="4" w:tentative="1">
+      <w:start w:val="1"/>
+      <w:numFmt w:val="bullet"/>
+      <w:lvlText w:val=""/>
+      <w:lvlJc w:val="left"/>
+      <w:pPr>
+        <w:tabs>
+          <w:tab w:val="num" w:pos="3600"/>
+        </w:tabs>
+        <w:ind w:left="3600" w:hanging="360"/>
+      </w:pPr>
+      <w:rPr>
+        <w:rFonts w:ascii="Wingdings" w:hAnsi="Wingdings" w:hint="default"/>
+        <w:sz w:val="20"/>
+      </w:rPr>
+    </w:lvl>
+    <w:lvl w:ilvl="5" w:tentative="1">
+      <w:start w:val="1"/>
+      <w:numFmt w:val="bullet"/>
+      <w:lvlText w:val=""/>
+      <w:lvlJc w:val="left"/>
+      <w:pPr>
+        <w:tabs>
+          <w:tab w:val="num" w:pos="4320"/>
+        </w:tabs>
+        <w:ind w:left="4320" w:hanging="360"/>
+      </w:pPr>
+      <w:rPr>
+        <w:rFonts w:ascii="Wingdings" w:hAnsi="Wingdings" w:hint="default"/>
+        <w:sz w:val="20"/>
+      </w:rPr>
+    </w:lvl>
+    <w:lvl w:ilvl="6" w:tentative="1">
+      <w:start w:val="1"/>
+      <w:numFmt w:val="bullet"/>
+      <w:lvlText w:val=""/>
+      <w:lvlJc w:val="left"/>
+      <w:pPr>
+        <w:tabs>
+          <w:tab w:val="num" w:pos="5040"/>
+        </w:tabs>
+        <w:ind w:left="5040" w:hanging="360"/>
+      </w:pPr>
+      <w:rPr>
+        <w:rFonts w:ascii="Wingdings" w:hAnsi="Wingdings" w:hint="default"/>
+        <w:sz w:val="20"/>
+      </w:rPr>
+    </w:lvl>
+    <w:lvl w:ilvl="7" w:tentative="1">
+      <w:start w:val="1"/>
+      <w:numFmt w:val="bullet"/>
+      <w:lvlText w:val=""/>
+      <w:lvlJc w:val="left"/>
+      <w:pPr>
+        <w:tabs>
+          <w:tab w:val="num" w:pos="5760"/>
+        </w:tabs>
+        <w:ind w:left="5760" w:hanging="360"/>
+      </w:pPr>
+      <w:rPr>
+        <w:rFonts w:ascii="Wingdings" w:hAnsi="Wingdings" w:hint="default"/>
+        <w:sz w:val="20"/>
+      </w:rPr>
+    </w:lvl>
+    <w:lvl w:ilvl="8" w:tentative="1">
+      <w:start w:val="1"/>
+      <w:numFmt w:val="bullet"/>
+      <w:lvlText w:val=""/>
+      <w:lvlJc w:val="left"/>
+      <w:pPr>
+        <w:tabs>
+          <w:tab w:val="num" w:pos="6480"/>
+        </w:tabs>
+        <w:ind w:left="6480" w:hanging="360"/>
+      </w:pPr>
+      <w:rPr>
+        <w:rFonts w:ascii="Wingdings" w:hAnsi="Wingdings" w:hint="default"/>
+        <w:sz w:val="20"/>
+      </w:rPr>
+    </w:lvl>
+  </w:abstractNum>
+  <w:abstractNum w:abstractNumId="2" w15:restartNumberingAfterBreak="0">
+    <w:nsid w:val="24C43865"/>
+    <w:multiLevelType w:val="multilevel"/>
+    <w:tmpl w:val="7A0EFBEC"/>
+    <w:lvl w:ilvl="0">
+      <w:start w:val="1"/>
+      <w:numFmt w:val="bullet"/>
+      <w:lvlText w:val=""/>
+      <w:lvlJc w:val="left"/>
+      <w:pPr>
+        <w:tabs>
+          <w:tab w:val="num" w:pos="720"/>
+        </w:tabs>
+        <w:ind w:left="720" w:hanging="360"/>
+      </w:pPr>
+      <w:rPr>
+        <w:rFonts w:ascii="Symbol" w:hAnsi="Symbol" w:hint="default"/>
+        <w:sz w:val="20"/>
+      </w:rPr>
+    </w:lvl>
+    <w:lvl w:ilvl="1" w:tentative="1">
+      <w:start w:val="1"/>
+      <w:numFmt w:val="bullet"/>
+      <w:lvlText w:val="o"/>
+      <w:lvlJc w:val="left"/>
+      <w:pPr>
+        <w:tabs>
+          <w:tab w:val="num" w:pos="1440"/>
+        </w:tabs>
+        <w:ind w:left="1440" w:hanging="360"/>
+      </w:pPr>
+      <w:rPr>
+        <w:rFonts w:ascii="Courier New" w:hAnsi="Courier New" w:hint="default"/>
+        <w:sz w:val="20"/>
+      </w:rPr>
+    </w:lvl>
+    <w:lvl w:ilvl="2" w:tentative="1">
+      <w:start w:val="1"/>
+      <w:numFmt w:val="bullet"/>
+      <w:lvlText w:val=""/>
+      <w:lvlJc w:val="left"/>
+      <w:pPr>
+        <w:tabs>
+          <w:tab w:val="num" w:pos="2160"/>
+        </w:tabs>
+        <w:ind w:left="2160" w:hanging="360"/>
+      </w:pPr>
+      <w:rPr>
+        <w:rFonts w:ascii="Wingdings" w:hAnsi="Wingdings" w:hint="default"/>
+        <w:sz w:val="20"/>
+      </w:rPr>
+    </w:lvl>
+    <w:lvl w:ilvl="3" w:tentative="1">
+      <w:start w:val="1"/>
+      <w:numFmt w:val="bullet"/>
+      <w:lvlText w:val=""/>
+      <w:lvlJc w:val="left"/>
+      <w:pPr>
+        <w:tabs>
+          <w:tab w:val="num" w:pos="2880"/>
+        </w:tabs>
+        <w:ind w:left="2880" w:hanging="360"/>
+      </w:pPr>
+      <w:rPr>
+        <w:rFonts w:ascii="Wingdings" w:hAnsi="Wingdings" w:hint="default"/>
+        <w:sz w:val="20"/>
+      </w:rPr>
+    </w:lvl>
+    <w:lvl w:ilvl="4" w:tentative="1">
+      <w:start w:val="1"/>
+      <w:numFmt w:val="bullet"/>
+      <w:lvlText w:val=""/>
+      <w:lvlJc w:val="left"/>
+      <w:pPr>
+        <w:tabs>
+          <w:tab w:val="num" w:pos="3600"/>
+        </w:tabs>
+        <w:ind w:left="3600" w:hanging="360"/>
+      </w:pPr>
+      <w:rPr>
+        <w:rFonts w:ascii="Wingdings" w:hAnsi="Wingdings" w:hint="default"/>
+        <w:sz w:val="20"/>
+      </w:rPr>
+    </w:lvl>
+    <w:lvl w:ilvl="5" w:tentative="1">
+      <w:start w:val="1"/>
+      <w:numFmt w:val="bullet"/>
+      <w:lvlText w:val=""/>
+      <w:lvlJc w:val="left"/>
+      <w:pPr>
+        <w:tabs>
+          <w:tab w:val="num" w:pos="4320"/>
+        </w:tabs>
+        <w:ind w:left="4320" w:hanging="360"/>
+      </w:pPr>
+      <w:rPr>
+        <w:rFonts w:ascii="Wingdings" w:hAnsi="Wingdings" w:hint="default"/>
+        <w:sz w:val="20"/>
+      </w:rPr>
+    </w:lvl>
+    <w:lvl w:ilvl="6" w:tentative="1">
+      <w:start w:val="1"/>
+      <w:numFmt w:val="bullet"/>
+      <w:lvlText w:val=""/>
+      <w:lvlJc w:val="left"/>
+      <w:pPr>
+        <w:tabs>
+          <w:tab w:val="num" w:pos="5040"/>
+        </w:tabs>
+        <w:ind w:left="5040" w:hanging="360"/>
+      </w:pPr>
+      <w:rPr>
+        <w:rFonts w:ascii="Wingdings" w:hAnsi="Wingdings" w:hint="default"/>
+        <w:sz w:val="20"/>
+      </w:rPr>
+    </w:lvl>
+    <w:lvl w:ilvl="7" w:tentative="1">
+      <w:start w:val="1"/>
+      <w:numFmt w:val="bullet"/>
+      <w:lvlText w:val=""/>
+      <w:lvlJc w:val="left"/>
+      <w:pPr>
+        <w:tabs>
+          <w:tab w:val="num" w:pos="5760"/>
+        </w:tabs>
+        <w:ind w:left="5760" w:hanging="360"/>
+      </w:pPr>
+      <w:rPr>
+        <w:rFonts w:ascii="Wingdings" w:hAnsi="Wingdings" w:hint="default"/>
+        <w:sz w:val="20"/>
+      </w:rPr>
+    </w:lvl>
+    <w:lvl w:ilvl="8" w:tentative="1">
+      <w:start w:val="1"/>
+      <w:numFmt w:val="bullet"/>
+      <w:lvlText w:val=""/>
+      <w:lvlJc w:val="left"/>
+      <w:pPr>
+        <w:tabs>
+          <w:tab w:val="num" w:pos="6480"/>
+        </w:tabs>
+        <w:ind w:left="6480" w:hanging="360"/>
+      </w:pPr>
+      <w:rPr>
+        <w:rFonts w:ascii="Wingdings" w:hAnsi="Wingdings" w:hint="default"/>
+        <w:sz w:val="20"/>
+      </w:rPr>
+    </w:lvl>
+  </w:abstractNum>
+  <w:abstractNum w:abstractNumId="3" w15:restartNumberingAfterBreak="0">
+    <w:nsid w:val="3350384C"/>
+    <w:multiLevelType w:val="multilevel"/>
+    <w:tmpl w:val="0122BD86"/>
+    <w:lvl w:ilvl="0">
+      <w:start w:val="1"/>
+      <w:numFmt w:val="bullet"/>
+      <w:lvlText w:val=""/>
+      <w:lvlJc w:val="left"/>
+      <w:pPr>
+        <w:tabs>
+          <w:tab w:val="num" w:pos="720"/>
+        </w:tabs>
+        <w:ind w:left="720" w:hanging="360"/>
+      </w:pPr>
+      <w:rPr>
+        <w:rFonts w:ascii="Symbol" w:hAnsi="Symbol" w:hint="default"/>
+        <w:sz w:val="20"/>
+      </w:rPr>
+    </w:lvl>
+    <w:lvl w:ilvl="1" w:tentative="1">
+      <w:start w:val="1"/>
+      <w:numFmt w:val="bullet"/>
+      <w:lvlText w:val="o"/>
+      <w:lvlJc w:val="left"/>
+      <w:pPr>
+        <w:tabs>
+          <w:tab w:val="num" w:pos="1440"/>
+        </w:tabs>
+        <w:ind w:left="1440" w:hanging="360"/>
+      </w:pPr>
+      <w:rPr>
+        <w:rFonts w:ascii="Courier New" w:hAnsi="Courier New" w:hint="default"/>
+        <w:sz w:val="20"/>
+      </w:rPr>
+    </w:lvl>
+    <w:lvl w:ilvl="2" w:tentative="1">
+      <w:start w:val="1"/>
+      <w:numFmt w:val="bullet"/>
+      <w:lvlText w:val=""/>
+      <w:lvlJc w:val="left"/>
+      <w:pPr>
+        <w:tabs>
+          <w:tab w:val="num" w:pos="2160"/>
+        </w:tabs>
+        <w:ind w:left="2160" w:hanging="360"/>
+      </w:pPr>
+      <w:rPr>
+        <w:rFonts w:ascii="Wingdings" w:hAnsi="Wingdings" w:hint="default"/>
+        <w:sz w:val="20"/>
+      </w:rPr>
+    </w:lvl>
+    <w:lvl w:ilvl="3" w:tentative="1">
+      <w:start w:val="1"/>
+      <w:numFmt w:val="bullet"/>
+      <w:lvlText w:val=""/>
+      <w:lvlJc w:val="left"/>
+      <w:pPr>
+        <w:tabs>
+          <w:tab w:val="num" w:pos="2880"/>
+        </w:tabs>
+        <w:ind w:left="2880" w:hanging="360"/>
+      </w:pPr>
+      <w:rPr>
+        <w:rFonts w:ascii="Wingdings" w:hAnsi="Wingdings" w:hint="default"/>
+        <w:sz w:val="20"/>
+      </w:rPr>
+    </w:lvl>
+    <w:lvl w:ilvl="4" w:tentative="1">
+      <w:start w:val="1"/>
+      <w:numFmt w:val="bullet"/>
+      <w:lvlText w:val=""/>
+      <w:lvlJc w:val="left"/>
+      <w:pPr>
+        <w:tabs>
+          <w:tab w:val="num" w:pos="3600"/>
+        </w:tabs>
+        <w:ind w:left="3600" w:hanging="360"/>
+      </w:pPr>
+      <w:rPr>
+        <w:rFonts w:ascii="Wingdings" w:hAnsi="Wingdings" w:hint="default"/>
+        <w:sz w:val="20"/>
+      </w:rPr>
+    </w:lvl>
+    <w:lvl w:ilvl="5" w:tentative="1">
+      <w:start w:val="1"/>
+      <w:numFmt w:val="bullet"/>
+      <w:lvlText w:val=""/>
+      <w:lvlJc w:val="left"/>
+      <w:pPr>
+        <w:tabs>
+          <w:tab w:val="num" w:pos="4320"/>
+        </w:tabs>
+        <w:ind w:left="4320" w:hanging="360"/>
+      </w:pPr>
+      <w:rPr>
+        <w:rFonts w:ascii="Wingdings" w:hAnsi="Wingdings" w:hint="default"/>
+        <w:sz w:val="20"/>
+      </w:rPr>
+    </w:lvl>
+    <w:lvl w:ilvl="6" w:tentative="1">
+      <w:start w:val="1"/>
+      <w:numFmt w:val="bullet"/>
+      <w:lvlText w:val=""/>
+      <w:lvlJc w:val="left"/>
+      <w:pPr>
+        <w:tabs>
+          <w:tab w:val="num" w:pos="5040"/>
+        </w:tabs>
+        <w:ind w:left="5040" w:hanging="360"/>
+      </w:pPr>
+      <w:rPr>
+        <w:rFonts w:ascii="Wingdings" w:hAnsi="Wingdings" w:hint="default"/>
+        <w:sz w:val="20"/>
+      </w:rPr>
+    </w:lvl>
+    <w:lvl w:ilvl="7" w:tentative="1">
+      <w:start w:val="1"/>
+      <w:numFmt w:val="bullet"/>
+      <w:lvlText w:val=""/>
+      <w:lvlJc w:val="left"/>
+      <w:pPr>
+        <w:tabs>
+          <w:tab w:val="num" w:pos="5760"/>
+        </w:tabs>
+        <w:ind w:left="5760" w:hanging="360"/>
+      </w:pPr>
+      <w:rPr>
+        <w:rFonts w:ascii="Wingdings" w:hAnsi="Wingdings" w:hint="default"/>
+        <w:sz w:val="20"/>
+      </w:rPr>
+    </w:lvl>
+    <w:lvl w:ilvl="8" w:tentative="1">
+      <w:start w:val="1"/>
+      <w:numFmt w:val="bullet"/>
+      <w:lvlText w:val=""/>
+      <w:lvlJc w:val="left"/>
+      <w:pPr>
+        <w:tabs>
+          <w:tab w:val="num" w:pos="6480"/>
+        </w:tabs>
+        <w:ind w:left="6480" w:hanging="360"/>
+      </w:pPr>
+      <w:rPr>
+        <w:rFonts w:ascii="Wingdings" w:hAnsi="Wingdings" w:hint="default"/>
+        <w:sz w:val="20"/>
+      </w:rPr>
+    </w:lvl>
+  </w:abstractNum>
+  <w:abstractNum w:abstractNumId="4" w15:restartNumberingAfterBreak="0">
+    <w:nsid w:val="391C2491"/>
+    <w:multiLevelType w:val="multilevel"/>
+    <w:tmpl w:val="309C323A"/>
+    <w:lvl w:ilvl="0">
+      <w:start w:val="1"/>
+      <w:numFmt w:val="bullet"/>
+      <w:lvlText w:val=""/>
+      <w:lvlJc w:val="left"/>
+      <w:pPr>
+        <w:tabs>
+          <w:tab w:val="num" w:pos="720"/>
+        </w:tabs>
+        <w:ind w:left="720" w:hanging="360"/>
+      </w:pPr>
+      <w:rPr>
+        <w:rFonts w:ascii="Symbol" w:hAnsi="Symbol" w:hint="default"/>
+        <w:sz w:val="20"/>
+      </w:rPr>
+    </w:lvl>
+    <w:lvl w:ilvl="1" w:tentative="1">
+      <w:start w:val="1"/>
+      <w:numFmt w:val="bullet"/>
+      <w:lvlText w:val="o"/>
+      <w:lvlJc w:val="left"/>
+      <w:pPr>
+        <w:tabs>
+          <w:tab w:val="num" w:pos="1440"/>
+        </w:tabs>
+        <w:ind w:left="1440" w:hanging="360"/>
+      </w:pPr>
+      <w:rPr>
+        <w:rFonts w:ascii="Courier New" w:hAnsi="Courier New" w:hint="default"/>
+        <w:sz w:val="20"/>
+      </w:rPr>
+    </w:lvl>
+    <w:lvl w:ilvl="2" w:tentative="1">
+      <w:start w:val="1"/>
+      <w:numFmt w:val="bullet"/>
+      <w:lvlText w:val=""/>
+      <w:lvlJc w:val="left"/>
+      <w:pPr>
+        <w:tabs>
+          <w:tab w:val="num" w:pos="2160"/>
+        </w:tabs>
+        <w:ind w:left="2160" w:hanging="360"/>
+      </w:pPr>
+      <w:rPr>
+        <w:rFonts w:ascii="Wingdings" w:hAnsi="Wingdings" w:hint="default"/>
+        <w:sz w:val="20"/>
+      </w:rPr>
+    </w:lvl>
+    <w:lvl w:ilvl="3" w:tentative="1">
+      <w:start w:val="1"/>
+      <w:numFmt w:val="bullet"/>
+      <w:lvlText w:val=""/>
+      <w:lvlJc w:val="left"/>
+      <w:pPr>
+        <w:tabs>
+          <w:tab w:val="num" w:pos="2880"/>
+        </w:tabs>
+        <w:ind w:left="2880" w:hanging="360"/>
+      </w:pPr>
+      <w:rPr>
+        <w:rFonts w:ascii="Wingdings" w:hAnsi="Wingdings" w:hint="default"/>
+        <w:sz w:val="20"/>
+      </w:rPr>
+    </w:lvl>
+    <w:lvl w:ilvl="4" w:tentative="1">
+      <w:start w:val="1"/>
+      <w:numFmt w:val="bullet"/>
+      <w:lvlText w:val=""/>
+      <w:lvlJc w:val="left"/>
+      <w:pPr>
+        <w:tabs>
+          <w:tab w:val="num" w:pos="3600"/>
+        </w:tabs>
+        <w:ind w:left="3600" w:hanging="360"/>
+      </w:pPr>
+      <w:rPr>
+        <w:rFonts w:ascii="Wingdings" w:hAnsi="Wingdings" w:hint="default"/>
+        <w:sz w:val="20"/>
+      </w:rPr>
+    </w:lvl>
+    <w:lvl w:ilvl="5" w:tentative="1">
+      <w:start w:val="1"/>
+      <w:numFmt w:val="bullet"/>
+      <w:lvlText w:val=""/>
+      <w:lvlJc w:val="left"/>
+      <w:pPr>
+        <w:tabs>
+          <w:tab w:val="num" w:pos="4320"/>
+        </w:tabs>
+        <w:ind w:left="4320" w:hanging="360"/>
+      </w:pPr>
+      <w:rPr>
+        <w:rFonts w:ascii="Wingdings" w:hAnsi="Wingdings" w:hint="default"/>
+        <w:sz w:val="20"/>
+      </w:rPr>
+    </w:lvl>
+    <w:lvl w:ilvl="6" w:tentative="1">
+      <w:start w:val="1"/>
+      <w:numFmt w:val="bullet"/>
+      <w:lvlText w:val=""/>
+      <w:lvlJc w:val="left"/>
+      <w:pPr>
+        <w:tabs>
+          <w:tab w:val="num" w:pos="5040"/>
+        </w:tabs>
+        <w:ind w:left="5040" w:hanging="360"/>
+      </w:pPr>
+      <w:rPr>
+        <w:rFonts w:ascii="Wingdings" w:hAnsi="Wingdings" w:hint="default"/>
+        <w:sz w:val="20"/>
+      </w:rPr>
+    </w:lvl>
+    <w:lvl w:ilvl="7" w:tentative="1">
+      <w:start w:val="1"/>
+      <w:numFmt w:val="bullet"/>
+      <w:lvlText w:val=""/>
+      <w:lvlJc w:val="left"/>
+      <w:pPr>
+        <w:tabs>
+          <w:tab w:val="num" w:pos="5760"/>
+        </w:tabs>
+        <w:ind w:left="5760" w:hanging="360"/>
+      </w:pPr>
+      <w:rPr>
+        <w:rFonts w:ascii="Wingdings" w:hAnsi="Wingdings" w:hint="default"/>
+        <w:sz w:val="20"/>
+      </w:rPr>
+    </w:lvl>
+    <w:lvl w:ilvl="8" w:tentative="1">
+      <w:start w:val="1"/>
+      <w:numFmt w:val="bullet"/>
+      <w:lvlText w:val=""/>
+      <w:lvlJc w:val="left"/>
+      <w:pPr>
+        <w:tabs>
+          <w:tab w:val="num" w:pos="6480"/>
+        </w:tabs>
+        <w:ind w:left="6480" w:hanging="360"/>
+      </w:pPr>
+      <w:rPr>
+        <w:rFonts w:ascii="Wingdings" w:hAnsi="Wingdings" w:hint="default"/>
+        <w:sz w:val="20"/>
+      </w:rPr>
+    </w:lvl>
+  </w:abstractNum>
+  <w:abstractNum w:abstractNumId="5" w15:restartNumberingAfterBreak="0">
     <w:nsid w:val="3D650D05"/>
     <w:multiLevelType w:val="multilevel"/>
     <w:tmpl w:val="083C4EFC"/>
@@ -2471,7 +5112,156 @@
       </w:rPr>
     </w:lvl>
   </w:abstractNum>
-  <w:abstractNum w:abstractNumId="1" w15:restartNumberingAfterBreak="0">
+  <w:abstractNum w:abstractNumId="6" w15:restartNumberingAfterBreak="0">
+    <w:nsid w:val="45EC419D"/>
+    <w:multiLevelType w:val="multilevel"/>
+    <w:tmpl w:val="E98417E4"/>
+    <w:lvl w:ilvl="0">
+      <w:start w:val="1"/>
+      <w:numFmt w:val="bullet"/>
+      <w:lvlText w:val=""/>
+      <w:lvlJc w:val="left"/>
+      <w:pPr>
+        <w:tabs>
+          <w:tab w:val="num" w:pos="720"/>
+        </w:tabs>
+        <w:ind w:left="720" w:hanging="360"/>
+      </w:pPr>
+      <w:rPr>
+        <w:rFonts w:ascii="Symbol" w:hAnsi="Symbol" w:hint="default"/>
+        <w:sz w:val="20"/>
+      </w:rPr>
+    </w:lvl>
+    <w:lvl w:ilvl="1" w:tentative="1">
+      <w:start w:val="1"/>
+      <w:numFmt w:val="bullet"/>
+      <w:lvlText w:val="o"/>
+      <w:lvlJc w:val="left"/>
+      <w:pPr>
+        <w:tabs>
+          <w:tab w:val="num" w:pos="1440"/>
+        </w:tabs>
+        <w:ind w:left="1440" w:hanging="360"/>
+      </w:pPr>
+      <w:rPr>
+        <w:rFonts w:ascii="Courier New" w:hAnsi="Courier New" w:hint="default"/>
+        <w:sz w:val="20"/>
+      </w:rPr>
+    </w:lvl>
+    <w:lvl w:ilvl="2" w:tentative="1">
+      <w:start w:val="1"/>
+      <w:numFmt w:val="bullet"/>
+      <w:lvlText w:val=""/>
+      <w:lvlJc w:val="left"/>
+      <w:pPr>
+        <w:tabs>
+          <w:tab w:val="num" w:pos="2160"/>
+        </w:tabs>
+        <w:ind w:left="2160" w:hanging="360"/>
+      </w:pPr>
+      <w:rPr>
+        <w:rFonts w:ascii="Wingdings" w:hAnsi="Wingdings" w:hint="default"/>
+        <w:sz w:val="20"/>
+      </w:rPr>
+    </w:lvl>
+    <w:lvl w:ilvl="3" w:tentative="1">
+      <w:start w:val="1"/>
+      <w:numFmt w:val="bullet"/>
+      <w:lvlText w:val=""/>
+      <w:lvlJc w:val="left"/>
+      <w:pPr>
+        <w:tabs>
+          <w:tab w:val="num" w:pos="2880"/>
+        </w:tabs>
+        <w:ind w:left="2880" w:hanging="360"/>
+      </w:pPr>
+      <w:rPr>
+        <w:rFonts w:ascii="Wingdings" w:hAnsi="Wingdings" w:hint="default"/>
+        <w:sz w:val="20"/>
+      </w:rPr>
+    </w:lvl>
+    <w:lvl w:ilvl="4" w:tentative="1">
+      <w:start w:val="1"/>
+      <w:numFmt w:val="bullet"/>
+      <w:lvlText w:val=""/>
+      <w:lvlJc w:val="left"/>
+      <w:pPr>
+        <w:tabs>
+          <w:tab w:val="num" w:pos="3600"/>
+        </w:tabs>
+        <w:ind w:left="3600" w:hanging="360"/>
+      </w:pPr>
+      <w:rPr>
+        <w:rFonts w:ascii="Wingdings" w:hAnsi="Wingdings" w:hint="default"/>
+        <w:sz w:val="20"/>
+      </w:rPr>
+    </w:lvl>
+    <w:lvl w:ilvl="5" w:tentative="1">
+      <w:start w:val="1"/>
+      <w:numFmt w:val="bullet"/>
+      <w:lvlText w:val=""/>
+      <w:lvlJc w:val="left"/>
+      <w:pPr>
+        <w:tabs>
+          <w:tab w:val="num" w:pos="4320"/>
+        </w:tabs>
+        <w:ind w:left="4320" w:hanging="360"/>
+      </w:pPr>
+      <w:rPr>
+        <w:rFonts w:ascii="Wingdings" w:hAnsi="Wingdings" w:hint="default"/>
+        <w:sz w:val="20"/>
+      </w:rPr>
+    </w:lvl>
+    <w:lvl w:ilvl="6" w:tentative="1">
+      <w:start w:val="1"/>
+      <w:numFmt w:val="bullet"/>
+      <w:lvlText w:val=""/>
+      <w:lvlJc w:val="left"/>
+      <w:pPr>
+        <w:tabs>
+          <w:tab w:val="num" w:pos="5040"/>
+        </w:tabs>
+        <w:ind w:left="5040" w:hanging="360"/>
+      </w:pPr>
+      <w:rPr>
+        <w:rFonts w:ascii="Wingdings" w:hAnsi="Wingdings" w:hint="default"/>
+        <w:sz w:val="20"/>
+      </w:rPr>
+    </w:lvl>
+    <w:lvl w:ilvl="7" w:tentative="1">
+      <w:start w:val="1"/>
+      <w:numFmt w:val="bullet"/>
+      <w:lvlText w:val=""/>
+      <w:lvlJc w:val="left"/>
+      <w:pPr>
+        <w:tabs>
+          <w:tab w:val="num" w:pos="5760"/>
+        </w:tabs>
+        <w:ind w:left="5760" w:hanging="360"/>
+      </w:pPr>
+      <w:rPr>
+        <w:rFonts w:ascii="Wingdings" w:hAnsi="Wingdings" w:hint="default"/>
+        <w:sz w:val="20"/>
+      </w:rPr>
+    </w:lvl>
+    <w:lvl w:ilvl="8" w:tentative="1">
+      <w:start w:val="1"/>
+      <w:numFmt w:val="bullet"/>
+      <w:lvlText w:val=""/>
+      <w:lvlJc w:val="left"/>
+      <w:pPr>
+        <w:tabs>
+          <w:tab w:val="num" w:pos="6480"/>
+        </w:tabs>
+        <w:ind w:left="6480" w:hanging="360"/>
+      </w:pPr>
+      <w:rPr>
+        <w:rFonts w:ascii="Wingdings" w:hAnsi="Wingdings" w:hint="default"/>
+        <w:sz w:val="20"/>
+      </w:rPr>
+    </w:lvl>
+  </w:abstractNum>
+  <w:abstractNum w:abstractNumId="7" w15:restartNumberingAfterBreak="0">
     <w:nsid w:val="481B691C"/>
     <w:multiLevelType w:val="multilevel"/>
     <w:tmpl w:val="083C4EFC"/>
@@ -2620,7 +5410,305 @@
       </w:rPr>
     </w:lvl>
   </w:abstractNum>
-  <w:abstractNum w:abstractNumId="2" w15:restartNumberingAfterBreak="0">
+  <w:abstractNum w:abstractNumId="8" w15:restartNumberingAfterBreak="0">
+    <w:nsid w:val="48F702A3"/>
+    <w:multiLevelType w:val="multilevel"/>
+    <w:tmpl w:val="C324F0FE"/>
+    <w:lvl w:ilvl="0">
+      <w:start w:val="1"/>
+      <w:numFmt w:val="bullet"/>
+      <w:lvlText w:val=""/>
+      <w:lvlJc w:val="left"/>
+      <w:pPr>
+        <w:tabs>
+          <w:tab w:val="num" w:pos="720"/>
+        </w:tabs>
+        <w:ind w:left="720" w:hanging="360"/>
+      </w:pPr>
+      <w:rPr>
+        <w:rFonts w:ascii="Symbol" w:hAnsi="Symbol" w:hint="default"/>
+        <w:sz w:val="20"/>
+      </w:rPr>
+    </w:lvl>
+    <w:lvl w:ilvl="1" w:tentative="1">
+      <w:start w:val="1"/>
+      <w:numFmt w:val="bullet"/>
+      <w:lvlText w:val="o"/>
+      <w:lvlJc w:val="left"/>
+      <w:pPr>
+        <w:tabs>
+          <w:tab w:val="num" w:pos="1440"/>
+        </w:tabs>
+        <w:ind w:left="1440" w:hanging="360"/>
+      </w:pPr>
+      <w:rPr>
+        <w:rFonts w:ascii="Courier New" w:hAnsi="Courier New" w:hint="default"/>
+        <w:sz w:val="20"/>
+      </w:rPr>
+    </w:lvl>
+    <w:lvl w:ilvl="2" w:tentative="1">
+      <w:start w:val="1"/>
+      <w:numFmt w:val="bullet"/>
+      <w:lvlText w:val=""/>
+      <w:lvlJc w:val="left"/>
+      <w:pPr>
+        <w:tabs>
+          <w:tab w:val="num" w:pos="2160"/>
+        </w:tabs>
+        <w:ind w:left="2160" w:hanging="360"/>
+      </w:pPr>
+      <w:rPr>
+        <w:rFonts w:ascii="Wingdings" w:hAnsi="Wingdings" w:hint="default"/>
+        <w:sz w:val="20"/>
+      </w:rPr>
+    </w:lvl>
+    <w:lvl w:ilvl="3" w:tentative="1">
+      <w:start w:val="1"/>
+      <w:numFmt w:val="bullet"/>
+      <w:lvlText w:val=""/>
+      <w:lvlJc w:val="left"/>
+      <w:pPr>
+        <w:tabs>
+          <w:tab w:val="num" w:pos="2880"/>
+        </w:tabs>
+        <w:ind w:left="2880" w:hanging="360"/>
+      </w:pPr>
+      <w:rPr>
+        <w:rFonts w:ascii="Wingdings" w:hAnsi="Wingdings" w:hint="default"/>
+        <w:sz w:val="20"/>
+      </w:rPr>
+    </w:lvl>
+    <w:lvl w:ilvl="4" w:tentative="1">
+      <w:start w:val="1"/>
+      <w:numFmt w:val="bullet"/>
+      <w:lvlText w:val=""/>
+      <w:lvlJc w:val="left"/>
+      <w:pPr>
+        <w:tabs>
+          <w:tab w:val="num" w:pos="3600"/>
+        </w:tabs>
+        <w:ind w:left="3600" w:hanging="360"/>
+      </w:pPr>
+      <w:rPr>
+        <w:rFonts w:ascii="Wingdings" w:hAnsi="Wingdings" w:hint="default"/>
+        <w:sz w:val="20"/>
+      </w:rPr>
+    </w:lvl>
+    <w:lvl w:ilvl="5" w:tentative="1">
+      <w:start w:val="1"/>
+      <w:numFmt w:val="bullet"/>
+      <w:lvlText w:val=""/>
+      <w:lvlJc w:val="left"/>
+      <w:pPr>
+        <w:tabs>
+          <w:tab w:val="num" w:pos="4320"/>
+        </w:tabs>
+        <w:ind w:left="4320" w:hanging="360"/>
+      </w:pPr>
+      <w:rPr>
+        <w:rFonts w:ascii="Wingdings" w:hAnsi="Wingdings" w:hint="default"/>
+        <w:sz w:val="20"/>
+      </w:rPr>
+    </w:lvl>
+    <w:lvl w:ilvl="6" w:tentative="1">
+      <w:start w:val="1"/>
+      <w:numFmt w:val="bullet"/>
+      <w:lvlText w:val=""/>
+      <w:lvlJc w:val="left"/>
+      <w:pPr>
+        <w:tabs>
+          <w:tab w:val="num" w:pos="5040"/>
+        </w:tabs>
+        <w:ind w:left="5040" w:hanging="360"/>
+      </w:pPr>
+      <w:rPr>
+        <w:rFonts w:ascii="Wingdings" w:hAnsi="Wingdings" w:hint="default"/>
+        <w:sz w:val="20"/>
+      </w:rPr>
+    </w:lvl>
+    <w:lvl w:ilvl="7" w:tentative="1">
+      <w:start w:val="1"/>
+      <w:numFmt w:val="bullet"/>
+      <w:lvlText w:val=""/>
+      <w:lvlJc w:val="left"/>
+      <w:pPr>
+        <w:tabs>
+          <w:tab w:val="num" w:pos="5760"/>
+        </w:tabs>
+        <w:ind w:left="5760" w:hanging="360"/>
+      </w:pPr>
+      <w:rPr>
+        <w:rFonts w:ascii="Wingdings" w:hAnsi="Wingdings" w:hint="default"/>
+        <w:sz w:val="20"/>
+      </w:rPr>
+    </w:lvl>
+    <w:lvl w:ilvl="8" w:tentative="1">
+      <w:start w:val="1"/>
+      <w:numFmt w:val="bullet"/>
+      <w:lvlText w:val=""/>
+      <w:lvlJc w:val="left"/>
+      <w:pPr>
+        <w:tabs>
+          <w:tab w:val="num" w:pos="6480"/>
+        </w:tabs>
+        <w:ind w:left="6480" w:hanging="360"/>
+      </w:pPr>
+      <w:rPr>
+        <w:rFonts w:ascii="Wingdings" w:hAnsi="Wingdings" w:hint="default"/>
+        <w:sz w:val="20"/>
+      </w:rPr>
+    </w:lvl>
+  </w:abstractNum>
+  <w:abstractNum w:abstractNumId="9" w15:restartNumberingAfterBreak="0">
+    <w:nsid w:val="52BF3FE0"/>
+    <w:multiLevelType w:val="multilevel"/>
+    <w:tmpl w:val="64188758"/>
+    <w:lvl w:ilvl="0">
+      <w:start w:val="1"/>
+      <w:numFmt w:val="bullet"/>
+      <w:lvlText w:val=""/>
+      <w:lvlJc w:val="left"/>
+      <w:pPr>
+        <w:tabs>
+          <w:tab w:val="num" w:pos="720"/>
+        </w:tabs>
+        <w:ind w:left="720" w:hanging="360"/>
+      </w:pPr>
+      <w:rPr>
+        <w:rFonts w:ascii="Symbol" w:hAnsi="Symbol" w:hint="default"/>
+        <w:sz w:val="20"/>
+      </w:rPr>
+    </w:lvl>
+    <w:lvl w:ilvl="1" w:tentative="1">
+      <w:start w:val="1"/>
+      <w:numFmt w:val="bullet"/>
+      <w:lvlText w:val="o"/>
+      <w:lvlJc w:val="left"/>
+      <w:pPr>
+        <w:tabs>
+          <w:tab w:val="num" w:pos="1440"/>
+        </w:tabs>
+        <w:ind w:left="1440" w:hanging="360"/>
+      </w:pPr>
+      <w:rPr>
+        <w:rFonts w:ascii="Courier New" w:hAnsi="Courier New" w:hint="default"/>
+        <w:sz w:val="20"/>
+      </w:rPr>
+    </w:lvl>
+    <w:lvl w:ilvl="2" w:tentative="1">
+      <w:start w:val="1"/>
+      <w:numFmt w:val="bullet"/>
+      <w:lvlText w:val=""/>
+      <w:lvlJc w:val="left"/>
+      <w:pPr>
+        <w:tabs>
+          <w:tab w:val="num" w:pos="2160"/>
+        </w:tabs>
+        <w:ind w:left="2160" w:hanging="360"/>
+      </w:pPr>
+      <w:rPr>
+        <w:rFonts w:ascii="Wingdings" w:hAnsi="Wingdings" w:hint="default"/>
+        <w:sz w:val="20"/>
+      </w:rPr>
+    </w:lvl>
+    <w:lvl w:ilvl="3" w:tentative="1">
+      <w:start w:val="1"/>
+      <w:numFmt w:val="bullet"/>
+      <w:lvlText w:val=""/>
+      <w:lvlJc w:val="left"/>
+      <w:pPr>
+        <w:tabs>
+          <w:tab w:val="num" w:pos="2880"/>
+        </w:tabs>
+        <w:ind w:left="2880" w:hanging="360"/>
+      </w:pPr>
+      <w:rPr>
+        <w:rFonts w:ascii="Wingdings" w:hAnsi="Wingdings" w:hint="default"/>
+        <w:sz w:val="20"/>
+      </w:rPr>
+    </w:lvl>
+    <w:lvl w:ilvl="4" w:tentative="1">
+      <w:start w:val="1"/>
+      <w:numFmt w:val="bullet"/>
+      <w:lvlText w:val=""/>
+      <w:lvlJc w:val="left"/>
+      <w:pPr>
+        <w:tabs>
+          <w:tab w:val="num" w:pos="3600"/>
+        </w:tabs>
+        <w:ind w:left="3600" w:hanging="360"/>
+      </w:pPr>
+      <w:rPr>
+        <w:rFonts w:ascii="Wingdings" w:hAnsi="Wingdings" w:hint="default"/>
+        <w:sz w:val="20"/>
+      </w:rPr>
+    </w:lvl>
+    <w:lvl w:ilvl="5" w:tentative="1">
+      <w:start w:val="1"/>
+      <w:numFmt w:val="bullet"/>
+      <w:lvlText w:val=""/>
+      <w:lvlJc w:val="left"/>
+      <w:pPr>
+        <w:tabs>
+          <w:tab w:val="num" w:pos="4320"/>
+        </w:tabs>
+        <w:ind w:left="4320" w:hanging="360"/>
+      </w:pPr>
+      <w:rPr>
+        <w:rFonts w:ascii="Wingdings" w:hAnsi="Wingdings" w:hint="default"/>
+        <w:sz w:val="20"/>
+      </w:rPr>
+    </w:lvl>
+    <w:lvl w:ilvl="6" w:tentative="1">
+      <w:start w:val="1"/>
+      <w:numFmt w:val="bullet"/>
+      <w:lvlText w:val=""/>
+      <w:lvlJc w:val="left"/>
+      <w:pPr>
+        <w:tabs>
+          <w:tab w:val="num" w:pos="5040"/>
+        </w:tabs>
+        <w:ind w:left="5040" w:hanging="360"/>
+      </w:pPr>
+      <w:rPr>
+        <w:rFonts w:ascii="Wingdings" w:hAnsi="Wingdings" w:hint="default"/>
+        <w:sz w:val="20"/>
+      </w:rPr>
+    </w:lvl>
+    <w:lvl w:ilvl="7" w:tentative="1">
+      <w:start w:val="1"/>
+      <w:numFmt w:val="bullet"/>
+      <w:lvlText w:val=""/>
+      <w:lvlJc w:val="left"/>
+      <w:pPr>
+        <w:tabs>
+          <w:tab w:val="num" w:pos="5760"/>
+        </w:tabs>
+        <w:ind w:left="5760" w:hanging="360"/>
+      </w:pPr>
+      <w:rPr>
+        <w:rFonts w:ascii="Wingdings" w:hAnsi="Wingdings" w:hint="default"/>
+        <w:sz w:val="20"/>
+      </w:rPr>
+    </w:lvl>
+    <w:lvl w:ilvl="8" w:tentative="1">
+      <w:start w:val="1"/>
+      <w:numFmt w:val="bullet"/>
+      <w:lvlText w:val=""/>
+      <w:lvlJc w:val="left"/>
+      <w:pPr>
+        <w:tabs>
+          <w:tab w:val="num" w:pos="6480"/>
+        </w:tabs>
+        <w:ind w:left="6480" w:hanging="360"/>
+      </w:pPr>
+      <w:rPr>
+        <w:rFonts w:ascii="Wingdings" w:hAnsi="Wingdings" w:hint="default"/>
+        <w:sz w:val="20"/>
+      </w:rPr>
+    </w:lvl>
+  </w:abstractNum>
+  <w:abstractNum w:abstractNumId="10" w15:restartNumberingAfterBreak="0">
     <w:nsid w:val="72DA7245"/>
     <w:multiLevelType w:val="multilevel"/>
     <w:tmpl w:val="083C4EFC"/>
@@ -2769,14 +5857,190 @@
       </w:rPr>
     </w:lvl>
   </w:abstractNum>
+  <w:abstractNum w:abstractNumId="11" w15:restartNumberingAfterBreak="0">
+    <w:nsid w:val="7E6076AF"/>
+    <w:multiLevelType w:val="multilevel"/>
+    <w:tmpl w:val="E304AC48"/>
+    <w:lvl w:ilvl="0">
+      <w:start w:val="1"/>
+      <w:numFmt w:val="bullet"/>
+      <w:lvlText w:val=""/>
+      <w:lvlJc w:val="left"/>
+      <w:pPr>
+        <w:tabs>
+          <w:tab w:val="num" w:pos="720"/>
+        </w:tabs>
+        <w:ind w:left="720" w:hanging="360"/>
+      </w:pPr>
+      <w:rPr>
+        <w:rFonts w:ascii="Symbol" w:hAnsi="Symbol" w:hint="default"/>
+        <w:sz w:val="20"/>
+      </w:rPr>
+    </w:lvl>
+    <w:lvl w:ilvl="1" w:tentative="1">
+      <w:start w:val="1"/>
+      <w:numFmt w:val="bullet"/>
+      <w:lvlText w:val="o"/>
+      <w:lvlJc w:val="left"/>
+      <w:pPr>
+        <w:tabs>
+          <w:tab w:val="num" w:pos="1440"/>
+        </w:tabs>
+        <w:ind w:left="1440" w:hanging="360"/>
+      </w:pPr>
+      <w:rPr>
+        <w:rFonts w:ascii="Courier New" w:hAnsi="Courier New" w:hint="default"/>
+        <w:sz w:val="20"/>
+      </w:rPr>
+    </w:lvl>
+    <w:lvl w:ilvl="2" w:tentative="1">
+      <w:start w:val="1"/>
+      <w:numFmt w:val="bullet"/>
+      <w:lvlText w:val=""/>
+      <w:lvlJc w:val="left"/>
+      <w:pPr>
+        <w:tabs>
+          <w:tab w:val="num" w:pos="2160"/>
+        </w:tabs>
+        <w:ind w:left="2160" w:hanging="360"/>
+      </w:pPr>
+      <w:rPr>
+        <w:rFonts w:ascii="Wingdings" w:hAnsi="Wingdings" w:hint="default"/>
+        <w:sz w:val="20"/>
+      </w:rPr>
+    </w:lvl>
+    <w:lvl w:ilvl="3" w:tentative="1">
+      <w:start w:val="1"/>
+      <w:numFmt w:val="bullet"/>
+      <w:lvlText w:val=""/>
+      <w:lvlJc w:val="left"/>
+      <w:pPr>
+        <w:tabs>
+          <w:tab w:val="num" w:pos="2880"/>
+        </w:tabs>
+        <w:ind w:left="2880" w:hanging="360"/>
+      </w:pPr>
+      <w:rPr>
+        <w:rFonts w:ascii="Wingdings" w:hAnsi="Wingdings" w:hint="default"/>
+        <w:sz w:val="20"/>
+      </w:rPr>
+    </w:lvl>
+    <w:lvl w:ilvl="4" w:tentative="1">
+      <w:start w:val="1"/>
+      <w:numFmt w:val="bullet"/>
+      <w:lvlText w:val=""/>
+      <w:lvlJc w:val="left"/>
+      <w:pPr>
+        <w:tabs>
+          <w:tab w:val="num" w:pos="3600"/>
+        </w:tabs>
+        <w:ind w:left="3600" w:hanging="360"/>
+      </w:pPr>
+      <w:rPr>
+        <w:rFonts w:ascii="Wingdings" w:hAnsi="Wingdings" w:hint="default"/>
+        <w:sz w:val="20"/>
+      </w:rPr>
+    </w:lvl>
+    <w:lvl w:ilvl="5" w:tentative="1">
+      <w:start w:val="1"/>
+      <w:numFmt w:val="bullet"/>
+      <w:lvlText w:val=""/>
+      <w:lvlJc w:val="left"/>
+      <w:pPr>
+        <w:tabs>
+          <w:tab w:val="num" w:pos="4320"/>
+        </w:tabs>
+        <w:ind w:left="4320" w:hanging="360"/>
+      </w:pPr>
+      <w:rPr>
+        <w:rFonts w:ascii="Wingdings" w:hAnsi="Wingdings" w:hint="default"/>
+        <w:sz w:val="20"/>
+      </w:rPr>
+    </w:lvl>
+    <w:lvl w:ilvl="6" w:tentative="1">
+      <w:start w:val="1"/>
+      <w:numFmt w:val="bullet"/>
+      <w:lvlText w:val=""/>
+      <w:lvlJc w:val="left"/>
+      <w:pPr>
+        <w:tabs>
+          <w:tab w:val="num" w:pos="5040"/>
+        </w:tabs>
+        <w:ind w:left="5040" w:hanging="360"/>
+      </w:pPr>
+      <w:rPr>
+        <w:rFonts w:ascii="Wingdings" w:hAnsi="Wingdings" w:hint="default"/>
+        <w:sz w:val="20"/>
+      </w:rPr>
+    </w:lvl>
+    <w:lvl w:ilvl="7" w:tentative="1">
+      <w:start w:val="1"/>
+      <w:numFmt w:val="bullet"/>
+      <w:lvlText w:val=""/>
+      <w:lvlJc w:val="left"/>
+      <w:pPr>
+        <w:tabs>
+          <w:tab w:val="num" w:pos="5760"/>
+        </w:tabs>
+        <w:ind w:left="5760" w:hanging="360"/>
+      </w:pPr>
+      <w:rPr>
+        <w:rFonts w:ascii="Wingdings" w:hAnsi="Wingdings" w:hint="default"/>
+        <w:sz w:val="20"/>
+      </w:rPr>
+    </w:lvl>
+    <w:lvl w:ilvl="8" w:tentative="1">
+      <w:start w:val="1"/>
+      <w:numFmt w:val="bullet"/>
+      <w:lvlText w:val=""/>
+      <w:lvlJc w:val="left"/>
+      <w:pPr>
+        <w:tabs>
+          <w:tab w:val="num" w:pos="6480"/>
+        </w:tabs>
+        <w:ind w:left="6480" w:hanging="360"/>
+      </w:pPr>
+      <w:rPr>
+        <w:rFonts w:ascii="Wingdings" w:hAnsi="Wingdings" w:hint="default"/>
+        <w:sz w:val="20"/>
+      </w:rPr>
+    </w:lvl>
+  </w:abstractNum>
   <w:num w:numId="1" w16cid:durableId="1164856901">
+    <w:abstractNumId w:val="10"/>
+  </w:num>
+  <w:num w:numId="2" w16cid:durableId="954138969">
+    <w:abstractNumId w:val="5"/>
+  </w:num>
+  <w:num w:numId="3" w16cid:durableId="360785773">
+    <w:abstractNumId w:val="7"/>
+  </w:num>
+  <w:num w:numId="4" w16cid:durableId="475995999">
+    <w:abstractNumId w:val="1"/>
+  </w:num>
+  <w:num w:numId="5" w16cid:durableId="604581854">
     <w:abstractNumId w:val="2"/>
   </w:num>
-  <w:num w:numId="2" w16cid:durableId="954138969">
+  <w:num w:numId="6" w16cid:durableId="768546798">
+    <w:abstractNumId w:val="3"/>
+  </w:num>
+  <w:num w:numId="7" w16cid:durableId="2016566837">
+    <w:abstractNumId w:val="6"/>
+  </w:num>
+  <w:num w:numId="8" w16cid:durableId="460804995">
+    <w:abstractNumId w:val="4"/>
+  </w:num>
+  <w:num w:numId="9" w16cid:durableId="1900898499">
+    <w:abstractNumId w:val="9"/>
+  </w:num>
+  <w:num w:numId="10" w16cid:durableId="2044281111">
+    <w:abstractNumId w:val="8"/>
+  </w:num>
+  <w:num w:numId="11" w16cid:durableId="1848061187">
+    <w:abstractNumId w:val="11"/>
+  </w:num>
+  <w:num w:numId="12" w16cid:durableId="111218174">
     <w:abstractNumId w:val="0"/>
-  </w:num>
-  <w:num w:numId="3" w16cid:durableId="360785773">
-    <w:abstractNumId w:val="1"/>
   </w:num>
 </w:numbering>
 </file>

</xml_diff>

<commit_message>
DOC(Rapport): Explication code rapport
[15][WIP]
</commit_message>
<xml_diff>
--- a/DOC/RAPPORT PROJET.docx
+++ b/DOC/RAPPORT PROJET.docx
@@ -2077,13 +2077,7 @@
     </w:p>
     <w:p>
       <w:r>
-        <w:t xml:space="preserve">En ce qui concerne le code nous devons également démontrer une </w:t>
-      </w:r>
-      <w:r>
-        <w:t>certaine</w:t>
-      </w:r>
-      <w:r>
-        <w:t xml:space="preserve"> structure au niveau de notre code.</w:t>
+        <w:t>En ce qui concerne le code nous devons également démontrer une certaine structure au niveau de notre code.</w:t>
       </w:r>
     </w:p>
     <w:p>
@@ -2620,6 +2614,9 @@
         <w:jc w:val="center"/>
       </w:pPr>
       <w:r>
+        <w:rPr>
+          <w:noProof/>
+        </w:rPr>
         <w:drawing>
           <wp:inline distT="0" distB="0" distL="0" distR="0" wp14:anchorId="772F3B06" wp14:editId="3B29CC66">
             <wp:extent cx="3414942" cy="2275624"/>
@@ -2748,10 +2745,7 @@
     </w:p>
     <w:p>
       <w:r>
-        <w:t>En</w:t>
-      </w:r>
-      <w:r>
-        <w:t xml:space="preserve"> tant que joueur je souhaite que mon joueur puisse tirer des accords de guitare afin de pouvoir par la suite contrer les ennemis et leurs attaques.</w:t>
+        <w:t>En tant que joueur je souhaite que mon joueur puisse tirer des accords de guitare afin de pouvoir par la suite contrer les ennemis et leurs attaques.</w:t>
       </w:r>
     </w:p>
     <w:p>
@@ -2759,6 +2753,9 @@
         <w:jc w:val="center"/>
       </w:pPr>
       <w:r>
+        <w:rPr>
+          <w:noProof/>
+        </w:rPr>
         <w:drawing>
           <wp:inline distT="0" distB="0" distL="0" distR="0" wp14:anchorId="6F5F0478" wp14:editId="511559FB">
             <wp:extent cx="3425738" cy="2277530"/>
@@ -2949,8 +2946,11 @@
         <w:jc w:val="center"/>
       </w:pPr>
       <w:r>
+        <w:rPr>
+          <w:noProof/>
+        </w:rPr>
         <w:drawing>
-          <wp:inline distT="0" distB="0" distL="0" distR="0" wp14:anchorId="5887A5FE" wp14:editId="011300E1">
+          <wp:inline distT="0" distB="0" distL="0" distR="0" wp14:anchorId="5887A5FE" wp14:editId="0A367803">
             <wp:extent cx="3921125" cy="2614227"/>
             <wp:effectExtent l="0" t="0" r="3175" b="0"/>
             <wp:docPr id="173038047" name="Image 8" descr="Image">
@@ -3111,6 +3111,9 @@
         <w:jc w:val="center"/>
       </w:pPr>
       <w:r>
+        <w:rPr>
+          <w:noProof/>
+        </w:rPr>
         <w:drawing>
           <wp:inline distT="0" distB="0" distL="0" distR="0" wp14:anchorId="6D443E7A" wp14:editId="1474A05E">
             <wp:extent cx="3381170" cy="2247900"/>
@@ -3233,6 +3236,9 @@
         <w:jc w:val="center"/>
       </w:pPr>
       <w:r>
+        <w:rPr>
+          <w:noProof/>
+        </w:rPr>
         <w:drawing>
           <wp:inline distT="0" distB="0" distL="0" distR="0" wp14:anchorId="3D170D68" wp14:editId="04323053">
             <wp:extent cx="3381043" cy="2246697"/>
@@ -3368,6 +3374,9 @@
         <w:jc w:val="center"/>
       </w:pPr>
       <w:r>
+        <w:rPr>
+          <w:noProof/>
+        </w:rPr>
         <w:drawing>
           <wp:inline distT="0" distB="0" distL="0" distR="0" wp14:anchorId="1A3F7CEF" wp14:editId="6F0A963A">
             <wp:extent cx="3180916" cy="2113714"/>
@@ -3529,6 +3538,9 @@
         <w:jc w:val="center"/>
       </w:pPr>
       <w:r>
+        <w:rPr>
+          <w:noProof/>
+        </w:rPr>
         <w:drawing>
           <wp:inline distT="0" distB="0" distL="0" distR="0" wp14:anchorId="3E48B80E" wp14:editId="646172B1">
             <wp:extent cx="4479359" cy="2990850"/>
@@ -3648,6 +3660,9 @@
         <w:jc w:val="center"/>
       </w:pPr>
       <w:r>
+        <w:rPr>
+          <w:noProof/>
+        </w:rPr>
         <w:drawing>
           <wp:inline distT="0" distB="0" distL="0" distR="0" wp14:anchorId="04792D1C" wp14:editId="4085DD95">
             <wp:extent cx="3034665" cy="2003147"/>
@@ -3937,15 +3952,541 @@
         <w:t xml:space="preserve"> Remise 100%</w:t>
       </w:r>
     </w:p>
-    <w:p/>
-    <w:p/>
+    <w:p>
+      <w:pPr>
+        <w:pStyle w:val="Titre1"/>
+      </w:pPr>
+      <w:r>
+        <w:lastRenderedPageBreak/>
+        <w:t>Code</w:t>
+      </w:r>
+    </w:p>
+    <w:p>
+      <w:pPr>
+        <w:pStyle w:val="Titre2"/>
+      </w:pPr>
+      <w:r>
+        <w:t>Classes</w:t>
+      </w:r>
+    </w:p>
+    <w:p>
+      <w:r>
+        <w:t>Pour mon projet je possède au total 5 types d’objets :</w:t>
+      </w:r>
+    </w:p>
+    <w:p>
+      <w:pPr>
+        <w:pStyle w:val="Paragraphedeliste"/>
+        <w:numPr>
+          <w:ilvl w:val="0"/>
+          <w:numId w:val="13"/>
+        </w:numPr>
+      </w:pPr>
+      <w:proofErr w:type="gramStart"/>
+      <w:r>
+        <w:t>Le joueur principale</w:t>
+      </w:r>
+      <w:proofErr w:type="gramEnd"/>
+      <w:r>
+        <w:t>.</w:t>
+      </w:r>
+    </w:p>
+    <w:p>
+      <w:pPr>
+        <w:pStyle w:val="Paragraphedeliste"/>
+        <w:numPr>
+          <w:ilvl w:val="0"/>
+          <w:numId w:val="13"/>
+        </w:numPr>
+      </w:pPr>
+      <w:r>
+        <w:t>Les ennemis.</w:t>
+      </w:r>
+    </w:p>
+    <w:p>
+      <w:pPr>
+        <w:pStyle w:val="Paragraphedeliste"/>
+        <w:numPr>
+          <w:ilvl w:val="0"/>
+          <w:numId w:val="13"/>
+        </w:numPr>
+      </w:pPr>
+      <w:r>
+        <w:t>Les munitions du joueur principale.</w:t>
+      </w:r>
+    </w:p>
+    <w:p>
+      <w:pPr>
+        <w:pStyle w:val="Paragraphedeliste"/>
+        <w:numPr>
+          <w:ilvl w:val="0"/>
+          <w:numId w:val="13"/>
+        </w:numPr>
+      </w:pPr>
+      <w:r>
+        <w:t>Les munitions des ennemis.</w:t>
+      </w:r>
+    </w:p>
+    <w:p>
+      <w:pPr>
+        <w:pStyle w:val="Paragraphedeliste"/>
+        <w:numPr>
+          <w:ilvl w:val="0"/>
+          <w:numId w:val="13"/>
+        </w:numPr>
+      </w:pPr>
+      <w:r>
+        <w:t>Les barrières de protections.</w:t>
+      </w:r>
+    </w:p>
+    <w:p>
+      <w:r>
+        <w:t>Et pour pouvoir les créer j’ai besoin d’une classe pour chacun des objets.</w:t>
+      </w:r>
+    </w:p>
+    <w:p>
+      <w:pPr>
+        <w:pStyle w:val="Titre3"/>
+      </w:pPr>
+      <w:r>
+        <w:t>J</w:t>
+      </w:r>
+      <w:r>
+        <w:t>oueur principale</w:t>
+      </w:r>
+    </w:p>
+    <w:p>
+      <w:pPr>
+        <w:rPr>
+          <w:b/>
+          <w:bCs/>
+          <w:i/>
+          <w:iCs/>
+          <w:u w:val="single"/>
+        </w:rPr>
+      </w:pPr>
+      <w:r>
+        <w:rPr>
+          <w:b/>
+          <w:bCs/>
+          <w:i/>
+          <w:iCs/>
+          <w:u w:val="single"/>
+        </w:rPr>
+        <w:t>Les attributs :</w:t>
+      </w:r>
+    </w:p>
+    <w:p>
+      <w:pPr>
+        <w:jc w:val="center"/>
+      </w:pPr>
+      <w:r>
+        <w:drawing>
+          <wp:inline distT="0" distB="0" distL="0" distR="0" wp14:anchorId="5D1F291F" wp14:editId="6A623572">
+            <wp:extent cx="1609705" cy="628642"/>
+            <wp:effectExtent l="152400" t="152400" r="353060" b="362585"/>
+            <wp:docPr id="228073649" name="Image 1"/>
+            <wp:cNvGraphicFramePr>
+              <a:graphicFrameLocks xmlns:a="http://schemas.openxmlformats.org/drawingml/2006/main" noChangeAspect="1"/>
+            </wp:cNvGraphicFramePr>
+            <a:graphic xmlns:a="http://schemas.openxmlformats.org/drawingml/2006/main">
+              <a:graphicData uri="http://schemas.openxmlformats.org/drawingml/2006/picture">
+                <pic:pic xmlns:pic="http://schemas.openxmlformats.org/drawingml/2006/picture">
+                  <pic:nvPicPr>
+                    <pic:cNvPr id="228073649" name=""/>
+                    <pic:cNvPicPr/>
+                  </pic:nvPicPr>
+                  <pic:blipFill>
+                    <a:blip r:embed="rId32"/>
+                    <a:stretch>
+                      <a:fillRect/>
+                    </a:stretch>
+                  </pic:blipFill>
+                  <pic:spPr>
+                    <a:xfrm>
+                      <a:off x="0" y="0"/>
+                      <a:ext cx="1626963" cy="635382"/>
+                    </a:xfrm>
+                    <a:prstGeom prst="rect">
+                      <a:avLst/>
+                    </a:prstGeom>
+                    <a:ln>
+                      <a:noFill/>
+                    </a:ln>
+                    <a:effectLst>
+                      <a:outerShdw blurRad="292100" dist="139700" dir="2700000" algn="tl" rotWithShape="0">
+                        <a:srgbClr val="333333">
+                          <a:alpha val="65000"/>
+                        </a:srgbClr>
+                      </a:outerShdw>
+                    </a:effectLst>
+                  </pic:spPr>
+                </pic:pic>
+              </a:graphicData>
+            </a:graphic>
+          </wp:inline>
+        </w:drawing>
+      </w:r>
+    </w:p>
+    <w:p>
+      <w:pPr>
+        <w:rPr>
+          <w:b/>
+          <w:bCs/>
+          <w:i/>
+          <w:iCs/>
+          <w:color w:val="EE0000"/>
+          <w:u w:val="single"/>
+        </w:rPr>
+      </w:pPr>
+      <w:r>
+        <w:rPr>
+          <w:b/>
+          <w:bCs/>
+          <w:i/>
+          <w:iCs/>
+          <w:u w:val="single"/>
+        </w:rPr>
+        <w:t>Le constructeur :</w:t>
+      </w:r>
+      <w:r>
+        <w:rPr>
+          <w:b/>
+          <w:bCs/>
+          <w:i/>
+          <w:iCs/>
+          <w:u w:val="single"/>
+        </w:rPr>
+        <w:t xml:space="preserve">  </w:t>
+      </w:r>
+      <w:r>
+        <w:rPr>
+          <w:b/>
+          <w:bCs/>
+          <w:i/>
+          <w:iCs/>
+          <w:color w:val="EE0000"/>
+          <w:u w:val="single"/>
+        </w:rPr>
+        <w:t xml:space="preserve">Faire un constructeur par </w:t>
+      </w:r>
+      <w:proofErr w:type="spellStart"/>
+      <w:r>
+        <w:rPr>
+          <w:b/>
+          <w:bCs/>
+          <w:i/>
+          <w:iCs/>
+          <w:color w:val="EE0000"/>
+          <w:u w:val="single"/>
+        </w:rPr>
+        <w:t>defaut</w:t>
+      </w:r>
+      <w:proofErr w:type="spellEnd"/>
+      <w:r>
+        <w:rPr>
+          <w:b/>
+          <w:bCs/>
+          <w:i/>
+          <w:iCs/>
+          <w:color w:val="EE0000"/>
+          <w:u w:val="single"/>
+        </w:rPr>
+        <w:t> !!</w:t>
+      </w:r>
+    </w:p>
+    <w:p>
+      <w:pPr>
+        <w:jc w:val="both"/>
+        <w:rPr>
+          <w:iCs/>
+        </w:rPr>
+      </w:pPr>
+      <w:r>
+        <w:rPr>
+          <w:iCs/>
+        </w:rPr>
+        <w:t>Voici le constructeur et ses attributs qui prennent la valeur de la signature.</w:t>
+      </w:r>
+    </w:p>
+    <w:p>
+      <w:pPr>
+        <w:jc w:val="center"/>
+      </w:pPr>
+      <w:r>
+        <w:drawing>
+          <wp:inline distT="0" distB="0" distL="0" distR="0" wp14:anchorId="2C30B8A1" wp14:editId="050F040D">
+            <wp:extent cx="1857375" cy="837978"/>
+            <wp:effectExtent l="152400" t="152400" r="352425" b="362585"/>
+            <wp:docPr id="208783760" name="Image 1"/>
+            <wp:cNvGraphicFramePr>
+              <a:graphicFrameLocks xmlns:a="http://schemas.openxmlformats.org/drawingml/2006/main" noChangeAspect="1"/>
+            </wp:cNvGraphicFramePr>
+            <a:graphic xmlns:a="http://schemas.openxmlformats.org/drawingml/2006/main">
+              <a:graphicData uri="http://schemas.openxmlformats.org/drawingml/2006/picture">
+                <pic:pic xmlns:pic="http://schemas.openxmlformats.org/drawingml/2006/picture">
+                  <pic:nvPicPr>
+                    <pic:cNvPr id="208783760" name=""/>
+                    <pic:cNvPicPr/>
+                  </pic:nvPicPr>
+                  <pic:blipFill>
+                    <a:blip r:embed="rId33"/>
+                    <a:stretch>
+                      <a:fillRect/>
+                    </a:stretch>
+                  </pic:blipFill>
+                  <pic:spPr>
+                    <a:xfrm>
+                      <a:off x="0" y="0"/>
+                      <a:ext cx="1863154" cy="840585"/>
+                    </a:xfrm>
+                    <a:prstGeom prst="rect">
+                      <a:avLst/>
+                    </a:prstGeom>
+                    <a:ln>
+                      <a:noFill/>
+                    </a:ln>
+                    <a:effectLst>
+                      <a:outerShdw blurRad="292100" dist="139700" dir="2700000" algn="tl" rotWithShape="0">
+                        <a:srgbClr val="333333">
+                          <a:alpha val="65000"/>
+                        </a:srgbClr>
+                      </a:outerShdw>
+                    </a:effectLst>
+                  </pic:spPr>
+                </pic:pic>
+              </a:graphicData>
+            </a:graphic>
+          </wp:inline>
+        </w:drawing>
+      </w:r>
+    </w:p>
+    <w:p>
+      <w:pPr>
+        <w:rPr>
+          <w:b/>
+          <w:bCs/>
+          <w:i/>
+          <w:iCs/>
+          <w:u w:val="single"/>
+        </w:rPr>
+      </w:pPr>
+      <w:r>
+        <w:rPr>
+          <w:b/>
+          <w:bCs/>
+          <w:i/>
+          <w:iCs/>
+          <w:u w:val="single"/>
+        </w:rPr>
+        <w:t xml:space="preserve">Les </w:t>
+      </w:r>
+      <w:proofErr w:type="spellStart"/>
+      <w:r>
+        <w:rPr>
+          <w:b/>
+          <w:bCs/>
+          <w:i/>
+          <w:iCs/>
+          <w:u w:val="single"/>
+        </w:rPr>
+        <w:t>Methodes</w:t>
+      </w:r>
+      <w:proofErr w:type="spellEnd"/>
+    </w:p>
+    <w:p>
+      <w:r>
+        <w:t xml:space="preserve">La première méthode </w:t>
+      </w:r>
+      <w:proofErr w:type="gramStart"/>
+      <w:r>
+        <w:t>keyLeftMotion(</w:t>
+      </w:r>
+      <w:proofErr w:type="gramEnd"/>
+      <w:r>
+        <w:t xml:space="preserve">) Est une méthode qui permets que lorsqu’elle </w:t>
+      </w:r>
+      <w:proofErr w:type="gramStart"/>
+      <w:r>
+        <w:t>est</w:t>
+      </w:r>
+      <w:proofErr w:type="gramEnd"/>
+      <w:r>
+        <w:t xml:space="preserve"> appelée, le guitariste se déplace contre la gauche.</w:t>
+      </w:r>
+    </w:p>
+    <w:p>
+      <w:pPr>
+        <w:jc w:val="center"/>
+        <w:rPr>
+          <w:b/>
+          <w:bCs/>
+        </w:rPr>
+      </w:pPr>
+      <w:r>
+        <w:rPr>
+          <w:b/>
+          <w:bCs/>
+        </w:rPr>
+        <w:drawing>
+          <wp:inline distT="0" distB="0" distL="0" distR="0" wp14:anchorId="286DE167" wp14:editId="3FE62785">
+            <wp:extent cx="1236475" cy="1057275"/>
+            <wp:effectExtent l="152400" t="152400" r="363855" b="352425"/>
+            <wp:docPr id="716507270" name="Image 1"/>
+            <wp:cNvGraphicFramePr>
+              <a:graphicFrameLocks xmlns:a="http://schemas.openxmlformats.org/drawingml/2006/main" noChangeAspect="1"/>
+            </wp:cNvGraphicFramePr>
+            <a:graphic xmlns:a="http://schemas.openxmlformats.org/drawingml/2006/main">
+              <a:graphicData uri="http://schemas.openxmlformats.org/drawingml/2006/picture">
+                <pic:pic xmlns:pic="http://schemas.openxmlformats.org/drawingml/2006/picture">
+                  <pic:nvPicPr>
+                    <pic:cNvPr id="716507270" name=""/>
+                    <pic:cNvPicPr/>
+                  </pic:nvPicPr>
+                  <pic:blipFill>
+                    <a:blip r:embed="rId34"/>
+                    <a:stretch>
+                      <a:fillRect/>
+                    </a:stretch>
+                  </pic:blipFill>
+                  <pic:spPr>
+                    <a:xfrm>
+                      <a:off x="0" y="0"/>
+                      <a:ext cx="1249076" cy="1068050"/>
+                    </a:xfrm>
+                    <a:prstGeom prst="rect">
+                      <a:avLst/>
+                    </a:prstGeom>
+                    <a:ln>
+                      <a:noFill/>
+                    </a:ln>
+                    <a:effectLst>
+                      <a:outerShdw blurRad="292100" dist="139700" dir="2700000" algn="tl" rotWithShape="0">
+                        <a:srgbClr val="333333">
+                          <a:alpha val="65000"/>
+                        </a:srgbClr>
+                      </a:outerShdw>
+                    </a:effectLst>
+                  </pic:spPr>
+                </pic:pic>
+              </a:graphicData>
+            </a:graphic>
+          </wp:inline>
+        </w:drawing>
+      </w:r>
+    </w:p>
+    <w:p>
+      <w:r>
+        <w:lastRenderedPageBreak/>
+        <w:t xml:space="preserve">La </w:t>
+      </w:r>
+      <w:r>
+        <w:t>deuxième</w:t>
+      </w:r>
+      <w:r>
+        <w:t xml:space="preserve"> méthode </w:t>
+      </w:r>
+      <w:proofErr w:type="spellStart"/>
+      <w:proofErr w:type="gramStart"/>
+      <w:r>
+        <w:t>key</w:t>
+      </w:r>
+      <w:r>
+        <w:t>Right</w:t>
+      </w:r>
+      <w:r>
+        <w:t>Motion</w:t>
+      </w:r>
+      <w:proofErr w:type="spellEnd"/>
+      <w:r>
+        <w:t>(</w:t>
+      </w:r>
+      <w:proofErr w:type="gramEnd"/>
+      <w:r>
+        <w:t xml:space="preserve">) Est une méthode qui permets que lorsqu’elle </w:t>
+      </w:r>
+      <w:proofErr w:type="gramStart"/>
+      <w:r>
+        <w:t>est</w:t>
+      </w:r>
+      <w:proofErr w:type="gramEnd"/>
+      <w:r>
+        <w:t xml:space="preserve"> appelée, le guitariste se déplace contre la </w:t>
+      </w:r>
+      <w:r>
+        <w:t>droite</w:t>
+      </w:r>
+      <w:r>
+        <w:t>.</w:t>
+      </w:r>
+    </w:p>
+    <w:p>
+      <w:pPr>
+        <w:jc w:val="center"/>
+        <w:rPr>
+          <w:b/>
+          <w:bCs/>
+        </w:rPr>
+      </w:pPr>
+      <w:r>
+        <w:rPr>
+          <w:b/>
+          <w:bCs/>
+        </w:rPr>
+        <w:drawing>
+          <wp:inline distT="0" distB="0" distL="0" distR="0" wp14:anchorId="1023A5A0" wp14:editId="4CA74E06">
+            <wp:extent cx="1800225" cy="1117948"/>
+            <wp:effectExtent l="152400" t="152400" r="352425" b="368300"/>
+            <wp:docPr id="599384060" name="Image 1"/>
+            <wp:cNvGraphicFramePr>
+              <a:graphicFrameLocks xmlns:a="http://schemas.openxmlformats.org/drawingml/2006/main" noChangeAspect="1"/>
+            </wp:cNvGraphicFramePr>
+            <a:graphic xmlns:a="http://schemas.openxmlformats.org/drawingml/2006/main">
+              <a:graphicData uri="http://schemas.openxmlformats.org/drawingml/2006/picture">
+                <pic:pic xmlns:pic="http://schemas.openxmlformats.org/drawingml/2006/picture">
+                  <pic:nvPicPr>
+                    <pic:cNvPr id="599384060" name=""/>
+                    <pic:cNvPicPr/>
+                  </pic:nvPicPr>
+                  <pic:blipFill>
+                    <a:blip r:embed="rId35"/>
+                    <a:stretch>
+                      <a:fillRect/>
+                    </a:stretch>
+                  </pic:blipFill>
+                  <pic:spPr>
+                    <a:xfrm>
+                      <a:off x="0" y="0"/>
+                      <a:ext cx="1806116" cy="1121606"/>
+                    </a:xfrm>
+                    <a:prstGeom prst="rect">
+                      <a:avLst/>
+                    </a:prstGeom>
+                    <a:ln>
+                      <a:noFill/>
+                    </a:ln>
+                    <a:effectLst>
+                      <a:outerShdw blurRad="292100" dist="139700" dir="2700000" algn="tl" rotWithShape="0">
+                        <a:srgbClr val="333333">
+                          <a:alpha val="65000"/>
+                        </a:srgbClr>
+                      </a:outerShdw>
+                    </a:effectLst>
+                  </pic:spPr>
+                </pic:pic>
+              </a:graphicData>
+            </a:graphic>
+          </wp:inline>
+        </w:drawing>
+      </w:r>
+    </w:p>
     <w:sectPr>
-      <w:headerReference w:type="even" r:id="rId32"/>
-      <w:headerReference w:type="default" r:id="rId33"/>
-      <w:footerReference w:type="even" r:id="rId34"/>
-      <w:footerReference w:type="default" r:id="rId35"/>
-      <w:headerReference w:type="first" r:id="rId36"/>
-      <w:footerReference w:type="first" r:id="rId37"/>
+      <w:headerReference w:type="even" r:id="rId36"/>
+      <w:headerReference w:type="default" r:id="rId37"/>
+      <w:footerReference w:type="even" r:id="rId38"/>
+      <w:footerReference w:type="default" r:id="rId39"/>
+      <w:headerReference w:type="first" r:id="rId40"/>
+      <w:footerReference w:type="first" r:id="rId41"/>
       <w:pgSz w:w="11906" w:h="16838" w:code="9"/>
       <w:pgMar w:top="1418" w:right="1418" w:bottom="1135" w:left="1418" w:header="709" w:footer="709" w:gutter="0"/>
       <w:pgBorders w:offsetFrom="page">
@@ -4517,6 +5058,118 @@
     </w:lvl>
   </w:abstractNum>
   <w:abstractNum w:abstractNumId="2" w15:restartNumberingAfterBreak="0">
+    <w:nsid w:val="1E8E5B79"/>
+    <w:multiLevelType w:val="hybridMultilevel"/>
+    <w:tmpl w:val="8E6A1D86"/>
+    <w:lvl w:ilvl="0" w:tplc="0FB2A40A">
+      <w:numFmt w:val="bullet"/>
+      <w:lvlText w:val="-"/>
+      <w:lvlJc w:val="left"/>
+      <w:pPr>
+        <w:ind w:left="720" w:hanging="360"/>
+      </w:pPr>
+      <w:rPr>
+        <w:rFonts w:ascii="Aptos" w:eastAsiaTheme="minorHAnsi" w:hAnsi="Aptos" w:cstheme="minorBidi" w:hint="default"/>
+      </w:rPr>
+    </w:lvl>
+    <w:lvl w:ilvl="1" w:tplc="100C0003" w:tentative="1">
+      <w:start w:val="1"/>
+      <w:numFmt w:val="bullet"/>
+      <w:lvlText w:val="o"/>
+      <w:lvlJc w:val="left"/>
+      <w:pPr>
+        <w:ind w:left="1440" w:hanging="360"/>
+      </w:pPr>
+      <w:rPr>
+        <w:rFonts w:ascii="Courier New" w:hAnsi="Courier New" w:cs="Courier New" w:hint="default"/>
+      </w:rPr>
+    </w:lvl>
+    <w:lvl w:ilvl="2" w:tplc="100C0005" w:tentative="1">
+      <w:start w:val="1"/>
+      <w:numFmt w:val="bullet"/>
+      <w:lvlText w:val=""/>
+      <w:lvlJc w:val="left"/>
+      <w:pPr>
+        <w:ind w:left="2160" w:hanging="360"/>
+      </w:pPr>
+      <w:rPr>
+        <w:rFonts w:ascii="Wingdings" w:hAnsi="Wingdings" w:hint="default"/>
+      </w:rPr>
+    </w:lvl>
+    <w:lvl w:ilvl="3" w:tplc="100C0001" w:tentative="1">
+      <w:start w:val="1"/>
+      <w:numFmt w:val="bullet"/>
+      <w:lvlText w:val=""/>
+      <w:lvlJc w:val="left"/>
+      <w:pPr>
+        <w:ind w:left="2880" w:hanging="360"/>
+      </w:pPr>
+      <w:rPr>
+        <w:rFonts w:ascii="Symbol" w:hAnsi="Symbol" w:hint="default"/>
+      </w:rPr>
+    </w:lvl>
+    <w:lvl w:ilvl="4" w:tplc="100C0003" w:tentative="1">
+      <w:start w:val="1"/>
+      <w:numFmt w:val="bullet"/>
+      <w:lvlText w:val="o"/>
+      <w:lvlJc w:val="left"/>
+      <w:pPr>
+        <w:ind w:left="3600" w:hanging="360"/>
+      </w:pPr>
+      <w:rPr>
+        <w:rFonts w:ascii="Courier New" w:hAnsi="Courier New" w:cs="Courier New" w:hint="default"/>
+      </w:rPr>
+    </w:lvl>
+    <w:lvl w:ilvl="5" w:tplc="100C0005" w:tentative="1">
+      <w:start w:val="1"/>
+      <w:numFmt w:val="bullet"/>
+      <w:lvlText w:val=""/>
+      <w:lvlJc w:val="left"/>
+      <w:pPr>
+        <w:ind w:left="4320" w:hanging="360"/>
+      </w:pPr>
+      <w:rPr>
+        <w:rFonts w:ascii="Wingdings" w:hAnsi="Wingdings" w:hint="default"/>
+      </w:rPr>
+    </w:lvl>
+    <w:lvl w:ilvl="6" w:tplc="100C0001" w:tentative="1">
+      <w:start w:val="1"/>
+      <w:numFmt w:val="bullet"/>
+      <w:lvlText w:val=""/>
+      <w:lvlJc w:val="left"/>
+      <w:pPr>
+        <w:ind w:left="5040" w:hanging="360"/>
+      </w:pPr>
+      <w:rPr>
+        <w:rFonts w:ascii="Symbol" w:hAnsi="Symbol" w:hint="default"/>
+      </w:rPr>
+    </w:lvl>
+    <w:lvl w:ilvl="7" w:tplc="100C0003" w:tentative="1">
+      <w:start w:val="1"/>
+      <w:numFmt w:val="bullet"/>
+      <w:lvlText w:val="o"/>
+      <w:lvlJc w:val="left"/>
+      <w:pPr>
+        <w:ind w:left="5760" w:hanging="360"/>
+      </w:pPr>
+      <w:rPr>
+        <w:rFonts w:ascii="Courier New" w:hAnsi="Courier New" w:cs="Courier New" w:hint="default"/>
+      </w:rPr>
+    </w:lvl>
+    <w:lvl w:ilvl="8" w:tplc="100C0005" w:tentative="1">
+      <w:start w:val="1"/>
+      <w:numFmt w:val="bullet"/>
+      <w:lvlText w:val=""/>
+      <w:lvlJc w:val="left"/>
+      <w:pPr>
+        <w:ind w:left="6480" w:hanging="360"/>
+      </w:pPr>
+      <w:rPr>
+        <w:rFonts w:ascii="Wingdings" w:hAnsi="Wingdings" w:hint="default"/>
+      </w:rPr>
+    </w:lvl>
+  </w:abstractNum>
+  <w:abstractNum w:abstractNumId="3" w15:restartNumberingAfterBreak="0">
     <w:nsid w:val="24C43865"/>
     <w:multiLevelType w:val="multilevel"/>
     <w:tmpl w:val="7A0EFBEC"/>
@@ -4665,7 +5318,7 @@
       </w:rPr>
     </w:lvl>
   </w:abstractNum>
-  <w:abstractNum w:abstractNumId="3" w15:restartNumberingAfterBreak="0">
+  <w:abstractNum w:abstractNumId="4" w15:restartNumberingAfterBreak="0">
     <w:nsid w:val="3350384C"/>
     <w:multiLevelType w:val="multilevel"/>
     <w:tmpl w:val="0122BD86"/>
@@ -4814,7 +5467,7 @@
       </w:rPr>
     </w:lvl>
   </w:abstractNum>
-  <w:abstractNum w:abstractNumId="4" w15:restartNumberingAfterBreak="0">
+  <w:abstractNum w:abstractNumId="5" w15:restartNumberingAfterBreak="0">
     <w:nsid w:val="391C2491"/>
     <w:multiLevelType w:val="multilevel"/>
     <w:tmpl w:val="309C323A"/>
@@ -4963,7 +5616,7 @@
       </w:rPr>
     </w:lvl>
   </w:abstractNum>
-  <w:abstractNum w:abstractNumId="5" w15:restartNumberingAfterBreak="0">
+  <w:abstractNum w:abstractNumId="6" w15:restartNumberingAfterBreak="0">
     <w:nsid w:val="3D650D05"/>
     <w:multiLevelType w:val="multilevel"/>
     <w:tmpl w:val="083C4EFC"/>
@@ -5112,7 +5765,7 @@
       </w:rPr>
     </w:lvl>
   </w:abstractNum>
-  <w:abstractNum w:abstractNumId="6" w15:restartNumberingAfterBreak="0">
+  <w:abstractNum w:abstractNumId="7" w15:restartNumberingAfterBreak="0">
     <w:nsid w:val="45EC419D"/>
     <w:multiLevelType w:val="multilevel"/>
     <w:tmpl w:val="E98417E4"/>
@@ -5261,7 +5914,7 @@
       </w:rPr>
     </w:lvl>
   </w:abstractNum>
-  <w:abstractNum w:abstractNumId="7" w15:restartNumberingAfterBreak="0">
+  <w:abstractNum w:abstractNumId="8" w15:restartNumberingAfterBreak="0">
     <w:nsid w:val="481B691C"/>
     <w:multiLevelType w:val="multilevel"/>
     <w:tmpl w:val="083C4EFC"/>
@@ -5410,7 +6063,7 @@
       </w:rPr>
     </w:lvl>
   </w:abstractNum>
-  <w:abstractNum w:abstractNumId="8" w15:restartNumberingAfterBreak="0">
+  <w:abstractNum w:abstractNumId="9" w15:restartNumberingAfterBreak="0">
     <w:nsid w:val="48F702A3"/>
     <w:multiLevelType w:val="multilevel"/>
     <w:tmpl w:val="C324F0FE"/>
@@ -5559,7 +6212,7 @@
       </w:rPr>
     </w:lvl>
   </w:abstractNum>
-  <w:abstractNum w:abstractNumId="9" w15:restartNumberingAfterBreak="0">
+  <w:abstractNum w:abstractNumId="10" w15:restartNumberingAfterBreak="0">
     <w:nsid w:val="52BF3FE0"/>
     <w:multiLevelType w:val="multilevel"/>
     <w:tmpl w:val="64188758"/>
@@ -5708,7 +6361,7 @@
       </w:rPr>
     </w:lvl>
   </w:abstractNum>
-  <w:abstractNum w:abstractNumId="10" w15:restartNumberingAfterBreak="0">
+  <w:abstractNum w:abstractNumId="11" w15:restartNumberingAfterBreak="0">
     <w:nsid w:val="72DA7245"/>
     <w:multiLevelType w:val="multilevel"/>
     <w:tmpl w:val="083C4EFC"/>
@@ -5857,7 +6510,7 @@
       </w:rPr>
     </w:lvl>
   </w:abstractNum>
-  <w:abstractNum w:abstractNumId="11" w15:restartNumberingAfterBreak="0">
+  <w:abstractNum w:abstractNumId="12" w15:restartNumberingAfterBreak="0">
     <w:nsid w:val="7E6076AF"/>
     <w:multiLevelType w:val="multilevel"/>
     <w:tmpl w:val="E304AC48"/>
@@ -6007,40 +6660,43 @@
     </w:lvl>
   </w:abstractNum>
   <w:num w:numId="1" w16cid:durableId="1164856901">
-    <w:abstractNumId w:val="10"/>
+    <w:abstractNumId w:val="11"/>
   </w:num>
   <w:num w:numId="2" w16cid:durableId="954138969">
-    <w:abstractNumId w:val="5"/>
+    <w:abstractNumId w:val="6"/>
   </w:num>
   <w:num w:numId="3" w16cid:durableId="360785773">
-    <w:abstractNumId w:val="7"/>
+    <w:abstractNumId w:val="8"/>
   </w:num>
   <w:num w:numId="4" w16cid:durableId="475995999">
     <w:abstractNumId w:val="1"/>
   </w:num>
   <w:num w:numId="5" w16cid:durableId="604581854">
-    <w:abstractNumId w:val="2"/>
+    <w:abstractNumId w:val="3"/>
   </w:num>
   <w:num w:numId="6" w16cid:durableId="768546798">
-    <w:abstractNumId w:val="3"/>
+    <w:abstractNumId w:val="4"/>
   </w:num>
   <w:num w:numId="7" w16cid:durableId="2016566837">
-    <w:abstractNumId w:val="6"/>
+    <w:abstractNumId w:val="7"/>
   </w:num>
   <w:num w:numId="8" w16cid:durableId="460804995">
-    <w:abstractNumId w:val="4"/>
+    <w:abstractNumId w:val="5"/>
   </w:num>
   <w:num w:numId="9" w16cid:durableId="1900898499">
+    <w:abstractNumId w:val="10"/>
+  </w:num>
+  <w:num w:numId="10" w16cid:durableId="2044281111">
     <w:abstractNumId w:val="9"/>
   </w:num>
-  <w:num w:numId="10" w16cid:durableId="2044281111">
-    <w:abstractNumId w:val="8"/>
-  </w:num>
   <w:num w:numId="11" w16cid:durableId="1848061187">
-    <w:abstractNumId w:val="11"/>
+    <w:abstractNumId w:val="12"/>
   </w:num>
   <w:num w:numId="12" w16cid:durableId="111218174">
     <w:abstractNumId w:val="0"/>
+  </w:num>
+  <w:num w:numId="13" w16cid:durableId="841745497">
+    <w:abstractNumId w:val="2"/>
   </w:num>
 </w:numbering>
 </file>
@@ -6445,6 +7101,7 @@
   <w:style w:type="paragraph" w:default="1" w:styleId="Normal">
     <w:name w:val="Normal"/>
     <w:qFormat/>
+    <w:rsid w:val="002E1B37"/>
   </w:style>
   <w:style w:type="paragraph" w:styleId="Titre1">
     <w:name w:val="heading 1"/>
@@ -6646,6 +7303,7 @@
   <w:style w:type="character" w:default="1" w:styleId="Policepardfaut">
     <w:name w:val="Default Paragraph Font"/>
     <w:uiPriority w:val="1"/>
+    <w:semiHidden/>
     <w:unhideWhenUsed/>
   </w:style>
   <w:style w:type="table" w:default="1" w:styleId="TableauNormal">

</xml_diff>

<commit_message>
doc(Rapport): Description des classes & arrangement visuel
[40][WIP]
</commit_message>
<xml_diff>
--- a/DOC/RAPPORT PROJET.docx
+++ b/DOC/RAPPORT PROJET.docx
@@ -1,6 +1,6 @@
 
 <file path=word/document.xml><?xml version="1.0" encoding="utf-8"?>
-<w:document xmlns:wpc="http://schemas.microsoft.com/office/word/2010/wordprocessingCanvas" xmlns:cx="http://schemas.microsoft.com/office/drawing/2014/chartex" xmlns:cx1="http://schemas.microsoft.com/office/drawing/2015/9/8/chartex" xmlns:cx2="http://schemas.microsoft.com/office/drawing/2015/10/21/chartex" xmlns:cx3="http://schemas.microsoft.com/office/drawing/2016/5/9/chartex" xmlns:cx4="http://schemas.microsoft.com/office/drawing/2016/5/10/chartex" xmlns:cx5="http://schemas.microsoft.com/office/drawing/2016/5/11/chartex" xmlns:cx6="http://schemas.microsoft.com/office/drawing/2016/5/12/chartex" xmlns:cx7="http://schemas.microsoft.com/office/drawing/2016/5/13/chartex" xmlns:cx8="http://schemas.microsoft.com/office/drawing/2016/5/14/chartex" xmlns:mc="http://schemas.openxmlformats.org/markup-compatibility/2006" xmlns:aink="http://schemas.microsoft.com/office/drawing/2016/ink" xmlns:am3d="http://schemas.microsoft.com/office/drawing/2017/model3d" xmlns:o="urn:schemas-microsoft-com:office:office" xmlns:oel="http://schemas.microsoft.com/office/2019/extlst" xmlns:r="http://schemas.openxmlformats.org/officeDocument/2006/relationships" xmlns:m="http://schemas.openxmlformats.org/officeDocument/2006/math" xmlns:v="urn:schemas-microsoft-com:vml" xmlns:wp14="http://schemas.microsoft.com/office/word/2010/wordprocessingDrawing" xmlns:wp="http://schemas.openxmlformats.org/drawingml/2006/wordprocessingDrawing" xmlns:w10="urn:schemas-microsoft-com:office:word" xmlns:w="http://schemas.openxmlformats.org/wordprocessingml/2006/main" xmlns:w14="http://schemas.microsoft.com/office/word/2010/wordml" xmlns:w15="http://schemas.microsoft.com/office/word/2012/wordml" xmlns:w16cex="http://schemas.microsoft.com/office/word/2018/wordml/cex" xmlns:w16cid="http://schemas.microsoft.com/office/word/2016/wordml/cid" xmlns:w16="http://schemas.microsoft.com/office/word/2018/wordml" xmlns:w16du="http://schemas.microsoft.com/office/word/2023/wordml/word16du" xmlns:w16sdtdh="http://schemas.microsoft.com/office/word/2020/wordml/sdtdatahash" xmlns:w16sdtfl="http://schemas.microsoft.com/office/word/2024/wordml/sdtformatlock" xmlns:w16se="http://schemas.microsoft.com/office/word/2015/wordml/symex" xmlns:wpg="http://schemas.microsoft.com/office/word/2010/wordprocessingGroup" xmlns:wpi="http://schemas.microsoft.com/office/word/2010/wordprocessingInk" xmlns:wne="http://schemas.microsoft.com/office/word/2006/wordml" xmlns:wps="http://schemas.microsoft.com/office/word/2010/wordprocessingShape" mc:Ignorable="w14 w15 w16se w16cid w16 w16cex w16sdtdh w16sdtfl w16du wp14">
+<w:document xmlns:wpc="http://schemas.microsoft.com/office/word/2010/wordprocessingCanvas" xmlns:cx="http://schemas.microsoft.com/office/drawing/2014/chartex" xmlns:cx1="http://schemas.microsoft.com/office/drawing/2015/9/8/chartex" xmlns:cx2="http://schemas.microsoft.com/office/drawing/2015/10/21/chartex" xmlns:cx3="http://schemas.microsoft.com/office/drawing/2016/5/9/chartex" xmlns:cx4="http://schemas.microsoft.com/office/drawing/2016/5/10/chartex" xmlns:cx5="http://schemas.microsoft.com/office/drawing/2016/5/11/chartex" xmlns:cx6="http://schemas.microsoft.com/office/drawing/2016/5/12/chartex" xmlns:cx7="http://schemas.microsoft.com/office/drawing/2016/5/13/chartex" xmlns:cx8="http://schemas.microsoft.com/office/drawing/2016/5/14/chartex" xmlns:mc="http://schemas.openxmlformats.org/markup-compatibility/2006" xmlns:aink="http://schemas.microsoft.com/office/drawing/2016/ink" xmlns:am3d="http://schemas.microsoft.com/office/drawing/2017/model3d" xmlns:o="urn:schemas-microsoft-com:office:office" xmlns:oel="http://schemas.microsoft.com/office/2019/extlst" xmlns:r="http://schemas.openxmlformats.org/officeDocument/2006/relationships" xmlns:m="http://schemas.openxmlformats.org/officeDocument/2006/math" xmlns:v="urn:schemas-microsoft-com:vml" xmlns:wp14="http://schemas.microsoft.com/office/word/2010/wordprocessingDrawing" xmlns:wp="http://schemas.openxmlformats.org/drawingml/2006/wordprocessingDrawing" xmlns:w10="urn:schemas-microsoft-com:office:word" xmlns:w="http://schemas.openxmlformats.org/wordprocessingml/2006/main" xmlns:w14="http://schemas.microsoft.com/office/word/2010/wordml" xmlns:w15="http://schemas.microsoft.com/office/word/2012/wordml" xmlns:w16cex="http://schemas.microsoft.com/office/word/2018/wordml/cex" xmlns:w16cid="http://schemas.microsoft.com/office/word/2016/wordml/cid" xmlns:w16="http://schemas.microsoft.com/office/word/2018/wordml" xmlns:w16du="http://schemas.microsoft.com/office/word/2023/wordml/word16du" xmlns:w16sdtdh="http://schemas.microsoft.com/office/word/2020/wordml/sdtdatahash" xmlns:w16se="http://schemas.microsoft.com/office/word/2015/wordml/symex" xmlns:wpg="http://schemas.microsoft.com/office/word/2010/wordprocessingGroup" xmlns:wpi="http://schemas.microsoft.com/office/word/2010/wordprocessingInk" xmlns:wne="http://schemas.microsoft.com/office/word/2006/wordml" xmlns:wps="http://schemas.microsoft.com/office/word/2010/wordprocessingShape" mc:Ignorable="w14 w15 w16se w16cid w16 w16cex w16sdtdh wp14">
   <w:body>
     <w:p>
       <w:pPr>
@@ -433,7 +433,7 @@
                 <w:noProof/>
                 <w:webHidden/>
               </w:rPr>
-              <w:t>3</w:t>
+              <w:t>4</w:t>
             </w:r>
             <w:r>
               <w:rPr>
@@ -503,7 +503,7 @@
                 <w:noProof/>
                 <w:webHidden/>
               </w:rPr>
-              <w:t>3</w:t>
+              <w:t>4</w:t>
             </w:r>
             <w:r>
               <w:rPr>
@@ -573,7 +573,7 @@
                 <w:noProof/>
                 <w:webHidden/>
               </w:rPr>
-              <w:t>3</w:t>
+              <w:t>4</w:t>
             </w:r>
             <w:r>
               <w:rPr>
@@ -713,7 +713,7 @@
                 <w:noProof/>
                 <w:webHidden/>
               </w:rPr>
-              <w:t>4</w:t>
+              <w:t>5</w:t>
             </w:r>
             <w:r>
               <w:rPr>
@@ -853,7 +853,7 @@
                 <w:noProof/>
                 <w:webHidden/>
               </w:rPr>
-              <w:t>5</w:t>
+              <w:t>6</w:t>
             </w:r>
             <w:r>
               <w:rPr>
@@ -993,7 +993,7 @@
                 <w:noProof/>
                 <w:webHidden/>
               </w:rPr>
-              <w:t>6</w:t>
+              <w:t>7</w:t>
             </w:r>
             <w:r>
               <w:rPr>
@@ -1133,7 +1133,7 @@
                 <w:noProof/>
                 <w:webHidden/>
               </w:rPr>
-              <w:t>7</w:t>
+              <w:t>8</w:t>
             </w:r>
             <w:r>
               <w:rPr>
@@ -1273,7 +1273,7 @@
                 <w:noProof/>
                 <w:webHidden/>
               </w:rPr>
-              <w:t>8</w:t>
+              <w:t>9</w:t>
             </w:r>
             <w:r>
               <w:rPr>
@@ -1343,7 +1343,7 @@
                 <w:noProof/>
                 <w:webHidden/>
               </w:rPr>
-              <w:t>10</w:t>
+              <w:t>9</w:t>
             </w:r>
             <w:r>
               <w:rPr>
@@ -1413,7 +1413,7 @@
                 <w:noProof/>
                 <w:webHidden/>
               </w:rPr>
-              <w:t>10</w:t>
+              <w:t>9</w:t>
             </w:r>
             <w:r>
               <w:rPr>
@@ -1483,7 +1483,7 @@
                 <w:noProof/>
                 <w:webHidden/>
               </w:rPr>
-              <w:t>10</w:t>
+              <w:t>9</w:t>
             </w:r>
             <w:r>
               <w:rPr>
@@ -1553,7 +1553,7 @@
                 <w:noProof/>
                 <w:webHidden/>
               </w:rPr>
-              <w:t>10</w:t>
+              <w:t>9</w:t>
             </w:r>
             <w:r>
               <w:rPr>
@@ -1624,7 +1624,7 @@
                 <w:noProof/>
                 <w:webHidden/>
               </w:rPr>
-              <w:t>10</w:t>
+              <w:t>9</w:t>
             </w:r>
             <w:r>
               <w:rPr>
@@ -1695,7 +1695,7 @@
                 <w:noProof/>
                 <w:webHidden/>
               </w:rPr>
-              <w:t>10</w:t>
+              <w:t>9</w:t>
             </w:r>
             <w:r>
               <w:rPr>
@@ -1765,7 +1765,7 @@
                 <w:noProof/>
                 <w:webHidden/>
               </w:rPr>
-              <w:t>10</w:t>
+              <w:t>9</w:t>
             </w:r>
             <w:r>
               <w:rPr>
@@ -1835,7 +1835,7 @@
                 <w:noProof/>
                 <w:webHidden/>
               </w:rPr>
-              <w:t>10</w:t>
+              <w:t>9</w:t>
             </w:r>
             <w:r>
               <w:rPr>
@@ -1905,7 +1905,7 @@
                 <w:noProof/>
                 <w:webHidden/>
               </w:rPr>
-              <w:t>10</w:t>
+              <w:t>9</w:t>
             </w:r>
             <w:r>
               <w:rPr>
@@ -2135,15 +2135,7 @@
       </w:r>
       <w:proofErr w:type="gramEnd"/>
       <w:r>
-        <w:t xml:space="preserve"> de </w:t>
-      </w:r>
-      <w:proofErr w:type="gramStart"/>
-      <w:r>
-        <w:t>concert )</w:t>
-      </w:r>
-      <w:proofErr w:type="gramEnd"/>
-      <w:r>
-        <w:t xml:space="preserve"> afin d'apporter une ambiance au jeu et d'immerger totalement le joueur dans le thème.</w:t>
+        <w:t xml:space="preserve"> de concert ) afin d'apporter une ambiance au jeu et d'immerger totalement le joueur dans le thème.</w:t>
       </w:r>
     </w:p>
     <w:p>
@@ -2155,9 +2147,9 @@
           <w:noProof/>
         </w:rPr>
         <w:drawing>
-          <wp:inline distT="0" distB="0" distL="0" distR="0" wp14:anchorId="5627E9D7" wp14:editId="51B86670">
+          <wp:inline distT="0" distB="0" distL="0" distR="0" wp14:anchorId="5627E9D7" wp14:editId="5EB71805">
             <wp:extent cx="1674420" cy="1115788"/>
-            <wp:effectExtent l="0" t="0" r="2540" b="8255"/>
+            <wp:effectExtent l="152400" t="152400" r="364490" b="370205"/>
             <wp:docPr id="429649636" name="Image 5" descr="Image">
               <a:hlinkClick xmlns:a="http://schemas.openxmlformats.org/drawingml/2006/main" r:id="rId10" tgtFrame="&quot;_blank&quot;"/>
             </wp:docPr>
@@ -2196,10 +2188,16 @@
                     <a:prstGeom prst="rect">
                       <a:avLst/>
                     </a:prstGeom>
-                    <a:noFill/>
                     <a:ln>
                       <a:noFill/>
                     </a:ln>
+                    <a:effectLst>
+                      <a:outerShdw blurRad="292100" dist="139700" dir="2700000" algn="tl" rotWithShape="0">
+                        <a:srgbClr val="333333">
+                          <a:alpha val="65000"/>
+                        </a:srgbClr>
+                      </a:outerShdw>
+                    </a:effectLst>
                   </pic:spPr>
                 </pic:pic>
               </a:graphicData>
@@ -2246,45 +2244,40 @@
       </w:r>
       <w:proofErr w:type="gramEnd"/>
       <w:r>
-        <w:t xml:space="preserve"> l'écran </w:t>
+        <w:t xml:space="preserve"> l'écran parfaitement )</w:t>
+      </w:r>
+    </w:p>
+    <w:p>
+      <w:pPr>
+        <w:pStyle w:val="Titre3"/>
+      </w:pPr>
+      <w:bookmarkStart w:id="6" w:name="_Toc241435682"/>
+      <w:r>
+        <w:t xml:space="preserve">US02 </w:t>
       </w:r>
       <w:proofErr w:type="gramStart"/>
       <w:r>
-        <w:t>parfaitement )</w:t>
+        <w:t xml:space="preserve">- </w:t>
+      </w:r>
+      <w:r>
+        <w:t> Affichage</w:t>
       </w:r>
       <w:proofErr w:type="gramEnd"/>
-    </w:p>
-    <w:p>
-      <w:pPr>
-        <w:pStyle w:val="Titre3"/>
-      </w:pPr>
-      <w:bookmarkStart w:id="6" w:name="_Toc241435682"/>
-      <w:r>
-        <w:t xml:space="preserve">US02 </w:t>
+      <w:r>
+        <w:t xml:space="preserve"> et déplacement du joueur</w:t>
+      </w:r>
+      <w:bookmarkEnd w:id="6"/>
+    </w:p>
+    <w:p>
+      <w:r>
+        <w:t xml:space="preserve">En tant que développeur je souhaite faire apparaitre </w:t>
       </w:r>
       <w:proofErr w:type="gramStart"/>
       <w:r>
-        <w:t xml:space="preserve">- </w:t>
-      </w:r>
-      <w:r>
-        <w:t> Affichage</w:t>
+        <w:t>le joueur principale</w:t>
       </w:r>
       <w:proofErr w:type="gramEnd"/>
       <w:r>
-        <w:t xml:space="preserve"> et déplacement du joueur</w:t>
-      </w:r>
-      <w:bookmarkEnd w:id="6"/>
-    </w:p>
-    <w:p>
-      <w:r>
-        <w:t xml:space="preserve">En tant que développeur je souhaite faire apparaitre </w:t>
-      </w:r>
-      <w:proofErr w:type="gramStart"/>
-      <w:r>
-        <w:t>le joueur principale</w:t>
-      </w:r>
-      <w:proofErr w:type="gramEnd"/>
-      <w:r>
         <w:t xml:space="preserve"> afin de pouvoir </w:t>
       </w:r>
       <w:proofErr w:type="spellStart"/>
@@ -2305,9 +2298,9 @@
           <w:noProof/>
         </w:rPr>
         <w:drawing>
-          <wp:inline distT="0" distB="0" distL="0" distR="0" wp14:anchorId="3527E578" wp14:editId="5D390D5C">
+          <wp:inline distT="0" distB="0" distL="0" distR="0" wp14:anchorId="3527E578" wp14:editId="49405B89">
             <wp:extent cx="2523884" cy="1686297"/>
-            <wp:effectExtent l="0" t="0" r="0" b="9525"/>
+            <wp:effectExtent l="152400" t="152400" r="353060" b="371475"/>
             <wp:docPr id="271072079" name="Image 7" descr="Image">
               <a:hlinkClick xmlns:a="http://schemas.openxmlformats.org/drawingml/2006/main" r:id="rId12" tgtFrame="&quot;_blank&quot;"/>
             </wp:docPr>
@@ -2346,10 +2339,16 @@
                     <a:prstGeom prst="rect">
                       <a:avLst/>
                     </a:prstGeom>
-                    <a:noFill/>
                     <a:ln>
                       <a:noFill/>
                     </a:ln>
+                    <a:effectLst>
+                      <a:outerShdw blurRad="292100" dist="139700" dir="2700000" algn="tl" rotWithShape="0">
+                        <a:srgbClr val="333333">
+                          <a:alpha val="65000"/>
+                        </a:srgbClr>
+                      </a:outerShdw>
+                    </a:effectLst>
                   </pic:spPr>
                 </pic:pic>
               </a:graphicData>
@@ -2423,11 +2422,6 @@
       <w:proofErr w:type="gramEnd"/>
       <w:r>
         <w:t xml:space="preserve"> joueur doit avoir une taille convenable</w:t>
-      </w:r>
-    </w:p>
-    <w:p>
-      <w:r>
-        <w:br w:type="page"/>
       </w:r>
     </w:p>
     <w:p>
@@ -2883,15 +2877,7 @@
       </w:r>
       <w:proofErr w:type="gramEnd"/>
       <w:r>
-        <w:t xml:space="preserve"> munitions </w:t>
-      </w:r>
-      <w:proofErr w:type="gramStart"/>
-      <w:r>
-        <w:t>affiche</w:t>
-      </w:r>
-      <w:proofErr w:type="gramEnd"/>
-      <w:r>
-        <w:t xml:space="preserve"> différents accords.</w:t>
+        <w:t xml:space="preserve"> munitions affiche différents accords.</w:t>
       </w:r>
     </w:p>
     <w:p>
@@ -3095,15 +3081,7 @@
       </w:r>
       <w:proofErr w:type="gramEnd"/>
       <w:r>
-        <w:t xml:space="preserve"> aussi le pouvoir d'éliminer </w:t>
-      </w:r>
-      <w:proofErr w:type="gramStart"/>
-      <w:r>
-        <w:t>le joueur principale</w:t>
-      </w:r>
-      <w:proofErr w:type="gramEnd"/>
-      <w:r>
-        <w:t xml:space="preserve"> afin de rajouter de la difficulté pour le joueur principale.</w:t>
+        <w:t xml:space="preserve"> aussi le pouvoir d'éliminer le joueur principale afin de rajouter de la difficulté pour le joueur principale.</w:t>
       </w:r>
     </w:p>
     <w:p>
@@ -3457,15 +3435,7 @@
       </w:r>
       <w:proofErr w:type="gramEnd"/>
       <w:r>
-        <w:t xml:space="preserve"> obstacles perdent la moitié de leur vie au contact d'un ennemi et le tiers si c'est une de </w:t>
-      </w:r>
-      <w:proofErr w:type="gramStart"/>
-      <w:r>
-        <w:t>leur munitions</w:t>
-      </w:r>
-      <w:proofErr w:type="gramEnd"/>
-      <w:r>
-        <w:t>.</w:t>
+        <w:t xml:space="preserve"> obstacles perdent la moitié de leur vie au contact d'un ennemi et le tiers si c'est une de leur munitions.</w:t>
       </w:r>
     </w:p>
     <w:p>
@@ -4047,12 +4017,17 @@
     <w:p>
       <w:pPr>
         <w:pStyle w:val="Titre3"/>
-      </w:pPr>
-      <w:r>
-        <w:t>J</w:t>
-      </w:r>
-      <w:r>
-        <w:t>oueur principale</w:t>
+        <w:rPr>
+          <w:b/>
+          <w:bCs/>
+        </w:rPr>
+      </w:pPr>
+      <w:r>
+        <w:rPr>
+          <w:b/>
+          <w:bCs/>
+        </w:rPr>
+        <w:t>Joueur principale</w:t>
       </w:r>
     </w:p>
     <w:p>
@@ -4081,6 +4056,9 @@
         <w:jc w:val="center"/>
       </w:pPr>
       <w:r>
+        <w:rPr>
+          <w:noProof/>
+        </w:rPr>
         <w:drawing>
           <wp:inline distT="0" distB="0" distL="0" distR="0" wp14:anchorId="5D1F291F" wp14:editId="6A623572">
             <wp:extent cx="1609705" cy="628642"/>
@@ -4214,6 +4192,9 @@
         <w:jc w:val="center"/>
       </w:pPr>
       <w:r>
+        <w:rPr>
+          <w:noProof/>
+        </w:rPr>
         <w:drawing>
           <wp:inline distT="0" distB="0" distL="0" distR="0" wp14:anchorId="2C30B8A1" wp14:editId="050F040D">
             <wp:extent cx="1857375" cy="837978"/>
@@ -4304,15 +4285,7 @@
       </w:r>
       <w:proofErr w:type="gramEnd"/>
       <w:r>
-        <w:t xml:space="preserve">) Est une méthode qui permets que lorsqu’elle </w:t>
-      </w:r>
-      <w:proofErr w:type="gramStart"/>
-      <w:r>
-        <w:t>est</w:t>
-      </w:r>
-      <w:proofErr w:type="gramEnd"/>
-      <w:r>
-        <w:t xml:space="preserve"> appelée, le guitariste se déplace contre la gauche.</w:t>
+        <w:t>) Est une méthode qui permets que lorsqu’elle est appelée, le guitariste se déplace contre la gauche.</w:t>
       </w:r>
     </w:p>
     <w:p>
@@ -4327,6 +4300,7 @@
         <w:rPr>
           <w:b/>
           <w:bCs/>
+          <w:noProof/>
         </w:rPr>
         <w:drawing>
           <wp:inline distT="0" distB="0" distL="0" distR="0" wp14:anchorId="286DE167" wp14:editId="3FE62785">
@@ -4378,24 +4352,12 @@
     <w:p>
       <w:r>
         <w:lastRenderedPageBreak/>
-        <w:t xml:space="preserve">La </w:t>
-      </w:r>
-      <w:r>
-        <w:t>deuxième</w:t>
-      </w:r>
-      <w:r>
-        <w:t xml:space="preserve"> méthode </w:t>
+        <w:t xml:space="preserve">La deuxième méthode </w:t>
       </w:r>
       <w:proofErr w:type="spellStart"/>
       <w:proofErr w:type="gramStart"/>
       <w:r>
-        <w:t>key</w:t>
-      </w:r>
-      <w:r>
-        <w:t>Right</w:t>
-      </w:r>
-      <w:r>
-        <w:t>Motion</w:t>
+        <w:t>keyRightMotion</w:t>
       </w:r>
       <w:proofErr w:type="spellEnd"/>
       <w:r>
@@ -4403,21 +4365,7 @@
       </w:r>
       <w:proofErr w:type="gramEnd"/>
       <w:r>
-        <w:t xml:space="preserve">) Est une méthode qui permets que lorsqu’elle </w:t>
-      </w:r>
-      <w:proofErr w:type="gramStart"/>
-      <w:r>
-        <w:t>est</w:t>
-      </w:r>
-      <w:proofErr w:type="gramEnd"/>
-      <w:r>
-        <w:t xml:space="preserve"> appelée, le guitariste se déplace contre la </w:t>
-      </w:r>
-      <w:r>
-        <w:t>droite</w:t>
-      </w:r>
-      <w:r>
-        <w:t>.</w:t>
+        <w:t>) Est une méthode qui permets que lorsqu’elle est appelée, le guitariste se déplace contre la droite.</w:t>
       </w:r>
     </w:p>
     <w:p>
@@ -4432,6 +4380,7 @@
         <w:rPr>
           <w:b/>
           <w:bCs/>
+          <w:noProof/>
         </w:rPr>
         <w:drawing>
           <wp:inline distT="0" distB="0" distL="0" distR="0" wp14:anchorId="1023A5A0" wp14:editId="4CA74E06">
@@ -4480,13 +4429,925 @@
         </w:drawing>
       </w:r>
     </w:p>
+    <w:p>
+      <w:r>
+        <w:t xml:space="preserve">La troisième méthode est </w:t>
+      </w:r>
+      <w:proofErr w:type="spellStart"/>
+      <w:proofErr w:type="gramStart"/>
+      <w:r>
+        <w:t>Render</w:t>
+      </w:r>
+      <w:proofErr w:type="spellEnd"/>
+      <w:r>
+        <w:t>(</w:t>
+      </w:r>
+      <w:proofErr w:type="gramEnd"/>
+      <w:r>
+        <w:t xml:space="preserve">). Elle sert à ce que lorsqu’on l’appelle ça dessine le guitariste à un emplacement précis dans le </w:t>
+      </w:r>
+      <w:proofErr w:type="spellStart"/>
+      <w:r>
+        <w:t>airspace</w:t>
+      </w:r>
+      <w:proofErr w:type="spellEnd"/>
+      <w:r>
+        <w:t>.</w:t>
+      </w:r>
+    </w:p>
+    <w:p>
+      <w:pPr>
+        <w:jc w:val="center"/>
+      </w:pPr>
+      <w:r>
+        <w:drawing>
+          <wp:inline distT="0" distB="0" distL="0" distR="0" wp14:anchorId="26816061" wp14:editId="1B68076B">
+            <wp:extent cx="3924527" cy="816437"/>
+            <wp:effectExtent l="152400" t="152400" r="361950" b="365125"/>
+            <wp:docPr id="161119753" name="Image 1" descr="Une image contenant texte, capture d’écran, Police&#10;&#10;Description générée automatiquement"/>
+            <wp:cNvGraphicFramePr>
+              <a:graphicFrameLocks xmlns:a="http://schemas.openxmlformats.org/drawingml/2006/main" noChangeAspect="1"/>
+            </wp:cNvGraphicFramePr>
+            <a:graphic xmlns:a="http://schemas.openxmlformats.org/drawingml/2006/main">
+              <a:graphicData uri="http://schemas.openxmlformats.org/drawingml/2006/picture">
+                <pic:pic xmlns:pic="http://schemas.openxmlformats.org/drawingml/2006/picture">
+                  <pic:nvPicPr>
+                    <pic:cNvPr id="161119753" name="Image 1" descr="Une image contenant texte, capture d’écran, Police&#10;&#10;Description générée automatiquement"/>
+                    <pic:cNvPicPr/>
+                  </pic:nvPicPr>
+                  <pic:blipFill>
+                    <a:blip r:embed="rId36"/>
+                    <a:stretch>
+                      <a:fillRect/>
+                    </a:stretch>
+                  </pic:blipFill>
+                  <pic:spPr>
+                    <a:xfrm>
+                      <a:off x="0" y="0"/>
+                      <a:ext cx="3976336" cy="827215"/>
+                    </a:xfrm>
+                    <a:prstGeom prst="rect">
+                      <a:avLst/>
+                    </a:prstGeom>
+                    <a:ln>
+                      <a:noFill/>
+                    </a:ln>
+                    <a:effectLst>
+                      <a:outerShdw blurRad="292100" dist="139700" dir="2700000" algn="tl" rotWithShape="0">
+                        <a:srgbClr val="333333">
+                          <a:alpha val="65000"/>
+                        </a:srgbClr>
+                      </a:outerShdw>
+                    </a:effectLst>
+                  </pic:spPr>
+                </pic:pic>
+              </a:graphicData>
+            </a:graphic>
+          </wp:inline>
+        </w:drawing>
+      </w:r>
+    </w:p>
+    <w:p>
+      <w:pPr>
+        <w:pStyle w:val="Titre3"/>
+        <w:rPr>
+          <w:b/>
+          <w:bCs/>
+        </w:rPr>
+      </w:pPr>
+      <w:r>
+        <w:rPr>
+          <w:b/>
+          <w:bCs/>
+        </w:rPr>
+        <w:t>Ennemis</w:t>
+      </w:r>
+    </w:p>
+    <w:p>
+      <w:pPr>
+        <w:rPr>
+          <w:b/>
+          <w:bCs/>
+          <w:i/>
+          <w:iCs/>
+        </w:rPr>
+      </w:pPr>
+      <w:r>
+        <w:rPr>
+          <w:b/>
+          <w:bCs/>
+          <w:i/>
+          <w:iCs/>
+          <w:u w:val="single"/>
+        </w:rPr>
+        <w:t>Attributs :</w:t>
+      </w:r>
+    </w:p>
+    <w:p>
+      <w:pPr>
+        <w:rPr>
+          <w:i/>
+          <w:iCs/>
+          <w:color w:val="FF0000"/>
+          <w:u w:val="single"/>
+        </w:rPr>
+      </w:pPr>
+      <w:r>
+        <w:rPr>
+          <w:i/>
+          <w:iCs/>
+          <w:color w:val="FF0000"/>
+          <w:u w:val="single"/>
+        </w:rPr>
+        <w:t>IL Y’A BEAUCOUP DE RANDOMS QUI VONT ETRE R</w:t>
+      </w:r>
+      <w:r>
+        <w:rPr>
+          <w:i/>
+          <w:iCs/>
+          <w:color w:val="FF0000"/>
+          <w:u w:val="single"/>
+        </w:rPr>
+        <w:t>EMP</w:t>
+      </w:r>
+      <w:r>
+        <w:rPr>
+          <w:i/>
+          <w:iCs/>
+          <w:color w:val="FF0000"/>
+          <w:u w:val="single"/>
+        </w:rPr>
+        <w:t>L</w:t>
+      </w:r>
+      <w:r>
+        <w:rPr>
+          <w:i/>
+          <w:iCs/>
+          <w:color w:val="FF0000"/>
+          <w:u w:val="single"/>
+        </w:rPr>
+        <w:t>AC</w:t>
+      </w:r>
+      <w:r>
+        <w:rPr>
+          <w:i/>
+          <w:iCs/>
+          <w:color w:val="FF0000"/>
+          <w:u w:val="single"/>
+        </w:rPr>
+        <w:t xml:space="preserve">ER </w:t>
+      </w:r>
+      <w:r>
+        <w:rPr>
+          <w:i/>
+          <w:iCs/>
+          <w:color w:val="FF0000"/>
+          <w:u w:val="single"/>
+        </w:rPr>
+        <w:t xml:space="preserve">PROCHAINEMENT </w:t>
+      </w:r>
+      <w:r>
+        <w:rPr>
+          <w:i/>
+          <w:iCs/>
+          <w:color w:val="FF0000"/>
+          <w:u w:val="single"/>
+        </w:rPr>
+        <w:t>EN UN RANDOM DANS UN FICHIER CONFIG.CS</w:t>
+      </w:r>
+      <w:r>
+        <w:rPr>
+          <w:i/>
+          <w:iCs/>
+          <w:color w:val="FF0000"/>
+          <w:u w:val="single"/>
+        </w:rPr>
+        <w:t>.</w:t>
+      </w:r>
+    </w:p>
+    <w:p>
+      <w:r>
+        <w:t>Nous avons :</w:t>
+      </w:r>
+    </w:p>
+    <w:p>
+      <w:pPr>
+        <w:jc w:val="center"/>
+      </w:pPr>
+      <w:r>
+        <w:drawing>
+          <wp:inline distT="0" distB="0" distL="0" distR="0" wp14:anchorId="7CD356DD" wp14:editId="6A6F9171">
+            <wp:extent cx="1964552" cy="1936326"/>
+            <wp:effectExtent l="152400" t="152400" r="360045" b="368935"/>
+            <wp:docPr id="376218113" name="Image 1" descr="Une image contenant texte, capture d’écran, Police&#10;&#10;Description générée automatiquement"/>
+            <wp:cNvGraphicFramePr>
+              <a:graphicFrameLocks xmlns:a="http://schemas.openxmlformats.org/drawingml/2006/main" noChangeAspect="1"/>
+            </wp:cNvGraphicFramePr>
+            <a:graphic xmlns:a="http://schemas.openxmlformats.org/drawingml/2006/main">
+              <a:graphicData uri="http://schemas.openxmlformats.org/drawingml/2006/picture">
+                <pic:pic xmlns:pic="http://schemas.openxmlformats.org/drawingml/2006/picture">
+                  <pic:nvPicPr>
+                    <pic:cNvPr id="376218113" name="Image 1" descr="Une image contenant texte, capture d’écran, Police&#10;&#10;Description générée automatiquement"/>
+                    <pic:cNvPicPr/>
+                  </pic:nvPicPr>
+                  <pic:blipFill>
+                    <a:blip r:embed="rId37"/>
+                    <a:stretch>
+                      <a:fillRect/>
+                    </a:stretch>
+                  </pic:blipFill>
+                  <pic:spPr>
+                    <a:xfrm>
+                      <a:off x="0" y="0"/>
+                      <a:ext cx="1967163" cy="1938899"/>
+                    </a:xfrm>
+                    <a:prstGeom prst="rect">
+                      <a:avLst/>
+                    </a:prstGeom>
+                    <a:ln>
+                      <a:noFill/>
+                    </a:ln>
+                    <a:effectLst>
+                      <a:outerShdw blurRad="292100" dist="139700" dir="2700000" algn="tl" rotWithShape="0">
+                        <a:srgbClr val="333333">
+                          <a:alpha val="65000"/>
+                        </a:srgbClr>
+                      </a:outerShdw>
+                    </a:effectLst>
+                  </pic:spPr>
+                </pic:pic>
+              </a:graphicData>
+            </a:graphic>
+          </wp:inline>
+        </w:drawing>
+      </w:r>
+    </w:p>
+    <w:p>
+      <w:proofErr w:type="spellStart"/>
+      <w:proofErr w:type="gramStart"/>
+      <w:r>
+        <w:t>rdmEnnemis</w:t>
+      </w:r>
+      <w:proofErr w:type="spellEnd"/>
+      <w:proofErr w:type="gramEnd"/>
+      <w:r>
+        <w:t xml:space="preserve"> représente la variable qui va stocker une image contenue dans le tableau d’image des ennemis « </w:t>
+      </w:r>
+      <w:proofErr w:type="spellStart"/>
+      <w:r>
+        <w:t>tabOfEnnemis</w:t>
+      </w:r>
+      <w:proofErr w:type="spellEnd"/>
+      <w:r>
+        <w:t xml:space="preserve"> » qui aura été choisis aléatoirement par </w:t>
+      </w:r>
+      <w:proofErr w:type="spellStart"/>
+      <w:r>
+        <w:t>indexEnnemis</w:t>
+      </w:r>
+      <w:proofErr w:type="spellEnd"/>
+      <w:r>
+        <w:t xml:space="preserve"> qui donneras un index de tableau aléatoire.</w:t>
+      </w:r>
+    </w:p>
+    <w:p/>
+    <w:p>
+      <w:pPr>
+        <w:rPr>
+          <w:b/>
+          <w:bCs/>
+          <w:i/>
+          <w:iCs/>
+          <w:color w:val="FF0000"/>
+          <w:u w:val="single"/>
+        </w:rPr>
+      </w:pPr>
+      <w:r>
+        <w:t xml:space="preserve">Nous avons également : </w:t>
+      </w:r>
+      <w:r>
+        <w:rPr>
+          <w:b/>
+          <w:bCs/>
+          <w:i/>
+          <w:iCs/>
+          <w:color w:val="FF0000"/>
+          <w:u w:val="single"/>
+        </w:rPr>
+        <w:t>Changement dans peu de temps !</w:t>
+      </w:r>
+    </w:p>
+    <w:p>
+      <w:pPr>
+        <w:jc w:val="center"/>
+      </w:pPr>
+      <w:r>
+        <w:drawing>
+          <wp:inline distT="0" distB="0" distL="0" distR="0" wp14:anchorId="1978CFE6" wp14:editId="081DF912">
+            <wp:extent cx="1580727" cy="1653764"/>
+            <wp:effectExtent l="190500" t="190500" r="191135" b="194310"/>
+            <wp:docPr id="542724955" name="Image 1" descr="Une image contenant texte, capture d’écran, Police&#10;&#10;Description générée automatiquement"/>
+            <wp:cNvGraphicFramePr>
+              <a:graphicFrameLocks xmlns:a="http://schemas.openxmlformats.org/drawingml/2006/main" noChangeAspect="1"/>
+            </wp:cNvGraphicFramePr>
+            <a:graphic xmlns:a="http://schemas.openxmlformats.org/drawingml/2006/main">
+              <a:graphicData uri="http://schemas.openxmlformats.org/drawingml/2006/picture">
+                <pic:pic xmlns:pic="http://schemas.openxmlformats.org/drawingml/2006/picture">
+                  <pic:nvPicPr>
+                    <pic:cNvPr id="542724955" name="Image 1" descr="Une image contenant texte, capture d’écran, Police&#10;&#10;Description générée automatiquement"/>
+                    <pic:cNvPicPr/>
+                  </pic:nvPicPr>
+                  <pic:blipFill>
+                    <a:blip r:embed="rId38"/>
+                    <a:stretch>
+                      <a:fillRect/>
+                    </a:stretch>
+                  </pic:blipFill>
+                  <pic:spPr>
+                    <a:xfrm>
+                      <a:off x="0" y="0"/>
+                      <a:ext cx="1592796" cy="1666391"/>
+                    </a:xfrm>
+                    <a:prstGeom prst="rect">
+                      <a:avLst/>
+                    </a:prstGeom>
+                    <a:ln>
+                      <a:noFill/>
+                    </a:ln>
+                    <a:effectLst>
+                      <a:outerShdw blurRad="190500" algn="tl" rotWithShape="0">
+                        <a:srgbClr val="000000">
+                          <a:alpha val="70000"/>
+                        </a:srgbClr>
+                      </a:outerShdw>
+                    </a:effectLst>
+                  </pic:spPr>
+                </pic:pic>
+              </a:graphicData>
+            </a:graphic>
+          </wp:inline>
+        </w:drawing>
+      </w:r>
+    </w:p>
+    <w:p>
+      <w:proofErr w:type="spellStart"/>
+      <w:proofErr w:type="gramStart"/>
+      <w:r>
+        <w:t>tabOfBullets</w:t>
+      </w:r>
+      <w:proofErr w:type="spellEnd"/>
+      <w:proofErr w:type="gramEnd"/>
+      <w:r>
+        <w:t xml:space="preserve"> qui représente le tableau contenant </w:t>
+      </w:r>
+      <w:proofErr w:type="spellStart"/>
+      <w:r>
+        <w:t>tout</w:t>
+      </w:r>
+      <w:proofErr w:type="spellEnd"/>
+      <w:r>
+        <w:t xml:space="preserve"> les munitions ennemis et qu’on pourra choisir aléatoirement la munitions de l’ennemi. </w:t>
+      </w:r>
+      <w:r>
+        <w:t>Il y a également X et Y qui représentent les position des ennemis individuellement.</w:t>
+      </w:r>
+      <w:r>
+        <w:t xml:space="preserve"> Ainsi que speed qui représente le nombre de pixels par seconde on l’utilise également pour savoir combien de pixel se déplacer par intervalles </w:t>
+      </w:r>
+      <w:r>
+        <w:sym w:font="Wingdings" w:char="F0E0"/>
+      </w:r>
+      <w:r>
+        <w:t xml:space="preserve"> méthode </w:t>
+      </w:r>
+      <w:proofErr w:type="gramStart"/>
+      <w:r>
+        <w:t>update(</w:t>
+      </w:r>
+      <w:proofErr w:type="gramEnd"/>
+      <w:r>
+        <w:t>) .</w:t>
+      </w:r>
+    </w:p>
+    <w:p/>
+    <w:p>
+      <w:pPr>
+        <w:rPr>
+          <w:b/>
+          <w:bCs/>
+          <w:i/>
+          <w:iCs/>
+          <w:u w:val="single"/>
+        </w:rPr>
+      </w:pPr>
+      <w:r>
+        <w:rPr>
+          <w:b/>
+          <w:bCs/>
+          <w:i/>
+          <w:iCs/>
+          <w:u w:val="single"/>
+        </w:rPr>
+        <w:t>Constructeur :</w:t>
+      </w:r>
+    </w:p>
+    <w:p>
+      <w:pPr>
+        <w:jc w:val="center"/>
+        <w:rPr>
+          <w:b/>
+          <w:bCs/>
+          <w:i/>
+          <w:iCs/>
+          <w:u w:val="single"/>
+        </w:rPr>
+      </w:pPr>
+      <w:r>
+        <w:rPr>
+          <w:b/>
+          <w:bCs/>
+          <w:i/>
+          <w:iCs/>
+          <w:noProof/>
+        </w:rPr>
+        <w:drawing>
+          <wp:inline distT="0" distB="0" distL="0" distR="0" wp14:anchorId="1FB2EBDF" wp14:editId="3EA7222D">
+            <wp:extent cx="4139565" cy="1511935"/>
+            <wp:effectExtent l="0" t="0" r="0" b="0"/>
+            <wp:docPr id="900051477" name="Image 1"/>
+            <wp:cNvGraphicFramePr>
+              <a:graphicFrameLocks xmlns:a="http://schemas.openxmlformats.org/drawingml/2006/main" noChangeAspect="1"/>
+            </wp:cNvGraphicFramePr>
+            <a:graphic xmlns:a="http://schemas.openxmlformats.org/drawingml/2006/main">
+              <a:graphicData uri="http://schemas.openxmlformats.org/drawingml/2006/picture">
+                <pic:pic xmlns:pic="http://schemas.openxmlformats.org/drawingml/2006/picture">
+                  <pic:nvPicPr>
+                    <pic:cNvPr id="0" name="Picture 2"/>
+                    <pic:cNvPicPr>
+                      <a:picLocks noChangeAspect="1" noChangeArrowheads="1"/>
+                    </pic:cNvPicPr>
+                  </pic:nvPicPr>
+                  <pic:blipFill>
+                    <a:blip r:embed="rId39">
+                      <a:extLst>
+                        <a:ext uri="{28A0092B-C50C-407E-A947-70E740481C1C}">
+                          <a14:useLocalDpi xmlns:a14="http://schemas.microsoft.com/office/drawing/2010/main" val="0"/>
+                        </a:ext>
+                      </a:extLst>
+                    </a:blip>
+                    <a:srcRect/>
+                    <a:stretch>
+                      <a:fillRect/>
+                    </a:stretch>
+                  </pic:blipFill>
+                  <pic:spPr bwMode="auto">
+                    <a:xfrm>
+                      <a:off x="0" y="0"/>
+                      <a:ext cx="4139565" cy="1511935"/>
+                    </a:xfrm>
+                    <a:prstGeom prst="rect">
+                      <a:avLst/>
+                    </a:prstGeom>
+                    <a:noFill/>
+                  </pic:spPr>
+                </pic:pic>
+              </a:graphicData>
+            </a:graphic>
+          </wp:inline>
+        </w:drawing>
+      </w:r>
+    </w:p>
+    <w:p>
+      <w:r>
+        <w:t xml:space="preserve">Nous pouvons dans le constructeur qu’il détient comme signature X qui représente la position de l’ennemi sur l’axe X et Y </w:t>
+      </w:r>
+      <w:r>
+        <w:t>qui représente la position de l’ennemi sur l’axe</w:t>
+      </w:r>
+      <w:r>
+        <w:t xml:space="preserve"> Y.</w:t>
+      </w:r>
+      <w:r>
+        <w:t xml:space="preserve"> Puis il y’a </w:t>
+      </w:r>
+      <w:proofErr w:type="spellStart"/>
+      <w:r>
+        <w:t>rdmEnnemis</w:t>
+      </w:r>
+      <w:proofErr w:type="spellEnd"/>
+      <w:r>
+        <w:t xml:space="preserve"> qui choisis lors de l’instanciation quelle image de l’ennemi ça va afficher de manière aléatoire.</w:t>
+      </w:r>
+    </w:p>
+    <w:p/>
+    <w:p>
+      <w:pPr>
+        <w:rPr>
+          <w:b/>
+          <w:bCs/>
+          <w:i/>
+          <w:iCs/>
+          <w:u w:val="single"/>
+        </w:rPr>
+      </w:pPr>
+      <w:r>
+        <w:rPr>
+          <w:b/>
+          <w:bCs/>
+          <w:i/>
+          <w:iCs/>
+          <w:u w:val="single"/>
+        </w:rPr>
+        <w:br w:type="page"/>
+      </w:r>
+    </w:p>
+    <w:p>
+      <w:pPr>
+        <w:rPr>
+          <w:b/>
+          <w:bCs/>
+          <w:i/>
+          <w:iCs/>
+          <w:u w:val="single"/>
+        </w:rPr>
+      </w:pPr>
+      <w:r>
+        <w:rPr>
+          <w:b/>
+          <w:bCs/>
+          <w:i/>
+          <w:iCs/>
+          <w:u w:val="single"/>
+        </w:rPr>
+        <w:lastRenderedPageBreak/>
+        <w:t>Méthodes :</w:t>
+      </w:r>
+    </w:p>
+    <w:p>
+      <w:r>
+        <w:t xml:space="preserve">Nous avons la </w:t>
+      </w:r>
+      <w:proofErr w:type="spellStart"/>
+      <w:r>
+        <w:t>méhode</w:t>
+      </w:r>
+      <w:proofErr w:type="spellEnd"/>
+      <w:r>
+        <w:t xml:space="preserve"> </w:t>
+      </w:r>
+      <w:proofErr w:type="gramStart"/>
+      <w:r>
+        <w:t>update(</w:t>
+      </w:r>
+      <w:proofErr w:type="gramEnd"/>
+      <w:r>
+        <w:t>).</w:t>
+      </w:r>
+    </w:p>
+    <w:p>
+      <w:pPr>
+        <w:jc w:val="center"/>
+      </w:pPr>
+      <w:r>
+        <w:drawing>
+          <wp:inline distT="0" distB="0" distL="0" distR="0" wp14:anchorId="31EA5103" wp14:editId="335A0BAD">
+            <wp:extent cx="2895851" cy="1242168"/>
+            <wp:effectExtent l="152400" t="152400" r="361950" b="358140"/>
+            <wp:docPr id="1630409174" name="Image 1" descr="Une image contenant texte, Police, capture d’écran&#10;&#10;Description générée automatiquement"/>
+            <wp:cNvGraphicFramePr>
+              <a:graphicFrameLocks xmlns:a="http://schemas.openxmlformats.org/drawingml/2006/main" noChangeAspect="1"/>
+            </wp:cNvGraphicFramePr>
+            <a:graphic xmlns:a="http://schemas.openxmlformats.org/drawingml/2006/main">
+              <a:graphicData uri="http://schemas.openxmlformats.org/drawingml/2006/picture">
+                <pic:pic xmlns:pic="http://schemas.openxmlformats.org/drawingml/2006/picture">
+                  <pic:nvPicPr>
+                    <pic:cNvPr id="1630409174" name="Image 1" descr="Une image contenant texte, Police, capture d’écran&#10;&#10;Description générée automatiquement"/>
+                    <pic:cNvPicPr/>
+                  </pic:nvPicPr>
+                  <pic:blipFill>
+                    <a:blip r:embed="rId40"/>
+                    <a:stretch>
+                      <a:fillRect/>
+                    </a:stretch>
+                  </pic:blipFill>
+                  <pic:spPr>
+                    <a:xfrm>
+                      <a:off x="0" y="0"/>
+                      <a:ext cx="2895851" cy="1242168"/>
+                    </a:xfrm>
+                    <a:prstGeom prst="rect">
+                      <a:avLst/>
+                    </a:prstGeom>
+                    <a:ln>
+                      <a:noFill/>
+                    </a:ln>
+                    <a:effectLst>
+                      <a:outerShdw blurRad="292100" dist="139700" dir="2700000" algn="tl" rotWithShape="0">
+                        <a:srgbClr val="333333">
+                          <a:alpha val="65000"/>
+                        </a:srgbClr>
+                      </a:outerShdw>
+                    </a:effectLst>
+                  </pic:spPr>
+                </pic:pic>
+              </a:graphicData>
+            </a:graphic>
+          </wp:inline>
+        </w:drawing>
+      </w:r>
+    </w:p>
+    <w:p>
+      <w:r>
+        <w:t xml:space="preserve">Dans cette méthode nous avons un seul calcul qui </w:t>
+      </w:r>
+      <w:r>
+        <w:t xml:space="preserve">permet de faire déplacer un ennemi de speed y par seconde mais en divisant le mouvement en plusieurs fois dans une seconde afin de rendre le mouvement plus fluide et que ça ne donne pas un mouvement sec chaque </w:t>
+      </w:r>
+      <w:proofErr w:type="spellStart"/>
+      <w:r>
+        <w:t>deplacement</w:t>
+      </w:r>
+      <w:proofErr w:type="spellEnd"/>
+      <w:r>
+        <w:t>.</w:t>
+      </w:r>
+    </w:p>
+    <w:p/>
+    <w:p>
+      <w:pPr>
+        <w:rPr>
+          <w:b/>
+          <w:bCs/>
+        </w:rPr>
+      </w:pPr>
+      <w:r>
+        <w:t xml:space="preserve">Nous avons ensuite la </w:t>
+      </w:r>
+      <w:proofErr w:type="spellStart"/>
+      <w:r>
+        <w:t>methode</w:t>
+      </w:r>
+      <w:proofErr w:type="spellEnd"/>
+      <w:r>
+        <w:t xml:space="preserve"> </w:t>
+      </w:r>
+      <w:proofErr w:type="spellStart"/>
+      <w:proofErr w:type="gramStart"/>
+      <w:r>
+        <w:t>Render</w:t>
+      </w:r>
+      <w:proofErr w:type="spellEnd"/>
+      <w:r>
+        <w:t>(</w:t>
+      </w:r>
+      <w:proofErr w:type="gramEnd"/>
+      <w:r>
+        <w:t>) </w:t>
+      </w:r>
+    </w:p>
+    <w:p>
+      <w:pPr>
+        <w:jc w:val="center"/>
+      </w:pPr>
+      <w:r>
+        <w:drawing>
+          <wp:inline distT="0" distB="0" distL="0" distR="0" wp14:anchorId="01B40D49" wp14:editId="095AAD15">
+            <wp:extent cx="3970071" cy="807863"/>
+            <wp:effectExtent l="152400" t="152400" r="354330" b="354330"/>
+            <wp:docPr id="819667392" name="Image 1"/>
+            <wp:cNvGraphicFramePr>
+              <a:graphicFrameLocks xmlns:a="http://schemas.openxmlformats.org/drawingml/2006/main" noChangeAspect="1"/>
+            </wp:cNvGraphicFramePr>
+            <a:graphic xmlns:a="http://schemas.openxmlformats.org/drawingml/2006/main">
+              <a:graphicData uri="http://schemas.openxmlformats.org/drawingml/2006/picture">
+                <pic:pic xmlns:pic="http://schemas.openxmlformats.org/drawingml/2006/picture">
+                  <pic:nvPicPr>
+                    <pic:cNvPr id="819667392" name=""/>
+                    <pic:cNvPicPr/>
+                  </pic:nvPicPr>
+                  <pic:blipFill>
+                    <a:blip r:embed="rId41"/>
+                    <a:stretch>
+                      <a:fillRect/>
+                    </a:stretch>
+                  </pic:blipFill>
+                  <pic:spPr>
+                    <a:xfrm>
+                      <a:off x="0" y="0"/>
+                      <a:ext cx="4014991" cy="817004"/>
+                    </a:xfrm>
+                    <a:prstGeom prst="rect">
+                      <a:avLst/>
+                    </a:prstGeom>
+                    <a:ln>
+                      <a:noFill/>
+                    </a:ln>
+                    <a:effectLst>
+                      <a:outerShdw blurRad="292100" dist="139700" dir="2700000" algn="tl" rotWithShape="0">
+                        <a:srgbClr val="333333">
+                          <a:alpha val="65000"/>
+                        </a:srgbClr>
+                      </a:outerShdw>
+                    </a:effectLst>
+                  </pic:spPr>
+                </pic:pic>
+              </a:graphicData>
+            </a:graphic>
+          </wp:inline>
+        </w:drawing>
+      </w:r>
+    </w:p>
+    <w:p>
+      <w:r>
+        <w:t xml:space="preserve">Qui permet de dessiner un ennemi à un endroit précis dans le </w:t>
+      </w:r>
+      <w:proofErr w:type="spellStart"/>
+      <w:r>
+        <w:t>airspace</w:t>
+      </w:r>
+      <w:proofErr w:type="spellEnd"/>
+      <w:r>
+        <w:t xml:space="preserve"> en indiquant également sa taille.</w:t>
+      </w:r>
+    </w:p>
+    <w:p/>
+    <w:p>
+      <w:pPr>
+        <w:pStyle w:val="Titre3"/>
+        <w:rPr>
+          <w:b/>
+          <w:bCs/>
+        </w:rPr>
+      </w:pPr>
+      <w:proofErr w:type="spellStart"/>
+      <w:r>
+        <w:rPr>
+          <w:b/>
+          <w:bCs/>
+        </w:rPr>
+        <w:t>BulletPlayer</w:t>
+      </w:r>
+      <w:proofErr w:type="spellEnd"/>
+    </w:p>
+    <w:p>
+      <w:pPr>
+        <w:rPr>
+          <w:color w:val="FF0000"/>
+        </w:rPr>
+      </w:pPr>
+      <w:r>
+        <w:rPr>
+          <w:color w:val="FF0000"/>
+        </w:rPr>
+        <w:t>Á venir…</w:t>
+      </w:r>
+    </w:p>
+    <w:p>
+      <w:pPr>
+        <w:pStyle w:val="Titre3"/>
+        <w:rPr>
+          <w:b/>
+          <w:bCs/>
+        </w:rPr>
+      </w:pPr>
+      <w:proofErr w:type="spellStart"/>
+      <w:r>
+        <w:rPr>
+          <w:b/>
+          <w:bCs/>
+        </w:rPr>
+        <w:t>BulletEnnemis</w:t>
+      </w:r>
+      <w:proofErr w:type="spellEnd"/>
+    </w:p>
+    <w:p>
+      <w:pPr>
+        <w:rPr>
+          <w:color w:val="FF0000"/>
+        </w:rPr>
+      </w:pPr>
+      <w:r>
+        <w:rPr>
+          <w:color w:val="FF0000"/>
+        </w:rPr>
+        <w:t>Á venir…</w:t>
+      </w:r>
+    </w:p>
+    <w:p>
+      <w:pPr>
+        <w:rPr>
+          <w:color w:val="FF0000"/>
+        </w:rPr>
+      </w:pPr>
+    </w:p>
+    <w:p>
+      <w:pPr>
+        <w:rPr>
+          <w:b/>
+          <w:bCs/>
+          <w:i/>
+          <w:iCs/>
+          <w:u w:val="single"/>
+        </w:rPr>
+      </w:pPr>
+    </w:p>
+    <w:p>
+      <w:pPr>
+        <w:rPr>
+          <w:b/>
+          <w:bCs/>
+          <w:i/>
+          <w:iCs/>
+          <w:color w:val="FF0000"/>
+          <w:u w:val="single"/>
+        </w:rPr>
+      </w:pPr>
+      <w:proofErr w:type="spellStart"/>
+      <w:r>
+        <w:rPr>
+          <w:b/>
+          <w:bCs/>
+          <w:i/>
+          <w:iCs/>
+          <w:u w:val="single"/>
+        </w:rPr>
+        <w:t>Config.cs</w:t>
+      </w:r>
+      <w:proofErr w:type="spellEnd"/>
+      <w:r>
+        <w:rPr>
+          <w:b/>
+          <w:bCs/>
+          <w:i/>
+          <w:iCs/>
+          <w:u w:val="single"/>
+        </w:rPr>
+        <w:t xml:space="preserve"> :                                                                                                                                                    </w:t>
+      </w:r>
+      <w:r>
+        <w:rPr>
+          <w:b/>
+          <w:bCs/>
+          <w:i/>
+          <w:iCs/>
+          <w:color w:val="FF0000"/>
+          <w:u w:val="single"/>
+        </w:rPr>
+        <w:t>Á venir</w:t>
+      </w:r>
+    </w:p>
+    <w:p>
+      <w:pPr>
+        <w:rPr>
+          <w:b/>
+          <w:bCs/>
+          <w:i/>
+          <w:iCs/>
+          <w:color w:val="FF0000"/>
+          <w:u w:val="single"/>
+        </w:rPr>
+      </w:pPr>
+      <w:proofErr w:type="spellStart"/>
+      <w:r>
+        <w:rPr>
+          <w:b/>
+          <w:bCs/>
+          <w:i/>
+          <w:iCs/>
+          <w:u w:val="single"/>
+        </w:rPr>
+        <w:t>Helper.cs</w:t>
+      </w:r>
+      <w:proofErr w:type="spellEnd"/>
+      <w:r>
+        <w:rPr>
+          <w:b/>
+          <w:bCs/>
+          <w:i/>
+          <w:iCs/>
+          <w:u w:val="single"/>
+        </w:rPr>
+        <w:t xml:space="preserve"> :                                                                                                                                                   </w:t>
+      </w:r>
+      <w:r>
+        <w:rPr>
+          <w:b/>
+          <w:bCs/>
+          <w:i/>
+          <w:iCs/>
+          <w:color w:val="FF0000"/>
+          <w:u w:val="single"/>
+        </w:rPr>
+        <w:t xml:space="preserve">Á venir  </w:t>
+      </w:r>
+    </w:p>
     <w:sectPr>
-      <w:headerReference w:type="even" r:id="rId36"/>
-      <w:headerReference w:type="default" r:id="rId37"/>
-      <w:footerReference w:type="even" r:id="rId38"/>
-      <w:footerReference w:type="default" r:id="rId39"/>
-      <w:headerReference w:type="first" r:id="rId40"/>
-      <w:footerReference w:type="first" r:id="rId41"/>
+      <w:headerReference w:type="even" r:id="rId42"/>
+      <w:headerReference w:type="default" r:id="rId43"/>
+      <w:footerReference w:type="even" r:id="rId44"/>
+      <w:footerReference w:type="default" r:id="rId45"/>
+      <w:headerReference w:type="first" r:id="rId46"/>
+      <w:footerReference w:type="first" r:id="rId47"/>
       <w:pgSz w:w="11906" w:h="16838" w:code="9"/>
       <w:pgMar w:top="1418" w:right="1418" w:bottom="1135" w:left="1418" w:header="709" w:footer="709" w:gutter="0"/>
       <w:pgBorders w:offsetFrom="page">
@@ -4504,7 +5365,7 @@
 </file>
 
 <file path=word/endnotes.xml><?xml version="1.0" encoding="utf-8"?>
-<w:endnotes xmlns:wpc="http://schemas.microsoft.com/office/word/2010/wordprocessingCanvas" xmlns:cx="http://schemas.microsoft.com/office/drawing/2014/chartex" xmlns:cx1="http://schemas.microsoft.com/office/drawing/2015/9/8/chartex" xmlns:cx2="http://schemas.microsoft.com/office/drawing/2015/10/21/chartex" xmlns:cx3="http://schemas.microsoft.com/office/drawing/2016/5/9/chartex" xmlns:cx4="http://schemas.microsoft.com/office/drawing/2016/5/10/chartex" xmlns:cx5="http://schemas.microsoft.com/office/drawing/2016/5/11/chartex" xmlns:cx6="http://schemas.microsoft.com/office/drawing/2016/5/12/chartex" xmlns:cx7="http://schemas.microsoft.com/office/drawing/2016/5/13/chartex" xmlns:cx8="http://schemas.microsoft.com/office/drawing/2016/5/14/chartex" xmlns:mc="http://schemas.openxmlformats.org/markup-compatibility/2006" xmlns:aink="http://schemas.microsoft.com/office/drawing/2016/ink" xmlns:am3d="http://schemas.microsoft.com/office/drawing/2017/model3d" xmlns:o="urn:schemas-microsoft-com:office:office" xmlns:oel="http://schemas.microsoft.com/office/2019/extlst" xmlns:r="http://schemas.openxmlformats.org/officeDocument/2006/relationships" xmlns:m="http://schemas.openxmlformats.org/officeDocument/2006/math" xmlns:v="urn:schemas-microsoft-com:vml" xmlns:wp14="http://schemas.microsoft.com/office/word/2010/wordprocessingDrawing" xmlns:wp="http://schemas.openxmlformats.org/drawingml/2006/wordprocessingDrawing" xmlns:w10="urn:schemas-microsoft-com:office:word" xmlns:w="http://schemas.openxmlformats.org/wordprocessingml/2006/main" xmlns:w14="http://schemas.microsoft.com/office/word/2010/wordml" xmlns:w15="http://schemas.microsoft.com/office/word/2012/wordml" xmlns:w16cex="http://schemas.microsoft.com/office/word/2018/wordml/cex" xmlns:w16cid="http://schemas.microsoft.com/office/word/2016/wordml/cid" xmlns:w16="http://schemas.microsoft.com/office/word/2018/wordml" xmlns:w16du="http://schemas.microsoft.com/office/word/2023/wordml/word16du" xmlns:w16sdtdh="http://schemas.microsoft.com/office/word/2020/wordml/sdtdatahash" xmlns:w16sdtfl="http://schemas.microsoft.com/office/word/2024/wordml/sdtformatlock" xmlns:w16se="http://schemas.microsoft.com/office/word/2015/wordml/symex" xmlns:wpg="http://schemas.microsoft.com/office/word/2010/wordprocessingGroup" xmlns:wpi="http://schemas.microsoft.com/office/word/2010/wordprocessingInk" xmlns:wne="http://schemas.microsoft.com/office/word/2006/wordml" xmlns:wps="http://schemas.microsoft.com/office/word/2010/wordprocessingShape" mc:Ignorable="w14 w15 w16se w16cid w16 w16cex w16sdtdh w16sdtfl w16du wp14">
+<w:endnotes xmlns:wpc="http://schemas.microsoft.com/office/word/2010/wordprocessingCanvas" xmlns:cx="http://schemas.microsoft.com/office/drawing/2014/chartex" xmlns:cx1="http://schemas.microsoft.com/office/drawing/2015/9/8/chartex" xmlns:cx2="http://schemas.microsoft.com/office/drawing/2015/10/21/chartex" xmlns:cx3="http://schemas.microsoft.com/office/drawing/2016/5/9/chartex" xmlns:cx4="http://schemas.microsoft.com/office/drawing/2016/5/10/chartex" xmlns:cx5="http://schemas.microsoft.com/office/drawing/2016/5/11/chartex" xmlns:cx6="http://schemas.microsoft.com/office/drawing/2016/5/12/chartex" xmlns:cx7="http://schemas.microsoft.com/office/drawing/2016/5/13/chartex" xmlns:cx8="http://schemas.microsoft.com/office/drawing/2016/5/14/chartex" xmlns:mc="http://schemas.openxmlformats.org/markup-compatibility/2006" xmlns:aink="http://schemas.microsoft.com/office/drawing/2016/ink" xmlns:am3d="http://schemas.microsoft.com/office/drawing/2017/model3d" xmlns:o="urn:schemas-microsoft-com:office:office" xmlns:oel="http://schemas.microsoft.com/office/2019/extlst" xmlns:r="http://schemas.openxmlformats.org/officeDocument/2006/relationships" xmlns:m="http://schemas.openxmlformats.org/officeDocument/2006/math" xmlns:v="urn:schemas-microsoft-com:vml" xmlns:wp14="http://schemas.microsoft.com/office/word/2010/wordprocessingDrawing" xmlns:wp="http://schemas.openxmlformats.org/drawingml/2006/wordprocessingDrawing" xmlns:w10="urn:schemas-microsoft-com:office:word" xmlns:w="http://schemas.openxmlformats.org/wordprocessingml/2006/main" xmlns:w14="http://schemas.microsoft.com/office/word/2010/wordml" xmlns:w15="http://schemas.microsoft.com/office/word/2012/wordml" xmlns:w16cex="http://schemas.microsoft.com/office/word/2018/wordml/cex" xmlns:w16cid="http://schemas.microsoft.com/office/word/2016/wordml/cid" xmlns:w16="http://schemas.microsoft.com/office/word/2018/wordml" xmlns:w16du="http://schemas.microsoft.com/office/word/2023/wordml/word16du" xmlns:w16sdtdh="http://schemas.microsoft.com/office/word/2020/wordml/sdtdatahash" xmlns:w16se="http://schemas.microsoft.com/office/word/2015/wordml/symex" xmlns:wpg="http://schemas.microsoft.com/office/word/2010/wordprocessingGroup" xmlns:wpi="http://schemas.microsoft.com/office/word/2010/wordprocessingInk" xmlns:wne="http://schemas.microsoft.com/office/word/2006/wordml" xmlns:wps="http://schemas.microsoft.com/office/word/2010/wordprocessingShape" mc:Ignorable="w14 w15 w16se w16cid w16 w16cex w16sdtdh wp14">
   <w:endnote w:type="separator" w:id="-1">
     <w:p>
       <w:pPr>
@@ -4529,7 +5390,7 @@
 </file>
 
 <file path=word/footer1.xml><?xml version="1.0" encoding="utf-8"?>
-<w:ftr xmlns:wpc="http://schemas.microsoft.com/office/word/2010/wordprocessingCanvas" xmlns:cx="http://schemas.microsoft.com/office/drawing/2014/chartex" xmlns:cx1="http://schemas.microsoft.com/office/drawing/2015/9/8/chartex" xmlns:cx2="http://schemas.microsoft.com/office/drawing/2015/10/21/chartex" xmlns:cx3="http://schemas.microsoft.com/office/drawing/2016/5/9/chartex" xmlns:cx4="http://schemas.microsoft.com/office/drawing/2016/5/10/chartex" xmlns:cx5="http://schemas.microsoft.com/office/drawing/2016/5/11/chartex" xmlns:cx6="http://schemas.microsoft.com/office/drawing/2016/5/12/chartex" xmlns:cx7="http://schemas.microsoft.com/office/drawing/2016/5/13/chartex" xmlns:cx8="http://schemas.microsoft.com/office/drawing/2016/5/14/chartex" xmlns:mc="http://schemas.openxmlformats.org/markup-compatibility/2006" xmlns:aink="http://schemas.microsoft.com/office/drawing/2016/ink" xmlns:am3d="http://schemas.microsoft.com/office/drawing/2017/model3d" xmlns:o="urn:schemas-microsoft-com:office:office" xmlns:oel="http://schemas.microsoft.com/office/2019/extlst" xmlns:r="http://schemas.openxmlformats.org/officeDocument/2006/relationships" xmlns:m="http://schemas.openxmlformats.org/officeDocument/2006/math" xmlns:v="urn:schemas-microsoft-com:vml" xmlns:wp14="http://schemas.microsoft.com/office/word/2010/wordprocessingDrawing" xmlns:wp="http://schemas.openxmlformats.org/drawingml/2006/wordprocessingDrawing" xmlns:w10="urn:schemas-microsoft-com:office:word" xmlns:w="http://schemas.openxmlformats.org/wordprocessingml/2006/main" xmlns:w14="http://schemas.microsoft.com/office/word/2010/wordml" xmlns:w15="http://schemas.microsoft.com/office/word/2012/wordml" xmlns:w16cex="http://schemas.microsoft.com/office/word/2018/wordml/cex" xmlns:w16cid="http://schemas.microsoft.com/office/word/2016/wordml/cid" xmlns:w16="http://schemas.microsoft.com/office/word/2018/wordml" xmlns:w16du="http://schemas.microsoft.com/office/word/2023/wordml/word16du" xmlns:w16sdtdh="http://schemas.microsoft.com/office/word/2020/wordml/sdtdatahash" xmlns:w16sdtfl="http://schemas.microsoft.com/office/word/2024/wordml/sdtformatlock" xmlns:w16se="http://schemas.microsoft.com/office/word/2015/wordml/symex" xmlns:wpg="http://schemas.microsoft.com/office/word/2010/wordprocessingGroup" xmlns:wpi="http://schemas.microsoft.com/office/word/2010/wordprocessingInk" xmlns:wne="http://schemas.microsoft.com/office/word/2006/wordml" xmlns:wps="http://schemas.microsoft.com/office/word/2010/wordprocessingShape" mc:Ignorable="w14 w15 w16se w16cid w16 w16cex w16sdtdh w16sdtfl w16du wp14">
+<w:ftr xmlns:wpc="http://schemas.microsoft.com/office/word/2010/wordprocessingCanvas" xmlns:cx="http://schemas.microsoft.com/office/drawing/2014/chartex" xmlns:cx1="http://schemas.microsoft.com/office/drawing/2015/9/8/chartex" xmlns:cx2="http://schemas.microsoft.com/office/drawing/2015/10/21/chartex" xmlns:cx3="http://schemas.microsoft.com/office/drawing/2016/5/9/chartex" xmlns:cx4="http://schemas.microsoft.com/office/drawing/2016/5/10/chartex" xmlns:cx5="http://schemas.microsoft.com/office/drawing/2016/5/11/chartex" xmlns:cx6="http://schemas.microsoft.com/office/drawing/2016/5/12/chartex" xmlns:cx7="http://schemas.microsoft.com/office/drawing/2016/5/13/chartex" xmlns:cx8="http://schemas.microsoft.com/office/drawing/2016/5/14/chartex" xmlns:mc="http://schemas.openxmlformats.org/markup-compatibility/2006" xmlns:aink="http://schemas.microsoft.com/office/drawing/2016/ink" xmlns:am3d="http://schemas.microsoft.com/office/drawing/2017/model3d" xmlns:o="urn:schemas-microsoft-com:office:office" xmlns:oel="http://schemas.microsoft.com/office/2019/extlst" xmlns:r="http://schemas.openxmlformats.org/officeDocument/2006/relationships" xmlns:m="http://schemas.openxmlformats.org/officeDocument/2006/math" xmlns:v="urn:schemas-microsoft-com:vml" xmlns:wp14="http://schemas.microsoft.com/office/word/2010/wordprocessingDrawing" xmlns:wp="http://schemas.openxmlformats.org/drawingml/2006/wordprocessingDrawing" xmlns:w10="urn:schemas-microsoft-com:office:word" xmlns:w="http://schemas.openxmlformats.org/wordprocessingml/2006/main" xmlns:w14="http://schemas.microsoft.com/office/word/2010/wordml" xmlns:w15="http://schemas.microsoft.com/office/word/2012/wordml" xmlns:w16cex="http://schemas.microsoft.com/office/word/2018/wordml/cex" xmlns:w16cid="http://schemas.microsoft.com/office/word/2016/wordml/cid" xmlns:w16="http://schemas.microsoft.com/office/word/2018/wordml" xmlns:w16du="http://schemas.microsoft.com/office/word/2023/wordml/word16du" xmlns:w16sdtdh="http://schemas.microsoft.com/office/word/2020/wordml/sdtdatahash" xmlns:w16se="http://schemas.microsoft.com/office/word/2015/wordml/symex" xmlns:wpg="http://schemas.microsoft.com/office/word/2010/wordprocessingGroup" xmlns:wpi="http://schemas.microsoft.com/office/word/2010/wordprocessingInk" xmlns:wne="http://schemas.microsoft.com/office/word/2006/wordml" xmlns:wps="http://schemas.microsoft.com/office/word/2010/wordprocessingShape" mc:Ignorable="w14 w15 w16se w16cid w16 w16cex w16sdtdh wp14">
   <w:p>
     <w:pPr>
       <w:pStyle w:val="Pieddepage"/>
@@ -4539,7 +5400,7 @@
 </file>
 
 <file path=word/footer2.xml><?xml version="1.0" encoding="utf-8"?>
-<w:ftr xmlns:wpc="http://schemas.microsoft.com/office/word/2010/wordprocessingCanvas" xmlns:cx="http://schemas.microsoft.com/office/drawing/2014/chartex" xmlns:cx1="http://schemas.microsoft.com/office/drawing/2015/9/8/chartex" xmlns:cx2="http://schemas.microsoft.com/office/drawing/2015/10/21/chartex" xmlns:cx3="http://schemas.microsoft.com/office/drawing/2016/5/9/chartex" xmlns:cx4="http://schemas.microsoft.com/office/drawing/2016/5/10/chartex" xmlns:cx5="http://schemas.microsoft.com/office/drawing/2016/5/11/chartex" xmlns:cx6="http://schemas.microsoft.com/office/drawing/2016/5/12/chartex" xmlns:cx7="http://schemas.microsoft.com/office/drawing/2016/5/13/chartex" xmlns:cx8="http://schemas.microsoft.com/office/drawing/2016/5/14/chartex" xmlns:mc="http://schemas.openxmlformats.org/markup-compatibility/2006" xmlns:aink="http://schemas.microsoft.com/office/drawing/2016/ink" xmlns:am3d="http://schemas.microsoft.com/office/drawing/2017/model3d" xmlns:o="urn:schemas-microsoft-com:office:office" xmlns:oel="http://schemas.microsoft.com/office/2019/extlst" xmlns:r="http://schemas.openxmlformats.org/officeDocument/2006/relationships" xmlns:m="http://schemas.openxmlformats.org/officeDocument/2006/math" xmlns:v="urn:schemas-microsoft-com:vml" xmlns:wp14="http://schemas.microsoft.com/office/word/2010/wordprocessingDrawing" xmlns:wp="http://schemas.openxmlformats.org/drawingml/2006/wordprocessingDrawing" xmlns:w10="urn:schemas-microsoft-com:office:word" xmlns:w="http://schemas.openxmlformats.org/wordprocessingml/2006/main" xmlns:w14="http://schemas.microsoft.com/office/word/2010/wordml" xmlns:w15="http://schemas.microsoft.com/office/word/2012/wordml" xmlns:w16cex="http://schemas.microsoft.com/office/word/2018/wordml/cex" xmlns:w16cid="http://schemas.microsoft.com/office/word/2016/wordml/cid" xmlns:w16="http://schemas.microsoft.com/office/word/2018/wordml" xmlns:w16du="http://schemas.microsoft.com/office/word/2023/wordml/word16du" xmlns:w16sdtdh="http://schemas.microsoft.com/office/word/2020/wordml/sdtdatahash" xmlns:w16sdtfl="http://schemas.microsoft.com/office/word/2024/wordml/sdtformatlock" xmlns:w16se="http://schemas.microsoft.com/office/word/2015/wordml/symex" xmlns:wpg="http://schemas.microsoft.com/office/word/2010/wordprocessingGroup" xmlns:wpi="http://schemas.microsoft.com/office/word/2010/wordprocessingInk" xmlns:wne="http://schemas.microsoft.com/office/word/2006/wordml" xmlns:wps="http://schemas.microsoft.com/office/word/2010/wordprocessingShape" mc:Ignorable="w14 w15 w16se w16cid w16 w16cex w16sdtdh w16sdtfl w16du wp14">
+<w:ftr xmlns:wpc="http://schemas.microsoft.com/office/word/2010/wordprocessingCanvas" xmlns:cx="http://schemas.microsoft.com/office/drawing/2014/chartex" xmlns:cx1="http://schemas.microsoft.com/office/drawing/2015/9/8/chartex" xmlns:cx2="http://schemas.microsoft.com/office/drawing/2015/10/21/chartex" xmlns:cx3="http://schemas.microsoft.com/office/drawing/2016/5/9/chartex" xmlns:cx4="http://schemas.microsoft.com/office/drawing/2016/5/10/chartex" xmlns:cx5="http://schemas.microsoft.com/office/drawing/2016/5/11/chartex" xmlns:cx6="http://schemas.microsoft.com/office/drawing/2016/5/12/chartex" xmlns:cx7="http://schemas.microsoft.com/office/drawing/2016/5/13/chartex" xmlns:cx8="http://schemas.microsoft.com/office/drawing/2016/5/14/chartex" xmlns:mc="http://schemas.openxmlformats.org/markup-compatibility/2006" xmlns:aink="http://schemas.microsoft.com/office/drawing/2016/ink" xmlns:am3d="http://schemas.microsoft.com/office/drawing/2017/model3d" xmlns:o="urn:schemas-microsoft-com:office:office" xmlns:oel="http://schemas.microsoft.com/office/2019/extlst" xmlns:r="http://schemas.openxmlformats.org/officeDocument/2006/relationships" xmlns:m="http://schemas.openxmlformats.org/officeDocument/2006/math" xmlns:v="urn:schemas-microsoft-com:vml" xmlns:wp14="http://schemas.microsoft.com/office/word/2010/wordprocessingDrawing" xmlns:wp="http://schemas.openxmlformats.org/drawingml/2006/wordprocessingDrawing" xmlns:w10="urn:schemas-microsoft-com:office:word" xmlns:w="http://schemas.openxmlformats.org/wordprocessingml/2006/main" xmlns:w14="http://schemas.microsoft.com/office/word/2010/wordml" xmlns:w15="http://schemas.microsoft.com/office/word/2012/wordml" xmlns:w16cex="http://schemas.microsoft.com/office/word/2018/wordml/cex" xmlns:w16cid="http://schemas.microsoft.com/office/word/2016/wordml/cid" xmlns:w16="http://schemas.microsoft.com/office/word/2018/wordml" xmlns:w16du="http://schemas.microsoft.com/office/word/2023/wordml/word16du" xmlns:w16sdtdh="http://schemas.microsoft.com/office/word/2020/wordml/sdtdatahash" xmlns:w16se="http://schemas.microsoft.com/office/word/2015/wordml/symex" xmlns:wpg="http://schemas.microsoft.com/office/word/2010/wordprocessingGroup" xmlns:wpi="http://schemas.microsoft.com/office/word/2010/wordprocessingInk" xmlns:wne="http://schemas.microsoft.com/office/word/2006/wordml" xmlns:wps="http://schemas.microsoft.com/office/word/2010/wordprocessingShape" mc:Ignorable="w14 w15 w16se w16cid w16 w16cex w16sdtdh wp14">
   <w:p>
     <w:pPr>
       <w:pStyle w:val="Pieddepage"/>
@@ -4549,7 +5410,7 @@
 </file>
 
 <file path=word/footer3.xml><?xml version="1.0" encoding="utf-8"?>
-<w:ftr xmlns:wpc="http://schemas.microsoft.com/office/word/2010/wordprocessingCanvas" xmlns:cx="http://schemas.microsoft.com/office/drawing/2014/chartex" xmlns:cx1="http://schemas.microsoft.com/office/drawing/2015/9/8/chartex" xmlns:cx2="http://schemas.microsoft.com/office/drawing/2015/10/21/chartex" xmlns:cx3="http://schemas.microsoft.com/office/drawing/2016/5/9/chartex" xmlns:cx4="http://schemas.microsoft.com/office/drawing/2016/5/10/chartex" xmlns:cx5="http://schemas.microsoft.com/office/drawing/2016/5/11/chartex" xmlns:cx6="http://schemas.microsoft.com/office/drawing/2016/5/12/chartex" xmlns:cx7="http://schemas.microsoft.com/office/drawing/2016/5/13/chartex" xmlns:cx8="http://schemas.microsoft.com/office/drawing/2016/5/14/chartex" xmlns:mc="http://schemas.openxmlformats.org/markup-compatibility/2006" xmlns:aink="http://schemas.microsoft.com/office/drawing/2016/ink" xmlns:am3d="http://schemas.microsoft.com/office/drawing/2017/model3d" xmlns:o="urn:schemas-microsoft-com:office:office" xmlns:oel="http://schemas.microsoft.com/office/2019/extlst" xmlns:r="http://schemas.openxmlformats.org/officeDocument/2006/relationships" xmlns:m="http://schemas.openxmlformats.org/officeDocument/2006/math" xmlns:v="urn:schemas-microsoft-com:vml" xmlns:wp14="http://schemas.microsoft.com/office/word/2010/wordprocessingDrawing" xmlns:wp="http://schemas.openxmlformats.org/drawingml/2006/wordprocessingDrawing" xmlns:w10="urn:schemas-microsoft-com:office:word" xmlns:w="http://schemas.openxmlformats.org/wordprocessingml/2006/main" xmlns:w14="http://schemas.microsoft.com/office/word/2010/wordml" xmlns:w15="http://schemas.microsoft.com/office/word/2012/wordml" xmlns:w16cex="http://schemas.microsoft.com/office/word/2018/wordml/cex" xmlns:w16cid="http://schemas.microsoft.com/office/word/2016/wordml/cid" xmlns:w16="http://schemas.microsoft.com/office/word/2018/wordml" xmlns:w16du="http://schemas.microsoft.com/office/word/2023/wordml/word16du" xmlns:w16sdtdh="http://schemas.microsoft.com/office/word/2020/wordml/sdtdatahash" xmlns:w16sdtfl="http://schemas.microsoft.com/office/word/2024/wordml/sdtformatlock" xmlns:w16se="http://schemas.microsoft.com/office/word/2015/wordml/symex" xmlns:wpg="http://schemas.microsoft.com/office/word/2010/wordprocessingGroup" xmlns:wpi="http://schemas.microsoft.com/office/word/2010/wordprocessingInk" xmlns:wne="http://schemas.microsoft.com/office/word/2006/wordml" xmlns:wps="http://schemas.microsoft.com/office/word/2010/wordprocessingShape" mc:Ignorable="w14 w15 w16se w16cid w16 w16cex w16sdtdh w16sdtfl w16du wp14">
+<w:ftr xmlns:wpc="http://schemas.microsoft.com/office/word/2010/wordprocessingCanvas" xmlns:cx="http://schemas.microsoft.com/office/drawing/2014/chartex" xmlns:cx1="http://schemas.microsoft.com/office/drawing/2015/9/8/chartex" xmlns:cx2="http://schemas.microsoft.com/office/drawing/2015/10/21/chartex" xmlns:cx3="http://schemas.microsoft.com/office/drawing/2016/5/9/chartex" xmlns:cx4="http://schemas.microsoft.com/office/drawing/2016/5/10/chartex" xmlns:cx5="http://schemas.microsoft.com/office/drawing/2016/5/11/chartex" xmlns:cx6="http://schemas.microsoft.com/office/drawing/2016/5/12/chartex" xmlns:cx7="http://schemas.microsoft.com/office/drawing/2016/5/13/chartex" xmlns:cx8="http://schemas.microsoft.com/office/drawing/2016/5/14/chartex" xmlns:mc="http://schemas.openxmlformats.org/markup-compatibility/2006" xmlns:aink="http://schemas.microsoft.com/office/drawing/2016/ink" xmlns:am3d="http://schemas.microsoft.com/office/drawing/2017/model3d" xmlns:o="urn:schemas-microsoft-com:office:office" xmlns:oel="http://schemas.microsoft.com/office/2019/extlst" xmlns:r="http://schemas.openxmlformats.org/officeDocument/2006/relationships" xmlns:m="http://schemas.openxmlformats.org/officeDocument/2006/math" xmlns:v="urn:schemas-microsoft-com:vml" xmlns:wp14="http://schemas.microsoft.com/office/word/2010/wordprocessingDrawing" xmlns:wp="http://schemas.openxmlformats.org/drawingml/2006/wordprocessingDrawing" xmlns:w10="urn:schemas-microsoft-com:office:word" xmlns:w="http://schemas.openxmlformats.org/wordprocessingml/2006/main" xmlns:w14="http://schemas.microsoft.com/office/word/2010/wordml" xmlns:w15="http://schemas.microsoft.com/office/word/2012/wordml" xmlns:w16cex="http://schemas.microsoft.com/office/word/2018/wordml/cex" xmlns:w16cid="http://schemas.microsoft.com/office/word/2016/wordml/cid" xmlns:w16="http://schemas.microsoft.com/office/word/2018/wordml" xmlns:w16du="http://schemas.microsoft.com/office/word/2023/wordml/word16du" xmlns:w16sdtdh="http://schemas.microsoft.com/office/word/2020/wordml/sdtdatahash" xmlns:w16se="http://schemas.microsoft.com/office/word/2015/wordml/symex" xmlns:wpg="http://schemas.microsoft.com/office/word/2010/wordprocessingGroup" xmlns:wpi="http://schemas.microsoft.com/office/word/2010/wordprocessingInk" xmlns:wne="http://schemas.microsoft.com/office/word/2006/wordml" xmlns:wps="http://schemas.microsoft.com/office/word/2010/wordprocessingShape" mc:Ignorable="w14 w15 w16se w16cid w16 w16cex w16sdtdh wp14">
   <w:p>
     <w:pPr>
       <w:pStyle w:val="Pieddepage"/>
@@ -4559,7 +5420,7 @@
 </file>
 
 <file path=word/footnotes.xml><?xml version="1.0" encoding="utf-8"?>
-<w:footnotes xmlns:wpc="http://schemas.microsoft.com/office/word/2010/wordprocessingCanvas" xmlns:cx="http://schemas.microsoft.com/office/drawing/2014/chartex" xmlns:cx1="http://schemas.microsoft.com/office/drawing/2015/9/8/chartex" xmlns:cx2="http://schemas.microsoft.com/office/drawing/2015/10/21/chartex" xmlns:cx3="http://schemas.microsoft.com/office/drawing/2016/5/9/chartex" xmlns:cx4="http://schemas.microsoft.com/office/drawing/2016/5/10/chartex" xmlns:cx5="http://schemas.microsoft.com/office/drawing/2016/5/11/chartex" xmlns:cx6="http://schemas.microsoft.com/office/drawing/2016/5/12/chartex" xmlns:cx7="http://schemas.microsoft.com/office/drawing/2016/5/13/chartex" xmlns:cx8="http://schemas.microsoft.com/office/drawing/2016/5/14/chartex" xmlns:mc="http://schemas.openxmlformats.org/markup-compatibility/2006" xmlns:aink="http://schemas.microsoft.com/office/drawing/2016/ink" xmlns:am3d="http://schemas.microsoft.com/office/drawing/2017/model3d" xmlns:o="urn:schemas-microsoft-com:office:office" xmlns:oel="http://schemas.microsoft.com/office/2019/extlst" xmlns:r="http://schemas.openxmlformats.org/officeDocument/2006/relationships" xmlns:m="http://schemas.openxmlformats.org/officeDocument/2006/math" xmlns:v="urn:schemas-microsoft-com:vml" xmlns:wp14="http://schemas.microsoft.com/office/word/2010/wordprocessingDrawing" xmlns:wp="http://schemas.openxmlformats.org/drawingml/2006/wordprocessingDrawing" xmlns:w10="urn:schemas-microsoft-com:office:word" xmlns:w="http://schemas.openxmlformats.org/wordprocessingml/2006/main" xmlns:w14="http://schemas.microsoft.com/office/word/2010/wordml" xmlns:w15="http://schemas.microsoft.com/office/word/2012/wordml" xmlns:w16cex="http://schemas.microsoft.com/office/word/2018/wordml/cex" xmlns:w16cid="http://schemas.microsoft.com/office/word/2016/wordml/cid" xmlns:w16="http://schemas.microsoft.com/office/word/2018/wordml" xmlns:w16du="http://schemas.microsoft.com/office/word/2023/wordml/word16du" xmlns:w16sdtdh="http://schemas.microsoft.com/office/word/2020/wordml/sdtdatahash" xmlns:w16sdtfl="http://schemas.microsoft.com/office/word/2024/wordml/sdtformatlock" xmlns:w16se="http://schemas.microsoft.com/office/word/2015/wordml/symex" xmlns:wpg="http://schemas.microsoft.com/office/word/2010/wordprocessingGroup" xmlns:wpi="http://schemas.microsoft.com/office/word/2010/wordprocessingInk" xmlns:wne="http://schemas.microsoft.com/office/word/2006/wordml" xmlns:wps="http://schemas.microsoft.com/office/word/2010/wordprocessingShape" mc:Ignorable="w14 w15 w16se w16cid w16 w16cex w16sdtdh w16sdtfl w16du wp14">
+<w:footnotes xmlns:wpc="http://schemas.microsoft.com/office/word/2010/wordprocessingCanvas" xmlns:cx="http://schemas.microsoft.com/office/drawing/2014/chartex" xmlns:cx1="http://schemas.microsoft.com/office/drawing/2015/9/8/chartex" xmlns:cx2="http://schemas.microsoft.com/office/drawing/2015/10/21/chartex" xmlns:cx3="http://schemas.microsoft.com/office/drawing/2016/5/9/chartex" xmlns:cx4="http://schemas.microsoft.com/office/drawing/2016/5/10/chartex" xmlns:cx5="http://schemas.microsoft.com/office/drawing/2016/5/11/chartex" xmlns:cx6="http://schemas.microsoft.com/office/drawing/2016/5/12/chartex" xmlns:cx7="http://schemas.microsoft.com/office/drawing/2016/5/13/chartex" xmlns:cx8="http://schemas.microsoft.com/office/drawing/2016/5/14/chartex" xmlns:mc="http://schemas.openxmlformats.org/markup-compatibility/2006" xmlns:aink="http://schemas.microsoft.com/office/drawing/2016/ink" xmlns:am3d="http://schemas.microsoft.com/office/drawing/2017/model3d" xmlns:o="urn:schemas-microsoft-com:office:office" xmlns:oel="http://schemas.microsoft.com/office/2019/extlst" xmlns:r="http://schemas.openxmlformats.org/officeDocument/2006/relationships" xmlns:m="http://schemas.openxmlformats.org/officeDocument/2006/math" xmlns:v="urn:schemas-microsoft-com:vml" xmlns:wp14="http://schemas.microsoft.com/office/word/2010/wordprocessingDrawing" xmlns:wp="http://schemas.openxmlformats.org/drawingml/2006/wordprocessingDrawing" xmlns:w10="urn:schemas-microsoft-com:office:word" xmlns:w="http://schemas.openxmlformats.org/wordprocessingml/2006/main" xmlns:w14="http://schemas.microsoft.com/office/word/2010/wordml" xmlns:w15="http://schemas.microsoft.com/office/word/2012/wordml" xmlns:w16cex="http://schemas.microsoft.com/office/word/2018/wordml/cex" xmlns:w16cid="http://schemas.microsoft.com/office/word/2016/wordml/cid" xmlns:w16="http://schemas.microsoft.com/office/word/2018/wordml" xmlns:w16du="http://schemas.microsoft.com/office/word/2023/wordml/word16du" xmlns:w16sdtdh="http://schemas.microsoft.com/office/word/2020/wordml/sdtdatahash" xmlns:w16se="http://schemas.microsoft.com/office/word/2015/wordml/symex" xmlns:wpg="http://schemas.microsoft.com/office/word/2010/wordprocessingGroup" xmlns:wpi="http://schemas.microsoft.com/office/word/2010/wordprocessingInk" xmlns:wne="http://schemas.microsoft.com/office/word/2006/wordml" xmlns:wps="http://schemas.microsoft.com/office/word/2010/wordprocessingShape" mc:Ignorable="w14 w15 w16se w16cid w16 w16cex w16sdtdh wp14">
   <w:footnote w:type="separator" w:id="-1">
     <w:p>
       <w:pPr>
@@ -4584,7 +5445,7 @@
 </file>
 
 <file path=word/header1.xml><?xml version="1.0" encoding="utf-8"?>
-<w:hdr xmlns:wpc="http://schemas.microsoft.com/office/word/2010/wordprocessingCanvas" xmlns:cx="http://schemas.microsoft.com/office/drawing/2014/chartex" xmlns:cx1="http://schemas.microsoft.com/office/drawing/2015/9/8/chartex" xmlns:cx2="http://schemas.microsoft.com/office/drawing/2015/10/21/chartex" xmlns:cx3="http://schemas.microsoft.com/office/drawing/2016/5/9/chartex" xmlns:cx4="http://schemas.microsoft.com/office/drawing/2016/5/10/chartex" xmlns:cx5="http://schemas.microsoft.com/office/drawing/2016/5/11/chartex" xmlns:cx6="http://schemas.microsoft.com/office/drawing/2016/5/12/chartex" xmlns:cx7="http://schemas.microsoft.com/office/drawing/2016/5/13/chartex" xmlns:cx8="http://schemas.microsoft.com/office/drawing/2016/5/14/chartex" xmlns:mc="http://schemas.openxmlformats.org/markup-compatibility/2006" xmlns:aink="http://schemas.microsoft.com/office/drawing/2016/ink" xmlns:am3d="http://schemas.microsoft.com/office/drawing/2017/model3d" xmlns:o="urn:schemas-microsoft-com:office:office" xmlns:oel="http://schemas.microsoft.com/office/2019/extlst" xmlns:r="http://schemas.openxmlformats.org/officeDocument/2006/relationships" xmlns:m="http://schemas.openxmlformats.org/officeDocument/2006/math" xmlns:v="urn:schemas-microsoft-com:vml" xmlns:wp14="http://schemas.microsoft.com/office/word/2010/wordprocessingDrawing" xmlns:wp="http://schemas.openxmlformats.org/drawingml/2006/wordprocessingDrawing" xmlns:w10="urn:schemas-microsoft-com:office:word" xmlns:w="http://schemas.openxmlformats.org/wordprocessingml/2006/main" xmlns:w14="http://schemas.microsoft.com/office/word/2010/wordml" xmlns:w15="http://schemas.microsoft.com/office/word/2012/wordml" xmlns:w16cex="http://schemas.microsoft.com/office/word/2018/wordml/cex" xmlns:w16cid="http://schemas.microsoft.com/office/word/2016/wordml/cid" xmlns:w16="http://schemas.microsoft.com/office/word/2018/wordml" xmlns:w16du="http://schemas.microsoft.com/office/word/2023/wordml/word16du" xmlns:w16sdtdh="http://schemas.microsoft.com/office/word/2020/wordml/sdtdatahash" xmlns:w16sdtfl="http://schemas.microsoft.com/office/word/2024/wordml/sdtformatlock" xmlns:w16se="http://schemas.microsoft.com/office/word/2015/wordml/symex" xmlns:wpg="http://schemas.microsoft.com/office/word/2010/wordprocessingGroup" xmlns:wpi="http://schemas.microsoft.com/office/word/2010/wordprocessingInk" xmlns:wne="http://schemas.microsoft.com/office/word/2006/wordml" xmlns:wps="http://schemas.microsoft.com/office/word/2010/wordprocessingShape" mc:Ignorable="w14 w15 w16se w16cid w16 w16cex w16sdtdh w16sdtfl w16du wp14">
+<w:hdr xmlns:wpc="http://schemas.microsoft.com/office/word/2010/wordprocessingCanvas" xmlns:cx="http://schemas.microsoft.com/office/drawing/2014/chartex" xmlns:cx1="http://schemas.microsoft.com/office/drawing/2015/9/8/chartex" xmlns:cx2="http://schemas.microsoft.com/office/drawing/2015/10/21/chartex" xmlns:cx3="http://schemas.microsoft.com/office/drawing/2016/5/9/chartex" xmlns:cx4="http://schemas.microsoft.com/office/drawing/2016/5/10/chartex" xmlns:cx5="http://schemas.microsoft.com/office/drawing/2016/5/11/chartex" xmlns:cx6="http://schemas.microsoft.com/office/drawing/2016/5/12/chartex" xmlns:cx7="http://schemas.microsoft.com/office/drawing/2016/5/13/chartex" xmlns:cx8="http://schemas.microsoft.com/office/drawing/2016/5/14/chartex" xmlns:mc="http://schemas.openxmlformats.org/markup-compatibility/2006" xmlns:aink="http://schemas.microsoft.com/office/drawing/2016/ink" xmlns:am3d="http://schemas.microsoft.com/office/drawing/2017/model3d" xmlns:o="urn:schemas-microsoft-com:office:office" xmlns:oel="http://schemas.microsoft.com/office/2019/extlst" xmlns:r="http://schemas.openxmlformats.org/officeDocument/2006/relationships" xmlns:m="http://schemas.openxmlformats.org/officeDocument/2006/math" xmlns:v="urn:schemas-microsoft-com:vml" xmlns:wp14="http://schemas.microsoft.com/office/word/2010/wordprocessingDrawing" xmlns:wp="http://schemas.openxmlformats.org/drawingml/2006/wordprocessingDrawing" xmlns:w10="urn:schemas-microsoft-com:office:word" xmlns:w="http://schemas.openxmlformats.org/wordprocessingml/2006/main" xmlns:w14="http://schemas.microsoft.com/office/word/2010/wordml" xmlns:w15="http://schemas.microsoft.com/office/word/2012/wordml" xmlns:w16cex="http://schemas.microsoft.com/office/word/2018/wordml/cex" xmlns:w16cid="http://schemas.microsoft.com/office/word/2016/wordml/cid" xmlns:w16="http://schemas.microsoft.com/office/word/2018/wordml" xmlns:w16du="http://schemas.microsoft.com/office/word/2023/wordml/word16du" xmlns:w16sdtdh="http://schemas.microsoft.com/office/word/2020/wordml/sdtdatahash" xmlns:w16se="http://schemas.microsoft.com/office/word/2015/wordml/symex" xmlns:wpg="http://schemas.microsoft.com/office/word/2010/wordprocessingGroup" xmlns:wpi="http://schemas.microsoft.com/office/word/2010/wordprocessingInk" xmlns:wne="http://schemas.microsoft.com/office/word/2006/wordml" xmlns:wps="http://schemas.microsoft.com/office/word/2010/wordprocessingShape" mc:Ignorable="w14 w15 w16se w16cid w16 w16cex w16sdtdh wp14">
   <w:p>
     <w:pPr>
       <w:pStyle w:val="En-tte"/>
@@ -4630,7 +5491,7 @@
 </file>
 
 <file path=word/header2.xml><?xml version="1.0" encoding="utf-8"?>
-<w:hdr xmlns:wpc="http://schemas.microsoft.com/office/word/2010/wordprocessingCanvas" xmlns:cx="http://schemas.microsoft.com/office/drawing/2014/chartex" xmlns:cx1="http://schemas.microsoft.com/office/drawing/2015/9/8/chartex" xmlns:cx2="http://schemas.microsoft.com/office/drawing/2015/10/21/chartex" xmlns:cx3="http://schemas.microsoft.com/office/drawing/2016/5/9/chartex" xmlns:cx4="http://schemas.microsoft.com/office/drawing/2016/5/10/chartex" xmlns:cx5="http://schemas.microsoft.com/office/drawing/2016/5/11/chartex" xmlns:cx6="http://schemas.microsoft.com/office/drawing/2016/5/12/chartex" xmlns:cx7="http://schemas.microsoft.com/office/drawing/2016/5/13/chartex" xmlns:cx8="http://schemas.microsoft.com/office/drawing/2016/5/14/chartex" xmlns:mc="http://schemas.openxmlformats.org/markup-compatibility/2006" xmlns:aink="http://schemas.microsoft.com/office/drawing/2016/ink" xmlns:am3d="http://schemas.microsoft.com/office/drawing/2017/model3d" xmlns:o="urn:schemas-microsoft-com:office:office" xmlns:oel="http://schemas.microsoft.com/office/2019/extlst" xmlns:r="http://schemas.openxmlformats.org/officeDocument/2006/relationships" xmlns:m="http://schemas.openxmlformats.org/officeDocument/2006/math" xmlns:v="urn:schemas-microsoft-com:vml" xmlns:wp14="http://schemas.microsoft.com/office/word/2010/wordprocessingDrawing" xmlns:wp="http://schemas.openxmlformats.org/drawingml/2006/wordprocessingDrawing" xmlns:w10="urn:schemas-microsoft-com:office:word" xmlns:w="http://schemas.openxmlformats.org/wordprocessingml/2006/main" xmlns:w14="http://schemas.microsoft.com/office/word/2010/wordml" xmlns:w15="http://schemas.microsoft.com/office/word/2012/wordml" xmlns:w16cex="http://schemas.microsoft.com/office/word/2018/wordml/cex" xmlns:w16cid="http://schemas.microsoft.com/office/word/2016/wordml/cid" xmlns:w16="http://schemas.microsoft.com/office/word/2018/wordml" xmlns:w16du="http://schemas.microsoft.com/office/word/2023/wordml/word16du" xmlns:w16sdtdh="http://schemas.microsoft.com/office/word/2020/wordml/sdtdatahash" xmlns:w16sdtfl="http://schemas.microsoft.com/office/word/2024/wordml/sdtformatlock" xmlns:w16se="http://schemas.microsoft.com/office/word/2015/wordml/symex" xmlns:wpg="http://schemas.microsoft.com/office/word/2010/wordprocessingGroup" xmlns:wpi="http://schemas.microsoft.com/office/word/2010/wordprocessingInk" xmlns:wne="http://schemas.microsoft.com/office/word/2006/wordml" xmlns:wps="http://schemas.microsoft.com/office/word/2010/wordprocessingShape" mc:Ignorable="w14 w15 w16se w16cid w16 w16cex w16sdtdh w16sdtfl w16du wp14">
+<w:hdr xmlns:wpc="http://schemas.microsoft.com/office/word/2010/wordprocessingCanvas" xmlns:cx="http://schemas.microsoft.com/office/drawing/2014/chartex" xmlns:cx1="http://schemas.microsoft.com/office/drawing/2015/9/8/chartex" xmlns:cx2="http://schemas.microsoft.com/office/drawing/2015/10/21/chartex" xmlns:cx3="http://schemas.microsoft.com/office/drawing/2016/5/9/chartex" xmlns:cx4="http://schemas.microsoft.com/office/drawing/2016/5/10/chartex" xmlns:cx5="http://schemas.microsoft.com/office/drawing/2016/5/11/chartex" xmlns:cx6="http://schemas.microsoft.com/office/drawing/2016/5/12/chartex" xmlns:cx7="http://schemas.microsoft.com/office/drawing/2016/5/13/chartex" xmlns:cx8="http://schemas.microsoft.com/office/drawing/2016/5/14/chartex" xmlns:mc="http://schemas.openxmlformats.org/markup-compatibility/2006" xmlns:aink="http://schemas.microsoft.com/office/drawing/2016/ink" xmlns:am3d="http://schemas.microsoft.com/office/drawing/2017/model3d" xmlns:o="urn:schemas-microsoft-com:office:office" xmlns:oel="http://schemas.microsoft.com/office/2019/extlst" xmlns:r="http://schemas.openxmlformats.org/officeDocument/2006/relationships" xmlns:m="http://schemas.openxmlformats.org/officeDocument/2006/math" xmlns:v="urn:schemas-microsoft-com:vml" xmlns:wp14="http://schemas.microsoft.com/office/word/2010/wordprocessingDrawing" xmlns:wp="http://schemas.openxmlformats.org/drawingml/2006/wordprocessingDrawing" xmlns:w10="urn:schemas-microsoft-com:office:word" xmlns:w="http://schemas.openxmlformats.org/wordprocessingml/2006/main" xmlns:w14="http://schemas.microsoft.com/office/word/2010/wordml" xmlns:w15="http://schemas.microsoft.com/office/word/2012/wordml" xmlns:w16cex="http://schemas.microsoft.com/office/word/2018/wordml/cex" xmlns:w16cid="http://schemas.microsoft.com/office/word/2016/wordml/cid" xmlns:w16="http://schemas.microsoft.com/office/word/2018/wordml" xmlns:w16du="http://schemas.microsoft.com/office/word/2023/wordml/word16du" xmlns:w16sdtdh="http://schemas.microsoft.com/office/word/2020/wordml/sdtdatahash" xmlns:w16se="http://schemas.microsoft.com/office/word/2015/wordml/symex" xmlns:wpg="http://schemas.microsoft.com/office/word/2010/wordprocessingGroup" xmlns:wpi="http://schemas.microsoft.com/office/word/2010/wordprocessingInk" xmlns:wne="http://schemas.microsoft.com/office/word/2006/wordml" xmlns:wps="http://schemas.microsoft.com/office/word/2010/wordprocessingShape" mc:Ignorable="w14 w15 w16se w16cid w16 w16cex w16sdtdh wp14">
   <w:tbl>
     <w:tblPr>
       <w:tblStyle w:val="Grilledutableau"/>
@@ -4748,7 +5609,7 @@
 </file>
 
 <file path=word/header3.xml><?xml version="1.0" encoding="utf-8"?>
-<w:hdr xmlns:wpc="http://schemas.microsoft.com/office/word/2010/wordprocessingCanvas" xmlns:cx="http://schemas.microsoft.com/office/drawing/2014/chartex" xmlns:cx1="http://schemas.microsoft.com/office/drawing/2015/9/8/chartex" xmlns:cx2="http://schemas.microsoft.com/office/drawing/2015/10/21/chartex" xmlns:cx3="http://schemas.microsoft.com/office/drawing/2016/5/9/chartex" xmlns:cx4="http://schemas.microsoft.com/office/drawing/2016/5/10/chartex" xmlns:cx5="http://schemas.microsoft.com/office/drawing/2016/5/11/chartex" xmlns:cx6="http://schemas.microsoft.com/office/drawing/2016/5/12/chartex" xmlns:cx7="http://schemas.microsoft.com/office/drawing/2016/5/13/chartex" xmlns:cx8="http://schemas.microsoft.com/office/drawing/2016/5/14/chartex" xmlns:mc="http://schemas.openxmlformats.org/markup-compatibility/2006" xmlns:aink="http://schemas.microsoft.com/office/drawing/2016/ink" xmlns:am3d="http://schemas.microsoft.com/office/drawing/2017/model3d" xmlns:o="urn:schemas-microsoft-com:office:office" xmlns:oel="http://schemas.microsoft.com/office/2019/extlst" xmlns:r="http://schemas.openxmlformats.org/officeDocument/2006/relationships" xmlns:m="http://schemas.openxmlformats.org/officeDocument/2006/math" xmlns:v="urn:schemas-microsoft-com:vml" xmlns:wp14="http://schemas.microsoft.com/office/word/2010/wordprocessingDrawing" xmlns:wp="http://schemas.openxmlformats.org/drawingml/2006/wordprocessingDrawing" xmlns:w10="urn:schemas-microsoft-com:office:word" xmlns:w="http://schemas.openxmlformats.org/wordprocessingml/2006/main" xmlns:w14="http://schemas.microsoft.com/office/word/2010/wordml" xmlns:w15="http://schemas.microsoft.com/office/word/2012/wordml" xmlns:w16cex="http://schemas.microsoft.com/office/word/2018/wordml/cex" xmlns:w16cid="http://schemas.microsoft.com/office/word/2016/wordml/cid" xmlns:w16="http://schemas.microsoft.com/office/word/2018/wordml" xmlns:w16du="http://schemas.microsoft.com/office/word/2023/wordml/word16du" xmlns:w16sdtdh="http://schemas.microsoft.com/office/word/2020/wordml/sdtdatahash" xmlns:w16sdtfl="http://schemas.microsoft.com/office/word/2024/wordml/sdtformatlock" xmlns:w16se="http://schemas.microsoft.com/office/word/2015/wordml/symex" xmlns:wpg="http://schemas.microsoft.com/office/word/2010/wordprocessingGroup" xmlns:wpi="http://schemas.microsoft.com/office/word/2010/wordprocessingInk" xmlns:wne="http://schemas.microsoft.com/office/word/2006/wordml" xmlns:wps="http://schemas.microsoft.com/office/word/2010/wordprocessingShape" mc:Ignorable="w14 w15 w16se w16cid w16 w16cex w16sdtdh w16sdtfl w16du wp14">
+<w:hdr xmlns:wpc="http://schemas.microsoft.com/office/word/2010/wordprocessingCanvas" xmlns:cx="http://schemas.microsoft.com/office/drawing/2014/chartex" xmlns:cx1="http://schemas.microsoft.com/office/drawing/2015/9/8/chartex" xmlns:cx2="http://schemas.microsoft.com/office/drawing/2015/10/21/chartex" xmlns:cx3="http://schemas.microsoft.com/office/drawing/2016/5/9/chartex" xmlns:cx4="http://schemas.microsoft.com/office/drawing/2016/5/10/chartex" xmlns:cx5="http://schemas.microsoft.com/office/drawing/2016/5/11/chartex" xmlns:cx6="http://schemas.microsoft.com/office/drawing/2016/5/12/chartex" xmlns:cx7="http://schemas.microsoft.com/office/drawing/2016/5/13/chartex" xmlns:cx8="http://schemas.microsoft.com/office/drawing/2016/5/14/chartex" xmlns:mc="http://schemas.openxmlformats.org/markup-compatibility/2006" xmlns:aink="http://schemas.microsoft.com/office/drawing/2016/ink" xmlns:am3d="http://schemas.microsoft.com/office/drawing/2017/model3d" xmlns:o="urn:schemas-microsoft-com:office:office" xmlns:oel="http://schemas.microsoft.com/office/2019/extlst" xmlns:r="http://schemas.openxmlformats.org/officeDocument/2006/relationships" xmlns:m="http://schemas.openxmlformats.org/officeDocument/2006/math" xmlns:v="urn:schemas-microsoft-com:vml" xmlns:wp14="http://schemas.microsoft.com/office/word/2010/wordprocessingDrawing" xmlns:wp="http://schemas.openxmlformats.org/drawingml/2006/wordprocessingDrawing" xmlns:w10="urn:schemas-microsoft-com:office:word" xmlns:w="http://schemas.openxmlformats.org/wordprocessingml/2006/main" xmlns:w14="http://schemas.microsoft.com/office/word/2010/wordml" xmlns:w15="http://schemas.microsoft.com/office/word/2012/wordml" xmlns:w16cex="http://schemas.microsoft.com/office/word/2018/wordml/cex" xmlns:w16cid="http://schemas.microsoft.com/office/word/2016/wordml/cid" xmlns:w16="http://schemas.microsoft.com/office/word/2018/wordml" xmlns:w16du="http://schemas.microsoft.com/office/word/2023/wordml/word16du" xmlns:w16sdtdh="http://schemas.microsoft.com/office/word/2020/wordml/sdtdatahash" xmlns:w16se="http://schemas.microsoft.com/office/word/2015/wordml/symex" xmlns:wpg="http://schemas.microsoft.com/office/word/2010/wordprocessingGroup" xmlns:wpi="http://schemas.microsoft.com/office/word/2010/wordprocessingInk" xmlns:wne="http://schemas.microsoft.com/office/word/2006/wordml" xmlns:wps="http://schemas.microsoft.com/office/word/2010/wordprocessingShape" mc:Ignorable="w14 w15 w16se w16cid w16 w16cex w16sdtdh wp14">
   <w:p>
     <w:pPr>
       <w:pStyle w:val="En-tte"/>
@@ -4794,7 +5655,7 @@
 </file>
 
 <file path=word/numbering.xml><?xml version="1.0" encoding="utf-8"?>
-<w:numbering xmlns:wpc="http://schemas.microsoft.com/office/word/2010/wordprocessingCanvas" xmlns:cx="http://schemas.microsoft.com/office/drawing/2014/chartex" xmlns:cx1="http://schemas.microsoft.com/office/drawing/2015/9/8/chartex" xmlns:cx2="http://schemas.microsoft.com/office/drawing/2015/10/21/chartex" xmlns:cx3="http://schemas.microsoft.com/office/drawing/2016/5/9/chartex" xmlns:cx4="http://schemas.microsoft.com/office/drawing/2016/5/10/chartex" xmlns:cx5="http://schemas.microsoft.com/office/drawing/2016/5/11/chartex" xmlns:cx6="http://schemas.microsoft.com/office/drawing/2016/5/12/chartex" xmlns:cx7="http://schemas.microsoft.com/office/drawing/2016/5/13/chartex" xmlns:cx8="http://schemas.microsoft.com/office/drawing/2016/5/14/chartex" xmlns:mc="http://schemas.openxmlformats.org/markup-compatibility/2006" xmlns:aink="http://schemas.microsoft.com/office/drawing/2016/ink" xmlns:am3d="http://schemas.microsoft.com/office/drawing/2017/model3d" xmlns:o="urn:schemas-microsoft-com:office:office" xmlns:oel="http://schemas.microsoft.com/office/2019/extlst" xmlns:r="http://schemas.openxmlformats.org/officeDocument/2006/relationships" xmlns:m="http://schemas.openxmlformats.org/officeDocument/2006/math" xmlns:v="urn:schemas-microsoft-com:vml" xmlns:wp14="http://schemas.microsoft.com/office/word/2010/wordprocessingDrawing" xmlns:wp="http://schemas.openxmlformats.org/drawingml/2006/wordprocessingDrawing" xmlns:w10="urn:schemas-microsoft-com:office:word" xmlns:w="http://schemas.openxmlformats.org/wordprocessingml/2006/main" xmlns:w14="http://schemas.microsoft.com/office/word/2010/wordml" xmlns:w15="http://schemas.microsoft.com/office/word/2012/wordml" xmlns:w16cex="http://schemas.microsoft.com/office/word/2018/wordml/cex" xmlns:w16cid="http://schemas.microsoft.com/office/word/2016/wordml/cid" xmlns:w16="http://schemas.microsoft.com/office/word/2018/wordml" xmlns:w16du="http://schemas.microsoft.com/office/word/2023/wordml/word16du" xmlns:w16sdtdh="http://schemas.microsoft.com/office/word/2020/wordml/sdtdatahash" xmlns:w16sdtfl="http://schemas.microsoft.com/office/word/2024/wordml/sdtformatlock" xmlns:w16se="http://schemas.microsoft.com/office/word/2015/wordml/symex" xmlns:wpg="http://schemas.microsoft.com/office/word/2010/wordprocessingGroup" xmlns:wpi="http://schemas.microsoft.com/office/word/2010/wordprocessingInk" xmlns:wne="http://schemas.microsoft.com/office/word/2006/wordml" xmlns:wps="http://schemas.microsoft.com/office/word/2010/wordprocessingShape" mc:Ignorable="w14 w15 w16se w16cid w16 w16cex w16sdtdh w16sdtfl w16du wp14">
+<w:numbering xmlns:wpc="http://schemas.microsoft.com/office/word/2010/wordprocessingCanvas" xmlns:cx="http://schemas.microsoft.com/office/drawing/2014/chartex" xmlns:cx1="http://schemas.microsoft.com/office/drawing/2015/9/8/chartex" xmlns:cx2="http://schemas.microsoft.com/office/drawing/2015/10/21/chartex" xmlns:cx3="http://schemas.microsoft.com/office/drawing/2016/5/9/chartex" xmlns:cx4="http://schemas.microsoft.com/office/drawing/2016/5/10/chartex" xmlns:cx5="http://schemas.microsoft.com/office/drawing/2016/5/11/chartex" xmlns:cx6="http://schemas.microsoft.com/office/drawing/2016/5/12/chartex" xmlns:cx7="http://schemas.microsoft.com/office/drawing/2016/5/13/chartex" xmlns:cx8="http://schemas.microsoft.com/office/drawing/2016/5/14/chartex" xmlns:mc="http://schemas.openxmlformats.org/markup-compatibility/2006" xmlns:aink="http://schemas.microsoft.com/office/drawing/2016/ink" xmlns:am3d="http://schemas.microsoft.com/office/drawing/2017/model3d" xmlns:o="urn:schemas-microsoft-com:office:office" xmlns:oel="http://schemas.microsoft.com/office/2019/extlst" xmlns:r="http://schemas.openxmlformats.org/officeDocument/2006/relationships" xmlns:m="http://schemas.openxmlformats.org/officeDocument/2006/math" xmlns:v="urn:schemas-microsoft-com:vml" xmlns:wp14="http://schemas.microsoft.com/office/word/2010/wordprocessingDrawing" xmlns:wp="http://schemas.openxmlformats.org/drawingml/2006/wordprocessingDrawing" xmlns:w10="urn:schemas-microsoft-com:office:word" xmlns:w="http://schemas.openxmlformats.org/wordprocessingml/2006/main" xmlns:w14="http://schemas.microsoft.com/office/word/2010/wordml" xmlns:w15="http://schemas.microsoft.com/office/word/2012/wordml" xmlns:w16cex="http://schemas.microsoft.com/office/word/2018/wordml/cex" xmlns:w16cid="http://schemas.microsoft.com/office/word/2016/wordml/cid" xmlns:w16="http://schemas.microsoft.com/office/word/2018/wordml" xmlns:w16du="http://schemas.microsoft.com/office/word/2023/wordml/word16du" xmlns:w16sdtdh="http://schemas.microsoft.com/office/word/2020/wordml/sdtdatahash" xmlns:w16se="http://schemas.microsoft.com/office/word/2015/wordml/symex" xmlns:wpg="http://schemas.microsoft.com/office/word/2010/wordprocessingGroup" xmlns:wpi="http://schemas.microsoft.com/office/word/2010/wordprocessingInk" xmlns:wne="http://schemas.microsoft.com/office/word/2006/wordml" xmlns:wps="http://schemas.microsoft.com/office/word/2010/wordprocessingShape" mc:Ignorable="w14 w15 w16se w16cid w16 w16cex w16sdtdh wp14">
   <w:abstractNum w:abstractNumId="0" w15:restartNumberingAfterBreak="0">
     <w:nsid w:val="06B863A5"/>
     <w:multiLevelType w:val="hybridMultilevel"/>
@@ -6702,7 +7563,7 @@
 </file>
 
 <file path=word/styles.xml><?xml version="1.0" encoding="utf-8"?>
-<w:styles xmlns:mc="http://schemas.openxmlformats.org/markup-compatibility/2006" xmlns:r="http://schemas.openxmlformats.org/officeDocument/2006/relationships" xmlns:w="http://schemas.openxmlformats.org/wordprocessingml/2006/main" xmlns:w14="http://schemas.microsoft.com/office/word/2010/wordml" xmlns:w15="http://schemas.microsoft.com/office/word/2012/wordml" xmlns:w16cex="http://schemas.microsoft.com/office/word/2018/wordml/cex" xmlns:w16cid="http://schemas.microsoft.com/office/word/2016/wordml/cid" xmlns:w16="http://schemas.microsoft.com/office/word/2018/wordml" xmlns:w16du="http://schemas.microsoft.com/office/word/2023/wordml/word16du" xmlns:w16sdtdh="http://schemas.microsoft.com/office/word/2020/wordml/sdtdatahash" xmlns:w16sdtfl="http://schemas.microsoft.com/office/word/2024/wordml/sdtformatlock" xmlns:w16se="http://schemas.microsoft.com/office/word/2015/wordml/symex" mc:Ignorable="w14 w15 w16se w16cid w16 w16cex w16sdtdh w16sdtfl w16du">
+<w:styles xmlns:mc="http://schemas.openxmlformats.org/markup-compatibility/2006" xmlns:r="http://schemas.openxmlformats.org/officeDocument/2006/relationships" xmlns:w="http://schemas.openxmlformats.org/wordprocessingml/2006/main" xmlns:w14="http://schemas.microsoft.com/office/word/2010/wordml" xmlns:w15="http://schemas.microsoft.com/office/word/2012/wordml" xmlns:w16cex="http://schemas.microsoft.com/office/word/2018/wordml/cex" xmlns:w16cid="http://schemas.microsoft.com/office/word/2016/wordml/cid" xmlns:w16="http://schemas.microsoft.com/office/word/2018/wordml" xmlns:w16sdtdh="http://schemas.microsoft.com/office/word/2020/wordml/sdtdatahash" xmlns:w16se="http://schemas.microsoft.com/office/word/2015/wordml/symex" mc:Ignorable="w14 w15 w16se w16cid w16 w16cex w16sdtdh">
   <w:docDefaults>
     <w:rPrDefault>
       <w:rPr>

</xml_diff>

<commit_message>
feat(Tests_unitaires): créeation de tests unitaire
[37][DONE]
</commit_message>
<xml_diff>
--- a/DOC/RAPPORT PROJET.docx
+++ b/DOC/RAPPORT PROJET.docx
@@ -1,7 +1,16 @@
 
 <file path=word/document.xml><?xml version="1.0" encoding="utf-8"?>
-<w:document xmlns:wpc="http://schemas.microsoft.com/office/word/2010/wordprocessingCanvas" xmlns:cx="http://schemas.microsoft.com/office/drawing/2014/chartex" xmlns:cx1="http://schemas.microsoft.com/office/drawing/2015/9/8/chartex" xmlns:cx2="http://schemas.microsoft.com/office/drawing/2015/10/21/chartex" xmlns:cx3="http://schemas.microsoft.com/office/drawing/2016/5/9/chartex" xmlns:cx4="http://schemas.microsoft.com/office/drawing/2016/5/10/chartex" xmlns:cx5="http://schemas.microsoft.com/office/drawing/2016/5/11/chartex" xmlns:cx6="http://schemas.microsoft.com/office/drawing/2016/5/12/chartex" xmlns:cx7="http://schemas.microsoft.com/office/drawing/2016/5/13/chartex" xmlns:cx8="http://schemas.microsoft.com/office/drawing/2016/5/14/chartex" xmlns:mc="http://schemas.openxmlformats.org/markup-compatibility/2006" xmlns:aink="http://schemas.microsoft.com/office/drawing/2016/ink" xmlns:am3d="http://schemas.microsoft.com/office/drawing/2017/model3d" xmlns:o="urn:schemas-microsoft-com:office:office" xmlns:oel="http://schemas.microsoft.com/office/2019/extlst" xmlns:r="http://schemas.openxmlformats.org/officeDocument/2006/relationships" xmlns:m="http://schemas.openxmlformats.org/officeDocument/2006/math" xmlns:v="urn:schemas-microsoft-com:vml" xmlns:wp14="http://schemas.microsoft.com/office/word/2010/wordprocessingDrawing" xmlns:wp="http://schemas.openxmlformats.org/drawingml/2006/wordprocessingDrawing" xmlns:w10="urn:schemas-microsoft-com:office:word" xmlns:w="http://schemas.openxmlformats.org/wordprocessingml/2006/main" xmlns:w14="http://schemas.microsoft.com/office/word/2010/wordml" xmlns:w15="http://schemas.microsoft.com/office/word/2012/wordml" xmlns:w16cex="http://schemas.microsoft.com/office/word/2018/wordml/cex" xmlns:w16cid="http://schemas.microsoft.com/office/word/2016/wordml/cid" xmlns:w16="http://schemas.microsoft.com/office/word/2018/wordml" xmlns:w16du="http://schemas.microsoft.com/office/word/2023/wordml/word16du" xmlns:w16sdtdh="http://schemas.microsoft.com/office/word/2020/wordml/sdtdatahash" xmlns:w16se="http://schemas.microsoft.com/office/word/2015/wordml/symex" xmlns:wpg="http://schemas.microsoft.com/office/word/2010/wordprocessingGroup" xmlns:wpi="http://schemas.microsoft.com/office/word/2010/wordprocessingInk" xmlns:wne="http://schemas.microsoft.com/office/word/2006/wordml" xmlns:wps="http://schemas.microsoft.com/office/word/2010/wordprocessingShape" mc:Ignorable="w14 w15 w16se w16cid w16 w16cex w16sdtdh wp14">
+<w:document xmlns:wpc="http://schemas.microsoft.com/office/word/2010/wordprocessingCanvas" xmlns:cx="http://schemas.microsoft.com/office/drawing/2014/chartex" xmlns:cx1="http://schemas.microsoft.com/office/drawing/2015/9/8/chartex" xmlns:cx2="http://schemas.microsoft.com/office/drawing/2015/10/21/chartex" xmlns:cx3="http://schemas.microsoft.com/office/drawing/2016/5/9/chartex" xmlns:cx4="http://schemas.microsoft.com/office/drawing/2016/5/10/chartex" xmlns:cx5="http://schemas.microsoft.com/office/drawing/2016/5/11/chartex" xmlns:cx6="http://schemas.microsoft.com/office/drawing/2016/5/12/chartex" xmlns:cx7="http://schemas.microsoft.com/office/drawing/2016/5/13/chartex" xmlns:cx8="http://schemas.microsoft.com/office/drawing/2016/5/14/chartex" xmlns:mc="http://schemas.openxmlformats.org/markup-compatibility/2006" xmlns:aink="http://schemas.microsoft.com/office/drawing/2016/ink" xmlns:am3d="http://schemas.microsoft.com/office/drawing/2017/model3d" xmlns:o="urn:schemas-microsoft-com:office:office" xmlns:oel="http://schemas.microsoft.com/office/2019/extlst" xmlns:r="http://schemas.openxmlformats.org/officeDocument/2006/relationships" xmlns:m="http://schemas.openxmlformats.org/officeDocument/2006/math" xmlns:v="urn:schemas-microsoft-com:vml" xmlns:wp14="http://schemas.microsoft.com/office/word/2010/wordprocessingDrawing" xmlns:wp="http://schemas.openxmlformats.org/drawingml/2006/wordprocessingDrawing" xmlns:w10="urn:schemas-microsoft-com:office:word" xmlns:w="http://schemas.openxmlformats.org/wordprocessingml/2006/main" xmlns:w14="http://schemas.microsoft.com/office/word/2010/wordml" xmlns:w15="http://schemas.microsoft.com/office/word/2012/wordml" xmlns:w16cex="http://schemas.microsoft.com/office/word/2018/wordml/cex" xmlns:w16cid="http://schemas.microsoft.com/office/word/2016/wordml/cid" xmlns:w16="http://schemas.microsoft.com/office/word/2018/wordml" xmlns:w16du="http://schemas.microsoft.com/office/word/2023/wordml/word16du" xmlns:w16sdtdh="http://schemas.microsoft.com/office/word/2020/wordml/sdtdatahash" xmlns:w16sdtfl="http://schemas.microsoft.com/office/word/2024/wordml/sdtformatlock" xmlns:w16se="http://schemas.microsoft.com/office/word/2015/wordml/symex" xmlns:wpg="http://schemas.microsoft.com/office/word/2010/wordprocessingGroup" xmlns:wpi="http://schemas.microsoft.com/office/word/2010/wordprocessingInk" xmlns:wne="http://schemas.microsoft.com/office/word/2006/wordml" xmlns:wps="http://schemas.microsoft.com/office/word/2010/wordprocessingShape" mc:Ignorable="w14 w15 w16se w16cid w16 w16cex w16sdtdh w16sdtfl w16du wp14">
   <w:body>
+    <w:p>
+      <w:pPr>
+        <w:pStyle w:val="Titre"/>
+        <w:pBdr>
+          <w:bottom w:val="single" w:sz="12" w:space="1" w:color="auto"/>
+        </w:pBdr>
+        <w:jc w:val="center"/>
+      </w:pPr>
+    </w:p>
     <w:p>
       <w:pPr>
         <w:pStyle w:val="Titre"/>
@@ -2135,7 +2144,15 @@
       </w:r>
       <w:proofErr w:type="gramEnd"/>
       <w:r>
-        <w:t xml:space="preserve"> de concert ) afin d'apporter une ambiance au jeu et d'immerger totalement le joueur dans le thème.</w:t>
+        <w:t xml:space="preserve"> de </w:t>
+      </w:r>
+      <w:proofErr w:type="gramStart"/>
+      <w:r>
+        <w:t>concert )</w:t>
+      </w:r>
+      <w:proofErr w:type="gramEnd"/>
+      <w:r>
+        <w:t xml:space="preserve"> afin d'apporter une ambiance au jeu et d'immerger totalement le joueur dans le thème.</w:t>
       </w:r>
     </w:p>
     <w:p>
@@ -2244,8 +2261,13 @@
       </w:r>
       <w:proofErr w:type="gramEnd"/>
       <w:r>
-        <w:t xml:space="preserve"> l'écran parfaitement )</w:t>
-      </w:r>
+        <w:t xml:space="preserve"> l'écran </w:t>
+      </w:r>
+      <w:proofErr w:type="gramStart"/>
+      <w:r>
+        <w:t>parfaitement )</w:t>
+      </w:r>
+      <w:proofErr w:type="gramEnd"/>
     </w:p>
     <w:p>
       <w:pPr>
@@ -2877,7 +2899,15 @@
       </w:r>
       <w:proofErr w:type="gramEnd"/>
       <w:r>
-        <w:t xml:space="preserve"> munitions affiche différents accords.</w:t>
+        <w:t xml:space="preserve"> munitions </w:t>
+      </w:r>
+      <w:proofErr w:type="gramStart"/>
+      <w:r>
+        <w:t>affiche</w:t>
+      </w:r>
+      <w:proofErr w:type="gramEnd"/>
+      <w:r>
+        <w:t xml:space="preserve"> différents accords.</w:t>
       </w:r>
     </w:p>
     <w:p>
@@ -2936,7 +2966,7 @@
           <w:noProof/>
         </w:rPr>
         <w:drawing>
-          <wp:inline distT="0" distB="0" distL="0" distR="0" wp14:anchorId="5887A5FE" wp14:editId="0A367803">
+          <wp:inline distT="0" distB="0" distL="0" distR="0" wp14:anchorId="5887A5FE" wp14:editId="722D1100">
             <wp:extent cx="3921125" cy="2614227"/>
             <wp:effectExtent l="0" t="0" r="3175" b="0"/>
             <wp:docPr id="173038047" name="Image 8" descr="Image">
@@ -3081,7 +3111,15 @@
       </w:r>
       <w:proofErr w:type="gramEnd"/>
       <w:r>
-        <w:t xml:space="preserve"> aussi le pouvoir d'éliminer le joueur principale afin de rajouter de la difficulté pour le joueur principale.</w:t>
+        <w:t xml:space="preserve"> aussi le pouvoir d'éliminer </w:t>
+      </w:r>
+      <w:proofErr w:type="gramStart"/>
+      <w:r>
+        <w:t>le joueur principale</w:t>
+      </w:r>
+      <w:proofErr w:type="gramEnd"/>
+      <w:r>
+        <w:t xml:space="preserve"> afin de rajouter de la difficulté pour le joueur principale.</w:t>
       </w:r>
     </w:p>
     <w:p>
@@ -3435,7 +3473,15 @@
       </w:r>
       <w:proofErr w:type="gramEnd"/>
       <w:r>
-        <w:t xml:space="preserve"> obstacles perdent la moitié de leur vie au contact d'un ennemi et le tiers si c'est une de leur munitions.</w:t>
+        <w:t xml:space="preserve"> obstacles perdent la moitié de leur vie au contact d'un ennemi et le tiers si c'est une de </w:t>
+      </w:r>
+      <w:proofErr w:type="gramStart"/>
+      <w:r>
+        <w:t>leur munitions</w:t>
+      </w:r>
+      <w:proofErr w:type="gramEnd"/>
+      <w:r>
+        <w:t>.</w:t>
       </w:r>
     </w:p>
     <w:p>
@@ -4285,7 +4331,15 @@
       </w:r>
       <w:proofErr w:type="gramEnd"/>
       <w:r>
-        <w:t>) Est une méthode qui permets que lorsqu’elle est appelée, le guitariste se déplace contre la gauche.</w:t>
+        <w:t xml:space="preserve">) Est une méthode qui permets que lorsqu’elle </w:t>
+      </w:r>
+      <w:proofErr w:type="gramStart"/>
+      <w:r>
+        <w:t>est</w:t>
+      </w:r>
+      <w:proofErr w:type="gramEnd"/>
+      <w:r>
+        <w:t xml:space="preserve"> appelée, le guitariste se déplace contre la gauche.</w:t>
       </w:r>
     </w:p>
     <w:p>
@@ -4365,7 +4419,15 @@
       </w:r>
       <w:proofErr w:type="gramEnd"/>
       <w:r>
-        <w:t>) Est une méthode qui permets que lorsqu’elle est appelée, le guitariste se déplace contre la droite.</w:t>
+        <w:t xml:space="preserve">) Est une méthode qui permets que lorsqu’elle </w:t>
+      </w:r>
+      <w:proofErr w:type="gramStart"/>
+      <w:r>
+        <w:t>est</w:t>
+      </w:r>
+      <w:proofErr w:type="gramEnd"/>
+      <w:r>
+        <w:t xml:space="preserve"> appelée, le guitariste se déplace contre la droite.</w:t>
       </w:r>
     </w:p>
     <w:p>
@@ -4433,25 +4495,20 @@
       <w:r>
         <w:t xml:space="preserve">La troisième méthode est </w:t>
       </w:r>
+      <w:proofErr w:type="gramStart"/>
+      <w:r>
+        <w:t>Render(</w:t>
+      </w:r>
+      <w:proofErr w:type="gramEnd"/>
+      <w:r>
+        <w:t xml:space="preserve">). Elle sert à ce que lorsqu’on l’appelle ça dessine le guitariste à un emplacement précis dans le </w:t>
+      </w:r>
       <w:proofErr w:type="spellStart"/>
-      <w:proofErr w:type="gramStart"/>
-      <w:r>
-        <w:t>Render</w:t>
+      <w:r>
+        <w:t>airspace</w:t>
       </w:r>
       <w:proofErr w:type="spellEnd"/>
       <w:r>
-        <w:t>(</w:t>
-      </w:r>
-      <w:proofErr w:type="gramEnd"/>
-      <w:r>
-        <w:t xml:space="preserve">). Elle sert à ce que lorsqu’on l’appelle ça dessine le guitariste à un emplacement précis dans le </w:t>
-      </w:r>
-      <w:proofErr w:type="spellStart"/>
-      <w:r>
-        <w:t>airspace</w:t>
-      </w:r>
-      <w:proofErr w:type="spellEnd"/>
-      <w:r>
         <w:t>.</w:t>
       </w:r>
     </w:p>
@@ -4460,6 +4517,9 @@
         <w:jc w:val="center"/>
       </w:pPr>
       <w:r>
+        <w:rPr>
+          <w:noProof/>
+        </w:rPr>
         <w:drawing>
           <wp:inline distT="0" distB="0" distL="0" distR="0" wp14:anchorId="26816061" wp14:editId="1B68076B">
             <wp:extent cx="3924527" cy="816437"/>
@@ -4524,14 +4584,6 @@
       </w:r>
     </w:p>
     <w:p>
-      <w:pPr>
-        <w:rPr>
-          <w:b/>
-          <w:bCs/>
-          <w:i/>
-          <w:iCs/>
-        </w:rPr>
-      </w:pPr>
       <w:r>
         <w:rPr>
           <w:b/>
@@ -4546,6 +4598,8 @@
     <w:p>
       <w:pPr>
         <w:rPr>
+          <w:b/>
+          <w:bCs/>
           <w:i/>
           <w:iCs/>
           <w:color w:val="FF0000"/>
@@ -4553,81 +4607,10 @@
         </w:rPr>
       </w:pPr>
       <w:r>
-        <w:rPr>
-          <w:i/>
-          <w:iCs/>
-          <w:color w:val="FF0000"/>
-          <w:u w:val="single"/>
-        </w:rPr>
-        <w:t>IL Y’A BEAUCOUP DE RANDOMS QUI VONT ETRE R</w:t>
-      </w:r>
-      <w:r>
-        <w:rPr>
-          <w:i/>
-          <w:iCs/>
-          <w:color w:val="FF0000"/>
-          <w:u w:val="single"/>
-        </w:rPr>
-        <w:t>EMP</w:t>
-      </w:r>
-      <w:r>
-        <w:rPr>
-          <w:i/>
-          <w:iCs/>
-          <w:color w:val="FF0000"/>
-          <w:u w:val="single"/>
-        </w:rPr>
-        <w:t>L</w:t>
-      </w:r>
-      <w:r>
-        <w:rPr>
-          <w:i/>
-          <w:iCs/>
-          <w:color w:val="FF0000"/>
-          <w:u w:val="single"/>
-        </w:rPr>
-        <w:t>AC</w:t>
-      </w:r>
-      <w:r>
-        <w:rPr>
-          <w:i/>
-          <w:iCs/>
-          <w:color w:val="FF0000"/>
-          <w:u w:val="single"/>
-        </w:rPr>
-        <w:t xml:space="preserve">ER </w:t>
-      </w:r>
-      <w:r>
-        <w:rPr>
-          <w:i/>
-          <w:iCs/>
-          <w:color w:val="FF0000"/>
-          <w:u w:val="single"/>
-        </w:rPr>
-        <w:t xml:space="preserve">PROCHAINEMENT </w:t>
-      </w:r>
-      <w:r>
-        <w:rPr>
-          <w:i/>
-          <w:iCs/>
-          <w:color w:val="FF0000"/>
-          <w:u w:val="single"/>
-        </w:rPr>
-        <w:t>EN UN RANDOM DANS UN FICHIER CONFIG.CS</w:t>
-      </w:r>
-      <w:r>
-        <w:rPr>
-          <w:i/>
-          <w:iCs/>
-          <w:color w:val="FF0000"/>
-          <w:u w:val="single"/>
-        </w:rPr>
-        <w:t>.</w:t>
-      </w:r>
-    </w:p>
-    <w:p>
-      <w:r>
-        <w:t>Nous avons :</w:t>
+        <w:t>Nous avons</w:t>
+      </w:r>
+      <w:r>
+        <w:t> :</w:t>
       </w:r>
     </w:p>
     <w:p>
@@ -4636,10 +4619,10 @@
       </w:pPr>
       <w:r>
         <w:drawing>
-          <wp:inline distT="0" distB="0" distL="0" distR="0" wp14:anchorId="7CD356DD" wp14:editId="6A6F9171">
-            <wp:extent cx="1964552" cy="1936326"/>
-            <wp:effectExtent l="152400" t="152400" r="360045" b="368935"/>
-            <wp:docPr id="376218113" name="Image 1" descr="Une image contenant texte, capture d’écran, Police&#10;&#10;Description générée automatiquement"/>
+          <wp:inline distT="0" distB="0" distL="0" distR="0" wp14:anchorId="10E6DBFC" wp14:editId="2FA45562">
+            <wp:extent cx="1996440" cy="3274163"/>
+            <wp:effectExtent l="152400" t="152400" r="365760" b="364490"/>
+            <wp:docPr id="1974489193" name="Image 1"/>
             <wp:cNvGraphicFramePr>
               <a:graphicFrameLocks xmlns:a="http://schemas.openxmlformats.org/drawingml/2006/main" noChangeAspect="1"/>
             </wp:cNvGraphicFramePr>
@@ -4647,7 +4630,7 @@
               <a:graphicData uri="http://schemas.openxmlformats.org/drawingml/2006/picture">
                 <pic:pic xmlns:pic="http://schemas.openxmlformats.org/drawingml/2006/picture">
                   <pic:nvPicPr>
-                    <pic:cNvPr id="376218113" name="Image 1" descr="Une image contenant texte, capture d’écran, Police&#10;&#10;Description générée automatiquement"/>
+                    <pic:cNvPr id="1974489193" name=""/>
                     <pic:cNvPicPr/>
                   </pic:nvPicPr>
                   <pic:blipFill>
@@ -4659,7 +4642,7 @@
                   <pic:spPr>
                     <a:xfrm>
                       <a:off x="0" y="0"/>
-                      <a:ext cx="1967163" cy="1938899"/>
+                      <a:ext cx="1998433" cy="3277431"/>
                     </a:xfrm>
                     <a:prstGeom prst="rect">
                       <a:avLst/>
@@ -4683,150 +4666,87 @@
       </w:r>
     </w:p>
     <w:p>
+      <w:r>
+        <w:lastRenderedPageBreak/>
+        <w:t xml:space="preserve">Nous avons </w:t>
+      </w:r>
       <w:proofErr w:type="spellStart"/>
+      <w:r>
+        <w:t>rdmEnnemis</w:t>
+      </w:r>
+      <w:proofErr w:type="spellEnd"/>
+      <w:r>
+        <w:t xml:space="preserve"> qui est la variable qui va stocker </w:t>
+      </w:r>
       <w:proofErr w:type="gramStart"/>
       <w:r>
-        <w:t>rdmEnnemis</w:t>
+        <w:t>quel ennemis</w:t>
+      </w:r>
+      <w:proofErr w:type="gramEnd"/>
+      <w:r>
+        <w:t xml:space="preserve"> on utilise. Nous avons également </w:t>
+      </w:r>
+      <w:proofErr w:type="spellStart"/>
+      <w:r>
+        <w:t>height</w:t>
       </w:r>
       <w:proofErr w:type="spellEnd"/>
+      <w:r>
+        <w:t xml:space="preserve"> et </w:t>
+      </w:r>
+      <w:proofErr w:type="spellStart"/>
+      <w:r>
+        <w:t>width</w:t>
+      </w:r>
+      <w:proofErr w:type="spellEnd"/>
+      <w:r>
+        <w:t xml:space="preserve"> qui définissent les </w:t>
+      </w:r>
+      <w:proofErr w:type="spellStart"/>
+      <w:r>
+        <w:t>diimensions</w:t>
+      </w:r>
+      <w:proofErr w:type="spellEnd"/>
+      <w:r>
+        <w:t xml:space="preserve"> de l’ennemi.</w:t>
+      </w:r>
+    </w:p>
+    <w:p>
+      <w:r>
+        <w:t>Nous avons aussi tab ennemis qui est le tableau qui stock chaque ennemis et index ennemis qui va permettre que l’on puisse choisir de manière aléatoire l’ennemie que va représenter l’instance.</w:t>
+      </w:r>
+    </w:p>
+    <w:p>
+      <w:r>
+        <w:t xml:space="preserve">Il y a également X et Y qui représentent </w:t>
+      </w:r>
+      <w:proofErr w:type="gramStart"/>
+      <w:r>
+        <w:t>les position</w:t>
+      </w:r>
       <w:proofErr w:type="gramEnd"/>
       <w:r>
-        <w:t xml:space="preserve"> représente la variable qui va stocker une image contenue dans le tableau d’image des ennemis « </w:t>
-      </w:r>
-      <w:proofErr w:type="spellStart"/>
-      <w:r>
-        <w:t>tabOfEnnemis</w:t>
-      </w:r>
-      <w:proofErr w:type="spellEnd"/>
-      <w:r>
-        <w:t xml:space="preserve"> » qui aura été choisis aléatoirement par </w:t>
-      </w:r>
-      <w:proofErr w:type="spellStart"/>
-      <w:r>
-        <w:t>indexEnnemis</w:t>
-      </w:r>
-      <w:proofErr w:type="spellEnd"/>
-      <w:r>
-        <w:t xml:space="preserve"> qui donneras un index de tableau aléatoire.</w:t>
-      </w:r>
-    </w:p>
-    <w:p/>
-    <w:p>
-      <w:pPr>
-        <w:rPr>
-          <w:b/>
-          <w:bCs/>
-          <w:i/>
-          <w:iCs/>
-          <w:color w:val="FF0000"/>
-          <w:u w:val="single"/>
-        </w:rPr>
-      </w:pPr>
-      <w:r>
-        <w:t xml:space="preserve">Nous avons également : </w:t>
-      </w:r>
-      <w:r>
-        <w:rPr>
-          <w:b/>
-          <w:bCs/>
-          <w:i/>
-          <w:iCs/>
-          <w:color w:val="FF0000"/>
-          <w:u w:val="single"/>
-        </w:rPr>
-        <w:t>Changement dans peu de temps !</w:t>
-      </w:r>
-    </w:p>
-    <w:p>
-      <w:pPr>
-        <w:jc w:val="center"/>
-      </w:pPr>
-      <w:r>
-        <w:drawing>
-          <wp:inline distT="0" distB="0" distL="0" distR="0" wp14:anchorId="1978CFE6" wp14:editId="081DF912">
-            <wp:extent cx="1580727" cy="1653764"/>
-            <wp:effectExtent l="190500" t="190500" r="191135" b="194310"/>
-            <wp:docPr id="542724955" name="Image 1" descr="Une image contenant texte, capture d’écran, Police&#10;&#10;Description générée automatiquement"/>
-            <wp:cNvGraphicFramePr>
-              <a:graphicFrameLocks xmlns:a="http://schemas.openxmlformats.org/drawingml/2006/main" noChangeAspect="1"/>
-            </wp:cNvGraphicFramePr>
-            <a:graphic xmlns:a="http://schemas.openxmlformats.org/drawingml/2006/main">
-              <a:graphicData uri="http://schemas.openxmlformats.org/drawingml/2006/picture">
-                <pic:pic xmlns:pic="http://schemas.openxmlformats.org/drawingml/2006/picture">
-                  <pic:nvPicPr>
-                    <pic:cNvPr id="542724955" name="Image 1" descr="Une image contenant texte, capture d’écran, Police&#10;&#10;Description générée automatiquement"/>
-                    <pic:cNvPicPr/>
-                  </pic:nvPicPr>
-                  <pic:blipFill>
-                    <a:blip r:embed="rId38"/>
-                    <a:stretch>
-                      <a:fillRect/>
-                    </a:stretch>
-                  </pic:blipFill>
-                  <pic:spPr>
-                    <a:xfrm>
-                      <a:off x="0" y="0"/>
-                      <a:ext cx="1592796" cy="1666391"/>
-                    </a:xfrm>
-                    <a:prstGeom prst="rect">
-                      <a:avLst/>
-                    </a:prstGeom>
-                    <a:ln>
-                      <a:noFill/>
-                    </a:ln>
-                    <a:effectLst>
-                      <a:outerShdw blurRad="190500" algn="tl" rotWithShape="0">
-                        <a:srgbClr val="000000">
-                          <a:alpha val="70000"/>
-                        </a:srgbClr>
-                      </a:outerShdw>
-                    </a:effectLst>
-                  </pic:spPr>
-                </pic:pic>
-              </a:graphicData>
-            </a:graphic>
-          </wp:inline>
-        </w:drawing>
-      </w:r>
-    </w:p>
-    <w:p>
-      <w:proofErr w:type="spellStart"/>
+        <w:t xml:space="preserve"> des ennemis individuellement.</w:t>
+      </w:r>
+      <w:r>
+        <w:t xml:space="preserve"> Ainsi que speed qui représente le nombre de pixels par seconde on l’utilise également pour savoir combien de pixel se déplacer par intervalles </w:t>
+      </w:r>
+      <w:r>
+        <w:sym w:font="Wingdings" w:char="F0E0"/>
+      </w:r>
+      <w:r>
+        <w:t xml:space="preserve"> méthode </w:t>
+      </w:r>
       <w:proofErr w:type="gramStart"/>
       <w:r>
-        <w:t>tabOfBullets</w:t>
-      </w:r>
-      <w:proofErr w:type="spellEnd"/>
+        <w:t>update(</w:t>
+      </w:r>
       <w:proofErr w:type="gramEnd"/>
       <w:r>
-        <w:t xml:space="preserve"> qui représente le tableau contenant </w:t>
-      </w:r>
-      <w:proofErr w:type="spellStart"/>
-      <w:r>
-        <w:t>tout</w:t>
-      </w:r>
-      <w:proofErr w:type="spellEnd"/>
-      <w:r>
-        <w:t xml:space="preserve"> les munitions ennemis et qu’on pourra choisir aléatoirement la munitions de l’ennemi. </w:t>
-      </w:r>
-      <w:r>
-        <w:t>Il y a également X et Y qui représentent les position des ennemis individuellement.</w:t>
-      </w:r>
-      <w:r>
-        <w:t xml:space="preserve"> Ainsi que speed qui représente le nombre de pixels par seconde on l’utilise également pour savoir combien de pixel se déplacer par intervalles </w:t>
-      </w:r>
-      <w:r>
-        <w:sym w:font="Wingdings" w:char="F0E0"/>
-      </w:r>
-      <w:r>
-        <w:t xml:space="preserve"> méthode </w:t>
-      </w:r>
-      <w:proofErr w:type="gramStart"/>
-      <w:r>
-        <w:t>update(</w:t>
-      </w:r>
-      <w:proofErr w:type="gramEnd"/>
-      <w:r>
-        <w:t>) .</w:t>
+        <w:t>)</w:t>
+      </w:r>
+      <w:r>
+        <w:t>.</w:t>
       </w:r>
     </w:p>
     <w:p/>
@@ -4888,7 +4808,7 @@
                     </pic:cNvPicPr>
                   </pic:nvPicPr>
                   <pic:blipFill>
-                    <a:blip r:embed="rId39">
+                    <a:blip r:embed="rId38">
                       <a:extLst>
                         <a:ext uri="{28A0092B-C50C-407E-A947-70E740481C1C}">
                           <a14:useLocalDpi xmlns:a14="http://schemas.microsoft.com/office/drawing/2010/main" val="0"/>
@@ -4919,13 +4839,7 @@
     </w:p>
     <w:p>
       <w:r>
-        <w:t xml:space="preserve">Nous pouvons dans le constructeur qu’il détient comme signature X qui représente la position de l’ennemi sur l’axe X et Y </w:t>
-      </w:r>
-      <w:r>
-        <w:t>qui représente la position de l’ennemi sur l’axe</w:t>
-      </w:r>
-      <w:r>
-        <w:t xml:space="preserve"> Y.</w:t>
+        <w:t>Nous pouvons dans le constructeur qu’il détient comme signature X qui représente la position de l’ennemi sur l’axe X et Y qui représente la position de l’ennemi sur l’axe Y.</w:t>
       </w:r>
       <w:r>
         <w:t xml:space="preserve"> Puis il y’a </w:t>
@@ -4939,7 +4853,6 @@
         <w:t xml:space="preserve"> qui choisis lors de l’instanciation quelle image de l’ennemi ça va afficher de manière aléatoire.</w:t>
       </w:r>
     </w:p>
-    <w:p/>
     <w:p>
       <w:pPr>
         <w:rPr>
@@ -4958,28 +4871,6 @@
           <w:iCs/>
           <w:u w:val="single"/>
         </w:rPr>
-        <w:br w:type="page"/>
-      </w:r>
-    </w:p>
-    <w:p>
-      <w:pPr>
-        <w:rPr>
-          <w:b/>
-          <w:bCs/>
-          <w:i/>
-          <w:iCs/>
-          <w:u w:val="single"/>
-        </w:rPr>
-      </w:pPr>
-      <w:r>
-        <w:rPr>
-          <w:b/>
-          <w:bCs/>
-          <w:i/>
-          <w:iCs/>
-          <w:u w:val="single"/>
-        </w:rPr>
-        <w:lastRenderedPageBreak/>
         <w:t>Méthodes :</w:t>
       </w:r>
     </w:p>
@@ -5009,6 +4900,9 @@
         <w:jc w:val="center"/>
       </w:pPr>
       <w:r>
+        <w:rPr>
+          <w:noProof/>
+        </w:rPr>
         <w:drawing>
           <wp:inline distT="0" distB="0" distL="0" distR="0" wp14:anchorId="31EA5103" wp14:editId="335A0BAD">
             <wp:extent cx="2895851" cy="1242168"/>
@@ -5025,7 +4919,7 @@
                     <pic:cNvPicPr/>
                   </pic:nvPicPr>
                   <pic:blipFill>
-                    <a:blip r:embed="rId40"/>
+                    <a:blip r:embed="rId39"/>
                     <a:stretch>
                       <a:fillRect/>
                     </a:stretch>
@@ -5081,6 +4975,7 @@
         </w:rPr>
       </w:pPr>
       <w:r>
+        <w:lastRenderedPageBreak/>
         <w:t xml:space="preserve">Nous avons ensuite la </w:t>
       </w:r>
       <w:proofErr w:type="spellStart"/>
@@ -5091,14 +4986,9 @@
       <w:r>
         <w:t xml:space="preserve"> </w:t>
       </w:r>
-      <w:proofErr w:type="spellStart"/>
       <w:proofErr w:type="gramStart"/>
       <w:r>
-        <w:t>Render</w:t>
-      </w:r>
-      <w:proofErr w:type="spellEnd"/>
-      <w:r>
-        <w:t>(</w:t>
+        <w:t>Render(</w:t>
       </w:r>
       <w:proofErr w:type="gramEnd"/>
       <w:r>
@@ -5110,6 +5000,9 @@
         <w:jc w:val="center"/>
       </w:pPr>
       <w:r>
+        <w:rPr>
+          <w:noProof/>
+        </w:rPr>
         <w:drawing>
           <wp:inline distT="0" distB="0" distL="0" distR="0" wp14:anchorId="01B40D49" wp14:editId="095AAD15">
             <wp:extent cx="3970071" cy="807863"/>
@@ -5126,7 +5019,7 @@
                     <pic:cNvPicPr/>
                   </pic:nvPicPr>
                   <pic:blipFill>
-                    <a:blip r:embed="rId41"/>
+                    <a:blip r:embed="rId40"/>
                     <a:stretch>
                       <a:fillRect/>
                     </a:stretch>
@@ -5170,7 +5063,11 @@
         <w:t xml:space="preserve"> en indiquant également sa taille.</w:t>
       </w:r>
     </w:p>
-    <w:p/>
+    <w:p>
+      <w:r>
+        <w:br w:type="page"/>
+      </w:r>
+    </w:p>
     <w:p>
       <w:pPr>
         <w:pStyle w:val="Titre3"/>
@@ -5185,60 +5082,10 @@
           <w:b/>
           <w:bCs/>
         </w:rPr>
+        <w:lastRenderedPageBreak/>
         <w:t>BulletPlayer</w:t>
       </w:r>
       <w:proofErr w:type="spellEnd"/>
-    </w:p>
-    <w:p>
-      <w:pPr>
-        <w:rPr>
-          <w:color w:val="FF0000"/>
-        </w:rPr>
-      </w:pPr>
-      <w:r>
-        <w:rPr>
-          <w:color w:val="FF0000"/>
-        </w:rPr>
-        <w:t>Á venir…</w:t>
-      </w:r>
-    </w:p>
-    <w:p>
-      <w:pPr>
-        <w:pStyle w:val="Titre3"/>
-        <w:rPr>
-          <w:b/>
-          <w:bCs/>
-        </w:rPr>
-      </w:pPr>
-      <w:proofErr w:type="spellStart"/>
-      <w:r>
-        <w:rPr>
-          <w:b/>
-          <w:bCs/>
-        </w:rPr>
-        <w:t>BulletEnnemis</w:t>
-      </w:r>
-      <w:proofErr w:type="spellEnd"/>
-    </w:p>
-    <w:p>
-      <w:pPr>
-        <w:rPr>
-          <w:color w:val="FF0000"/>
-        </w:rPr>
-      </w:pPr>
-      <w:r>
-        <w:rPr>
-          <w:color w:val="FF0000"/>
-        </w:rPr>
-        <w:t>Á venir…</w:t>
-      </w:r>
-    </w:p>
-    <w:p>
-      <w:pPr>
-        <w:rPr>
-          <w:color w:val="FF0000"/>
-        </w:rPr>
-      </w:pPr>
     </w:p>
     <w:p>
       <w:pPr>
@@ -5250,19 +5097,6 @@
           <w:u w:val="single"/>
         </w:rPr>
       </w:pPr>
-    </w:p>
-    <w:p>
-      <w:pPr>
-        <w:rPr>
-          <w:b/>
-          <w:bCs/>
-          <w:i/>
-          <w:iCs/>
-          <w:color w:val="FF0000"/>
-          <w:u w:val="single"/>
-        </w:rPr>
-      </w:pPr>
-      <w:proofErr w:type="spellStart"/>
       <w:r>
         <w:rPr>
           <w:b/>
@@ -5271,10 +5105,183 @@
           <w:iCs/>
           <w:u w:val="single"/>
         </w:rPr>
-        <w:t>Config.cs</w:t>
+        <w:t xml:space="preserve">Attribut : </w:t>
+      </w:r>
+    </w:p>
+    <w:p>
+      <w:pPr>
+        <w:jc w:val="center"/>
+        <w:rPr>
+          <w:color w:val="FF0000"/>
+        </w:rPr>
+      </w:pPr>
+      <w:r>
+        <w:rPr>
+          <w:color w:val="FF0000"/>
+        </w:rPr>
+        <w:drawing>
+          <wp:inline distT="0" distB="0" distL="0" distR="0" wp14:anchorId="41A14046" wp14:editId="2ECB88CA">
+            <wp:extent cx="2491301" cy="3800475"/>
+            <wp:effectExtent l="152400" t="152400" r="366395" b="352425"/>
+            <wp:docPr id="1659019572" name="Image 1"/>
+            <wp:cNvGraphicFramePr>
+              <a:graphicFrameLocks xmlns:a="http://schemas.openxmlformats.org/drawingml/2006/main" noChangeAspect="1"/>
+            </wp:cNvGraphicFramePr>
+            <a:graphic xmlns:a="http://schemas.openxmlformats.org/drawingml/2006/main">
+              <a:graphicData uri="http://schemas.openxmlformats.org/drawingml/2006/picture">
+                <pic:pic xmlns:pic="http://schemas.openxmlformats.org/drawingml/2006/picture">
+                  <pic:nvPicPr>
+                    <pic:cNvPr id="1659019572" name=""/>
+                    <pic:cNvPicPr/>
+                  </pic:nvPicPr>
+                  <pic:blipFill>
+                    <a:blip r:embed="rId41"/>
+                    <a:stretch>
+                      <a:fillRect/>
+                    </a:stretch>
+                  </pic:blipFill>
+                  <pic:spPr>
+                    <a:xfrm>
+                      <a:off x="0" y="0"/>
+                      <a:ext cx="2508652" cy="3826944"/>
+                    </a:xfrm>
+                    <a:prstGeom prst="rect">
+                      <a:avLst/>
+                    </a:prstGeom>
+                    <a:ln>
+                      <a:noFill/>
+                    </a:ln>
+                    <a:effectLst>
+                      <a:outerShdw blurRad="292100" dist="139700" dir="2700000" algn="tl" rotWithShape="0">
+                        <a:srgbClr val="333333">
+                          <a:alpha val="65000"/>
+                        </a:srgbClr>
+                      </a:outerShdw>
+                    </a:effectLst>
+                  </pic:spPr>
+                </pic:pic>
+              </a:graphicData>
+            </a:graphic>
+          </wp:inline>
+        </w:drawing>
+      </w:r>
+    </w:p>
+    <w:p>
+      <w:r>
+        <w:t xml:space="preserve">Nous avons </w:t>
+      </w:r>
+      <w:proofErr w:type="spellStart"/>
+      <w:r>
+        <w:t>speed_y</w:t>
       </w:r>
       <w:proofErr w:type="spellEnd"/>
       <w:r>
+        <w:t xml:space="preserve"> qui définit la le nombre de pixel par seconde que </w:t>
+      </w:r>
+      <w:proofErr w:type="gramStart"/>
+      <w:r>
+        <w:t>la  balle</w:t>
+      </w:r>
+      <w:proofErr w:type="gramEnd"/>
+      <w:r>
+        <w:t xml:space="preserve"> du joueur </w:t>
+      </w:r>
+      <w:proofErr w:type="spellStart"/>
+      <w:r>
+        <w:t>parcour</w:t>
+      </w:r>
+      <w:proofErr w:type="spellEnd"/>
+      <w:r>
+        <w:t xml:space="preserve"> sur l’axe y. Ensuite nous avons </w:t>
+      </w:r>
+      <w:proofErr w:type="spellStart"/>
+      <w:r>
+        <w:t>posX</w:t>
+      </w:r>
+      <w:proofErr w:type="spellEnd"/>
+      <w:r>
+        <w:t xml:space="preserve"> qui définit la position de la balle sur l’axe </w:t>
+      </w:r>
+      <w:proofErr w:type="gramStart"/>
+      <w:r>
+        <w:t xml:space="preserve">x </w:t>
+      </w:r>
+      <w:r>
+        <w:t>.</w:t>
+      </w:r>
+      <w:proofErr w:type="gramEnd"/>
+      <w:r>
+        <w:t xml:space="preserve"> Ensuite nous avons </w:t>
+      </w:r>
+      <w:proofErr w:type="spellStart"/>
+      <w:r>
+        <w:t>po</w:t>
+      </w:r>
+      <w:r>
+        <w:t>sY</w:t>
+      </w:r>
+      <w:proofErr w:type="spellEnd"/>
+      <w:r>
+        <w:t xml:space="preserve"> qui définit la position de la balle sur l’axe </w:t>
+      </w:r>
+      <w:r>
+        <w:t xml:space="preserve">y. Ensuite nous avons </w:t>
+      </w:r>
+      <w:proofErr w:type="spellStart"/>
+      <w:r>
+        <w:t>width</w:t>
+      </w:r>
+      <w:proofErr w:type="spellEnd"/>
+      <w:r>
+        <w:t xml:space="preserve"> qui </w:t>
+      </w:r>
+      <w:proofErr w:type="spellStart"/>
+      <w:r>
+        <w:t>représent</w:t>
+      </w:r>
+      <w:proofErr w:type="spellEnd"/>
+      <w:r>
+        <w:t xml:space="preserve"> la largeur de la balle et ensuite nous avons </w:t>
+      </w:r>
+      <w:proofErr w:type="spellStart"/>
+      <w:r>
+        <w:t>height</w:t>
+      </w:r>
+      <w:proofErr w:type="spellEnd"/>
+      <w:r>
+        <w:t xml:space="preserve"> qui vaut la longueur de la balle. Et nous avons </w:t>
+      </w:r>
+      <w:proofErr w:type="spellStart"/>
+      <w:r>
+        <w:t>chosen</w:t>
+      </w:r>
+      <w:proofErr w:type="spellEnd"/>
+      <w:r>
+        <w:t xml:space="preserve"> pics qui est la </w:t>
+      </w:r>
+      <w:proofErr w:type="spellStart"/>
+      <w:r>
+        <w:t>varible</w:t>
+      </w:r>
+      <w:proofErr w:type="spellEnd"/>
+      <w:r>
+        <w:t xml:space="preserve"> qui va stocker quel image (accords de guitare) la balle va être.</w:t>
+      </w:r>
+      <w:r>
+        <w:t xml:space="preserve"> Et </w:t>
+      </w:r>
+      <w:proofErr w:type="spellStart"/>
+      <w:r>
+        <w:t>tabOfBullet</w:t>
+      </w:r>
+      <w:proofErr w:type="spellEnd"/>
+      <w:r>
+        <w:t xml:space="preserve"> qui est le tableau qui stock les différentes images de munitions</w:t>
+      </w:r>
+    </w:p>
+    <w:p/>
+    <w:p>
+      <w:pPr>
         <w:rPr>
           <w:b/>
           <w:bCs/>
@@ -5282,32 +5289,7 @@
           <w:iCs/>
           <w:u w:val="single"/>
         </w:rPr>
-        <w:t xml:space="preserve"> :                                                                                                                                                    </w:t>
-      </w:r>
-      <w:r>
-        <w:rPr>
-          <w:b/>
-          <w:bCs/>
-          <w:i/>
-          <w:iCs/>
-          <w:color w:val="FF0000"/>
-          <w:u w:val="single"/>
-        </w:rPr>
-        <w:t>Á venir</w:t>
-      </w:r>
-    </w:p>
-    <w:p>
-      <w:pPr>
-        <w:rPr>
-          <w:b/>
-          <w:bCs/>
-          <w:i/>
-          <w:iCs/>
-          <w:color w:val="FF0000"/>
-          <w:u w:val="single"/>
-        </w:rPr>
-      </w:pPr>
-      <w:proofErr w:type="spellStart"/>
+      </w:pPr>
       <w:r>
         <w:rPr>
           <w:b/>
@@ -5316,10 +5298,154 @@
           <w:iCs/>
           <w:u w:val="single"/>
         </w:rPr>
-        <w:t>Helper.cs</w:t>
+        <w:t>Constructeur :</w:t>
+      </w:r>
+    </w:p>
+    <w:p>
+      <w:r>
+        <w:t xml:space="preserve">Nous avons la </w:t>
+      </w:r>
+      <w:proofErr w:type="spellStart"/>
+      <w:r>
+        <w:t>methode</w:t>
       </w:r>
       <w:proofErr w:type="spellEnd"/>
       <w:r>
+        <w:t xml:space="preserve"> </w:t>
+      </w:r>
+      <w:proofErr w:type="spellStart"/>
+      <w:r>
+        <w:t>bulletPlayer</w:t>
+      </w:r>
+      <w:proofErr w:type="spellEnd"/>
+      <w:r>
+        <w:t xml:space="preserve"> </w:t>
+      </w:r>
+      <w:r>
+        <w:t xml:space="preserve">qui est le constructeur de la </w:t>
+      </w:r>
+      <w:proofErr w:type="spellStart"/>
+      <w:r>
+        <w:t>class</w:t>
+      </w:r>
+      <w:proofErr w:type="spellEnd"/>
+      <w:r>
+        <w:t xml:space="preserve"> </w:t>
+      </w:r>
+      <w:proofErr w:type="spellStart"/>
+      <w:r>
+        <w:t>bulletPlayer</w:t>
+      </w:r>
+      <w:proofErr w:type="spellEnd"/>
+      <w:r>
+        <w:t xml:space="preserve"> qui a comme </w:t>
+      </w:r>
+      <w:proofErr w:type="gramStart"/>
+      <w:r>
+        <w:t xml:space="preserve">signature  </w:t>
+      </w:r>
+      <w:proofErr w:type="spellStart"/>
+      <w:r>
+        <w:t>int</w:t>
+      </w:r>
+      <w:proofErr w:type="spellEnd"/>
+      <w:proofErr w:type="gramEnd"/>
+      <w:r>
+        <w:t xml:space="preserve"> x et </w:t>
+      </w:r>
+      <w:proofErr w:type="spellStart"/>
+      <w:r>
+        <w:t>int</w:t>
+      </w:r>
+      <w:proofErr w:type="spellEnd"/>
+      <w:r>
+        <w:t xml:space="preserve"> y qui sont les variables qui vont permettre d’indiquer la position d’une instance et </w:t>
+      </w:r>
+      <w:proofErr w:type="spellStart"/>
+      <w:r>
+        <w:t>chosenPics</w:t>
+      </w:r>
+      <w:proofErr w:type="spellEnd"/>
+      <w:r>
+        <w:t xml:space="preserve"> qui est </w:t>
+      </w:r>
+      <w:proofErr w:type="gramStart"/>
+      <w:r>
+        <w:t>la variables</w:t>
+      </w:r>
+      <w:proofErr w:type="gramEnd"/>
+      <w:r>
+        <w:t xml:space="preserve"> qui va choisir de manière aléatoire la munition qui va être affichée. </w:t>
+      </w:r>
+    </w:p>
+    <w:p>
+      <w:pPr>
+        <w:jc w:val="center"/>
+        <w:rPr>
+          <w:color w:val="FF0000"/>
+        </w:rPr>
+      </w:pPr>
+      <w:r>
+        <w:rPr>
+          <w:color w:val="FF0000"/>
+        </w:rPr>
+        <w:lastRenderedPageBreak/>
+        <w:drawing>
+          <wp:inline distT="0" distB="0" distL="0" distR="0" wp14:anchorId="345F20AF" wp14:editId="17983BF2">
+            <wp:extent cx="3324225" cy="735215"/>
+            <wp:effectExtent l="152400" t="152400" r="352425" b="370205"/>
+            <wp:docPr id="935959810" name="Image 1"/>
+            <wp:cNvGraphicFramePr>
+              <a:graphicFrameLocks xmlns:a="http://schemas.openxmlformats.org/drawingml/2006/main" noChangeAspect="1"/>
+            </wp:cNvGraphicFramePr>
+            <a:graphic xmlns:a="http://schemas.openxmlformats.org/drawingml/2006/main">
+              <a:graphicData uri="http://schemas.openxmlformats.org/drawingml/2006/picture">
+                <pic:pic xmlns:pic="http://schemas.openxmlformats.org/drawingml/2006/picture">
+                  <pic:nvPicPr>
+                    <pic:cNvPr id="935959810" name=""/>
+                    <pic:cNvPicPr/>
+                  </pic:nvPicPr>
+                  <pic:blipFill>
+                    <a:blip r:embed="rId42"/>
+                    <a:stretch>
+                      <a:fillRect/>
+                    </a:stretch>
+                  </pic:blipFill>
+                  <pic:spPr>
+                    <a:xfrm>
+                      <a:off x="0" y="0"/>
+                      <a:ext cx="3424310" cy="757351"/>
+                    </a:xfrm>
+                    <a:prstGeom prst="rect">
+                      <a:avLst/>
+                    </a:prstGeom>
+                    <a:ln>
+                      <a:noFill/>
+                    </a:ln>
+                    <a:effectLst>
+                      <a:outerShdw blurRad="292100" dist="139700" dir="2700000" algn="tl" rotWithShape="0">
+                        <a:srgbClr val="333333">
+                          <a:alpha val="65000"/>
+                        </a:srgbClr>
+                      </a:outerShdw>
+                    </a:effectLst>
+                  </pic:spPr>
+                </pic:pic>
+              </a:graphicData>
+            </a:graphic>
+          </wp:inline>
+        </w:drawing>
+      </w:r>
+    </w:p>
+    <w:p>
+      <w:pPr>
+        <w:rPr>
+          <w:color w:val="FF0000"/>
+        </w:rPr>
+      </w:pPr>
+    </w:p>
+    <w:p>
+      <w:pPr>
         <w:rPr>
           <w:b/>
           <w:bCs/>
@@ -5327,27 +5453,3456 @@
           <w:iCs/>
           <w:u w:val="single"/>
         </w:rPr>
-        <w:t xml:space="preserve"> :                                                                                                                                                   </w:t>
-      </w:r>
+      </w:pPr>
+      <w:proofErr w:type="spellStart"/>
       <w:r>
         <w:rPr>
           <w:b/>
           <w:bCs/>
           <w:i/>
           <w:iCs/>
+          <w:u w:val="single"/>
+        </w:rPr>
+        <w:t>Methodes</w:t>
+      </w:r>
+      <w:proofErr w:type="spellEnd"/>
+      <w:r>
+        <w:rPr>
+          <w:b/>
+          <w:bCs/>
+          <w:i/>
+          <w:iCs/>
+          <w:u w:val="single"/>
+        </w:rPr>
+        <w:t xml:space="preserve"> : </w:t>
+      </w:r>
+    </w:p>
+    <w:p>
+      <w:r>
+        <w:t xml:space="preserve">Nous avons la </w:t>
+      </w:r>
+      <w:proofErr w:type="spellStart"/>
+      <w:r>
+        <w:t>methode</w:t>
+      </w:r>
+      <w:proofErr w:type="spellEnd"/>
+      <w:r>
+        <w:t xml:space="preserve"> Update qui va être appelée à chaque frame et qui va servir pour mettre à jour la position de la balle du joueur.</w:t>
+      </w:r>
+    </w:p>
+    <w:p>
+      <w:pPr>
+        <w:jc w:val="center"/>
+        <w:rPr>
           <w:color w:val="FF0000"/>
+        </w:rPr>
+      </w:pPr>
+      <w:r>
+        <w:rPr>
+          <w:color w:val="FF0000"/>
+        </w:rPr>
+        <w:drawing>
+          <wp:inline distT="0" distB="0" distL="0" distR="0" wp14:anchorId="6D2A64B3" wp14:editId="390439E0">
+            <wp:extent cx="2407920" cy="604860"/>
+            <wp:effectExtent l="0" t="0" r="0" b="5080"/>
+            <wp:docPr id="253138156" name="Image 1"/>
+            <wp:cNvGraphicFramePr>
+              <a:graphicFrameLocks xmlns:a="http://schemas.openxmlformats.org/drawingml/2006/main" noChangeAspect="1"/>
+            </wp:cNvGraphicFramePr>
+            <a:graphic xmlns:a="http://schemas.openxmlformats.org/drawingml/2006/main">
+              <a:graphicData uri="http://schemas.openxmlformats.org/drawingml/2006/picture">
+                <pic:pic xmlns:pic="http://schemas.openxmlformats.org/drawingml/2006/picture">
+                  <pic:nvPicPr>
+                    <pic:cNvPr id="253138156" name=""/>
+                    <pic:cNvPicPr/>
+                  </pic:nvPicPr>
+                  <pic:blipFill>
+                    <a:blip r:embed="rId43"/>
+                    <a:stretch>
+                      <a:fillRect/>
+                    </a:stretch>
+                  </pic:blipFill>
+                  <pic:spPr>
+                    <a:xfrm>
+                      <a:off x="0" y="0"/>
+                      <a:ext cx="2428290" cy="609977"/>
+                    </a:xfrm>
+                    <a:prstGeom prst="rect">
+                      <a:avLst/>
+                    </a:prstGeom>
+                  </pic:spPr>
+                </pic:pic>
+              </a:graphicData>
+            </a:graphic>
+          </wp:inline>
+        </w:drawing>
+      </w:r>
+    </w:p>
+    <w:p>
+      <w:pPr>
+        <w:rPr>
+          <w:color w:val="FF0000"/>
+        </w:rPr>
+      </w:pPr>
+    </w:p>
+    <w:p>
+      <w:r>
+        <w:t>Ensuite nous avons la méthode Render qui va servir afin dessiner à un emplacement précis la balle qui a été choisie pour l’instance.</w:t>
+      </w:r>
+    </w:p>
+    <w:p>
+      <w:pPr>
+        <w:jc w:val="center"/>
+        <w:rPr>
+          <w:color w:val="FF0000"/>
+        </w:rPr>
+      </w:pPr>
+      <w:r>
+        <w:rPr>
+          <w:color w:val="FF0000"/>
+        </w:rPr>
+        <w:drawing>
+          <wp:inline distT="0" distB="0" distL="0" distR="0" wp14:anchorId="66FB0240" wp14:editId="74785FA0">
+            <wp:extent cx="3322320" cy="491824"/>
+            <wp:effectExtent l="152400" t="152400" r="354330" b="365760"/>
+            <wp:docPr id="1165055511" name="Image 1"/>
+            <wp:cNvGraphicFramePr>
+              <a:graphicFrameLocks xmlns:a="http://schemas.openxmlformats.org/drawingml/2006/main" noChangeAspect="1"/>
+            </wp:cNvGraphicFramePr>
+            <a:graphic xmlns:a="http://schemas.openxmlformats.org/drawingml/2006/main">
+              <a:graphicData uri="http://schemas.openxmlformats.org/drawingml/2006/picture">
+                <pic:pic xmlns:pic="http://schemas.openxmlformats.org/drawingml/2006/picture">
+                  <pic:nvPicPr>
+                    <pic:cNvPr id="1165055511" name=""/>
+                    <pic:cNvPicPr/>
+                  </pic:nvPicPr>
+                  <pic:blipFill>
+                    <a:blip r:embed="rId44"/>
+                    <a:stretch>
+                      <a:fillRect/>
+                    </a:stretch>
+                  </pic:blipFill>
+                  <pic:spPr>
+                    <a:xfrm>
+                      <a:off x="0" y="0"/>
+                      <a:ext cx="3363804" cy="497965"/>
+                    </a:xfrm>
+                    <a:prstGeom prst="rect">
+                      <a:avLst/>
+                    </a:prstGeom>
+                    <a:ln>
+                      <a:noFill/>
+                    </a:ln>
+                    <a:effectLst>
+                      <a:outerShdw blurRad="292100" dist="139700" dir="2700000" algn="tl" rotWithShape="0">
+                        <a:srgbClr val="333333">
+                          <a:alpha val="65000"/>
+                        </a:srgbClr>
+                      </a:outerShdw>
+                    </a:effectLst>
+                  </pic:spPr>
+                </pic:pic>
+              </a:graphicData>
+            </a:graphic>
+          </wp:inline>
+        </w:drawing>
+      </w:r>
+    </w:p>
+    <w:p>
+      <w:pPr>
+        <w:rPr>
+          <w:rFonts w:eastAsiaTheme="majorEastAsia" w:cstheme="majorBidi"/>
+          <w:b/>
+          <w:bCs/>
+          <w:color w:val="0F4761" w:themeColor="accent1" w:themeShade="BF"/>
+          <w:sz w:val="28"/>
+          <w:szCs w:val="28"/>
+        </w:rPr>
+      </w:pPr>
+      <w:r>
+        <w:rPr>
+          <w:b/>
+          <w:bCs/>
+        </w:rPr>
+        <w:br w:type="page"/>
+      </w:r>
+    </w:p>
+    <w:p>
+      <w:pPr>
+        <w:pStyle w:val="Titre3"/>
+        <w:rPr>
+          <w:b/>
+          <w:bCs/>
+        </w:rPr>
+      </w:pPr>
+      <w:proofErr w:type="spellStart"/>
+      <w:r>
+        <w:rPr>
+          <w:b/>
+          <w:bCs/>
+        </w:rPr>
+        <w:lastRenderedPageBreak/>
+        <w:t>BulletEnnemis</w:t>
+      </w:r>
+      <w:proofErr w:type="spellEnd"/>
+    </w:p>
+    <w:p>
+      <w:pPr>
+        <w:rPr>
+          <w:b/>
+          <w:bCs/>
+          <w:i/>
+          <w:iCs/>
           <w:u w:val="single"/>
         </w:rPr>
-        <w:t xml:space="preserve">Á venir  </w:t>
+      </w:pPr>
+      <w:r>
+        <w:rPr>
+          <w:b/>
+          <w:bCs/>
+          <w:i/>
+          <w:iCs/>
+          <w:u w:val="single"/>
+        </w:rPr>
+        <w:t xml:space="preserve">Attribut : </w:t>
+      </w:r>
+    </w:p>
+    <w:p>
+      <w:pPr>
+        <w:jc w:val="center"/>
+      </w:pPr>
+      <w:r>
+        <w:drawing>
+          <wp:inline distT="0" distB="0" distL="0" distR="0" wp14:anchorId="7F6736F0" wp14:editId="26773ABC">
+            <wp:extent cx="3343275" cy="3417351"/>
+            <wp:effectExtent l="152400" t="152400" r="352425" b="354965"/>
+            <wp:docPr id="1973674921" name="Image 1"/>
+            <wp:cNvGraphicFramePr>
+              <a:graphicFrameLocks xmlns:a="http://schemas.openxmlformats.org/drawingml/2006/main" noChangeAspect="1"/>
+            </wp:cNvGraphicFramePr>
+            <a:graphic xmlns:a="http://schemas.openxmlformats.org/drawingml/2006/main">
+              <a:graphicData uri="http://schemas.openxmlformats.org/drawingml/2006/picture">
+                <pic:pic xmlns:pic="http://schemas.openxmlformats.org/drawingml/2006/picture">
+                  <pic:nvPicPr>
+                    <pic:cNvPr id="1973674921" name=""/>
+                    <pic:cNvPicPr/>
+                  </pic:nvPicPr>
+                  <pic:blipFill>
+                    <a:blip r:embed="rId45"/>
+                    <a:stretch>
+                      <a:fillRect/>
+                    </a:stretch>
+                  </pic:blipFill>
+                  <pic:spPr>
+                    <a:xfrm>
+                      <a:off x="0" y="0"/>
+                      <a:ext cx="3352215" cy="3426489"/>
+                    </a:xfrm>
+                    <a:prstGeom prst="rect">
+                      <a:avLst/>
+                    </a:prstGeom>
+                    <a:ln>
+                      <a:noFill/>
+                    </a:ln>
+                    <a:effectLst>
+                      <a:outerShdw blurRad="292100" dist="139700" dir="2700000" algn="tl" rotWithShape="0">
+                        <a:srgbClr val="333333">
+                          <a:alpha val="65000"/>
+                        </a:srgbClr>
+                      </a:outerShdw>
+                    </a:effectLst>
+                  </pic:spPr>
+                </pic:pic>
+              </a:graphicData>
+            </a:graphic>
+          </wp:inline>
+        </w:drawing>
+      </w:r>
+    </w:p>
+    <w:p>
+      <w:r>
+        <w:t xml:space="preserve">Nous avons </w:t>
+      </w:r>
+      <w:proofErr w:type="spellStart"/>
+      <w:r>
+        <w:t>speed_y</w:t>
+      </w:r>
+      <w:proofErr w:type="spellEnd"/>
+      <w:r>
+        <w:t xml:space="preserve"> qui définit </w:t>
+      </w:r>
+      <w:proofErr w:type="spellStart"/>
+      <w:r>
+        <w:t>la</w:t>
+      </w:r>
+      <w:proofErr w:type="spellEnd"/>
+      <w:r>
+        <w:t xml:space="preserve"> le nombre de pixel par seconde que </w:t>
+      </w:r>
+      <w:proofErr w:type="gramStart"/>
+      <w:r>
+        <w:t>la  balle</w:t>
+      </w:r>
+      <w:proofErr w:type="gramEnd"/>
+      <w:r>
+        <w:t xml:space="preserve"> d</w:t>
+      </w:r>
+      <w:r>
+        <w:t>e l’ennemi</w:t>
+      </w:r>
+      <w:r>
+        <w:t xml:space="preserve"> parcour</w:t>
+      </w:r>
+      <w:r>
+        <w:t>t</w:t>
+      </w:r>
+      <w:r>
+        <w:t xml:space="preserve"> sur l’axe y. Ensuite nous avons </w:t>
+      </w:r>
+      <w:proofErr w:type="spellStart"/>
+      <w:r>
+        <w:t>posX</w:t>
+      </w:r>
+      <w:proofErr w:type="spellEnd"/>
+      <w:r>
+        <w:t xml:space="preserve"> qui définit la position de la balle sur l’axe </w:t>
+      </w:r>
+      <w:proofErr w:type="gramStart"/>
+      <w:r>
+        <w:t>x .</w:t>
+      </w:r>
+      <w:proofErr w:type="gramEnd"/>
+      <w:r>
+        <w:t xml:space="preserve"> Ensuite nous avons </w:t>
+      </w:r>
+      <w:proofErr w:type="spellStart"/>
+      <w:r>
+        <w:t>posY</w:t>
+      </w:r>
+      <w:proofErr w:type="spellEnd"/>
+      <w:r>
+        <w:t xml:space="preserve"> qui définit la position de la balle sur l’axe y. Ensuite nous avons </w:t>
+      </w:r>
+      <w:proofErr w:type="spellStart"/>
+      <w:r>
+        <w:t>width</w:t>
+      </w:r>
+      <w:proofErr w:type="spellEnd"/>
+      <w:r>
+        <w:t xml:space="preserve"> qui </w:t>
+      </w:r>
+      <w:proofErr w:type="spellStart"/>
+      <w:r>
+        <w:t>représent</w:t>
+      </w:r>
+      <w:proofErr w:type="spellEnd"/>
+      <w:r>
+        <w:t xml:space="preserve"> la largeur de la balle et ensuite nous avons </w:t>
+      </w:r>
+      <w:proofErr w:type="spellStart"/>
+      <w:r>
+        <w:t>height</w:t>
+      </w:r>
+      <w:proofErr w:type="spellEnd"/>
+      <w:r>
+        <w:t xml:space="preserve"> qui vaut la longueur de la balle. Et nous avons </w:t>
+      </w:r>
+      <w:proofErr w:type="spellStart"/>
+      <w:r>
+        <w:t>chosen</w:t>
+      </w:r>
+      <w:proofErr w:type="spellEnd"/>
+      <w:r>
+        <w:t xml:space="preserve"> pics qui est la </w:t>
+      </w:r>
+      <w:proofErr w:type="spellStart"/>
+      <w:r>
+        <w:t>varible</w:t>
+      </w:r>
+      <w:proofErr w:type="spellEnd"/>
+      <w:r>
+        <w:t xml:space="preserve"> qui va stocker quel image (accords de guitare) la balle va être. Et </w:t>
+      </w:r>
+      <w:proofErr w:type="spellStart"/>
+      <w:r>
+        <w:t>tabOfBullet</w:t>
+      </w:r>
+      <w:proofErr w:type="spellEnd"/>
+      <w:r>
+        <w:t xml:space="preserve"> qui est le tableau qui stock les différentes images de munitions</w:t>
+      </w:r>
+    </w:p>
+    <w:p>
+      <w:pPr>
+        <w:rPr>
+          <w:b/>
+          <w:bCs/>
+          <w:i/>
+          <w:iCs/>
+          <w:u w:val="single"/>
+        </w:rPr>
+      </w:pPr>
+      <w:r>
+        <w:rPr>
+          <w:b/>
+          <w:bCs/>
+          <w:i/>
+          <w:iCs/>
+          <w:u w:val="single"/>
+        </w:rPr>
+        <w:t>Constructeur</w:t>
+      </w:r>
+      <w:r>
+        <w:rPr>
+          <w:b/>
+          <w:bCs/>
+          <w:i/>
+          <w:iCs/>
+          <w:u w:val="single"/>
+        </w:rPr>
+        <w:t xml:space="preserve"> : </w:t>
+      </w:r>
+    </w:p>
+    <w:p>
+      <w:pPr>
+        <w:jc w:val="center"/>
+        <w:rPr>
+          <w:color w:val="FF0000"/>
+        </w:rPr>
+      </w:pPr>
+      <w:r>
+        <w:rPr>
+          <w:color w:val="FF0000"/>
+        </w:rPr>
+        <w:drawing>
+          <wp:inline distT="0" distB="0" distL="0" distR="0" wp14:anchorId="77406F5C" wp14:editId="0AD78DBB">
+            <wp:extent cx="3139440" cy="695446"/>
+            <wp:effectExtent l="152400" t="152400" r="365760" b="371475"/>
+            <wp:docPr id="1110908601" name="Image 1"/>
+            <wp:cNvGraphicFramePr>
+              <a:graphicFrameLocks xmlns:a="http://schemas.openxmlformats.org/drawingml/2006/main" noChangeAspect="1"/>
+            </wp:cNvGraphicFramePr>
+            <a:graphic xmlns:a="http://schemas.openxmlformats.org/drawingml/2006/main">
+              <a:graphicData uri="http://schemas.openxmlformats.org/drawingml/2006/picture">
+                <pic:pic xmlns:pic="http://schemas.openxmlformats.org/drawingml/2006/picture">
+                  <pic:nvPicPr>
+                    <pic:cNvPr id="1110908601" name=""/>
+                    <pic:cNvPicPr/>
+                  </pic:nvPicPr>
+                  <pic:blipFill>
+                    <a:blip r:embed="rId46"/>
+                    <a:stretch>
+                      <a:fillRect/>
+                    </a:stretch>
+                  </pic:blipFill>
+                  <pic:spPr>
+                    <a:xfrm>
+                      <a:off x="0" y="0"/>
+                      <a:ext cx="3171343" cy="702513"/>
+                    </a:xfrm>
+                    <a:prstGeom prst="rect">
+                      <a:avLst/>
+                    </a:prstGeom>
+                    <a:ln>
+                      <a:noFill/>
+                    </a:ln>
+                    <a:effectLst>
+                      <a:outerShdw blurRad="292100" dist="139700" dir="2700000" algn="tl" rotWithShape="0">
+                        <a:srgbClr val="333333">
+                          <a:alpha val="65000"/>
+                        </a:srgbClr>
+                      </a:outerShdw>
+                    </a:effectLst>
+                  </pic:spPr>
+                </pic:pic>
+              </a:graphicData>
+            </a:graphic>
+          </wp:inline>
+        </w:drawing>
+      </w:r>
+    </w:p>
+    <w:p>
+      <w:r>
+        <w:t xml:space="preserve">Nous avons la </w:t>
+      </w:r>
+      <w:proofErr w:type="spellStart"/>
+      <w:r>
+        <w:t>methode</w:t>
+      </w:r>
+      <w:proofErr w:type="spellEnd"/>
+      <w:r>
+        <w:t xml:space="preserve"> </w:t>
+      </w:r>
+      <w:proofErr w:type="spellStart"/>
+      <w:r>
+        <w:t>bullet</w:t>
+      </w:r>
+      <w:r>
+        <w:t>Ennemis</w:t>
+      </w:r>
+      <w:proofErr w:type="spellEnd"/>
+      <w:r>
+        <w:t xml:space="preserve"> qui est le constructeur de la </w:t>
+      </w:r>
+      <w:proofErr w:type="spellStart"/>
+      <w:r>
+        <w:t>class</w:t>
+      </w:r>
+      <w:proofErr w:type="spellEnd"/>
+      <w:r>
+        <w:t xml:space="preserve"> </w:t>
+      </w:r>
+      <w:proofErr w:type="spellStart"/>
+      <w:r>
+        <w:t>bul</w:t>
+      </w:r>
+      <w:r>
+        <w:t>letEnnemis</w:t>
+      </w:r>
+      <w:proofErr w:type="spellEnd"/>
+      <w:r>
+        <w:t xml:space="preserve"> qui a comme </w:t>
+      </w:r>
+      <w:proofErr w:type="gramStart"/>
+      <w:r>
+        <w:t xml:space="preserve">signature  </w:t>
+      </w:r>
+      <w:proofErr w:type="spellStart"/>
+      <w:r>
+        <w:t>int</w:t>
+      </w:r>
+      <w:proofErr w:type="spellEnd"/>
+      <w:proofErr w:type="gramEnd"/>
+      <w:r>
+        <w:t xml:space="preserve"> x et </w:t>
+      </w:r>
+      <w:proofErr w:type="spellStart"/>
+      <w:r>
+        <w:t>int</w:t>
+      </w:r>
+      <w:proofErr w:type="spellEnd"/>
+      <w:r>
+        <w:t xml:space="preserve"> y qui sont les variables qui vont permettre d’indiquer la position d’une instance et </w:t>
+      </w:r>
+      <w:proofErr w:type="spellStart"/>
+      <w:r>
+        <w:t>chosenPics</w:t>
+      </w:r>
+      <w:proofErr w:type="spellEnd"/>
+      <w:r>
+        <w:t xml:space="preserve"> qui est </w:t>
+      </w:r>
+      <w:proofErr w:type="gramStart"/>
+      <w:r>
+        <w:t>la variables</w:t>
+      </w:r>
+      <w:proofErr w:type="gramEnd"/>
+      <w:r>
+        <w:t xml:space="preserve"> qui va choisir de manière aléatoire la munition qui va être affichée. </w:t>
+      </w:r>
+    </w:p>
+    <w:p>
+      <w:pPr>
+        <w:rPr>
+          <w:b/>
+          <w:bCs/>
+          <w:i/>
+          <w:iCs/>
+          <w:u w:val="single"/>
+        </w:rPr>
+      </w:pPr>
+      <w:proofErr w:type="spellStart"/>
+      <w:r>
+        <w:rPr>
+          <w:b/>
+          <w:bCs/>
+          <w:i/>
+          <w:iCs/>
+          <w:u w:val="single"/>
+        </w:rPr>
+        <w:lastRenderedPageBreak/>
+        <w:t>Methodes</w:t>
+      </w:r>
+      <w:proofErr w:type="spellEnd"/>
+      <w:r>
+        <w:rPr>
+          <w:b/>
+          <w:bCs/>
+          <w:i/>
+          <w:iCs/>
+          <w:u w:val="single"/>
+        </w:rPr>
+        <w:t> :</w:t>
+      </w:r>
+    </w:p>
+    <w:p>
+      <w:r>
+        <w:t xml:space="preserve">Nous avons la </w:t>
+      </w:r>
+      <w:proofErr w:type="spellStart"/>
+      <w:r>
+        <w:t>methode</w:t>
+      </w:r>
+      <w:proofErr w:type="spellEnd"/>
+      <w:r>
+        <w:t xml:space="preserve"> Update qui va être appelée à chaque frame et qui va servir pour mettre à jour la position de la balle de l’ennemi.</w:t>
+      </w:r>
+    </w:p>
+    <w:p>
+      <w:pPr>
+        <w:jc w:val="center"/>
+        <w:rPr>
+          <w:color w:val="FF0000"/>
+        </w:rPr>
+      </w:pPr>
+      <w:r>
+        <w:rPr>
+          <w:color w:val="FF0000"/>
+        </w:rPr>
+        <w:drawing>
+          <wp:inline distT="0" distB="0" distL="0" distR="0" wp14:anchorId="41D24CD7" wp14:editId="066EB858">
+            <wp:extent cx="2405743" cy="639334"/>
+            <wp:effectExtent l="152400" t="152400" r="356870" b="370840"/>
+            <wp:docPr id="1231961794" name="Image 1"/>
+            <wp:cNvGraphicFramePr>
+              <a:graphicFrameLocks xmlns:a="http://schemas.openxmlformats.org/drawingml/2006/main" noChangeAspect="1"/>
+            </wp:cNvGraphicFramePr>
+            <a:graphic xmlns:a="http://schemas.openxmlformats.org/drawingml/2006/main">
+              <a:graphicData uri="http://schemas.openxmlformats.org/drawingml/2006/picture">
+                <pic:pic xmlns:pic="http://schemas.openxmlformats.org/drawingml/2006/picture">
+                  <pic:nvPicPr>
+                    <pic:cNvPr id="1231961794" name=""/>
+                    <pic:cNvPicPr/>
+                  </pic:nvPicPr>
+                  <pic:blipFill>
+                    <a:blip r:embed="rId47"/>
+                    <a:stretch>
+                      <a:fillRect/>
+                    </a:stretch>
+                  </pic:blipFill>
+                  <pic:spPr>
+                    <a:xfrm>
+                      <a:off x="0" y="0"/>
+                      <a:ext cx="2425322" cy="644537"/>
+                    </a:xfrm>
+                    <a:prstGeom prst="rect">
+                      <a:avLst/>
+                    </a:prstGeom>
+                    <a:ln>
+                      <a:noFill/>
+                    </a:ln>
+                    <a:effectLst>
+                      <a:outerShdw blurRad="292100" dist="139700" dir="2700000" algn="tl" rotWithShape="0">
+                        <a:srgbClr val="333333">
+                          <a:alpha val="65000"/>
+                        </a:srgbClr>
+                      </a:outerShdw>
+                    </a:effectLst>
+                  </pic:spPr>
+                </pic:pic>
+              </a:graphicData>
+            </a:graphic>
+          </wp:inline>
+        </w:drawing>
+      </w:r>
+    </w:p>
+    <w:p>
+      <w:r>
+        <w:t>Ensuite nous avons la méthode Render qui va servir afin dessiner à un emplacement précis la balle qui a été choisie pour l’instance.</w:t>
+      </w:r>
+    </w:p>
+    <w:p>
+      <w:r>
+        <w:tab/>
+      </w:r>
+    </w:p>
+    <w:p>
+      <w:pPr>
+        <w:jc w:val="center"/>
+        <w:rPr>
+          <w:color w:val="FF0000"/>
+        </w:rPr>
+      </w:pPr>
+      <w:r>
+        <w:rPr>
+          <w:color w:val="FF0000"/>
+        </w:rPr>
+        <w:drawing>
+          <wp:inline distT="0" distB="0" distL="0" distR="0" wp14:anchorId="2AF44C74" wp14:editId="010B8769">
+            <wp:extent cx="4191000" cy="576614"/>
+            <wp:effectExtent l="152400" t="152400" r="361950" b="356870"/>
+            <wp:docPr id="1322527814" name="Image 1"/>
+            <wp:cNvGraphicFramePr>
+              <a:graphicFrameLocks xmlns:a="http://schemas.openxmlformats.org/drawingml/2006/main" noChangeAspect="1"/>
+            </wp:cNvGraphicFramePr>
+            <a:graphic xmlns:a="http://schemas.openxmlformats.org/drawingml/2006/main">
+              <a:graphicData uri="http://schemas.openxmlformats.org/drawingml/2006/picture">
+                <pic:pic xmlns:pic="http://schemas.openxmlformats.org/drawingml/2006/picture">
+                  <pic:nvPicPr>
+                    <pic:cNvPr id="1322527814" name=""/>
+                    <pic:cNvPicPr/>
+                  </pic:nvPicPr>
+                  <pic:blipFill>
+                    <a:blip r:embed="rId48"/>
+                    <a:stretch>
+                      <a:fillRect/>
+                    </a:stretch>
+                  </pic:blipFill>
+                  <pic:spPr>
+                    <a:xfrm>
+                      <a:off x="0" y="0"/>
+                      <a:ext cx="4205116" cy="578556"/>
+                    </a:xfrm>
+                    <a:prstGeom prst="rect">
+                      <a:avLst/>
+                    </a:prstGeom>
+                    <a:ln>
+                      <a:noFill/>
+                    </a:ln>
+                    <a:effectLst>
+                      <a:outerShdw blurRad="292100" dist="139700" dir="2700000" algn="tl" rotWithShape="0">
+                        <a:srgbClr val="333333">
+                          <a:alpha val="65000"/>
+                        </a:srgbClr>
+                      </a:outerShdw>
+                    </a:effectLst>
+                  </pic:spPr>
+                </pic:pic>
+              </a:graphicData>
+            </a:graphic>
+          </wp:inline>
+        </w:drawing>
+      </w:r>
+    </w:p>
+    <w:p>
+      <w:pPr>
+        <w:pStyle w:val="Titre3"/>
+        <w:rPr>
+          <w:b/>
+          <w:bCs/>
+        </w:rPr>
+      </w:pPr>
+      <w:r>
+        <w:rPr>
+          <w:b/>
+          <w:bCs/>
+        </w:rPr>
+        <w:t>Obstacles</w:t>
+      </w:r>
+    </w:p>
+    <w:p>
+      <w:pPr>
+        <w:rPr>
+          <w:b/>
+          <w:bCs/>
+          <w:i/>
+          <w:iCs/>
+          <w:u w:val="single"/>
+        </w:rPr>
+      </w:pPr>
+      <w:r>
+        <w:rPr>
+          <w:b/>
+          <w:bCs/>
+          <w:i/>
+          <w:iCs/>
+          <w:u w:val="single"/>
+        </w:rPr>
+        <w:t>Attributs :</w:t>
+      </w:r>
+    </w:p>
+    <w:p>
+      <w:pPr>
+        <w:jc w:val="center"/>
+      </w:pPr>
+      <w:r>
+        <w:drawing>
+          <wp:inline distT="0" distB="0" distL="0" distR="0" wp14:anchorId="0FED89A2" wp14:editId="54F16493">
+            <wp:extent cx="2503714" cy="2494669"/>
+            <wp:effectExtent l="152400" t="152400" r="354330" b="363220"/>
+            <wp:docPr id="53396745" name="Image 1"/>
+            <wp:cNvGraphicFramePr>
+              <a:graphicFrameLocks xmlns:a="http://schemas.openxmlformats.org/drawingml/2006/main" noChangeAspect="1"/>
+            </wp:cNvGraphicFramePr>
+            <a:graphic xmlns:a="http://schemas.openxmlformats.org/drawingml/2006/main">
+              <a:graphicData uri="http://schemas.openxmlformats.org/drawingml/2006/picture">
+                <pic:pic xmlns:pic="http://schemas.openxmlformats.org/drawingml/2006/picture">
+                  <pic:nvPicPr>
+                    <pic:cNvPr id="53396745" name=""/>
+                    <pic:cNvPicPr/>
+                  </pic:nvPicPr>
+                  <pic:blipFill rotWithShape="1">
+                    <a:blip r:embed="rId49"/>
+                    <a:srcRect t="10077"/>
+                    <a:stretch>
+                      <a:fillRect/>
+                    </a:stretch>
+                  </pic:blipFill>
+                  <pic:spPr bwMode="auto">
+                    <a:xfrm>
+                      <a:off x="0" y="0"/>
+                      <a:ext cx="2519328" cy="2510227"/>
+                    </a:xfrm>
+                    <a:prstGeom prst="rect">
+                      <a:avLst/>
+                    </a:prstGeom>
+                    <a:ln>
+                      <a:noFill/>
+                    </a:ln>
+                    <a:effectLst>
+                      <a:outerShdw blurRad="292100" dist="139700" dir="2700000" algn="tl" rotWithShape="0">
+                        <a:srgbClr val="333333">
+                          <a:alpha val="65000"/>
+                        </a:srgbClr>
+                      </a:outerShdw>
+                    </a:effectLst>
+                    <a:extLst>
+                      <a:ext uri="{53640926-AAD7-44D8-BBD7-CCE9431645EC}">
+                        <a14:shadowObscured xmlns:a14="http://schemas.microsoft.com/office/drawing/2010/main"/>
+                      </a:ext>
+                    </a:extLst>
+                  </pic:spPr>
+                </pic:pic>
+              </a:graphicData>
+            </a:graphic>
+          </wp:inline>
+        </w:drawing>
+      </w:r>
+    </w:p>
+    <w:p>
+      <w:r>
+        <w:t>Nous avons _</w:t>
+      </w:r>
+      <w:proofErr w:type="spellStart"/>
+      <w:r>
+        <w:t>posX</w:t>
+      </w:r>
+      <w:proofErr w:type="spellEnd"/>
+      <w:r>
+        <w:t xml:space="preserve"> qui représente la position de l’obstacle sur l’axe x et idem pour l’axe avec la variable _</w:t>
+      </w:r>
+      <w:proofErr w:type="spellStart"/>
+      <w:r>
+        <w:t>posY</w:t>
+      </w:r>
+      <w:proofErr w:type="spellEnd"/>
+      <w:r>
+        <w:t xml:space="preserve">. Et nous avons la largeur de l’obstacle avec </w:t>
+      </w:r>
+      <w:proofErr w:type="spellStart"/>
+      <w:r>
+        <w:t>width</w:t>
+      </w:r>
+      <w:proofErr w:type="spellEnd"/>
+      <w:r>
+        <w:t xml:space="preserve"> et la longueur avec </w:t>
+      </w:r>
+      <w:proofErr w:type="spellStart"/>
+      <w:r>
+        <w:t>height</w:t>
+      </w:r>
+      <w:proofErr w:type="spellEnd"/>
+      <w:r>
+        <w:t xml:space="preserve">. En suite </w:t>
+      </w:r>
+      <w:proofErr w:type="spellStart"/>
+      <w:r>
+        <w:t>lifeObstacle</w:t>
+      </w:r>
+      <w:proofErr w:type="spellEnd"/>
+      <w:r>
+        <w:t xml:space="preserve"> qui est la </w:t>
+      </w:r>
+      <w:proofErr w:type="spellStart"/>
+      <w:r>
+        <w:t>varibale</w:t>
+      </w:r>
+      <w:proofErr w:type="spellEnd"/>
+      <w:r>
+        <w:t xml:space="preserve"> qui va stocker la vie de chaque grillage et sa propriété et pour finir nous avons </w:t>
+      </w:r>
+      <w:proofErr w:type="spellStart"/>
+      <w:r>
+        <w:t>TabOfGrillage</w:t>
+      </w:r>
+      <w:proofErr w:type="spellEnd"/>
+      <w:r>
+        <w:t xml:space="preserve"> qui représente le tableau qui stock les deux </w:t>
+      </w:r>
+      <w:proofErr w:type="gramStart"/>
+      <w:r>
+        <w:t>état  des</w:t>
+      </w:r>
+      <w:proofErr w:type="gramEnd"/>
+      <w:r>
+        <w:t xml:space="preserve"> grillages.</w:t>
+      </w:r>
+    </w:p>
+    <w:p>
+      <w:pPr>
+        <w:rPr>
+          <w:b/>
+          <w:bCs/>
+          <w:i/>
+          <w:iCs/>
+          <w:u w:val="single"/>
+        </w:rPr>
+      </w:pPr>
+      <w:r>
+        <w:rPr>
+          <w:b/>
+          <w:bCs/>
+          <w:i/>
+          <w:iCs/>
+          <w:u w:val="single"/>
+        </w:rPr>
+        <w:lastRenderedPageBreak/>
+        <w:t>Constructeur :</w:t>
+      </w:r>
+    </w:p>
+    <w:p>
+      <w:r>
+        <w:t xml:space="preserve">Nous avons le constructeur avec comme signature </w:t>
+      </w:r>
+      <w:proofErr w:type="spellStart"/>
+      <w:r>
+        <w:t>int</w:t>
+      </w:r>
+      <w:proofErr w:type="spellEnd"/>
+      <w:r>
+        <w:t xml:space="preserve"> x et oint y qui représentent l’emplacement de l’obstacle dans la salle de concert</w:t>
+      </w:r>
+    </w:p>
+    <w:p>
+      <w:pPr>
+        <w:jc w:val="center"/>
+      </w:pPr>
+      <w:r>
+        <w:drawing>
+          <wp:inline distT="0" distB="0" distL="0" distR="0" wp14:anchorId="52788225" wp14:editId="7DD86F6B">
+            <wp:extent cx="2690093" cy="1341236"/>
+            <wp:effectExtent l="152400" t="152400" r="358140" b="354330"/>
+            <wp:docPr id="871367401" name="Image 1"/>
+            <wp:cNvGraphicFramePr>
+              <a:graphicFrameLocks xmlns:a="http://schemas.openxmlformats.org/drawingml/2006/main" noChangeAspect="1"/>
+            </wp:cNvGraphicFramePr>
+            <a:graphic xmlns:a="http://schemas.openxmlformats.org/drawingml/2006/main">
+              <a:graphicData uri="http://schemas.openxmlformats.org/drawingml/2006/picture">
+                <pic:pic xmlns:pic="http://schemas.openxmlformats.org/drawingml/2006/picture">
+                  <pic:nvPicPr>
+                    <pic:cNvPr id="871367401" name=""/>
+                    <pic:cNvPicPr/>
+                  </pic:nvPicPr>
+                  <pic:blipFill>
+                    <a:blip r:embed="rId50"/>
+                    <a:stretch>
+                      <a:fillRect/>
+                    </a:stretch>
+                  </pic:blipFill>
+                  <pic:spPr>
+                    <a:xfrm>
+                      <a:off x="0" y="0"/>
+                      <a:ext cx="2690093" cy="1341236"/>
+                    </a:xfrm>
+                    <a:prstGeom prst="rect">
+                      <a:avLst/>
+                    </a:prstGeom>
+                    <a:ln>
+                      <a:noFill/>
+                    </a:ln>
+                    <a:effectLst>
+                      <a:outerShdw blurRad="292100" dist="139700" dir="2700000" algn="tl" rotWithShape="0">
+                        <a:srgbClr val="333333">
+                          <a:alpha val="65000"/>
+                        </a:srgbClr>
+                      </a:outerShdw>
+                    </a:effectLst>
+                  </pic:spPr>
+                </pic:pic>
+              </a:graphicData>
+            </a:graphic>
+          </wp:inline>
+        </w:drawing>
+      </w:r>
+    </w:p>
+    <w:p>
+      <w:pPr>
+        <w:rPr>
+          <w:b/>
+          <w:bCs/>
+          <w:i/>
+          <w:iCs/>
+          <w:u w:val="single"/>
+        </w:rPr>
+      </w:pPr>
+      <w:r>
+        <w:rPr>
+          <w:b/>
+          <w:bCs/>
+          <w:i/>
+          <w:iCs/>
+          <w:u w:val="single"/>
+        </w:rPr>
+        <w:t>Méthodes :</w:t>
+      </w:r>
+    </w:p>
+    <w:p>
+      <w:r>
+        <w:t xml:space="preserve">Nous avons la méthode </w:t>
+      </w:r>
+      <w:proofErr w:type="spellStart"/>
+      <w:proofErr w:type="gramStart"/>
+      <w:r>
+        <w:t>degats</w:t>
+      </w:r>
+      <w:proofErr w:type="spellEnd"/>
+      <w:r>
+        <w:t>(</w:t>
+      </w:r>
+      <w:proofErr w:type="gramEnd"/>
+      <w:r>
+        <w:t xml:space="preserve">) qui va </w:t>
+      </w:r>
+      <w:proofErr w:type="spellStart"/>
+      <w:r>
+        <w:t>ennlever</w:t>
+      </w:r>
+      <w:proofErr w:type="spellEnd"/>
+      <w:r>
+        <w:t xml:space="preserve"> 50 sur la vie d’un grillage lorsqu’elle va être appelée.</w:t>
+      </w:r>
+    </w:p>
+    <w:p>
+      <w:pPr>
+        <w:jc w:val="center"/>
+      </w:pPr>
+      <w:r>
+        <w:drawing>
+          <wp:inline distT="0" distB="0" distL="0" distR="0" wp14:anchorId="03AEE0CE" wp14:editId="1F3AE5F5">
+            <wp:extent cx="2636748" cy="1036410"/>
+            <wp:effectExtent l="152400" t="152400" r="354330" b="354330"/>
+            <wp:docPr id="1918765794" name="Image 1"/>
+            <wp:cNvGraphicFramePr>
+              <a:graphicFrameLocks xmlns:a="http://schemas.openxmlformats.org/drawingml/2006/main" noChangeAspect="1"/>
+            </wp:cNvGraphicFramePr>
+            <a:graphic xmlns:a="http://schemas.openxmlformats.org/drawingml/2006/main">
+              <a:graphicData uri="http://schemas.openxmlformats.org/drawingml/2006/picture">
+                <pic:pic xmlns:pic="http://schemas.openxmlformats.org/drawingml/2006/picture">
+                  <pic:nvPicPr>
+                    <pic:cNvPr id="1918765794" name=""/>
+                    <pic:cNvPicPr/>
+                  </pic:nvPicPr>
+                  <pic:blipFill>
+                    <a:blip r:embed="rId51"/>
+                    <a:stretch>
+                      <a:fillRect/>
+                    </a:stretch>
+                  </pic:blipFill>
+                  <pic:spPr>
+                    <a:xfrm>
+                      <a:off x="0" y="0"/>
+                      <a:ext cx="2636748" cy="1036410"/>
+                    </a:xfrm>
+                    <a:prstGeom prst="rect">
+                      <a:avLst/>
+                    </a:prstGeom>
+                    <a:ln>
+                      <a:noFill/>
+                    </a:ln>
+                    <a:effectLst>
+                      <a:outerShdw blurRad="292100" dist="139700" dir="2700000" algn="tl" rotWithShape="0">
+                        <a:srgbClr val="333333">
+                          <a:alpha val="65000"/>
+                        </a:srgbClr>
+                      </a:outerShdw>
+                    </a:effectLst>
+                  </pic:spPr>
+                </pic:pic>
+              </a:graphicData>
+            </a:graphic>
+          </wp:inline>
+        </w:drawing>
+      </w:r>
+    </w:p>
+    <w:p>
+      <w:r>
+        <w:t xml:space="preserve">Et pour finir nous avons la méthode </w:t>
+      </w:r>
+      <w:proofErr w:type="gramStart"/>
+      <w:r>
+        <w:t>Render(</w:t>
+      </w:r>
+      <w:proofErr w:type="gramEnd"/>
+      <w:r>
+        <w:t xml:space="preserve">) qui va </w:t>
+      </w:r>
+      <w:r>
+        <w:t>dessiner le grillage sois en bonne état sois abimé à un emplacement précis dans la salle de concert.</w:t>
+      </w:r>
+    </w:p>
+    <w:p>
+      <w:pPr>
+        <w:jc w:val="center"/>
+        <w:rPr>
+          <w:lang w:val="fr-FR"/>
+        </w:rPr>
+      </w:pPr>
+      <w:r>
+        <w:drawing>
+          <wp:inline distT="0" distB="0" distL="0" distR="0" wp14:anchorId="7989FEB5" wp14:editId="712D9AE6">
+            <wp:extent cx="4050393" cy="1094544"/>
+            <wp:effectExtent l="152400" t="152400" r="369570" b="353695"/>
+            <wp:docPr id="2051549122" name="Image 1"/>
+            <wp:cNvGraphicFramePr>
+              <a:graphicFrameLocks xmlns:a="http://schemas.openxmlformats.org/drawingml/2006/main" noChangeAspect="1"/>
+            </wp:cNvGraphicFramePr>
+            <a:graphic xmlns:a="http://schemas.openxmlformats.org/drawingml/2006/main">
+              <a:graphicData uri="http://schemas.openxmlformats.org/drawingml/2006/picture">
+                <pic:pic xmlns:pic="http://schemas.openxmlformats.org/drawingml/2006/picture">
+                  <pic:nvPicPr>
+                    <pic:cNvPr id="2051549122" name=""/>
+                    <pic:cNvPicPr/>
+                  </pic:nvPicPr>
+                  <pic:blipFill>
+                    <a:blip r:embed="rId52"/>
+                    <a:stretch>
+                      <a:fillRect/>
+                    </a:stretch>
+                  </pic:blipFill>
+                  <pic:spPr>
+                    <a:xfrm>
+                      <a:off x="0" y="0"/>
+                      <a:ext cx="4077473" cy="1101862"/>
+                    </a:xfrm>
+                    <a:prstGeom prst="rect">
+                      <a:avLst/>
+                    </a:prstGeom>
+                    <a:ln>
+                      <a:noFill/>
+                    </a:ln>
+                    <a:effectLst>
+                      <a:outerShdw blurRad="292100" dist="139700" dir="2700000" algn="tl" rotWithShape="0">
+                        <a:srgbClr val="333333">
+                          <a:alpha val="65000"/>
+                        </a:srgbClr>
+                      </a:outerShdw>
+                    </a:effectLst>
+                  </pic:spPr>
+                </pic:pic>
+              </a:graphicData>
+            </a:graphic>
+          </wp:inline>
+        </w:drawing>
+      </w:r>
+    </w:p>
+    <w:p>
+      <w:pPr>
+        <w:jc w:val="center"/>
+        <w:rPr>
+          <w:lang w:val="fr-FR"/>
+        </w:rPr>
+      </w:pPr>
+    </w:p>
+    <w:p>
+      <w:pPr>
+        <w:rPr>
+          <w:lang w:val="fr-FR"/>
+        </w:rPr>
+      </w:pPr>
+      <w:r>
+        <w:rPr>
+          <w:lang w:val="fr-FR"/>
+        </w:rPr>
+        <w:br w:type="page"/>
+      </w:r>
+    </w:p>
+    <w:p>
+      <w:pPr>
+        <w:pStyle w:val="Titre3"/>
+        <w:rPr>
+          <w:lang w:val="fr-FR"/>
+        </w:rPr>
+      </w:pPr>
+      <w:proofErr w:type="spellStart"/>
+      <w:r>
+        <w:rPr>
+          <w:lang w:val="fr-FR"/>
+        </w:rPr>
+        <w:lastRenderedPageBreak/>
+        <w:t>GameOverForm.cs</w:t>
+      </w:r>
+      <w:proofErr w:type="spellEnd"/>
+    </w:p>
+    <w:p>
+      <w:pPr>
+        <w:rPr>
+          <w:lang w:val="fr-FR"/>
+        </w:rPr>
+      </w:pPr>
+      <w:r>
+        <w:rPr>
+          <w:lang w:val="fr-FR"/>
+        </w:rPr>
+        <w:t xml:space="preserve">La classe </w:t>
+      </w:r>
+      <w:proofErr w:type="spellStart"/>
+      <w:r>
+        <w:rPr>
+          <w:lang w:val="fr-FR"/>
+        </w:rPr>
+        <w:t>GameOverForm</w:t>
+      </w:r>
+      <w:proofErr w:type="spellEnd"/>
+      <w:r>
+        <w:rPr>
+          <w:lang w:val="fr-FR"/>
+        </w:rPr>
+        <w:t xml:space="preserve"> sert à afficher l'écran de fin lorsque le joueur perd la partie.</w:t>
+      </w:r>
+    </w:p>
+    <w:p>
+      <w:pPr>
+        <w:jc w:val="center"/>
+        <w:rPr>
+          <w:lang w:val="fr-FR"/>
+        </w:rPr>
+      </w:pPr>
+      <w:r>
+        <w:rPr>
+          <w:lang w:val="fr-FR"/>
+        </w:rPr>
+        <w:drawing>
+          <wp:inline distT="0" distB="0" distL="0" distR="0" wp14:anchorId="427284AA" wp14:editId="5666A0D9">
+            <wp:extent cx="3383280" cy="2735142"/>
+            <wp:effectExtent l="152400" t="152400" r="369570" b="370205"/>
+            <wp:docPr id="1483357370" name="Image 1"/>
+            <wp:cNvGraphicFramePr>
+              <a:graphicFrameLocks xmlns:a="http://schemas.openxmlformats.org/drawingml/2006/main" noChangeAspect="1"/>
+            </wp:cNvGraphicFramePr>
+            <a:graphic xmlns:a="http://schemas.openxmlformats.org/drawingml/2006/main">
+              <a:graphicData uri="http://schemas.openxmlformats.org/drawingml/2006/picture">
+                <pic:pic xmlns:pic="http://schemas.openxmlformats.org/drawingml/2006/picture">
+                  <pic:nvPicPr>
+                    <pic:cNvPr id="1483357370" name=""/>
+                    <pic:cNvPicPr/>
+                  </pic:nvPicPr>
+                  <pic:blipFill>
+                    <a:blip r:embed="rId53"/>
+                    <a:stretch>
+                      <a:fillRect/>
+                    </a:stretch>
+                  </pic:blipFill>
+                  <pic:spPr>
+                    <a:xfrm>
+                      <a:off x="0" y="0"/>
+                      <a:ext cx="3389111" cy="2739856"/>
+                    </a:xfrm>
+                    <a:prstGeom prst="rect">
+                      <a:avLst/>
+                    </a:prstGeom>
+                    <a:ln>
+                      <a:noFill/>
+                    </a:ln>
+                    <a:effectLst>
+                      <a:outerShdw blurRad="292100" dist="139700" dir="2700000" algn="tl" rotWithShape="0">
+                        <a:srgbClr val="333333">
+                          <a:alpha val="65000"/>
+                        </a:srgbClr>
+                      </a:outerShdw>
+                    </a:effectLst>
+                  </pic:spPr>
+                </pic:pic>
+              </a:graphicData>
+            </a:graphic>
+          </wp:inline>
+        </w:drawing>
+      </w:r>
+    </w:p>
+    <w:p>
+      <w:r>
+        <w:t xml:space="preserve">La classe </w:t>
+      </w:r>
+      <w:proofErr w:type="spellStart"/>
+      <w:r>
+        <w:t>GameOverForm</w:t>
+      </w:r>
+      <w:proofErr w:type="spellEnd"/>
+      <w:r>
+        <w:t xml:space="preserve"> sert à afficher l'écran de fin lorsque le joueur perd la partie. Lorsqu'elle est créée, elle reçoit le score du joueur grâce au paramètre score. La méthode </w:t>
+      </w:r>
+      <w:proofErr w:type="spellStart"/>
+      <w:proofErr w:type="gramStart"/>
+      <w:r>
+        <w:t>InitializeComponent</w:t>
+      </w:r>
+      <w:proofErr w:type="spellEnd"/>
+      <w:r>
+        <w:t>(</w:t>
+      </w:r>
+      <w:proofErr w:type="gramEnd"/>
+      <w:r>
+        <w:t xml:space="preserve">) permet de charger tous les éléments graphiques du formulaire, comme l'image de fond et les différents composants affichés à l'écran. Ensuite, le texte du label </w:t>
+      </w:r>
+      <w:proofErr w:type="spellStart"/>
+      <w:r>
+        <w:t>lblScore</w:t>
+      </w:r>
+      <w:proofErr w:type="spellEnd"/>
+      <w:r>
+        <w:t xml:space="preserve"> est modifié afin d'afficher le score obtenu pendant la partie. Les méthodes label1_Click, label1_Click_1 et </w:t>
+      </w:r>
+      <w:proofErr w:type="spellStart"/>
+      <w:r>
+        <w:t>GameOverForm_Load</w:t>
+      </w:r>
+      <w:proofErr w:type="spellEnd"/>
+      <w:r>
+        <w:t xml:space="preserve"> sont des événements créés automatiquement par Visual Studio. Dans ce projet, elles ne contiennent aucune instruction particulière et ne sont donc pas utilisées. Cette classe permet simplement d'afficher un écran de défaite personnalisé avec le score final du joueur à la fin de la partie.</w:t>
+      </w:r>
+    </w:p>
+    <w:p>
+      <w:r>
+        <w:br w:type="page"/>
+      </w:r>
+    </w:p>
+    <w:p>
+      <w:pPr>
+        <w:pStyle w:val="Titre3"/>
+      </w:pPr>
+      <w:r>
+        <w:lastRenderedPageBreak/>
+        <w:t>Salle de concert</w:t>
+      </w:r>
+    </w:p>
+    <w:p>
+      <w:pPr>
+        <w:rPr>
+          <w:b/>
+          <w:bCs/>
+          <w:i/>
+          <w:iCs/>
+          <w:u w:val="single"/>
+        </w:rPr>
+      </w:pPr>
+      <w:r>
+        <w:rPr>
+          <w:b/>
+          <w:bCs/>
+          <w:i/>
+          <w:iCs/>
+          <w:u w:val="single"/>
+        </w:rPr>
+        <w:t>Attributs :</w:t>
+      </w:r>
+    </w:p>
+    <w:p>
+      <w:r>
+        <w:drawing>
+          <wp:inline distT="0" distB="0" distL="0" distR="0" wp14:anchorId="47A389F9" wp14:editId="40F146F0">
+            <wp:extent cx="5490845" cy="5151120"/>
+            <wp:effectExtent l="152400" t="152400" r="357505" b="354330"/>
+            <wp:docPr id="103231410" name="Image 1"/>
+            <wp:cNvGraphicFramePr>
+              <a:graphicFrameLocks xmlns:a="http://schemas.openxmlformats.org/drawingml/2006/main" noChangeAspect="1"/>
+            </wp:cNvGraphicFramePr>
+            <a:graphic xmlns:a="http://schemas.openxmlformats.org/drawingml/2006/main">
+              <a:graphicData uri="http://schemas.openxmlformats.org/drawingml/2006/picture">
+                <pic:pic xmlns:pic="http://schemas.openxmlformats.org/drawingml/2006/picture">
+                  <pic:nvPicPr>
+                    <pic:cNvPr id="103231410" name=""/>
+                    <pic:cNvPicPr/>
+                  </pic:nvPicPr>
+                  <pic:blipFill>
+                    <a:blip r:embed="rId54"/>
+                    <a:stretch>
+                      <a:fillRect/>
+                    </a:stretch>
+                  </pic:blipFill>
+                  <pic:spPr>
+                    <a:xfrm>
+                      <a:off x="0" y="0"/>
+                      <a:ext cx="5492590" cy="5152757"/>
+                    </a:xfrm>
+                    <a:prstGeom prst="rect">
+                      <a:avLst/>
+                    </a:prstGeom>
+                    <a:ln>
+                      <a:noFill/>
+                    </a:ln>
+                    <a:effectLst>
+                      <a:outerShdw blurRad="292100" dist="139700" dir="2700000" algn="tl" rotWithShape="0">
+                        <a:srgbClr val="333333">
+                          <a:alpha val="65000"/>
+                        </a:srgbClr>
+                      </a:outerShdw>
+                    </a:effectLst>
+                  </pic:spPr>
+                </pic:pic>
+              </a:graphicData>
+            </a:graphic>
+          </wp:inline>
+        </w:drawing>
+      </w:r>
+    </w:p>
+    <w:p>
+      <w:r>
+        <w:t>Cette partie contient toutes les variables utilisées pendant le jeu. WIDTH et HEIGHT définissent la taille de la salle de concert. Les variables _score et _</w:t>
+      </w:r>
+      <w:proofErr w:type="spellStart"/>
+      <w:r>
+        <w:t>nbKill</w:t>
+      </w:r>
+      <w:proofErr w:type="spellEnd"/>
+      <w:r>
+        <w:t xml:space="preserve"> permettent de garder en mémoire le score du joueur ainsi que le nombre d'ennemis éliminés. Les listes foule, balles, </w:t>
+      </w:r>
+      <w:proofErr w:type="spellStart"/>
+      <w:r>
+        <w:t>ballesEnnemis</w:t>
+      </w:r>
+      <w:proofErr w:type="spellEnd"/>
+      <w:r>
+        <w:t xml:space="preserve"> et </w:t>
+      </w:r>
+      <w:proofErr w:type="spellStart"/>
+      <w:r>
+        <w:t>barrieres</w:t>
+      </w:r>
+      <w:proofErr w:type="spellEnd"/>
+      <w:r>
+        <w:t xml:space="preserve"> servent à stocker les ennemis, les munitions du joueur, les munitions ennemies et les barrières présentes dans la partie. Les objets Random sont utilisés pour ajouter de l'aléatoire, par exemple pour l'apparition des ennemis ou le moment où ils tirent. La variable </w:t>
+      </w:r>
+      <w:proofErr w:type="spellStart"/>
+      <w:r>
+        <w:t>intervalEnnemis</w:t>
+      </w:r>
+      <w:proofErr w:type="spellEnd"/>
+      <w:r>
+        <w:t xml:space="preserve"> sert à gérer le temps entre chaque apparition d'ennemi tandis que </w:t>
+      </w:r>
+      <w:proofErr w:type="spellStart"/>
+      <w:r>
+        <w:t>ralentisseurTir</w:t>
+      </w:r>
+      <w:proofErr w:type="spellEnd"/>
+      <w:r>
+        <w:t xml:space="preserve"> évite que le joueur puisse tirer sans arrêt. La variable _</w:t>
+      </w:r>
+      <w:proofErr w:type="spellStart"/>
+      <w:r>
+        <w:t>player</w:t>
+      </w:r>
+      <w:proofErr w:type="spellEnd"/>
+      <w:r>
+        <w:t xml:space="preserve"> représente le guitariste contrôlé par le joueur. Enfin, </w:t>
+      </w:r>
+      <w:proofErr w:type="spellStart"/>
+      <w:r>
+        <w:t>currentContext</w:t>
+      </w:r>
+      <w:proofErr w:type="spellEnd"/>
+      <w:r>
+        <w:t xml:space="preserve">, </w:t>
+      </w:r>
+      <w:proofErr w:type="spellStart"/>
+      <w:r>
+        <w:t>airspace</w:t>
+      </w:r>
+      <w:proofErr w:type="spellEnd"/>
+      <w:r>
+        <w:t xml:space="preserve"> et </w:t>
+      </w:r>
+      <w:proofErr w:type="spellStart"/>
+      <w:r>
+        <w:t>drawingSpace</w:t>
+      </w:r>
+      <w:proofErr w:type="spellEnd"/>
+      <w:r>
+        <w:t xml:space="preserve"> sont utilisés pour dessiner les différents éléments du jeu à l'écran de manière fluide.</w:t>
+      </w:r>
+    </w:p>
+    <w:p>
+      <w:pPr>
+        <w:rPr>
+          <w:lang w:val="fr-FR"/>
+        </w:rPr>
+      </w:pPr>
+    </w:p>
+    <w:p>
+      <w:pPr>
+        <w:rPr>
+          <w:b/>
+          <w:bCs/>
+          <w:i/>
+          <w:iCs/>
+          <w:u w:val="single"/>
+          <w:lang w:val="fr-FR"/>
+        </w:rPr>
+      </w:pPr>
+      <w:r>
+        <w:rPr>
+          <w:b/>
+          <w:bCs/>
+          <w:i/>
+          <w:iCs/>
+          <w:u w:val="single"/>
+          <w:lang w:val="fr-FR"/>
+        </w:rPr>
+        <w:lastRenderedPageBreak/>
+        <w:t>Constructeur :</w:t>
+      </w:r>
+    </w:p>
+    <w:p>
+      <w:pPr>
+        <w:rPr>
+          <w:b/>
+          <w:bCs/>
+          <w:i/>
+          <w:iCs/>
+          <w:u w:val="single"/>
+          <w:lang w:val="fr-FR"/>
+        </w:rPr>
+      </w:pPr>
+      <w:r>
+        <w:rPr>
+          <w:b/>
+          <w:bCs/>
+          <w:i/>
+          <w:iCs/>
+          <w:lang w:val="fr-FR"/>
+        </w:rPr>
+        <w:drawing>
+          <wp:inline distT="0" distB="0" distL="0" distR="0" wp14:anchorId="62319530" wp14:editId="0321472E">
+            <wp:extent cx="5906345" cy="3691467"/>
+            <wp:effectExtent l="152400" t="152400" r="361315" b="366395"/>
+            <wp:docPr id="1226075407" name="Image 1"/>
+            <wp:cNvGraphicFramePr>
+              <a:graphicFrameLocks xmlns:a="http://schemas.openxmlformats.org/drawingml/2006/main" noChangeAspect="1"/>
+            </wp:cNvGraphicFramePr>
+            <a:graphic xmlns:a="http://schemas.openxmlformats.org/drawingml/2006/main">
+              <a:graphicData uri="http://schemas.openxmlformats.org/drawingml/2006/picture">
+                <pic:pic xmlns:pic="http://schemas.openxmlformats.org/drawingml/2006/picture">
+                  <pic:nvPicPr>
+                    <pic:cNvPr id="1226075407" name=""/>
+                    <pic:cNvPicPr/>
+                  </pic:nvPicPr>
+                  <pic:blipFill>
+                    <a:blip r:embed="rId55"/>
+                    <a:stretch>
+                      <a:fillRect/>
+                    </a:stretch>
+                  </pic:blipFill>
+                  <pic:spPr>
+                    <a:xfrm>
+                      <a:off x="0" y="0"/>
+                      <a:ext cx="5911259" cy="3694538"/>
+                    </a:xfrm>
+                    <a:prstGeom prst="rect">
+                      <a:avLst/>
+                    </a:prstGeom>
+                    <a:ln>
+                      <a:noFill/>
+                    </a:ln>
+                    <a:effectLst>
+                      <a:outerShdw blurRad="292100" dist="139700" dir="2700000" algn="tl" rotWithShape="0">
+                        <a:srgbClr val="333333">
+                          <a:alpha val="65000"/>
+                        </a:srgbClr>
+                      </a:outerShdw>
+                    </a:effectLst>
+                  </pic:spPr>
+                </pic:pic>
+              </a:graphicData>
+            </a:graphic>
+          </wp:inline>
+        </w:drawing>
+      </w:r>
+    </w:p>
+    <w:p>
+      <w:pPr>
+        <w:rPr>
+          <w:lang w:val="fr-FR"/>
+        </w:rPr>
+      </w:pPr>
+      <w:r>
+        <w:rPr>
+          <w:lang w:val="fr-FR"/>
+        </w:rPr>
+        <w:t xml:space="preserve">Ce constructeur sert à préparer la fenêtre principale du jeu lorsque celle-ci est créée. La méthode </w:t>
+      </w:r>
+      <w:proofErr w:type="spellStart"/>
+      <w:proofErr w:type="gramStart"/>
+      <w:r>
+        <w:rPr>
+          <w:lang w:val="fr-FR"/>
+        </w:rPr>
+        <w:t>InitializeComponent</w:t>
+      </w:r>
+      <w:proofErr w:type="spellEnd"/>
+      <w:r>
+        <w:rPr>
+          <w:lang w:val="fr-FR"/>
+        </w:rPr>
+        <w:t>(</w:t>
+      </w:r>
+      <w:proofErr w:type="gramEnd"/>
+      <w:r>
+        <w:rPr>
+          <w:lang w:val="fr-FR"/>
+        </w:rPr>
+        <w:t xml:space="preserve">) initialise les différents composants graphiques de la fenêtre. Ensuite, </w:t>
+      </w:r>
+      <w:proofErr w:type="spellStart"/>
+      <w:r>
+        <w:rPr>
+          <w:lang w:val="fr-FR"/>
+        </w:rPr>
+        <w:t>ClientSize</w:t>
+      </w:r>
+      <w:proofErr w:type="spellEnd"/>
+      <w:r>
+        <w:rPr>
+          <w:lang w:val="fr-FR"/>
+        </w:rPr>
+        <w:t xml:space="preserve"> définit la taille de la salle de concert. La vitesse du </w:t>
+      </w:r>
+      <w:proofErr w:type="spellStart"/>
+      <w:r>
+        <w:rPr>
+          <w:lang w:val="fr-FR"/>
+        </w:rPr>
+        <w:t>timer</w:t>
+      </w:r>
+      <w:proofErr w:type="spellEnd"/>
+      <w:r>
+        <w:rPr>
+          <w:lang w:val="fr-FR"/>
+        </w:rPr>
+        <w:t xml:space="preserve"> est augmentée en réglant son intervalle à 20 millisecondes afin d'obtenir des déplacements et des animations plus fluides. Les variables liées au </w:t>
+      </w:r>
+      <w:proofErr w:type="spellStart"/>
+      <w:r>
+        <w:rPr>
+          <w:lang w:val="fr-FR"/>
+        </w:rPr>
+        <w:t>BufferedGraphics</w:t>
+      </w:r>
+      <w:proofErr w:type="spellEnd"/>
+      <w:r>
+        <w:rPr>
+          <w:lang w:val="fr-FR"/>
+        </w:rPr>
+        <w:t xml:space="preserve"> sont ensuite initialisées pour éviter le scintillement lors de l'affichage des éléments du jeu. Le joueur reçu en paramètre est enregistré dans la variable _</w:t>
+      </w:r>
+      <w:proofErr w:type="spellStart"/>
+      <w:r>
+        <w:rPr>
+          <w:lang w:val="fr-FR"/>
+        </w:rPr>
+        <w:t>player</w:t>
+      </w:r>
+      <w:proofErr w:type="spellEnd"/>
+      <w:r>
+        <w:rPr>
+          <w:lang w:val="fr-FR"/>
+        </w:rPr>
+        <w:t xml:space="preserve"> afin qu'il puisse être utilisé dans le reste du programme. La propriété </w:t>
+      </w:r>
+      <w:proofErr w:type="spellStart"/>
+      <w:r>
+        <w:rPr>
+          <w:lang w:val="fr-FR"/>
+        </w:rPr>
+        <w:t>KeyPreview</w:t>
+      </w:r>
+      <w:proofErr w:type="spellEnd"/>
+      <w:r>
+        <w:rPr>
+          <w:lang w:val="fr-FR"/>
+        </w:rPr>
+        <w:t xml:space="preserve"> est activée pour permettre au formulaire de détecter les touches du clavier, puis l'événement </w:t>
+      </w:r>
+      <w:proofErr w:type="spellStart"/>
+      <w:r>
+        <w:rPr>
+          <w:lang w:val="fr-FR"/>
+        </w:rPr>
+        <w:t>KeyDown</w:t>
+      </w:r>
+      <w:proofErr w:type="spellEnd"/>
+      <w:r>
+        <w:rPr>
+          <w:lang w:val="fr-FR"/>
+        </w:rPr>
+        <w:t xml:space="preserve"> est relié à la méthode qui gère les déplacements et les tirs du joueur. Enfin, une boucle crée les différentes barrières placées devant le joueur et une seconde boucle génère les ennemis présents au début de la partie.</w:t>
+      </w:r>
+      <w:r>
+        <w:rPr>
+          <w:lang w:val="fr-FR"/>
+        </w:rPr>
+        <w:br/>
+      </w:r>
+    </w:p>
+    <w:p>
+      <w:pPr>
+        <w:rPr>
+          <w:b/>
+          <w:bCs/>
+          <w:i/>
+          <w:iCs/>
+          <w:u w:val="single"/>
+          <w:lang w:val="fr-FR"/>
+        </w:rPr>
+      </w:pPr>
+      <w:r>
+        <w:rPr>
+          <w:b/>
+          <w:bCs/>
+          <w:i/>
+          <w:iCs/>
+          <w:u w:val="single"/>
+          <w:lang w:val="fr-FR"/>
+        </w:rPr>
+        <w:br w:type="page"/>
+      </w:r>
+    </w:p>
+    <w:p>
+      <w:pPr>
+        <w:rPr>
+          <w:b/>
+          <w:bCs/>
+          <w:i/>
+          <w:iCs/>
+          <w:u w:val="single"/>
+          <w:lang w:val="fr-FR"/>
+        </w:rPr>
+      </w:pPr>
+      <w:r>
+        <w:rPr>
+          <w:b/>
+          <w:bCs/>
+          <w:i/>
+          <w:iCs/>
+          <w:u w:val="single"/>
+          <w:lang w:val="fr-FR"/>
+        </w:rPr>
+        <w:lastRenderedPageBreak/>
+        <w:t>Méthodes :</w:t>
+      </w:r>
+    </w:p>
+    <w:p>
+      <w:pPr>
+        <w:rPr>
+          <w:lang w:val="fr-FR"/>
+        </w:rPr>
+      </w:pPr>
+      <w:r>
+        <w:rPr>
+          <w:lang w:val="fr-FR"/>
+        </w:rPr>
+        <w:t xml:space="preserve">Nous avons </w:t>
+      </w:r>
+      <w:proofErr w:type="gramStart"/>
+      <w:r>
+        <w:rPr>
+          <w:lang w:val="fr-FR"/>
+        </w:rPr>
+        <w:t>Render(</w:t>
+      </w:r>
+      <w:proofErr w:type="gramEnd"/>
+      <w:r>
+        <w:rPr>
+          <w:lang w:val="fr-FR"/>
+        </w:rPr>
+        <w:t>).</w:t>
+      </w:r>
+    </w:p>
+    <w:p>
+      <w:pPr>
+        <w:rPr>
+          <w:b/>
+          <w:bCs/>
+          <w:i/>
+          <w:iCs/>
+          <w:u w:val="single"/>
+          <w:lang w:val="fr-FR"/>
+        </w:rPr>
+      </w:pPr>
+      <w:r>
+        <w:rPr>
+          <w:b/>
+          <w:bCs/>
+          <w:i/>
+          <w:iCs/>
+          <w:lang w:val="fr-FR"/>
+        </w:rPr>
+        <w:drawing>
+          <wp:inline distT="0" distB="0" distL="0" distR="0" wp14:anchorId="27352A2A" wp14:editId="302CE06E">
+            <wp:extent cx="5759450" cy="2486660"/>
+            <wp:effectExtent l="152400" t="152400" r="355600" b="370840"/>
+            <wp:docPr id="2052556341" name="Image 1"/>
+            <wp:cNvGraphicFramePr>
+              <a:graphicFrameLocks xmlns:a="http://schemas.openxmlformats.org/drawingml/2006/main" noChangeAspect="1"/>
+            </wp:cNvGraphicFramePr>
+            <a:graphic xmlns:a="http://schemas.openxmlformats.org/drawingml/2006/main">
+              <a:graphicData uri="http://schemas.openxmlformats.org/drawingml/2006/picture">
+                <pic:pic xmlns:pic="http://schemas.openxmlformats.org/drawingml/2006/picture">
+                  <pic:nvPicPr>
+                    <pic:cNvPr id="2052556341" name=""/>
+                    <pic:cNvPicPr/>
+                  </pic:nvPicPr>
+                  <pic:blipFill>
+                    <a:blip r:embed="rId56"/>
+                    <a:stretch>
+                      <a:fillRect/>
+                    </a:stretch>
+                  </pic:blipFill>
+                  <pic:spPr>
+                    <a:xfrm>
+                      <a:off x="0" y="0"/>
+                      <a:ext cx="5759450" cy="2486660"/>
+                    </a:xfrm>
+                    <a:prstGeom prst="rect">
+                      <a:avLst/>
+                    </a:prstGeom>
+                    <a:ln>
+                      <a:noFill/>
+                    </a:ln>
+                    <a:effectLst>
+                      <a:outerShdw blurRad="292100" dist="139700" dir="2700000" algn="tl" rotWithShape="0">
+                        <a:srgbClr val="333333">
+                          <a:alpha val="65000"/>
+                        </a:srgbClr>
+                      </a:outerShdw>
+                    </a:effectLst>
+                  </pic:spPr>
+                </pic:pic>
+              </a:graphicData>
+            </a:graphic>
+          </wp:inline>
+        </w:drawing>
+      </w:r>
+    </w:p>
+    <w:p>
+      <w:r>
+        <w:t xml:space="preserve">La méthode </w:t>
+      </w:r>
+      <w:proofErr w:type="gramStart"/>
+      <w:r>
+        <w:t>Render(</w:t>
+      </w:r>
+      <w:proofErr w:type="gramEnd"/>
+      <w:r>
+        <w:t xml:space="preserve">) sert à afficher tous les éléments du jeu à l'écran. Elle commence par afficher l'image de fond représentant la salle de concert. Ensuite, elle dessine le joueur principal, puis tous les ennemis présents dans la liste foule. Après cela, les munitions du joueur et celles des ennemis sont affichées à leur position actuelle. Les barrières sont également dessinées afin qu'elles soient visibles pendant la partie. À la fin de la méthode, le score du joueur ainsi que le nombre d'ennemis éliminés sont affichés en bas de l'écran. Enfin, la méthode </w:t>
+      </w:r>
+      <w:proofErr w:type="spellStart"/>
+      <w:proofErr w:type="gramStart"/>
+      <w:r>
+        <w:t>airspace.Render</w:t>
+      </w:r>
+      <w:proofErr w:type="spellEnd"/>
+      <w:proofErr w:type="gramEnd"/>
+      <w:r>
+        <w:t>() permet de mettre à jour l'affichage pour que tous les éléments dessinés apparaissent à l'écran.</w:t>
+      </w:r>
+    </w:p>
+    <w:p>
+      <w:r>
+        <w:br w:type="page"/>
+      </w:r>
+    </w:p>
+    <w:p>
+      <w:r>
+        <w:lastRenderedPageBreak/>
+        <w:t xml:space="preserve">Nous avons maintenant </w:t>
+      </w:r>
+      <w:proofErr w:type="gramStart"/>
+      <w:r>
+        <w:t>Update(</w:t>
+      </w:r>
+      <w:proofErr w:type="gramEnd"/>
+      <w:r>
+        <w:t xml:space="preserve">) </w:t>
+      </w:r>
+      <w:proofErr w:type="spellStart"/>
+      <w:r>
+        <w:t>ert</w:t>
+      </w:r>
+      <w:proofErr w:type="spellEnd"/>
+      <w:r>
+        <w:t xml:space="preserve"> en raison de sa longueur elle est séparée en plusieurs capture.</w:t>
+      </w:r>
+    </w:p>
+    <w:p>
+      <w:r>
+        <w:drawing>
+          <wp:inline distT="0" distB="0" distL="0" distR="0" wp14:anchorId="4A49648A" wp14:editId="6643DD61">
+            <wp:extent cx="5759450" cy="1957070"/>
+            <wp:effectExtent l="152400" t="152400" r="355600" b="367030"/>
+            <wp:docPr id="1971526635" name="Image 1"/>
+            <wp:cNvGraphicFramePr>
+              <a:graphicFrameLocks xmlns:a="http://schemas.openxmlformats.org/drawingml/2006/main" noChangeAspect="1"/>
+            </wp:cNvGraphicFramePr>
+            <a:graphic xmlns:a="http://schemas.openxmlformats.org/drawingml/2006/main">
+              <a:graphicData uri="http://schemas.openxmlformats.org/drawingml/2006/picture">
+                <pic:pic xmlns:pic="http://schemas.openxmlformats.org/drawingml/2006/picture">
+                  <pic:nvPicPr>
+                    <pic:cNvPr id="1971526635" name=""/>
+                    <pic:cNvPicPr/>
+                  </pic:nvPicPr>
+                  <pic:blipFill>
+                    <a:blip r:embed="rId57"/>
+                    <a:stretch>
+                      <a:fillRect/>
+                    </a:stretch>
+                  </pic:blipFill>
+                  <pic:spPr>
+                    <a:xfrm>
+                      <a:off x="0" y="0"/>
+                      <a:ext cx="5759450" cy="1957070"/>
+                    </a:xfrm>
+                    <a:prstGeom prst="rect">
+                      <a:avLst/>
+                    </a:prstGeom>
+                    <a:ln>
+                      <a:noFill/>
+                    </a:ln>
+                    <a:effectLst>
+                      <a:outerShdw blurRad="292100" dist="139700" dir="2700000" algn="tl" rotWithShape="0">
+                        <a:srgbClr val="333333">
+                          <a:alpha val="65000"/>
+                        </a:srgbClr>
+                      </a:outerShdw>
+                    </a:effectLst>
+                  </pic:spPr>
+                </pic:pic>
+              </a:graphicData>
+            </a:graphic>
+          </wp:inline>
+        </w:drawing>
+      </w:r>
+    </w:p>
+    <w:p>
+      <w:r>
+        <w:t xml:space="preserve">Cette partie de la méthode </w:t>
+      </w:r>
+      <w:proofErr w:type="gramStart"/>
+      <w:r>
+        <w:t>Update(</w:t>
+      </w:r>
+      <w:proofErr w:type="gramEnd"/>
+      <w:r>
+        <w:t xml:space="preserve">) permet de gérer plusieurs éléments importants du jeu. Elle commence par vérifier si certaines barrières n'ont plus de points de vie afin de les supprimer. Ensuite, elle gère l'apparition des ennemis grâce à la variable </w:t>
+      </w:r>
+      <w:proofErr w:type="spellStart"/>
+      <w:r>
+        <w:t>intervalEnnemis</w:t>
+      </w:r>
+      <w:proofErr w:type="spellEnd"/>
+      <w:r>
+        <w:t>. Lorsque le temps défini est atteint, un nouvel ennemi est créé à une position aléatoire. Cette partie sert également à gérer le ralentissement du tir du joueur afin d'éviter qu'il puisse tirer sans arrêt.</w:t>
+      </w:r>
+    </w:p>
+    <w:p>
+      <w:pPr>
+        <w:jc w:val="center"/>
+      </w:pPr>
+      <w:r>
+        <w:lastRenderedPageBreak/>
+        <w:drawing>
+          <wp:inline distT="0" distB="0" distL="0" distR="0" wp14:anchorId="36BDC24A" wp14:editId="24B3F538">
+            <wp:extent cx="4252328" cy="4549534"/>
+            <wp:effectExtent l="152400" t="152400" r="358140" b="365760"/>
+            <wp:docPr id="119634703" name="Image 1"/>
+            <wp:cNvGraphicFramePr>
+              <a:graphicFrameLocks xmlns:a="http://schemas.openxmlformats.org/drawingml/2006/main" noChangeAspect="1"/>
+            </wp:cNvGraphicFramePr>
+            <a:graphic xmlns:a="http://schemas.openxmlformats.org/drawingml/2006/main">
+              <a:graphicData uri="http://schemas.openxmlformats.org/drawingml/2006/picture">
+                <pic:pic xmlns:pic="http://schemas.openxmlformats.org/drawingml/2006/picture">
+                  <pic:nvPicPr>
+                    <pic:cNvPr id="119634703" name=""/>
+                    <pic:cNvPicPr/>
+                  </pic:nvPicPr>
+                  <pic:blipFill>
+                    <a:blip r:embed="rId58"/>
+                    <a:stretch>
+                      <a:fillRect/>
+                    </a:stretch>
+                  </pic:blipFill>
+                  <pic:spPr>
+                    <a:xfrm>
+                      <a:off x="0" y="0"/>
+                      <a:ext cx="4252328" cy="4549534"/>
+                    </a:xfrm>
+                    <a:prstGeom prst="rect">
+                      <a:avLst/>
+                    </a:prstGeom>
+                    <a:ln>
+                      <a:noFill/>
+                    </a:ln>
+                    <a:effectLst>
+                      <a:outerShdw blurRad="292100" dist="139700" dir="2700000" algn="tl" rotWithShape="0">
+                        <a:srgbClr val="333333">
+                          <a:alpha val="65000"/>
+                        </a:srgbClr>
+                      </a:outerShdw>
+                    </a:effectLst>
+                  </pic:spPr>
+                </pic:pic>
+              </a:graphicData>
+            </a:graphic>
+          </wp:inline>
+        </w:drawing>
+      </w:r>
+    </w:p>
+    <w:p>
+      <w:r>
+        <w:t>Cette partie s'occupe du déplacement des ennemis. Chaque ennemi est mis à jour et possède une chance de tirer un projectile ennemi. Lorsqu'un ennemi sort de l'écran, il est automatiquement supprimé. Une collision est également vérifiée entre les ennemis et les barrières. Si un ennemi touche une barrière, celui-ci disparaît et la barrière perd des points de vie. Enfin, les projectiles du joueur sont mis à jour et supprimés lorsqu'ils quittent la zone de jeu.</w:t>
+      </w:r>
+      <w:r>
+        <w:t xml:space="preserve"> Par en haut.</w:t>
+      </w:r>
+    </w:p>
+    <w:p/>
+    <w:p>
+      <w:pPr>
+        <w:jc w:val="center"/>
+      </w:pPr>
+      <w:r>
+        <w:lastRenderedPageBreak/>
+        <w:drawing>
+          <wp:inline distT="0" distB="0" distL="0" distR="0" wp14:anchorId="07E6C39E" wp14:editId="47B49091">
+            <wp:extent cx="4572396" cy="4900085"/>
+            <wp:effectExtent l="152400" t="152400" r="361950" b="358140"/>
+            <wp:docPr id="1096820100" name="Image 1"/>
+            <wp:cNvGraphicFramePr>
+              <a:graphicFrameLocks xmlns:a="http://schemas.openxmlformats.org/drawingml/2006/main" noChangeAspect="1"/>
+            </wp:cNvGraphicFramePr>
+            <a:graphic xmlns:a="http://schemas.openxmlformats.org/drawingml/2006/main">
+              <a:graphicData uri="http://schemas.openxmlformats.org/drawingml/2006/picture">
+                <pic:pic xmlns:pic="http://schemas.openxmlformats.org/drawingml/2006/picture">
+                  <pic:nvPicPr>
+                    <pic:cNvPr id="1096820100" name=""/>
+                    <pic:cNvPicPr/>
+                  </pic:nvPicPr>
+                  <pic:blipFill>
+                    <a:blip r:embed="rId59"/>
+                    <a:stretch>
+                      <a:fillRect/>
+                    </a:stretch>
+                  </pic:blipFill>
+                  <pic:spPr>
+                    <a:xfrm>
+                      <a:off x="0" y="0"/>
+                      <a:ext cx="4572396" cy="4900085"/>
+                    </a:xfrm>
+                    <a:prstGeom prst="rect">
+                      <a:avLst/>
+                    </a:prstGeom>
+                    <a:ln>
+                      <a:noFill/>
+                    </a:ln>
+                    <a:effectLst>
+                      <a:outerShdw blurRad="292100" dist="139700" dir="2700000" algn="tl" rotWithShape="0">
+                        <a:srgbClr val="333333">
+                          <a:alpha val="65000"/>
+                        </a:srgbClr>
+                      </a:outerShdw>
+                    </a:effectLst>
+                  </pic:spPr>
+                </pic:pic>
+              </a:graphicData>
+            </a:graphic>
+          </wp:inline>
+        </w:drawing>
+      </w:r>
+    </w:p>
+    <w:p>
+      <w:r>
+        <w:t>Cette partie met à jour les projectiles ennemis. Une vérification est effectuée pour savoir si une munition ennemie touche une barrière. Dans ce cas, la barrière subit des dégâts et le projectile est supprimé. Les projectiles qui sortent de l'écran sont également supprimés. La fin de cette partie gère aussi les collisions entre les projectiles du joueur et ceux des ennemis. Lorsque deux projectiles se rencontrent, ils sont supprimés et le joueur gagne des points supplémentaires.</w:t>
+      </w:r>
+    </w:p>
+    <w:p>
+      <w:r>
+        <w:t>Cette partie met à jour les projectiles ennemis. Une vérification est effectuée pour savoir si une munition ennemie touche une barrière. Dans ce cas, la barrière subit des dégâts et le projectile est supprimé. Les projectiles qui sortent de l'écran sont également supprimés. La fin de cette partie gère aussi les collisions entre les projectiles du joueur et ceux des ennemis. Lorsque deux projectiles se rencontrent, ils sont supprimés et le joueur gagne des points supplémentaires.</w:t>
+      </w:r>
+    </w:p>
+    <w:p>
+      <w:pPr>
+        <w:rPr>
+          <w:lang w:val="fr-FR"/>
+        </w:rPr>
+      </w:pPr>
+      <w:r>
+        <w:rPr>
+          <w:lang w:val="fr-FR"/>
+        </w:rPr>
+        <w:br w:type="page"/>
+      </w:r>
+    </w:p>
+    <w:p>
+      <w:pPr>
+        <w:tabs>
+          <w:tab w:val="left" w:pos="2040"/>
+        </w:tabs>
+        <w:rPr>
+          <w:lang w:val="fr-FR"/>
+        </w:rPr>
+      </w:pPr>
+      <w:r>
+        <w:rPr>
+          <w:lang w:val="fr-FR"/>
+        </w:rPr>
+        <w:lastRenderedPageBreak/>
+        <w:t>Nous avons :</w:t>
+      </w:r>
+    </w:p>
+    <w:p>
+      <w:pPr>
+        <w:tabs>
+          <w:tab w:val="left" w:pos="2040"/>
+        </w:tabs>
+        <w:jc w:val="center"/>
+        <w:rPr>
+          <w:lang w:val="fr-FR"/>
+        </w:rPr>
+      </w:pPr>
+      <w:r>
+        <w:rPr>
+          <w:lang w:val="fr-FR"/>
+        </w:rPr>
+        <w:drawing>
+          <wp:inline distT="0" distB="0" distL="0" distR="0" wp14:anchorId="15D28252" wp14:editId="1407474D">
+            <wp:extent cx="3813290" cy="923925"/>
+            <wp:effectExtent l="152400" t="152400" r="358775" b="352425"/>
+            <wp:docPr id="785878801" name="Image 1"/>
+            <wp:cNvGraphicFramePr>
+              <a:graphicFrameLocks xmlns:a="http://schemas.openxmlformats.org/drawingml/2006/main" noChangeAspect="1"/>
+            </wp:cNvGraphicFramePr>
+            <a:graphic xmlns:a="http://schemas.openxmlformats.org/drawingml/2006/main">
+              <a:graphicData uri="http://schemas.openxmlformats.org/drawingml/2006/picture">
+                <pic:pic xmlns:pic="http://schemas.openxmlformats.org/drawingml/2006/picture">
+                  <pic:nvPicPr>
+                    <pic:cNvPr id="785878801" name=""/>
+                    <pic:cNvPicPr/>
+                  </pic:nvPicPr>
+                  <pic:blipFill>
+                    <a:blip r:embed="rId60"/>
+                    <a:stretch>
+                      <a:fillRect/>
+                    </a:stretch>
+                  </pic:blipFill>
+                  <pic:spPr>
+                    <a:xfrm>
+                      <a:off x="0" y="0"/>
+                      <a:ext cx="3820233" cy="925607"/>
+                    </a:xfrm>
+                    <a:prstGeom prst="rect">
+                      <a:avLst/>
+                    </a:prstGeom>
+                    <a:ln>
+                      <a:noFill/>
+                    </a:ln>
+                    <a:effectLst>
+                      <a:outerShdw blurRad="292100" dist="139700" dir="2700000" algn="tl" rotWithShape="0">
+                        <a:srgbClr val="333333">
+                          <a:alpha val="65000"/>
+                        </a:srgbClr>
+                      </a:outerShdw>
+                    </a:effectLst>
+                  </pic:spPr>
+                </pic:pic>
+              </a:graphicData>
+            </a:graphic>
+          </wp:inline>
+        </w:drawing>
+      </w:r>
+    </w:p>
+    <w:p>
+      <w:pPr>
+        <w:tabs>
+          <w:tab w:val="left" w:pos="2040"/>
+        </w:tabs>
+        <w:rPr>
+          <w:lang w:val="fr-FR"/>
+        </w:rPr>
+      </w:pPr>
+      <w:r>
+        <w:rPr>
+          <w:lang w:val="fr-FR"/>
+        </w:rPr>
+        <w:t xml:space="preserve">Cette méthode ne rien de plus simple que de créer </w:t>
+      </w:r>
+      <w:proofErr w:type="gramStart"/>
+      <w:r>
+        <w:rPr>
+          <w:lang w:val="fr-FR"/>
+        </w:rPr>
+        <w:t>une nouvelle frame</w:t>
+      </w:r>
+      <w:proofErr w:type="gramEnd"/>
+      <w:r>
+        <w:rPr>
+          <w:lang w:val="fr-FR"/>
+        </w:rPr>
+        <w:t xml:space="preserve">. Et elle appelle update et </w:t>
+      </w:r>
+      <w:proofErr w:type="spellStart"/>
+      <w:r>
+        <w:rPr>
+          <w:lang w:val="fr-FR"/>
+        </w:rPr>
+        <w:t>render</w:t>
+      </w:r>
+      <w:proofErr w:type="spellEnd"/>
+      <w:r>
+        <w:rPr>
+          <w:lang w:val="fr-FR"/>
+        </w:rPr>
+        <w:t xml:space="preserve"> aussi pour qu’il s’actualise.</w:t>
+      </w:r>
+    </w:p>
+    <w:p>
+      <w:pPr>
+        <w:tabs>
+          <w:tab w:val="left" w:pos="2040"/>
+        </w:tabs>
+        <w:rPr>
+          <w:lang w:val="fr-FR"/>
+        </w:rPr>
+      </w:pPr>
+    </w:p>
+    <w:p>
+      <w:pPr>
+        <w:tabs>
+          <w:tab w:val="left" w:pos="2040"/>
+          <w:tab w:val="left" w:pos="3000"/>
+        </w:tabs>
+        <w:rPr>
+          <w:lang w:val="fr-FR"/>
+        </w:rPr>
+      </w:pPr>
+      <w:r>
+        <w:rPr>
+          <w:lang w:val="fr-FR"/>
+        </w:rPr>
+        <w:t>Nous avons pour finir </w:t>
+      </w:r>
+      <w:proofErr w:type="spellStart"/>
+      <w:r>
+        <w:rPr>
+          <w:lang w:val="fr-FR"/>
+        </w:rPr>
+        <w:t>Airspace_</w:t>
+      </w:r>
+      <w:proofErr w:type="gramStart"/>
+      <w:r>
+        <w:rPr>
+          <w:lang w:val="fr-FR"/>
+        </w:rPr>
+        <w:t>KeyDown</w:t>
+      </w:r>
+      <w:proofErr w:type="spellEnd"/>
+      <w:r>
+        <w:rPr>
+          <w:lang w:val="fr-FR"/>
+        </w:rPr>
+        <w:t>(</w:t>
+      </w:r>
+      <w:proofErr w:type="gramEnd"/>
+      <w:r>
+        <w:rPr>
+          <w:lang w:val="fr-FR"/>
+        </w:rPr>
+        <w:t>) :</w:t>
+      </w:r>
+    </w:p>
+    <w:p>
+      <w:pPr>
+        <w:tabs>
+          <w:tab w:val="left" w:pos="2040"/>
+        </w:tabs>
+        <w:jc w:val="center"/>
+        <w:rPr>
+          <w:lang w:val="fr-FR"/>
+        </w:rPr>
+      </w:pPr>
+      <w:r>
+        <w:rPr>
+          <w:lang w:val="fr-FR"/>
+        </w:rPr>
+        <w:drawing>
+          <wp:inline distT="0" distB="0" distL="0" distR="0" wp14:anchorId="2CCE4A14" wp14:editId="4093AB76">
+            <wp:extent cx="3078480" cy="2886075"/>
+            <wp:effectExtent l="152400" t="152400" r="369570" b="371475"/>
+            <wp:docPr id="171857506" name="Image 1"/>
+            <wp:cNvGraphicFramePr>
+              <a:graphicFrameLocks xmlns:a="http://schemas.openxmlformats.org/drawingml/2006/main" noChangeAspect="1"/>
+            </wp:cNvGraphicFramePr>
+            <a:graphic xmlns:a="http://schemas.openxmlformats.org/drawingml/2006/main">
+              <a:graphicData uri="http://schemas.openxmlformats.org/drawingml/2006/picture">
+                <pic:pic xmlns:pic="http://schemas.openxmlformats.org/drawingml/2006/picture">
+                  <pic:nvPicPr>
+                    <pic:cNvPr id="171857506" name=""/>
+                    <pic:cNvPicPr/>
+                  </pic:nvPicPr>
+                  <pic:blipFill>
+                    <a:blip r:embed="rId61"/>
+                    <a:stretch>
+                      <a:fillRect/>
+                    </a:stretch>
+                  </pic:blipFill>
+                  <pic:spPr>
+                    <a:xfrm>
+                      <a:off x="0" y="0"/>
+                      <a:ext cx="3078748" cy="2886326"/>
+                    </a:xfrm>
+                    <a:prstGeom prst="rect">
+                      <a:avLst/>
+                    </a:prstGeom>
+                    <a:ln>
+                      <a:noFill/>
+                    </a:ln>
+                    <a:effectLst>
+                      <a:outerShdw blurRad="292100" dist="139700" dir="2700000" algn="tl" rotWithShape="0">
+                        <a:srgbClr val="333333">
+                          <a:alpha val="65000"/>
+                        </a:srgbClr>
+                      </a:outerShdw>
+                    </a:effectLst>
+                  </pic:spPr>
+                </pic:pic>
+              </a:graphicData>
+            </a:graphic>
+          </wp:inline>
+        </w:drawing>
+      </w:r>
+    </w:p>
+    <w:p>
+      <w:pPr>
+        <w:tabs>
+          <w:tab w:val="left" w:pos="2040"/>
+        </w:tabs>
+      </w:pPr>
+      <w:r>
+        <w:t xml:space="preserve">Cette méthode permet de gérer les actions effectuées par le joueur lorsqu'il appuie sur une touche du clavier. Tout d'abord, une vérification est effectuée pour savoir si le joueur est encore vivant. Si ce n'est pas le cas, aucune action n'est exécutée. Ensuite, une structure switch permet de détecter la touche appuyée. Lorsque la flèche de droite est utilisée, le guitariste se déplace vers la droite grâce à la méthode </w:t>
+      </w:r>
+      <w:proofErr w:type="spellStart"/>
+      <w:proofErr w:type="gramStart"/>
+      <w:r>
+        <w:t>keyRightMotion</w:t>
+      </w:r>
+      <w:proofErr w:type="spellEnd"/>
+      <w:r>
+        <w:t>(</w:t>
+      </w:r>
+      <w:proofErr w:type="gramEnd"/>
+      <w:r>
+        <w:t xml:space="preserve">). Lorsque la flèche de gauche est utilisée, le guitariste se déplace vers la gauche grâce à la méthode </w:t>
+      </w:r>
+      <w:proofErr w:type="spellStart"/>
+      <w:proofErr w:type="gramStart"/>
+      <w:r>
+        <w:t>keyLeftMotion</w:t>
+      </w:r>
+      <w:proofErr w:type="spellEnd"/>
+      <w:r>
+        <w:t>(</w:t>
+      </w:r>
+      <w:proofErr w:type="gramEnd"/>
+      <w:r>
+        <w:t xml:space="preserve">). Enfin, lorsque la touche espace est pressée, une nouvelle munition est créée à la position du joueur. La variable </w:t>
+      </w:r>
+      <w:proofErr w:type="spellStart"/>
+      <w:r>
+        <w:t>ralentisseurTir</w:t>
+      </w:r>
+      <w:proofErr w:type="spellEnd"/>
+      <w:r>
+        <w:t xml:space="preserve"> est utilisée pour ajouter un délai de 200 millisecondes entre chaque tir et empêcher le joueur de tirer de façon continue.</w:t>
+      </w:r>
+    </w:p>
+    <w:p>
+      <w:pPr>
+        <w:tabs>
+          <w:tab w:val="left" w:pos="2040"/>
+        </w:tabs>
+        <w:rPr>
+          <w:lang w:val="fr-FR"/>
+        </w:rPr>
+      </w:pPr>
+    </w:p>
+    <w:p>
+      <w:pPr>
+        <w:rPr>
+          <w:rFonts w:asciiTheme="majorHAnsi" w:eastAsiaTheme="majorEastAsia" w:hAnsiTheme="majorHAnsi" w:cstheme="majorBidi"/>
+          <w:color w:val="0F4761" w:themeColor="accent1" w:themeShade="BF"/>
+          <w:sz w:val="40"/>
+          <w:szCs w:val="40"/>
+          <w:lang w:val="fr-FR"/>
+        </w:rPr>
+      </w:pPr>
+      <w:r>
+        <w:rPr>
+          <w:lang w:val="fr-FR"/>
+        </w:rPr>
+        <w:br w:type="page"/>
+      </w:r>
+      <w:r>
+        <w:rPr>
+          <w:lang w:val="fr-FR"/>
+        </w:rPr>
+        <w:lastRenderedPageBreak/>
+        <w:t>Tests Unitaires</w:t>
+      </w:r>
+    </w:p>
+    <w:p>
+      <w:pPr>
+        <w:rPr>
+          <w:lang w:val="fr-FR"/>
+        </w:rPr>
+      </w:pPr>
+      <w:r>
+        <w:rPr>
+          <w:lang w:val="fr-FR"/>
+        </w:rPr>
+        <w:t xml:space="preserve">Pour </w:t>
+      </w:r>
+      <w:proofErr w:type="gramStart"/>
+      <w:r>
+        <w:rPr>
+          <w:lang w:val="fr-FR"/>
+        </w:rPr>
+        <w:t>notre projets</w:t>
+      </w:r>
+      <w:proofErr w:type="gramEnd"/>
+      <w:r>
+        <w:rPr>
+          <w:lang w:val="fr-FR"/>
+        </w:rPr>
+        <w:t xml:space="preserve"> nous avons pour consigne de créer </w:t>
+      </w:r>
+      <w:proofErr w:type="gramStart"/>
+      <w:r>
+        <w:rPr>
+          <w:lang w:val="fr-FR"/>
+        </w:rPr>
+        <w:t>des tests unitaire</w:t>
+      </w:r>
+      <w:proofErr w:type="gramEnd"/>
+      <w:r>
+        <w:rPr>
+          <w:lang w:val="fr-FR"/>
+        </w:rPr>
+        <w:t xml:space="preserve"> et donc pour cela j’ai </w:t>
+      </w:r>
+      <w:proofErr w:type="gramStart"/>
+      <w:r>
+        <w:rPr>
+          <w:lang w:val="fr-FR"/>
+        </w:rPr>
+        <w:t>choisis</w:t>
+      </w:r>
+      <w:proofErr w:type="gramEnd"/>
+      <w:r>
+        <w:rPr>
+          <w:lang w:val="fr-FR"/>
+        </w:rPr>
+        <w:t xml:space="preserve"> d’en créer 3.</w:t>
+      </w:r>
+    </w:p>
+    <w:p>
+      <w:pPr>
+        <w:rPr>
+          <w:lang w:val="fr-FR"/>
+        </w:rPr>
+      </w:pPr>
+    </w:p>
+    <w:p>
+      <w:pPr>
+        <w:rPr>
+          <w:b/>
+          <w:bCs/>
+          <w:i/>
+          <w:iCs/>
+          <w:u w:val="single"/>
+        </w:rPr>
+      </w:pPr>
+      <w:proofErr w:type="spellStart"/>
+      <w:r>
+        <w:rPr>
+          <w:b/>
+          <w:bCs/>
+          <w:i/>
+          <w:iCs/>
+          <w:u w:val="single"/>
+        </w:rPr>
+        <w:t>KeyRightMotion_</w:t>
+      </w:r>
+      <w:proofErr w:type="gramStart"/>
+      <w:r>
+        <w:rPr>
+          <w:b/>
+          <w:bCs/>
+          <w:i/>
+          <w:iCs/>
+          <w:u w:val="single"/>
+        </w:rPr>
+        <w:t>DeplaceLeJoueurVersLaDroite</w:t>
+      </w:r>
+      <w:proofErr w:type="spellEnd"/>
+      <w:r>
+        <w:rPr>
+          <w:b/>
+          <w:bCs/>
+          <w:i/>
+          <w:iCs/>
+          <w:u w:val="single"/>
+        </w:rPr>
+        <w:t>(</w:t>
+      </w:r>
+      <w:proofErr w:type="gramEnd"/>
+      <w:r>
+        <w:rPr>
+          <w:b/>
+          <w:bCs/>
+          <w:i/>
+          <w:iCs/>
+          <w:u w:val="single"/>
+        </w:rPr>
+        <w:t>)</w:t>
+      </w:r>
+    </w:p>
+    <w:p>
+      <w:pPr>
+        <w:rPr>
+          <w:lang w:val="fr-FR"/>
+        </w:rPr>
+      </w:pPr>
+      <w:r>
+        <w:rPr>
+          <w:lang w:val="fr-FR"/>
+        </w:rPr>
+        <w:t xml:space="preserve">Ce test </w:t>
+      </w:r>
+      <w:proofErr w:type="gramStart"/>
+      <w:r>
+        <w:rPr>
+          <w:lang w:val="fr-FR"/>
+        </w:rPr>
+        <w:t>fais</w:t>
+      </w:r>
+      <w:proofErr w:type="gramEnd"/>
+      <w:r>
+        <w:rPr>
+          <w:lang w:val="fr-FR"/>
+        </w:rPr>
+        <w:t xml:space="preserve"> que l’on va tester si on appel la </w:t>
+      </w:r>
+      <w:proofErr w:type="spellStart"/>
+      <w:r>
+        <w:rPr>
+          <w:lang w:val="fr-FR"/>
+        </w:rPr>
+        <w:t>methode</w:t>
+      </w:r>
+      <w:proofErr w:type="spellEnd"/>
+      <w:r>
+        <w:rPr>
+          <w:lang w:val="fr-FR"/>
+        </w:rPr>
+        <w:t xml:space="preserve"> qui fais déplacer le joueur contre la droite est ce que sa position change comme prévu.</w:t>
+      </w:r>
+    </w:p>
+    <w:p>
+      <w:pPr>
+        <w:jc w:val="center"/>
+        <w:rPr>
+          <w:lang w:val="fr-FR"/>
+        </w:rPr>
+      </w:pPr>
+      <w:r>
+        <w:rPr>
+          <w:lang w:val="fr-FR"/>
+        </w:rPr>
+        <w:drawing>
+          <wp:inline distT="0" distB="0" distL="0" distR="0" wp14:anchorId="224213E8" wp14:editId="2359E207">
+            <wp:extent cx="2917372" cy="1749250"/>
+            <wp:effectExtent l="152400" t="152400" r="359410" b="369570"/>
+            <wp:docPr id="600890596" name="Image 1"/>
+            <wp:cNvGraphicFramePr>
+              <a:graphicFrameLocks xmlns:a="http://schemas.openxmlformats.org/drawingml/2006/main" noChangeAspect="1"/>
+            </wp:cNvGraphicFramePr>
+            <a:graphic xmlns:a="http://schemas.openxmlformats.org/drawingml/2006/main">
+              <a:graphicData uri="http://schemas.openxmlformats.org/drawingml/2006/picture">
+                <pic:pic xmlns:pic="http://schemas.openxmlformats.org/drawingml/2006/picture">
+                  <pic:nvPicPr>
+                    <pic:cNvPr id="600890596" name=""/>
+                    <pic:cNvPicPr/>
+                  </pic:nvPicPr>
+                  <pic:blipFill>
+                    <a:blip r:embed="rId62"/>
+                    <a:stretch>
+                      <a:fillRect/>
+                    </a:stretch>
+                  </pic:blipFill>
+                  <pic:spPr>
+                    <a:xfrm>
+                      <a:off x="0" y="0"/>
+                      <a:ext cx="2917372" cy="1749250"/>
+                    </a:xfrm>
+                    <a:prstGeom prst="rect">
+                      <a:avLst/>
+                    </a:prstGeom>
+                    <a:ln>
+                      <a:noFill/>
+                    </a:ln>
+                    <a:effectLst>
+                      <a:outerShdw blurRad="292100" dist="139700" dir="2700000" algn="tl" rotWithShape="0">
+                        <a:srgbClr val="333333">
+                          <a:alpha val="65000"/>
+                        </a:srgbClr>
+                      </a:outerShdw>
+                    </a:effectLst>
+                  </pic:spPr>
+                </pic:pic>
+              </a:graphicData>
+            </a:graphic>
+          </wp:inline>
+        </w:drawing>
+      </w:r>
+    </w:p>
+    <w:p>
+      <w:pPr>
+        <w:rPr>
+          <w:b/>
+          <w:bCs/>
+          <w:u w:val="single"/>
+        </w:rPr>
+      </w:pPr>
+      <w:proofErr w:type="spellStart"/>
+      <w:r>
+        <w:rPr>
+          <w:b/>
+          <w:bCs/>
+          <w:u w:val="single"/>
+        </w:rPr>
+        <w:t>KeyLeftMotion_</w:t>
+      </w:r>
+      <w:proofErr w:type="gramStart"/>
+      <w:r>
+        <w:rPr>
+          <w:b/>
+          <w:bCs/>
+          <w:u w:val="single"/>
+        </w:rPr>
+        <w:t>DeplaceLeJoueurVersLaGauche</w:t>
+      </w:r>
+      <w:proofErr w:type="spellEnd"/>
+      <w:r>
+        <w:rPr>
+          <w:b/>
+          <w:bCs/>
+          <w:u w:val="single"/>
+        </w:rPr>
+        <w:t>(</w:t>
+      </w:r>
+      <w:proofErr w:type="gramEnd"/>
+      <w:r>
+        <w:rPr>
+          <w:b/>
+          <w:bCs/>
+          <w:u w:val="single"/>
+        </w:rPr>
+        <w:t>)</w:t>
+      </w:r>
+    </w:p>
+    <w:p>
+      <w:pPr>
+        <w:rPr>
+          <w:lang w:val="fr-FR"/>
+        </w:rPr>
+      </w:pPr>
+      <w:r>
+        <w:rPr>
+          <w:lang w:val="fr-FR"/>
+        </w:rPr>
+        <w:t xml:space="preserve">Ce test </w:t>
+      </w:r>
+      <w:proofErr w:type="gramStart"/>
+      <w:r>
+        <w:rPr>
+          <w:lang w:val="fr-FR"/>
+        </w:rPr>
+        <w:t>fais</w:t>
+      </w:r>
+      <w:proofErr w:type="gramEnd"/>
+      <w:r>
+        <w:rPr>
+          <w:lang w:val="fr-FR"/>
+        </w:rPr>
+        <w:t xml:space="preserve"> que l’on va tester si on </w:t>
+      </w:r>
+      <w:proofErr w:type="spellStart"/>
+      <w:r>
+        <w:rPr>
+          <w:lang w:val="fr-FR"/>
+        </w:rPr>
+        <w:t>appel</w:t>
+      </w:r>
+      <w:proofErr w:type="spellEnd"/>
+      <w:r>
+        <w:rPr>
+          <w:lang w:val="fr-FR"/>
+        </w:rPr>
+        <w:t xml:space="preserve"> la </w:t>
+      </w:r>
+      <w:proofErr w:type="spellStart"/>
+      <w:r>
+        <w:rPr>
+          <w:lang w:val="fr-FR"/>
+        </w:rPr>
+        <w:t>methode</w:t>
+      </w:r>
+      <w:proofErr w:type="spellEnd"/>
+      <w:r>
+        <w:rPr>
+          <w:lang w:val="fr-FR"/>
+        </w:rPr>
+        <w:t xml:space="preserve"> qui fais déplacer le joueur contre la </w:t>
+      </w:r>
+      <w:r>
+        <w:rPr>
+          <w:lang w:val="fr-FR"/>
+        </w:rPr>
+        <w:t>gauche</w:t>
+      </w:r>
+      <w:r>
+        <w:rPr>
+          <w:lang w:val="fr-FR"/>
+        </w:rPr>
+        <w:t xml:space="preserve"> est ce que sa position change comme prévu.</w:t>
+      </w:r>
+      <w:r>
+        <w:rPr>
+          <w:lang w:val="fr-FR"/>
+        </w:rPr>
+        <w:t xml:space="preserve"> Passe de sa position initiale 100 à – 10 et </w:t>
+      </w:r>
+      <w:proofErr w:type="gramStart"/>
+      <w:r>
+        <w:rPr>
+          <w:lang w:val="fr-FR"/>
+        </w:rPr>
+        <w:t>sa doit</w:t>
+      </w:r>
+      <w:proofErr w:type="gramEnd"/>
+      <w:r>
+        <w:rPr>
+          <w:lang w:val="fr-FR"/>
+        </w:rPr>
+        <w:t xml:space="preserve"> valoir 90.</w:t>
+      </w:r>
+    </w:p>
+    <w:p>
+      <w:pPr>
+        <w:rPr>
+          <w:lang w:val="fr-FR"/>
+        </w:rPr>
+      </w:pPr>
+    </w:p>
+    <w:p>
+      <w:pPr>
+        <w:jc w:val="center"/>
+        <w:rPr>
+          <w:lang w:val="fr-FR"/>
+        </w:rPr>
+      </w:pPr>
+      <w:r>
+        <w:rPr>
+          <w:lang w:val="fr-FR"/>
+        </w:rPr>
+        <w:drawing>
+          <wp:inline distT="0" distB="0" distL="0" distR="0" wp14:anchorId="6C35BDC6" wp14:editId="4BB832C4">
+            <wp:extent cx="2841172" cy="1508357"/>
+            <wp:effectExtent l="152400" t="152400" r="359410" b="358775"/>
+            <wp:docPr id="482675773" name="Image 1"/>
+            <wp:cNvGraphicFramePr>
+              <a:graphicFrameLocks xmlns:a="http://schemas.openxmlformats.org/drawingml/2006/main" noChangeAspect="1"/>
+            </wp:cNvGraphicFramePr>
+            <a:graphic xmlns:a="http://schemas.openxmlformats.org/drawingml/2006/main">
+              <a:graphicData uri="http://schemas.openxmlformats.org/drawingml/2006/picture">
+                <pic:pic xmlns:pic="http://schemas.openxmlformats.org/drawingml/2006/picture">
+                  <pic:nvPicPr>
+                    <pic:cNvPr id="482675773" name=""/>
+                    <pic:cNvPicPr/>
+                  </pic:nvPicPr>
+                  <pic:blipFill>
+                    <a:blip r:embed="rId63"/>
+                    <a:stretch>
+                      <a:fillRect/>
+                    </a:stretch>
+                  </pic:blipFill>
+                  <pic:spPr>
+                    <a:xfrm>
+                      <a:off x="0" y="0"/>
+                      <a:ext cx="2841172" cy="1508357"/>
+                    </a:xfrm>
+                    <a:prstGeom prst="rect">
+                      <a:avLst/>
+                    </a:prstGeom>
+                    <a:ln>
+                      <a:noFill/>
+                    </a:ln>
+                    <a:effectLst>
+                      <a:outerShdw blurRad="292100" dist="139700" dir="2700000" algn="tl" rotWithShape="0">
+                        <a:srgbClr val="333333">
+                          <a:alpha val="65000"/>
+                        </a:srgbClr>
+                      </a:outerShdw>
+                    </a:effectLst>
+                  </pic:spPr>
+                </pic:pic>
+              </a:graphicData>
+            </a:graphic>
+          </wp:inline>
+        </w:drawing>
+      </w:r>
+    </w:p>
+    <w:p>
+      <w:pPr>
+        <w:rPr>
+          <w:lang w:val="fr-FR"/>
+        </w:rPr>
+      </w:pPr>
+      <w:r>
+        <w:rPr>
+          <w:lang w:val="fr-FR"/>
+        </w:rPr>
+        <w:br w:type="page"/>
+      </w:r>
+    </w:p>
+    <w:p>
+      <w:pPr>
+        <w:rPr>
+          <w:b/>
+          <w:bCs/>
+          <w:i/>
+          <w:iCs/>
+          <w:u w:val="single"/>
+        </w:rPr>
+      </w:pPr>
+      <w:r>
+        <w:rPr>
+          <w:b/>
+          <w:bCs/>
+          <w:i/>
+          <w:iCs/>
+          <w:u w:val="single"/>
+        </w:rPr>
+        <w:lastRenderedPageBreak/>
+        <w:t>Degats_Retire50</w:t>
+      </w:r>
+      <w:proofErr w:type="gramStart"/>
+      <w:r>
+        <w:rPr>
+          <w:b/>
+          <w:bCs/>
+          <w:i/>
+          <w:iCs/>
+          <w:u w:val="single"/>
+        </w:rPr>
+        <w:t>PointsDeVie(</w:t>
+      </w:r>
+      <w:proofErr w:type="gramEnd"/>
+      <w:r>
+        <w:rPr>
+          <w:b/>
+          <w:bCs/>
+          <w:i/>
+          <w:iCs/>
+          <w:u w:val="single"/>
+        </w:rPr>
+        <w:t>)</w:t>
+      </w:r>
+    </w:p>
+    <w:p>
+      <w:pPr>
+        <w:rPr>
+          <w:lang w:val="fr-FR"/>
+        </w:rPr>
+      </w:pPr>
+      <w:r>
+        <w:rPr>
+          <w:lang w:val="fr-FR"/>
+        </w:rPr>
+        <w:t xml:space="preserve">Cette </w:t>
+      </w:r>
+      <w:proofErr w:type="spellStart"/>
+      <w:r>
+        <w:rPr>
+          <w:lang w:val="fr-FR"/>
+        </w:rPr>
+        <w:t>methode</w:t>
+      </w:r>
+      <w:proofErr w:type="spellEnd"/>
+      <w:r>
+        <w:rPr>
+          <w:lang w:val="fr-FR"/>
+        </w:rPr>
+        <w:t xml:space="preserve"> test que si on </w:t>
+      </w:r>
+      <w:proofErr w:type="gramStart"/>
+      <w:r>
+        <w:rPr>
+          <w:lang w:val="fr-FR"/>
+        </w:rPr>
+        <w:t>fais</w:t>
+      </w:r>
+      <w:proofErr w:type="gramEnd"/>
+      <w:r>
+        <w:rPr>
+          <w:lang w:val="fr-FR"/>
+        </w:rPr>
+        <w:t xml:space="preserve"> appel à la </w:t>
+      </w:r>
+      <w:proofErr w:type="spellStart"/>
+      <w:r>
+        <w:rPr>
+          <w:lang w:val="fr-FR"/>
+        </w:rPr>
+        <w:t>mthode</w:t>
+      </w:r>
+      <w:proofErr w:type="spellEnd"/>
+      <w:r>
+        <w:rPr>
+          <w:lang w:val="fr-FR"/>
+        </w:rPr>
+        <w:t xml:space="preserve"> dégâts qui est la </w:t>
+      </w:r>
+      <w:proofErr w:type="spellStart"/>
+      <w:r>
+        <w:rPr>
+          <w:lang w:val="fr-FR"/>
+        </w:rPr>
+        <w:t>methode</w:t>
+      </w:r>
+      <w:proofErr w:type="spellEnd"/>
+      <w:r>
+        <w:rPr>
+          <w:lang w:val="fr-FR"/>
+        </w:rPr>
+        <w:t xml:space="preserve"> qui inflige des dégâts au barrière elle perd réellement de la vie et est ce </w:t>
+      </w:r>
+      <w:proofErr w:type="gramStart"/>
+      <w:r>
+        <w:rPr>
+          <w:lang w:val="fr-FR"/>
+        </w:rPr>
+        <w:t>que elle</w:t>
+      </w:r>
+      <w:proofErr w:type="gramEnd"/>
+      <w:r>
+        <w:rPr>
+          <w:lang w:val="fr-FR"/>
+        </w:rPr>
+        <w:t xml:space="preserve"> perd la bonne quantité de </w:t>
+      </w:r>
+      <w:proofErr w:type="gramStart"/>
+      <w:r>
+        <w:rPr>
+          <w:lang w:val="fr-FR"/>
+        </w:rPr>
+        <w:t>vie .</w:t>
+      </w:r>
+      <w:proofErr w:type="gramEnd"/>
+    </w:p>
+    <w:p>
+      <w:pPr>
+        <w:jc w:val="center"/>
+        <w:rPr>
+          <w:lang w:val="fr-FR"/>
+        </w:rPr>
+      </w:pPr>
+      <w:r>
+        <w:rPr>
+          <w:lang w:val="fr-FR"/>
+        </w:rPr>
+        <w:drawing>
+          <wp:inline distT="0" distB="0" distL="0" distR="0" wp14:anchorId="51907CE0" wp14:editId="1BD76185">
+            <wp:extent cx="2286000" cy="1463787"/>
+            <wp:effectExtent l="152400" t="152400" r="361950" b="365125"/>
+            <wp:docPr id="1416174568" name="Image 1"/>
+            <wp:cNvGraphicFramePr>
+              <a:graphicFrameLocks xmlns:a="http://schemas.openxmlformats.org/drawingml/2006/main" noChangeAspect="1"/>
+            </wp:cNvGraphicFramePr>
+            <a:graphic xmlns:a="http://schemas.openxmlformats.org/drawingml/2006/main">
+              <a:graphicData uri="http://schemas.openxmlformats.org/drawingml/2006/picture">
+                <pic:pic xmlns:pic="http://schemas.openxmlformats.org/drawingml/2006/picture">
+                  <pic:nvPicPr>
+                    <pic:cNvPr id="1416174568" name=""/>
+                    <pic:cNvPicPr/>
+                  </pic:nvPicPr>
+                  <pic:blipFill>
+                    <a:blip r:embed="rId64"/>
+                    <a:stretch>
+                      <a:fillRect/>
+                    </a:stretch>
+                  </pic:blipFill>
+                  <pic:spPr>
+                    <a:xfrm>
+                      <a:off x="0" y="0"/>
+                      <a:ext cx="2293903" cy="1468847"/>
+                    </a:xfrm>
+                    <a:prstGeom prst="rect">
+                      <a:avLst/>
+                    </a:prstGeom>
+                    <a:ln>
+                      <a:noFill/>
+                    </a:ln>
+                    <a:effectLst>
+                      <a:outerShdw blurRad="292100" dist="139700" dir="2700000" algn="tl" rotWithShape="0">
+                        <a:srgbClr val="333333">
+                          <a:alpha val="65000"/>
+                        </a:srgbClr>
+                      </a:outerShdw>
+                    </a:effectLst>
+                  </pic:spPr>
+                </pic:pic>
+              </a:graphicData>
+            </a:graphic>
+          </wp:inline>
+        </w:drawing>
+      </w:r>
+    </w:p>
+    <w:p>
+      <w:pPr>
+        <w:rPr>
+          <w:b/>
+          <w:bCs/>
+          <w:i/>
+          <w:iCs/>
+          <w:u w:val="single"/>
+          <w:lang w:val="fr-FR"/>
+        </w:rPr>
+      </w:pPr>
+      <w:r>
+        <w:rPr>
+          <w:b/>
+          <w:bCs/>
+          <w:i/>
+          <w:iCs/>
+          <w:u w:val="single"/>
+          <w:lang w:val="fr-FR"/>
+        </w:rPr>
+        <w:t xml:space="preserve">Contrôle </w:t>
+      </w:r>
+      <w:proofErr w:type="gramStart"/>
+      <w:r>
+        <w:rPr>
+          <w:b/>
+          <w:bCs/>
+          <w:i/>
+          <w:iCs/>
+          <w:u w:val="single"/>
+          <w:lang w:val="fr-FR"/>
+        </w:rPr>
+        <w:t>des test</w:t>
+      </w:r>
+      <w:proofErr w:type="gramEnd"/>
+      <w:r>
+        <w:rPr>
+          <w:b/>
+          <w:bCs/>
+          <w:i/>
+          <w:iCs/>
+          <w:u w:val="single"/>
+          <w:lang w:val="fr-FR"/>
+        </w:rPr>
+        <w:t xml:space="preserve"> se </w:t>
+      </w:r>
+      <w:proofErr w:type="spellStart"/>
+      <w:r>
+        <w:rPr>
+          <w:b/>
+          <w:bCs/>
+          <w:i/>
+          <w:iCs/>
+          <w:u w:val="single"/>
+          <w:lang w:val="fr-FR"/>
+        </w:rPr>
+        <w:t>deroulant</w:t>
+      </w:r>
+      <w:proofErr w:type="spellEnd"/>
+      <w:r>
+        <w:rPr>
+          <w:b/>
+          <w:bCs/>
+          <w:i/>
+          <w:iCs/>
+          <w:u w:val="single"/>
+          <w:lang w:val="fr-FR"/>
+        </w:rPr>
+        <w:t xml:space="preserve"> bien :</w:t>
+      </w:r>
+    </w:p>
+    <w:p>
+      <w:pPr>
+        <w:rPr>
+          <w:lang w:val="fr-FR"/>
+        </w:rPr>
+      </w:pPr>
+      <w:r>
+        <w:rPr>
+          <w:lang w:val="fr-FR"/>
+        </w:rPr>
+        <w:t xml:space="preserve">Comme vous pouvez le voir ci-dessous </w:t>
+      </w:r>
+      <w:proofErr w:type="gramStart"/>
+      <w:r>
+        <w:rPr>
+          <w:lang w:val="fr-FR"/>
+        </w:rPr>
+        <w:t>les test</w:t>
+      </w:r>
+      <w:proofErr w:type="gramEnd"/>
+      <w:r>
+        <w:rPr>
+          <w:lang w:val="fr-FR"/>
+        </w:rPr>
+        <w:t xml:space="preserve"> </w:t>
+      </w:r>
+      <w:r>
+        <w:rPr>
+          <w:lang w:val="fr-FR"/>
+        </w:rPr>
+        <w:t xml:space="preserve">se déroule comme prévu ils sont </w:t>
+      </w:r>
+      <w:proofErr w:type="spellStart"/>
+      <w:r>
+        <w:rPr>
+          <w:lang w:val="fr-FR"/>
+        </w:rPr>
+        <w:t>éxécuté</w:t>
+      </w:r>
+      <w:proofErr w:type="spellEnd"/>
+      <w:r>
+        <w:rPr>
+          <w:lang w:val="fr-FR"/>
+        </w:rPr>
+        <w:t xml:space="preserve"> et il parvient à atteindre </w:t>
+      </w:r>
+      <w:proofErr w:type="spellStart"/>
+      <w:proofErr w:type="gramStart"/>
+      <w:r>
+        <w:rPr>
+          <w:lang w:val="fr-FR"/>
+        </w:rPr>
+        <w:t>tout</w:t>
+      </w:r>
+      <w:proofErr w:type="spellEnd"/>
+      <w:r>
+        <w:rPr>
+          <w:lang w:val="fr-FR"/>
+        </w:rPr>
+        <w:t xml:space="preserve"> les éléments</w:t>
+      </w:r>
+      <w:proofErr w:type="gramEnd"/>
+      <w:r>
+        <w:rPr>
+          <w:lang w:val="fr-FR"/>
+        </w:rPr>
+        <w:t xml:space="preserve"> qu’on a </w:t>
+      </w:r>
+      <w:proofErr w:type="spellStart"/>
+      <w:r>
+        <w:rPr>
+          <w:lang w:val="fr-FR"/>
+        </w:rPr>
+        <w:t>besoi</w:t>
+      </w:r>
+      <w:proofErr w:type="spellEnd"/>
+      <w:r>
+        <w:rPr>
+          <w:lang w:val="fr-FR"/>
+        </w:rPr>
+        <w:t xml:space="preserve"> pour le test et on sait que sa marche car </w:t>
+      </w:r>
+      <w:proofErr w:type="gramStart"/>
+      <w:r>
+        <w:rPr>
+          <w:lang w:val="fr-FR"/>
+        </w:rPr>
+        <w:t>les test</w:t>
+      </w:r>
+      <w:proofErr w:type="gramEnd"/>
+      <w:r>
+        <w:rPr>
+          <w:lang w:val="fr-FR"/>
+        </w:rPr>
+        <w:t xml:space="preserve"> arrive même à donner un résultat positif.</w:t>
+      </w:r>
+    </w:p>
+    <w:p>
+      <w:pPr>
+        <w:jc w:val="center"/>
+        <w:rPr>
+          <w:lang w:val="fr-FR"/>
+        </w:rPr>
+      </w:pPr>
+      <w:r>
+        <w:rPr>
+          <w:lang w:val="fr-FR"/>
+        </w:rPr>
+        <w:drawing>
+          <wp:inline distT="0" distB="0" distL="0" distR="0" wp14:anchorId="0CC73FD6" wp14:editId="369E5A14">
+            <wp:extent cx="4322886" cy="1426028"/>
+            <wp:effectExtent l="152400" t="152400" r="363855" b="365125"/>
+            <wp:docPr id="292964861" name="Image 1"/>
+            <wp:cNvGraphicFramePr>
+              <a:graphicFrameLocks xmlns:a="http://schemas.openxmlformats.org/drawingml/2006/main" noChangeAspect="1"/>
+            </wp:cNvGraphicFramePr>
+            <a:graphic xmlns:a="http://schemas.openxmlformats.org/drawingml/2006/main">
+              <a:graphicData uri="http://schemas.openxmlformats.org/drawingml/2006/picture">
+                <pic:pic xmlns:pic="http://schemas.openxmlformats.org/drawingml/2006/picture">
+                  <pic:nvPicPr>
+                    <pic:cNvPr id="292964861" name=""/>
+                    <pic:cNvPicPr/>
+                  </pic:nvPicPr>
+                  <pic:blipFill>
+                    <a:blip r:embed="rId65"/>
+                    <a:stretch>
+                      <a:fillRect/>
+                    </a:stretch>
+                  </pic:blipFill>
+                  <pic:spPr>
+                    <a:xfrm>
+                      <a:off x="0" y="0"/>
+                      <a:ext cx="4346035" cy="1433664"/>
+                    </a:xfrm>
+                    <a:prstGeom prst="rect">
+                      <a:avLst/>
+                    </a:prstGeom>
+                    <a:ln>
+                      <a:noFill/>
+                    </a:ln>
+                    <a:effectLst>
+                      <a:outerShdw blurRad="292100" dist="139700" dir="2700000" algn="tl" rotWithShape="0">
+                        <a:srgbClr val="333333">
+                          <a:alpha val="65000"/>
+                        </a:srgbClr>
+                      </a:outerShdw>
+                    </a:effectLst>
+                  </pic:spPr>
+                </pic:pic>
+              </a:graphicData>
+            </a:graphic>
+          </wp:inline>
+        </w:drawing>
+      </w:r>
+    </w:p>
+    <w:p>
+      <w:pPr>
+        <w:rPr>
+          <w:lang w:val="fr-FR"/>
+        </w:rPr>
+      </w:pPr>
+      <w:r>
+        <w:rPr>
+          <w:lang w:val="fr-FR"/>
+        </w:rPr>
+        <w:br w:type="page"/>
+      </w:r>
+    </w:p>
+    <w:p>
+      <w:pPr>
+        <w:pStyle w:val="Titre1"/>
+        <w:rPr>
+          <w:lang w:val="fr-FR"/>
+        </w:rPr>
+      </w:pPr>
+      <w:r>
+        <w:rPr>
+          <w:lang w:val="fr-FR"/>
+        </w:rPr>
+        <w:lastRenderedPageBreak/>
+        <w:t xml:space="preserve">Utilisation de </w:t>
+      </w:r>
+      <w:proofErr w:type="spellStart"/>
+      <w:r>
+        <w:rPr>
+          <w:lang w:val="fr-FR"/>
+        </w:rPr>
+        <w:t>l’ia</w:t>
+      </w:r>
+      <w:proofErr w:type="spellEnd"/>
+    </w:p>
+    <w:p>
+      <w:pPr>
+        <w:rPr>
+          <w:lang w:val="fr-FR"/>
+        </w:rPr>
+      </w:pPr>
+      <w:r>
+        <w:rPr>
+          <w:lang w:val="fr-FR"/>
+        </w:rPr>
+        <w:t>J’ai utilisé l’intelligence artificielle tout au long du projet pour m’aider quand j’étais bloqué.</w:t>
+      </w:r>
+    </w:p>
+    <w:p>
+      <w:pPr>
+        <w:rPr>
+          <w:lang w:val="fr-FR"/>
+        </w:rPr>
+      </w:pPr>
+      <w:r>
+        <w:rPr>
+          <w:lang w:val="fr-FR"/>
+        </w:rPr>
+        <w:t>Elle m’a aidé à :</w:t>
+      </w:r>
+    </w:p>
+    <w:p>
+      <w:pPr>
+        <w:pStyle w:val="Paragraphedeliste"/>
+        <w:numPr>
+          <w:ilvl w:val="0"/>
+          <w:numId w:val="14"/>
+        </w:numPr>
+        <w:rPr>
+          <w:lang w:val="fr-FR"/>
+        </w:rPr>
+      </w:pPr>
+      <w:proofErr w:type="gramStart"/>
+      <w:r>
+        <w:rPr>
+          <w:lang w:val="fr-FR"/>
+        </w:rPr>
+        <w:t>comprendre</w:t>
+      </w:r>
+      <w:proofErr w:type="gramEnd"/>
+      <w:r>
+        <w:rPr>
+          <w:lang w:val="fr-FR"/>
+        </w:rPr>
+        <w:t xml:space="preserve"> certaines erreurs en C#</w:t>
+      </w:r>
+    </w:p>
+    <w:p>
+      <w:pPr>
+        <w:pStyle w:val="Paragraphedeliste"/>
+        <w:numPr>
+          <w:ilvl w:val="0"/>
+          <w:numId w:val="14"/>
+        </w:numPr>
+        <w:rPr>
+          <w:lang w:val="fr-FR"/>
+        </w:rPr>
+      </w:pPr>
+      <w:proofErr w:type="gramStart"/>
+      <w:r>
+        <w:rPr>
+          <w:lang w:val="fr-FR"/>
+        </w:rPr>
+        <w:t>corriger</w:t>
+      </w:r>
+      <w:proofErr w:type="gramEnd"/>
+      <w:r>
+        <w:rPr>
+          <w:lang w:val="fr-FR"/>
+        </w:rPr>
+        <w:t xml:space="preserve"> des bugs</w:t>
+      </w:r>
+    </w:p>
+    <w:p>
+      <w:pPr>
+        <w:pStyle w:val="Paragraphedeliste"/>
+        <w:numPr>
+          <w:ilvl w:val="0"/>
+          <w:numId w:val="14"/>
+        </w:numPr>
+        <w:rPr>
+          <w:lang w:val="fr-FR"/>
+        </w:rPr>
+      </w:pPr>
+      <w:proofErr w:type="gramStart"/>
+      <w:r>
+        <w:rPr>
+          <w:lang w:val="fr-FR"/>
+        </w:rPr>
+        <w:t>créer</w:t>
+      </w:r>
+      <w:proofErr w:type="gramEnd"/>
+      <w:r>
+        <w:rPr>
+          <w:lang w:val="fr-FR"/>
+        </w:rPr>
+        <w:t xml:space="preserve"> certaines collisions dans le jeu</w:t>
+      </w:r>
+    </w:p>
+    <w:p>
+      <w:pPr>
+        <w:rPr>
+          <w:lang w:val="fr-FR"/>
+        </w:rPr>
+      </w:pPr>
+      <w:r>
+        <w:rPr>
+          <w:lang w:val="fr-FR"/>
+        </w:rPr>
+        <w:t>L’intelligence artificielle a servi comme aide, mais j’ai réalisé moi-même le projet, les tests et les différentes modifications du code</w:t>
+      </w:r>
+    </w:p>
+    <w:p>
+      <w:pPr>
+        <w:rPr>
+          <w:lang w:val="fr-FR"/>
+        </w:rPr>
+      </w:pPr>
+    </w:p>
+    <w:p>
+      <w:pPr>
+        <w:pStyle w:val="Titre1"/>
+        <w:rPr>
+          <w:lang w:val="fr-FR"/>
+        </w:rPr>
+      </w:pPr>
+      <w:r>
+        <w:rPr>
+          <w:lang w:val="fr-FR"/>
+        </w:rPr>
+        <w:t>Conclusion</w:t>
+      </w:r>
+    </w:p>
+    <w:p>
+      <w:r>
+        <w:t>J’ai beaucoup apprécié ce module 320. Comparé à l’année passée, je l’ai trouvé bien plus intéressant et plus riche. J’ai eu l’impression de mieux comprendre ce que je faisais et de progresser tout au long du projet.</w:t>
+      </w:r>
+    </w:p>
+    <w:p>
+      <w:r>
+        <w:t>Ce module m’a permis de mieux comprendre la programmation orientée objet et de mettre en pratique plusieurs notions vues en cours. J’ai parfois rencontré des difficultés, mais j’ai réussi à les surmonter en cherchant des solutions et en faisant différents tests.</w:t>
+      </w:r>
+    </w:p>
+    <w:p>
+      <w:r>
+        <w:t>J’ai même apprécié le sujet au point de commencer d’autres petits projets à la maison pour m’entraîner à la programmation orientée objet et continuer à progresser.</w:t>
+      </w:r>
+    </w:p>
+    <w:p>
+      <w:r>
+        <w:t>Grâce à ce module, j’ai gagné en confiance et je redoute moins la suite de la formation. Voir que j’ai réussi à comprendre et réaliser un projet de ce type me motive pour les prochains modules et les futurs projets.</w:t>
       </w:r>
     </w:p>
     <w:sectPr>
-      <w:headerReference w:type="even" r:id="rId42"/>
-      <w:headerReference w:type="default" r:id="rId43"/>
-      <w:footerReference w:type="even" r:id="rId44"/>
-      <w:footerReference w:type="default" r:id="rId45"/>
-      <w:headerReference w:type="first" r:id="rId46"/>
-      <w:footerReference w:type="first" r:id="rId47"/>
+      <w:headerReference w:type="even" r:id="rId66"/>
+      <w:headerReference w:type="default" r:id="rId67"/>
+      <w:footerReference w:type="even" r:id="rId68"/>
+      <w:footerReference w:type="default" r:id="rId69"/>
+      <w:headerReference w:type="first" r:id="rId70"/>
+      <w:footerReference w:type="first" r:id="rId71"/>
       <w:pgSz w:w="11906" w:h="16838" w:code="9"/>
       <w:pgMar w:top="1418" w:right="1418" w:bottom="1135" w:left="1418" w:header="709" w:footer="709" w:gutter="0"/>
       <w:pgBorders w:offsetFrom="page">
@@ -5365,7 +8920,7 @@
 </file>
 
 <file path=word/endnotes.xml><?xml version="1.0" encoding="utf-8"?>
-<w:endnotes xmlns:wpc="http://schemas.microsoft.com/office/word/2010/wordprocessingCanvas" xmlns:cx="http://schemas.microsoft.com/office/drawing/2014/chartex" xmlns:cx1="http://schemas.microsoft.com/office/drawing/2015/9/8/chartex" xmlns:cx2="http://schemas.microsoft.com/office/drawing/2015/10/21/chartex" xmlns:cx3="http://schemas.microsoft.com/office/drawing/2016/5/9/chartex" xmlns:cx4="http://schemas.microsoft.com/office/drawing/2016/5/10/chartex" xmlns:cx5="http://schemas.microsoft.com/office/drawing/2016/5/11/chartex" xmlns:cx6="http://schemas.microsoft.com/office/drawing/2016/5/12/chartex" xmlns:cx7="http://schemas.microsoft.com/office/drawing/2016/5/13/chartex" xmlns:cx8="http://schemas.microsoft.com/office/drawing/2016/5/14/chartex" xmlns:mc="http://schemas.openxmlformats.org/markup-compatibility/2006" xmlns:aink="http://schemas.microsoft.com/office/drawing/2016/ink" xmlns:am3d="http://schemas.microsoft.com/office/drawing/2017/model3d" xmlns:o="urn:schemas-microsoft-com:office:office" xmlns:oel="http://schemas.microsoft.com/office/2019/extlst" xmlns:r="http://schemas.openxmlformats.org/officeDocument/2006/relationships" xmlns:m="http://schemas.openxmlformats.org/officeDocument/2006/math" xmlns:v="urn:schemas-microsoft-com:vml" xmlns:wp14="http://schemas.microsoft.com/office/word/2010/wordprocessingDrawing" xmlns:wp="http://schemas.openxmlformats.org/drawingml/2006/wordprocessingDrawing" xmlns:w10="urn:schemas-microsoft-com:office:word" xmlns:w="http://schemas.openxmlformats.org/wordprocessingml/2006/main" xmlns:w14="http://schemas.microsoft.com/office/word/2010/wordml" xmlns:w15="http://schemas.microsoft.com/office/word/2012/wordml" xmlns:w16cex="http://schemas.microsoft.com/office/word/2018/wordml/cex" xmlns:w16cid="http://schemas.microsoft.com/office/word/2016/wordml/cid" xmlns:w16="http://schemas.microsoft.com/office/word/2018/wordml" xmlns:w16du="http://schemas.microsoft.com/office/word/2023/wordml/word16du" xmlns:w16sdtdh="http://schemas.microsoft.com/office/word/2020/wordml/sdtdatahash" xmlns:w16se="http://schemas.microsoft.com/office/word/2015/wordml/symex" xmlns:wpg="http://schemas.microsoft.com/office/word/2010/wordprocessingGroup" xmlns:wpi="http://schemas.microsoft.com/office/word/2010/wordprocessingInk" xmlns:wne="http://schemas.microsoft.com/office/word/2006/wordml" xmlns:wps="http://schemas.microsoft.com/office/word/2010/wordprocessingShape" mc:Ignorable="w14 w15 w16se w16cid w16 w16cex w16sdtdh wp14">
+<w:endnotes xmlns:wpc="http://schemas.microsoft.com/office/word/2010/wordprocessingCanvas" xmlns:cx="http://schemas.microsoft.com/office/drawing/2014/chartex" xmlns:cx1="http://schemas.microsoft.com/office/drawing/2015/9/8/chartex" xmlns:cx2="http://schemas.microsoft.com/office/drawing/2015/10/21/chartex" xmlns:cx3="http://schemas.microsoft.com/office/drawing/2016/5/9/chartex" xmlns:cx4="http://schemas.microsoft.com/office/drawing/2016/5/10/chartex" xmlns:cx5="http://schemas.microsoft.com/office/drawing/2016/5/11/chartex" xmlns:cx6="http://schemas.microsoft.com/office/drawing/2016/5/12/chartex" xmlns:cx7="http://schemas.microsoft.com/office/drawing/2016/5/13/chartex" xmlns:cx8="http://schemas.microsoft.com/office/drawing/2016/5/14/chartex" xmlns:mc="http://schemas.openxmlformats.org/markup-compatibility/2006" xmlns:aink="http://schemas.microsoft.com/office/drawing/2016/ink" xmlns:am3d="http://schemas.microsoft.com/office/drawing/2017/model3d" xmlns:o="urn:schemas-microsoft-com:office:office" xmlns:oel="http://schemas.microsoft.com/office/2019/extlst" xmlns:r="http://schemas.openxmlformats.org/officeDocument/2006/relationships" xmlns:m="http://schemas.openxmlformats.org/officeDocument/2006/math" xmlns:v="urn:schemas-microsoft-com:vml" xmlns:wp14="http://schemas.microsoft.com/office/word/2010/wordprocessingDrawing" xmlns:wp="http://schemas.openxmlformats.org/drawingml/2006/wordprocessingDrawing" xmlns:w10="urn:schemas-microsoft-com:office:word" xmlns:w="http://schemas.openxmlformats.org/wordprocessingml/2006/main" xmlns:w14="http://schemas.microsoft.com/office/word/2010/wordml" xmlns:w15="http://schemas.microsoft.com/office/word/2012/wordml" xmlns:w16cex="http://schemas.microsoft.com/office/word/2018/wordml/cex" xmlns:w16cid="http://schemas.microsoft.com/office/word/2016/wordml/cid" xmlns:w16="http://schemas.microsoft.com/office/word/2018/wordml" xmlns:w16du="http://schemas.microsoft.com/office/word/2023/wordml/word16du" xmlns:w16sdtdh="http://schemas.microsoft.com/office/word/2020/wordml/sdtdatahash" xmlns:w16sdtfl="http://schemas.microsoft.com/office/word/2024/wordml/sdtformatlock" xmlns:w16se="http://schemas.microsoft.com/office/word/2015/wordml/symex" xmlns:wpg="http://schemas.microsoft.com/office/word/2010/wordprocessingGroup" xmlns:wpi="http://schemas.microsoft.com/office/word/2010/wordprocessingInk" xmlns:wne="http://schemas.microsoft.com/office/word/2006/wordml" xmlns:wps="http://schemas.microsoft.com/office/word/2010/wordprocessingShape" mc:Ignorable="w14 w15 w16se w16cid w16 w16cex w16sdtdh w16sdtfl w16du wp14">
   <w:endnote w:type="separator" w:id="-1">
     <w:p>
       <w:pPr>
@@ -5390,7 +8945,7 @@
 </file>
 
 <file path=word/footer1.xml><?xml version="1.0" encoding="utf-8"?>
-<w:ftr xmlns:wpc="http://schemas.microsoft.com/office/word/2010/wordprocessingCanvas" xmlns:cx="http://schemas.microsoft.com/office/drawing/2014/chartex" xmlns:cx1="http://schemas.microsoft.com/office/drawing/2015/9/8/chartex" xmlns:cx2="http://schemas.microsoft.com/office/drawing/2015/10/21/chartex" xmlns:cx3="http://schemas.microsoft.com/office/drawing/2016/5/9/chartex" xmlns:cx4="http://schemas.microsoft.com/office/drawing/2016/5/10/chartex" xmlns:cx5="http://schemas.microsoft.com/office/drawing/2016/5/11/chartex" xmlns:cx6="http://schemas.microsoft.com/office/drawing/2016/5/12/chartex" xmlns:cx7="http://schemas.microsoft.com/office/drawing/2016/5/13/chartex" xmlns:cx8="http://schemas.microsoft.com/office/drawing/2016/5/14/chartex" xmlns:mc="http://schemas.openxmlformats.org/markup-compatibility/2006" xmlns:aink="http://schemas.microsoft.com/office/drawing/2016/ink" xmlns:am3d="http://schemas.microsoft.com/office/drawing/2017/model3d" xmlns:o="urn:schemas-microsoft-com:office:office" xmlns:oel="http://schemas.microsoft.com/office/2019/extlst" xmlns:r="http://schemas.openxmlformats.org/officeDocument/2006/relationships" xmlns:m="http://schemas.openxmlformats.org/officeDocument/2006/math" xmlns:v="urn:schemas-microsoft-com:vml" xmlns:wp14="http://schemas.microsoft.com/office/word/2010/wordprocessingDrawing" xmlns:wp="http://schemas.openxmlformats.org/drawingml/2006/wordprocessingDrawing" xmlns:w10="urn:schemas-microsoft-com:office:word" xmlns:w="http://schemas.openxmlformats.org/wordprocessingml/2006/main" xmlns:w14="http://schemas.microsoft.com/office/word/2010/wordml" xmlns:w15="http://schemas.microsoft.com/office/word/2012/wordml" xmlns:w16cex="http://schemas.microsoft.com/office/word/2018/wordml/cex" xmlns:w16cid="http://schemas.microsoft.com/office/word/2016/wordml/cid" xmlns:w16="http://schemas.microsoft.com/office/word/2018/wordml" xmlns:w16du="http://schemas.microsoft.com/office/word/2023/wordml/word16du" xmlns:w16sdtdh="http://schemas.microsoft.com/office/word/2020/wordml/sdtdatahash" xmlns:w16se="http://schemas.microsoft.com/office/word/2015/wordml/symex" xmlns:wpg="http://schemas.microsoft.com/office/word/2010/wordprocessingGroup" xmlns:wpi="http://schemas.microsoft.com/office/word/2010/wordprocessingInk" xmlns:wne="http://schemas.microsoft.com/office/word/2006/wordml" xmlns:wps="http://schemas.microsoft.com/office/word/2010/wordprocessingShape" mc:Ignorable="w14 w15 w16se w16cid w16 w16cex w16sdtdh wp14">
+<w:ftr xmlns:wpc="http://schemas.microsoft.com/office/word/2010/wordprocessingCanvas" xmlns:cx="http://schemas.microsoft.com/office/drawing/2014/chartex" xmlns:cx1="http://schemas.microsoft.com/office/drawing/2015/9/8/chartex" xmlns:cx2="http://schemas.microsoft.com/office/drawing/2015/10/21/chartex" xmlns:cx3="http://schemas.microsoft.com/office/drawing/2016/5/9/chartex" xmlns:cx4="http://schemas.microsoft.com/office/drawing/2016/5/10/chartex" xmlns:cx5="http://schemas.microsoft.com/office/drawing/2016/5/11/chartex" xmlns:cx6="http://schemas.microsoft.com/office/drawing/2016/5/12/chartex" xmlns:cx7="http://schemas.microsoft.com/office/drawing/2016/5/13/chartex" xmlns:cx8="http://schemas.microsoft.com/office/drawing/2016/5/14/chartex" xmlns:mc="http://schemas.openxmlformats.org/markup-compatibility/2006" xmlns:aink="http://schemas.microsoft.com/office/drawing/2016/ink" xmlns:am3d="http://schemas.microsoft.com/office/drawing/2017/model3d" xmlns:o="urn:schemas-microsoft-com:office:office" xmlns:oel="http://schemas.microsoft.com/office/2019/extlst" xmlns:r="http://schemas.openxmlformats.org/officeDocument/2006/relationships" xmlns:m="http://schemas.openxmlformats.org/officeDocument/2006/math" xmlns:v="urn:schemas-microsoft-com:vml" xmlns:wp14="http://schemas.microsoft.com/office/word/2010/wordprocessingDrawing" xmlns:wp="http://schemas.openxmlformats.org/drawingml/2006/wordprocessingDrawing" xmlns:w10="urn:schemas-microsoft-com:office:word" xmlns:w="http://schemas.openxmlformats.org/wordprocessingml/2006/main" xmlns:w14="http://schemas.microsoft.com/office/word/2010/wordml" xmlns:w15="http://schemas.microsoft.com/office/word/2012/wordml" xmlns:w16cex="http://schemas.microsoft.com/office/word/2018/wordml/cex" xmlns:w16cid="http://schemas.microsoft.com/office/word/2016/wordml/cid" xmlns:w16="http://schemas.microsoft.com/office/word/2018/wordml" xmlns:w16du="http://schemas.microsoft.com/office/word/2023/wordml/word16du" xmlns:w16sdtdh="http://schemas.microsoft.com/office/word/2020/wordml/sdtdatahash" xmlns:w16sdtfl="http://schemas.microsoft.com/office/word/2024/wordml/sdtformatlock" xmlns:w16se="http://schemas.microsoft.com/office/word/2015/wordml/symex" xmlns:wpg="http://schemas.microsoft.com/office/word/2010/wordprocessingGroup" xmlns:wpi="http://schemas.microsoft.com/office/word/2010/wordprocessingInk" xmlns:wne="http://schemas.microsoft.com/office/word/2006/wordml" xmlns:wps="http://schemas.microsoft.com/office/word/2010/wordprocessingShape" mc:Ignorable="w14 w15 w16se w16cid w16 w16cex w16sdtdh w16sdtfl w16du wp14">
   <w:p>
     <w:pPr>
       <w:pStyle w:val="Pieddepage"/>
@@ -5400,7 +8955,7 @@
 </file>
 
 <file path=word/footer2.xml><?xml version="1.0" encoding="utf-8"?>
-<w:ftr xmlns:wpc="http://schemas.microsoft.com/office/word/2010/wordprocessingCanvas" xmlns:cx="http://schemas.microsoft.com/office/drawing/2014/chartex" xmlns:cx1="http://schemas.microsoft.com/office/drawing/2015/9/8/chartex" xmlns:cx2="http://schemas.microsoft.com/office/drawing/2015/10/21/chartex" xmlns:cx3="http://schemas.microsoft.com/office/drawing/2016/5/9/chartex" xmlns:cx4="http://schemas.microsoft.com/office/drawing/2016/5/10/chartex" xmlns:cx5="http://schemas.microsoft.com/office/drawing/2016/5/11/chartex" xmlns:cx6="http://schemas.microsoft.com/office/drawing/2016/5/12/chartex" xmlns:cx7="http://schemas.microsoft.com/office/drawing/2016/5/13/chartex" xmlns:cx8="http://schemas.microsoft.com/office/drawing/2016/5/14/chartex" xmlns:mc="http://schemas.openxmlformats.org/markup-compatibility/2006" xmlns:aink="http://schemas.microsoft.com/office/drawing/2016/ink" xmlns:am3d="http://schemas.microsoft.com/office/drawing/2017/model3d" xmlns:o="urn:schemas-microsoft-com:office:office" xmlns:oel="http://schemas.microsoft.com/office/2019/extlst" xmlns:r="http://schemas.openxmlformats.org/officeDocument/2006/relationships" xmlns:m="http://schemas.openxmlformats.org/officeDocument/2006/math" xmlns:v="urn:schemas-microsoft-com:vml" xmlns:wp14="http://schemas.microsoft.com/office/word/2010/wordprocessingDrawing" xmlns:wp="http://schemas.openxmlformats.org/drawingml/2006/wordprocessingDrawing" xmlns:w10="urn:schemas-microsoft-com:office:word" xmlns:w="http://schemas.openxmlformats.org/wordprocessingml/2006/main" xmlns:w14="http://schemas.microsoft.com/office/word/2010/wordml" xmlns:w15="http://schemas.microsoft.com/office/word/2012/wordml" xmlns:w16cex="http://schemas.microsoft.com/office/word/2018/wordml/cex" xmlns:w16cid="http://schemas.microsoft.com/office/word/2016/wordml/cid" xmlns:w16="http://schemas.microsoft.com/office/word/2018/wordml" xmlns:w16du="http://schemas.microsoft.com/office/word/2023/wordml/word16du" xmlns:w16sdtdh="http://schemas.microsoft.com/office/word/2020/wordml/sdtdatahash" xmlns:w16se="http://schemas.microsoft.com/office/word/2015/wordml/symex" xmlns:wpg="http://schemas.microsoft.com/office/word/2010/wordprocessingGroup" xmlns:wpi="http://schemas.microsoft.com/office/word/2010/wordprocessingInk" xmlns:wne="http://schemas.microsoft.com/office/word/2006/wordml" xmlns:wps="http://schemas.microsoft.com/office/word/2010/wordprocessingShape" mc:Ignorable="w14 w15 w16se w16cid w16 w16cex w16sdtdh wp14">
+<w:ftr xmlns:wpc="http://schemas.microsoft.com/office/word/2010/wordprocessingCanvas" xmlns:cx="http://schemas.microsoft.com/office/drawing/2014/chartex" xmlns:cx1="http://schemas.microsoft.com/office/drawing/2015/9/8/chartex" xmlns:cx2="http://schemas.microsoft.com/office/drawing/2015/10/21/chartex" xmlns:cx3="http://schemas.microsoft.com/office/drawing/2016/5/9/chartex" xmlns:cx4="http://schemas.microsoft.com/office/drawing/2016/5/10/chartex" xmlns:cx5="http://schemas.microsoft.com/office/drawing/2016/5/11/chartex" xmlns:cx6="http://schemas.microsoft.com/office/drawing/2016/5/12/chartex" xmlns:cx7="http://schemas.microsoft.com/office/drawing/2016/5/13/chartex" xmlns:cx8="http://schemas.microsoft.com/office/drawing/2016/5/14/chartex" xmlns:mc="http://schemas.openxmlformats.org/markup-compatibility/2006" xmlns:aink="http://schemas.microsoft.com/office/drawing/2016/ink" xmlns:am3d="http://schemas.microsoft.com/office/drawing/2017/model3d" xmlns:o="urn:schemas-microsoft-com:office:office" xmlns:oel="http://schemas.microsoft.com/office/2019/extlst" xmlns:r="http://schemas.openxmlformats.org/officeDocument/2006/relationships" xmlns:m="http://schemas.openxmlformats.org/officeDocument/2006/math" xmlns:v="urn:schemas-microsoft-com:vml" xmlns:wp14="http://schemas.microsoft.com/office/word/2010/wordprocessingDrawing" xmlns:wp="http://schemas.openxmlformats.org/drawingml/2006/wordprocessingDrawing" xmlns:w10="urn:schemas-microsoft-com:office:word" xmlns:w="http://schemas.openxmlformats.org/wordprocessingml/2006/main" xmlns:w14="http://schemas.microsoft.com/office/word/2010/wordml" xmlns:w15="http://schemas.microsoft.com/office/word/2012/wordml" xmlns:w16cex="http://schemas.microsoft.com/office/word/2018/wordml/cex" xmlns:w16cid="http://schemas.microsoft.com/office/word/2016/wordml/cid" xmlns:w16="http://schemas.microsoft.com/office/word/2018/wordml" xmlns:w16du="http://schemas.microsoft.com/office/word/2023/wordml/word16du" xmlns:w16sdtdh="http://schemas.microsoft.com/office/word/2020/wordml/sdtdatahash" xmlns:w16sdtfl="http://schemas.microsoft.com/office/word/2024/wordml/sdtformatlock" xmlns:w16se="http://schemas.microsoft.com/office/word/2015/wordml/symex" xmlns:wpg="http://schemas.microsoft.com/office/word/2010/wordprocessingGroup" xmlns:wpi="http://schemas.microsoft.com/office/word/2010/wordprocessingInk" xmlns:wne="http://schemas.microsoft.com/office/word/2006/wordml" xmlns:wps="http://schemas.microsoft.com/office/word/2010/wordprocessingShape" mc:Ignorable="w14 w15 w16se w16cid w16 w16cex w16sdtdh w16sdtfl w16du wp14">
   <w:p>
     <w:pPr>
       <w:pStyle w:val="Pieddepage"/>
@@ -5410,7 +8965,7 @@
 </file>
 
 <file path=word/footer3.xml><?xml version="1.0" encoding="utf-8"?>
-<w:ftr xmlns:wpc="http://schemas.microsoft.com/office/word/2010/wordprocessingCanvas" xmlns:cx="http://schemas.microsoft.com/office/drawing/2014/chartex" xmlns:cx1="http://schemas.microsoft.com/office/drawing/2015/9/8/chartex" xmlns:cx2="http://schemas.microsoft.com/office/drawing/2015/10/21/chartex" xmlns:cx3="http://schemas.microsoft.com/office/drawing/2016/5/9/chartex" xmlns:cx4="http://schemas.microsoft.com/office/drawing/2016/5/10/chartex" xmlns:cx5="http://schemas.microsoft.com/office/drawing/2016/5/11/chartex" xmlns:cx6="http://schemas.microsoft.com/office/drawing/2016/5/12/chartex" xmlns:cx7="http://schemas.microsoft.com/office/drawing/2016/5/13/chartex" xmlns:cx8="http://schemas.microsoft.com/office/drawing/2016/5/14/chartex" xmlns:mc="http://schemas.openxmlformats.org/markup-compatibility/2006" xmlns:aink="http://schemas.microsoft.com/office/drawing/2016/ink" xmlns:am3d="http://schemas.microsoft.com/office/drawing/2017/model3d" xmlns:o="urn:schemas-microsoft-com:office:office" xmlns:oel="http://schemas.microsoft.com/office/2019/extlst" xmlns:r="http://schemas.openxmlformats.org/officeDocument/2006/relationships" xmlns:m="http://schemas.openxmlformats.org/officeDocument/2006/math" xmlns:v="urn:schemas-microsoft-com:vml" xmlns:wp14="http://schemas.microsoft.com/office/word/2010/wordprocessingDrawing" xmlns:wp="http://schemas.openxmlformats.org/drawingml/2006/wordprocessingDrawing" xmlns:w10="urn:schemas-microsoft-com:office:word" xmlns:w="http://schemas.openxmlformats.org/wordprocessingml/2006/main" xmlns:w14="http://schemas.microsoft.com/office/word/2010/wordml" xmlns:w15="http://schemas.microsoft.com/office/word/2012/wordml" xmlns:w16cex="http://schemas.microsoft.com/office/word/2018/wordml/cex" xmlns:w16cid="http://schemas.microsoft.com/office/word/2016/wordml/cid" xmlns:w16="http://schemas.microsoft.com/office/word/2018/wordml" xmlns:w16du="http://schemas.microsoft.com/office/word/2023/wordml/word16du" xmlns:w16sdtdh="http://schemas.microsoft.com/office/word/2020/wordml/sdtdatahash" xmlns:w16se="http://schemas.microsoft.com/office/word/2015/wordml/symex" xmlns:wpg="http://schemas.microsoft.com/office/word/2010/wordprocessingGroup" xmlns:wpi="http://schemas.microsoft.com/office/word/2010/wordprocessingInk" xmlns:wne="http://schemas.microsoft.com/office/word/2006/wordml" xmlns:wps="http://schemas.microsoft.com/office/word/2010/wordprocessingShape" mc:Ignorable="w14 w15 w16se w16cid w16 w16cex w16sdtdh wp14">
+<w:ftr xmlns:wpc="http://schemas.microsoft.com/office/word/2010/wordprocessingCanvas" xmlns:cx="http://schemas.microsoft.com/office/drawing/2014/chartex" xmlns:cx1="http://schemas.microsoft.com/office/drawing/2015/9/8/chartex" xmlns:cx2="http://schemas.microsoft.com/office/drawing/2015/10/21/chartex" xmlns:cx3="http://schemas.microsoft.com/office/drawing/2016/5/9/chartex" xmlns:cx4="http://schemas.microsoft.com/office/drawing/2016/5/10/chartex" xmlns:cx5="http://schemas.microsoft.com/office/drawing/2016/5/11/chartex" xmlns:cx6="http://schemas.microsoft.com/office/drawing/2016/5/12/chartex" xmlns:cx7="http://schemas.microsoft.com/office/drawing/2016/5/13/chartex" xmlns:cx8="http://schemas.microsoft.com/office/drawing/2016/5/14/chartex" xmlns:mc="http://schemas.openxmlformats.org/markup-compatibility/2006" xmlns:aink="http://schemas.microsoft.com/office/drawing/2016/ink" xmlns:am3d="http://schemas.microsoft.com/office/drawing/2017/model3d" xmlns:o="urn:schemas-microsoft-com:office:office" xmlns:oel="http://schemas.microsoft.com/office/2019/extlst" xmlns:r="http://schemas.openxmlformats.org/officeDocument/2006/relationships" xmlns:m="http://schemas.openxmlformats.org/officeDocument/2006/math" xmlns:v="urn:schemas-microsoft-com:vml" xmlns:wp14="http://schemas.microsoft.com/office/word/2010/wordprocessingDrawing" xmlns:wp="http://schemas.openxmlformats.org/drawingml/2006/wordprocessingDrawing" xmlns:w10="urn:schemas-microsoft-com:office:word" xmlns:w="http://schemas.openxmlformats.org/wordprocessingml/2006/main" xmlns:w14="http://schemas.microsoft.com/office/word/2010/wordml" xmlns:w15="http://schemas.microsoft.com/office/word/2012/wordml" xmlns:w16cex="http://schemas.microsoft.com/office/word/2018/wordml/cex" xmlns:w16cid="http://schemas.microsoft.com/office/word/2016/wordml/cid" xmlns:w16="http://schemas.microsoft.com/office/word/2018/wordml" xmlns:w16du="http://schemas.microsoft.com/office/word/2023/wordml/word16du" xmlns:w16sdtdh="http://schemas.microsoft.com/office/word/2020/wordml/sdtdatahash" xmlns:w16sdtfl="http://schemas.microsoft.com/office/word/2024/wordml/sdtformatlock" xmlns:w16se="http://schemas.microsoft.com/office/word/2015/wordml/symex" xmlns:wpg="http://schemas.microsoft.com/office/word/2010/wordprocessingGroup" xmlns:wpi="http://schemas.microsoft.com/office/word/2010/wordprocessingInk" xmlns:wne="http://schemas.microsoft.com/office/word/2006/wordml" xmlns:wps="http://schemas.microsoft.com/office/word/2010/wordprocessingShape" mc:Ignorable="w14 w15 w16se w16cid w16 w16cex w16sdtdh w16sdtfl w16du wp14">
   <w:p>
     <w:pPr>
       <w:pStyle w:val="Pieddepage"/>
@@ -5420,7 +8975,7 @@
 </file>
 
 <file path=word/footnotes.xml><?xml version="1.0" encoding="utf-8"?>
-<w:footnotes xmlns:wpc="http://schemas.microsoft.com/office/word/2010/wordprocessingCanvas" xmlns:cx="http://schemas.microsoft.com/office/drawing/2014/chartex" xmlns:cx1="http://schemas.microsoft.com/office/drawing/2015/9/8/chartex" xmlns:cx2="http://schemas.microsoft.com/office/drawing/2015/10/21/chartex" xmlns:cx3="http://schemas.microsoft.com/office/drawing/2016/5/9/chartex" xmlns:cx4="http://schemas.microsoft.com/office/drawing/2016/5/10/chartex" xmlns:cx5="http://schemas.microsoft.com/office/drawing/2016/5/11/chartex" xmlns:cx6="http://schemas.microsoft.com/office/drawing/2016/5/12/chartex" xmlns:cx7="http://schemas.microsoft.com/office/drawing/2016/5/13/chartex" xmlns:cx8="http://schemas.microsoft.com/office/drawing/2016/5/14/chartex" xmlns:mc="http://schemas.openxmlformats.org/markup-compatibility/2006" xmlns:aink="http://schemas.microsoft.com/office/drawing/2016/ink" xmlns:am3d="http://schemas.microsoft.com/office/drawing/2017/model3d" xmlns:o="urn:schemas-microsoft-com:office:office" xmlns:oel="http://schemas.microsoft.com/office/2019/extlst" xmlns:r="http://schemas.openxmlformats.org/officeDocument/2006/relationships" xmlns:m="http://schemas.openxmlformats.org/officeDocument/2006/math" xmlns:v="urn:schemas-microsoft-com:vml" xmlns:wp14="http://schemas.microsoft.com/office/word/2010/wordprocessingDrawing" xmlns:wp="http://schemas.openxmlformats.org/drawingml/2006/wordprocessingDrawing" xmlns:w10="urn:schemas-microsoft-com:office:word" xmlns:w="http://schemas.openxmlformats.org/wordprocessingml/2006/main" xmlns:w14="http://schemas.microsoft.com/office/word/2010/wordml" xmlns:w15="http://schemas.microsoft.com/office/word/2012/wordml" xmlns:w16cex="http://schemas.microsoft.com/office/word/2018/wordml/cex" xmlns:w16cid="http://schemas.microsoft.com/office/word/2016/wordml/cid" xmlns:w16="http://schemas.microsoft.com/office/word/2018/wordml" xmlns:w16du="http://schemas.microsoft.com/office/word/2023/wordml/word16du" xmlns:w16sdtdh="http://schemas.microsoft.com/office/word/2020/wordml/sdtdatahash" xmlns:w16se="http://schemas.microsoft.com/office/word/2015/wordml/symex" xmlns:wpg="http://schemas.microsoft.com/office/word/2010/wordprocessingGroup" xmlns:wpi="http://schemas.microsoft.com/office/word/2010/wordprocessingInk" xmlns:wne="http://schemas.microsoft.com/office/word/2006/wordml" xmlns:wps="http://schemas.microsoft.com/office/word/2010/wordprocessingShape" mc:Ignorable="w14 w15 w16se w16cid w16 w16cex w16sdtdh wp14">
+<w:footnotes xmlns:wpc="http://schemas.microsoft.com/office/word/2010/wordprocessingCanvas" xmlns:cx="http://schemas.microsoft.com/office/drawing/2014/chartex" xmlns:cx1="http://schemas.microsoft.com/office/drawing/2015/9/8/chartex" xmlns:cx2="http://schemas.microsoft.com/office/drawing/2015/10/21/chartex" xmlns:cx3="http://schemas.microsoft.com/office/drawing/2016/5/9/chartex" xmlns:cx4="http://schemas.microsoft.com/office/drawing/2016/5/10/chartex" xmlns:cx5="http://schemas.microsoft.com/office/drawing/2016/5/11/chartex" xmlns:cx6="http://schemas.microsoft.com/office/drawing/2016/5/12/chartex" xmlns:cx7="http://schemas.microsoft.com/office/drawing/2016/5/13/chartex" xmlns:cx8="http://schemas.microsoft.com/office/drawing/2016/5/14/chartex" xmlns:mc="http://schemas.openxmlformats.org/markup-compatibility/2006" xmlns:aink="http://schemas.microsoft.com/office/drawing/2016/ink" xmlns:am3d="http://schemas.microsoft.com/office/drawing/2017/model3d" xmlns:o="urn:schemas-microsoft-com:office:office" xmlns:oel="http://schemas.microsoft.com/office/2019/extlst" xmlns:r="http://schemas.openxmlformats.org/officeDocument/2006/relationships" xmlns:m="http://schemas.openxmlformats.org/officeDocument/2006/math" xmlns:v="urn:schemas-microsoft-com:vml" xmlns:wp14="http://schemas.microsoft.com/office/word/2010/wordprocessingDrawing" xmlns:wp="http://schemas.openxmlformats.org/drawingml/2006/wordprocessingDrawing" xmlns:w10="urn:schemas-microsoft-com:office:word" xmlns:w="http://schemas.openxmlformats.org/wordprocessingml/2006/main" xmlns:w14="http://schemas.microsoft.com/office/word/2010/wordml" xmlns:w15="http://schemas.microsoft.com/office/word/2012/wordml" xmlns:w16cex="http://schemas.microsoft.com/office/word/2018/wordml/cex" xmlns:w16cid="http://schemas.microsoft.com/office/word/2016/wordml/cid" xmlns:w16="http://schemas.microsoft.com/office/word/2018/wordml" xmlns:w16du="http://schemas.microsoft.com/office/word/2023/wordml/word16du" xmlns:w16sdtdh="http://schemas.microsoft.com/office/word/2020/wordml/sdtdatahash" xmlns:w16sdtfl="http://schemas.microsoft.com/office/word/2024/wordml/sdtformatlock" xmlns:w16se="http://schemas.microsoft.com/office/word/2015/wordml/symex" xmlns:wpg="http://schemas.microsoft.com/office/word/2010/wordprocessingGroup" xmlns:wpi="http://schemas.microsoft.com/office/word/2010/wordprocessingInk" xmlns:wne="http://schemas.microsoft.com/office/word/2006/wordml" xmlns:wps="http://schemas.microsoft.com/office/word/2010/wordprocessingShape" mc:Ignorable="w14 w15 w16se w16cid w16 w16cex w16sdtdh w16sdtfl w16du wp14">
   <w:footnote w:type="separator" w:id="-1">
     <w:p>
       <w:pPr>
@@ -5445,7 +9000,7 @@
 </file>
 
 <file path=word/header1.xml><?xml version="1.0" encoding="utf-8"?>
-<w:hdr xmlns:wpc="http://schemas.microsoft.com/office/word/2010/wordprocessingCanvas" xmlns:cx="http://schemas.microsoft.com/office/drawing/2014/chartex" xmlns:cx1="http://schemas.microsoft.com/office/drawing/2015/9/8/chartex" xmlns:cx2="http://schemas.microsoft.com/office/drawing/2015/10/21/chartex" xmlns:cx3="http://schemas.microsoft.com/office/drawing/2016/5/9/chartex" xmlns:cx4="http://schemas.microsoft.com/office/drawing/2016/5/10/chartex" xmlns:cx5="http://schemas.microsoft.com/office/drawing/2016/5/11/chartex" xmlns:cx6="http://schemas.microsoft.com/office/drawing/2016/5/12/chartex" xmlns:cx7="http://schemas.microsoft.com/office/drawing/2016/5/13/chartex" xmlns:cx8="http://schemas.microsoft.com/office/drawing/2016/5/14/chartex" xmlns:mc="http://schemas.openxmlformats.org/markup-compatibility/2006" xmlns:aink="http://schemas.microsoft.com/office/drawing/2016/ink" xmlns:am3d="http://schemas.microsoft.com/office/drawing/2017/model3d" xmlns:o="urn:schemas-microsoft-com:office:office" xmlns:oel="http://schemas.microsoft.com/office/2019/extlst" xmlns:r="http://schemas.openxmlformats.org/officeDocument/2006/relationships" xmlns:m="http://schemas.openxmlformats.org/officeDocument/2006/math" xmlns:v="urn:schemas-microsoft-com:vml" xmlns:wp14="http://schemas.microsoft.com/office/word/2010/wordprocessingDrawing" xmlns:wp="http://schemas.openxmlformats.org/drawingml/2006/wordprocessingDrawing" xmlns:w10="urn:schemas-microsoft-com:office:word" xmlns:w="http://schemas.openxmlformats.org/wordprocessingml/2006/main" xmlns:w14="http://schemas.microsoft.com/office/word/2010/wordml" xmlns:w15="http://schemas.microsoft.com/office/word/2012/wordml" xmlns:w16cex="http://schemas.microsoft.com/office/word/2018/wordml/cex" xmlns:w16cid="http://schemas.microsoft.com/office/word/2016/wordml/cid" xmlns:w16="http://schemas.microsoft.com/office/word/2018/wordml" xmlns:w16du="http://schemas.microsoft.com/office/word/2023/wordml/word16du" xmlns:w16sdtdh="http://schemas.microsoft.com/office/word/2020/wordml/sdtdatahash" xmlns:w16se="http://schemas.microsoft.com/office/word/2015/wordml/symex" xmlns:wpg="http://schemas.microsoft.com/office/word/2010/wordprocessingGroup" xmlns:wpi="http://schemas.microsoft.com/office/word/2010/wordprocessingInk" xmlns:wne="http://schemas.microsoft.com/office/word/2006/wordml" xmlns:wps="http://schemas.microsoft.com/office/word/2010/wordprocessingShape" mc:Ignorable="w14 w15 w16se w16cid w16 w16cex w16sdtdh wp14">
+<w:hdr xmlns:wpc="http://schemas.microsoft.com/office/word/2010/wordprocessingCanvas" xmlns:cx="http://schemas.microsoft.com/office/drawing/2014/chartex" xmlns:cx1="http://schemas.microsoft.com/office/drawing/2015/9/8/chartex" xmlns:cx2="http://schemas.microsoft.com/office/drawing/2015/10/21/chartex" xmlns:cx3="http://schemas.microsoft.com/office/drawing/2016/5/9/chartex" xmlns:cx4="http://schemas.microsoft.com/office/drawing/2016/5/10/chartex" xmlns:cx5="http://schemas.microsoft.com/office/drawing/2016/5/11/chartex" xmlns:cx6="http://schemas.microsoft.com/office/drawing/2016/5/12/chartex" xmlns:cx7="http://schemas.microsoft.com/office/drawing/2016/5/13/chartex" xmlns:cx8="http://schemas.microsoft.com/office/drawing/2016/5/14/chartex" xmlns:mc="http://schemas.openxmlformats.org/markup-compatibility/2006" xmlns:aink="http://schemas.microsoft.com/office/drawing/2016/ink" xmlns:am3d="http://schemas.microsoft.com/office/drawing/2017/model3d" xmlns:o="urn:schemas-microsoft-com:office:office" xmlns:oel="http://schemas.microsoft.com/office/2019/extlst" xmlns:r="http://schemas.openxmlformats.org/officeDocument/2006/relationships" xmlns:m="http://schemas.openxmlformats.org/officeDocument/2006/math" xmlns:v="urn:schemas-microsoft-com:vml" xmlns:wp14="http://schemas.microsoft.com/office/word/2010/wordprocessingDrawing" xmlns:wp="http://schemas.openxmlformats.org/drawingml/2006/wordprocessingDrawing" xmlns:w10="urn:schemas-microsoft-com:office:word" xmlns:w="http://schemas.openxmlformats.org/wordprocessingml/2006/main" xmlns:w14="http://schemas.microsoft.com/office/word/2010/wordml" xmlns:w15="http://schemas.microsoft.com/office/word/2012/wordml" xmlns:w16cex="http://schemas.microsoft.com/office/word/2018/wordml/cex" xmlns:w16cid="http://schemas.microsoft.com/office/word/2016/wordml/cid" xmlns:w16="http://schemas.microsoft.com/office/word/2018/wordml" xmlns:w16du="http://schemas.microsoft.com/office/word/2023/wordml/word16du" xmlns:w16sdtdh="http://schemas.microsoft.com/office/word/2020/wordml/sdtdatahash" xmlns:w16sdtfl="http://schemas.microsoft.com/office/word/2024/wordml/sdtformatlock" xmlns:w16se="http://schemas.microsoft.com/office/word/2015/wordml/symex" xmlns:wpg="http://schemas.microsoft.com/office/word/2010/wordprocessingGroup" xmlns:wpi="http://schemas.microsoft.com/office/word/2010/wordprocessingInk" xmlns:wne="http://schemas.microsoft.com/office/word/2006/wordml" xmlns:wps="http://schemas.microsoft.com/office/word/2010/wordprocessingShape" mc:Ignorable="w14 w15 w16se w16cid w16 w16cex w16sdtdh w16sdtfl w16du wp14">
   <w:p>
     <w:pPr>
       <w:pStyle w:val="En-tte"/>
@@ -5491,7 +9046,7 @@
 </file>
 
 <file path=word/header2.xml><?xml version="1.0" encoding="utf-8"?>
-<w:hdr xmlns:wpc="http://schemas.microsoft.com/office/word/2010/wordprocessingCanvas" xmlns:cx="http://schemas.microsoft.com/office/drawing/2014/chartex" xmlns:cx1="http://schemas.microsoft.com/office/drawing/2015/9/8/chartex" xmlns:cx2="http://schemas.microsoft.com/office/drawing/2015/10/21/chartex" xmlns:cx3="http://schemas.microsoft.com/office/drawing/2016/5/9/chartex" xmlns:cx4="http://schemas.microsoft.com/office/drawing/2016/5/10/chartex" xmlns:cx5="http://schemas.microsoft.com/office/drawing/2016/5/11/chartex" xmlns:cx6="http://schemas.microsoft.com/office/drawing/2016/5/12/chartex" xmlns:cx7="http://schemas.microsoft.com/office/drawing/2016/5/13/chartex" xmlns:cx8="http://schemas.microsoft.com/office/drawing/2016/5/14/chartex" xmlns:mc="http://schemas.openxmlformats.org/markup-compatibility/2006" xmlns:aink="http://schemas.microsoft.com/office/drawing/2016/ink" xmlns:am3d="http://schemas.microsoft.com/office/drawing/2017/model3d" xmlns:o="urn:schemas-microsoft-com:office:office" xmlns:oel="http://schemas.microsoft.com/office/2019/extlst" xmlns:r="http://schemas.openxmlformats.org/officeDocument/2006/relationships" xmlns:m="http://schemas.openxmlformats.org/officeDocument/2006/math" xmlns:v="urn:schemas-microsoft-com:vml" xmlns:wp14="http://schemas.microsoft.com/office/word/2010/wordprocessingDrawing" xmlns:wp="http://schemas.openxmlformats.org/drawingml/2006/wordprocessingDrawing" xmlns:w10="urn:schemas-microsoft-com:office:word" xmlns:w="http://schemas.openxmlformats.org/wordprocessingml/2006/main" xmlns:w14="http://schemas.microsoft.com/office/word/2010/wordml" xmlns:w15="http://schemas.microsoft.com/office/word/2012/wordml" xmlns:w16cex="http://schemas.microsoft.com/office/word/2018/wordml/cex" xmlns:w16cid="http://schemas.microsoft.com/office/word/2016/wordml/cid" xmlns:w16="http://schemas.microsoft.com/office/word/2018/wordml" xmlns:w16du="http://schemas.microsoft.com/office/word/2023/wordml/word16du" xmlns:w16sdtdh="http://schemas.microsoft.com/office/word/2020/wordml/sdtdatahash" xmlns:w16se="http://schemas.microsoft.com/office/word/2015/wordml/symex" xmlns:wpg="http://schemas.microsoft.com/office/word/2010/wordprocessingGroup" xmlns:wpi="http://schemas.microsoft.com/office/word/2010/wordprocessingInk" xmlns:wne="http://schemas.microsoft.com/office/word/2006/wordml" xmlns:wps="http://schemas.microsoft.com/office/word/2010/wordprocessingShape" mc:Ignorable="w14 w15 w16se w16cid w16 w16cex w16sdtdh wp14">
+<w:hdr xmlns:wpc="http://schemas.microsoft.com/office/word/2010/wordprocessingCanvas" xmlns:cx="http://schemas.microsoft.com/office/drawing/2014/chartex" xmlns:cx1="http://schemas.microsoft.com/office/drawing/2015/9/8/chartex" xmlns:cx2="http://schemas.microsoft.com/office/drawing/2015/10/21/chartex" xmlns:cx3="http://schemas.microsoft.com/office/drawing/2016/5/9/chartex" xmlns:cx4="http://schemas.microsoft.com/office/drawing/2016/5/10/chartex" xmlns:cx5="http://schemas.microsoft.com/office/drawing/2016/5/11/chartex" xmlns:cx6="http://schemas.microsoft.com/office/drawing/2016/5/12/chartex" xmlns:cx7="http://schemas.microsoft.com/office/drawing/2016/5/13/chartex" xmlns:cx8="http://schemas.microsoft.com/office/drawing/2016/5/14/chartex" xmlns:mc="http://schemas.openxmlformats.org/markup-compatibility/2006" xmlns:aink="http://schemas.microsoft.com/office/drawing/2016/ink" xmlns:am3d="http://schemas.microsoft.com/office/drawing/2017/model3d" xmlns:o="urn:schemas-microsoft-com:office:office" xmlns:oel="http://schemas.microsoft.com/office/2019/extlst" xmlns:r="http://schemas.openxmlformats.org/officeDocument/2006/relationships" xmlns:m="http://schemas.openxmlformats.org/officeDocument/2006/math" xmlns:v="urn:schemas-microsoft-com:vml" xmlns:wp14="http://schemas.microsoft.com/office/word/2010/wordprocessingDrawing" xmlns:wp="http://schemas.openxmlformats.org/drawingml/2006/wordprocessingDrawing" xmlns:w10="urn:schemas-microsoft-com:office:word" xmlns:w="http://schemas.openxmlformats.org/wordprocessingml/2006/main" xmlns:w14="http://schemas.microsoft.com/office/word/2010/wordml" xmlns:w15="http://schemas.microsoft.com/office/word/2012/wordml" xmlns:w16cex="http://schemas.microsoft.com/office/word/2018/wordml/cex" xmlns:w16cid="http://schemas.microsoft.com/office/word/2016/wordml/cid" xmlns:w16="http://schemas.microsoft.com/office/word/2018/wordml" xmlns:w16du="http://schemas.microsoft.com/office/word/2023/wordml/word16du" xmlns:w16sdtdh="http://schemas.microsoft.com/office/word/2020/wordml/sdtdatahash" xmlns:w16sdtfl="http://schemas.microsoft.com/office/word/2024/wordml/sdtformatlock" xmlns:w16se="http://schemas.microsoft.com/office/word/2015/wordml/symex" xmlns:wpg="http://schemas.microsoft.com/office/word/2010/wordprocessingGroup" xmlns:wpi="http://schemas.microsoft.com/office/word/2010/wordprocessingInk" xmlns:wne="http://schemas.microsoft.com/office/word/2006/wordml" xmlns:wps="http://schemas.microsoft.com/office/word/2010/wordprocessingShape" mc:Ignorable="w14 w15 w16se w16cid w16 w16cex w16sdtdh w16sdtfl w16du wp14">
   <w:tbl>
     <w:tblPr>
       <w:tblStyle w:val="Grilledutableau"/>
@@ -5609,7 +9164,7 @@
 </file>
 
 <file path=word/header3.xml><?xml version="1.0" encoding="utf-8"?>
-<w:hdr xmlns:wpc="http://schemas.microsoft.com/office/word/2010/wordprocessingCanvas" xmlns:cx="http://schemas.microsoft.com/office/drawing/2014/chartex" xmlns:cx1="http://schemas.microsoft.com/office/drawing/2015/9/8/chartex" xmlns:cx2="http://schemas.microsoft.com/office/drawing/2015/10/21/chartex" xmlns:cx3="http://schemas.microsoft.com/office/drawing/2016/5/9/chartex" xmlns:cx4="http://schemas.microsoft.com/office/drawing/2016/5/10/chartex" xmlns:cx5="http://schemas.microsoft.com/office/drawing/2016/5/11/chartex" xmlns:cx6="http://schemas.microsoft.com/office/drawing/2016/5/12/chartex" xmlns:cx7="http://schemas.microsoft.com/office/drawing/2016/5/13/chartex" xmlns:cx8="http://schemas.microsoft.com/office/drawing/2016/5/14/chartex" xmlns:mc="http://schemas.openxmlformats.org/markup-compatibility/2006" xmlns:aink="http://schemas.microsoft.com/office/drawing/2016/ink" xmlns:am3d="http://schemas.microsoft.com/office/drawing/2017/model3d" xmlns:o="urn:schemas-microsoft-com:office:office" xmlns:oel="http://schemas.microsoft.com/office/2019/extlst" xmlns:r="http://schemas.openxmlformats.org/officeDocument/2006/relationships" xmlns:m="http://schemas.openxmlformats.org/officeDocument/2006/math" xmlns:v="urn:schemas-microsoft-com:vml" xmlns:wp14="http://schemas.microsoft.com/office/word/2010/wordprocessingDrawing" xmlns:wp="http://schemas.openxmlformats.org/drawingml/2006/wordprocessingDrawing" xmlns:w10="urn:schemas-microsoft-com:office:word" xmlns:w="http://schemas.openxmlformats.org/wordprocessingml/2006/main" xmlns:w14="http://schemas.microsoft.com/office/word/2010/wordml" xmlns:w15="http://schemas.microsoft.com/office/word/2012/wordml" xmlns:w16cex="http://schemas.microsoft.com/office/word/2018/wordml/cex" xmlns:w16cid="http://schemas.microsoft.com/office/word/2016/wordml/cid" xmlns:w16="http://schemas.microsoft.com/office/word/2018/wordml" xmlns:w16du="http://schemas.microsoft.com/office/word/2023/wordml/word16du" xmlns:w16sdtdh="http://schemas.microsoft.com/office/word/2020/wordml/sdtdatahash" xmlns:w16se="http://schemas.microsoft.com/office/word/2015/wordml/symex" xmlns:wpg="http://schemas.microsoft.com/office/word/2010/wordprocessingGroup" xmlns:wpi="http://schemas.microsoft.com/office/word/2010/wordprocessingInk" xmlns:wne="http://schemas.microsoft.com/office/word/2006/wordml" xmlns:wps="http://schemas.microsoft.com/office/word/2010/wordprocessingShape" mc:Ignorable="w14 w15 w16se w16cid w16 w16cex w16sdtdh wp14">
+<w:hdr xmlns:wpc="http://schemas.microsoft.com/office/word/2010/wordprocessingCanvas" xmlns:cx="http://schemas.microsoft.com/office/drawing/2014/chartex" xmlns:cx1="http://schemas.microsoft.com/office/drawing/2015/9/8/chartex" xmlns:cx2="http://schemas.microsoft.com/office/drawing/2015/10/21/chartex" xmlns:cx3="http://schemas.microsoft.com/office/drawing/2016/5/9/chartex" xmlns:cx4="http://schemas.microsoft.com/office/drawing/2016/5/10/chartex" xmlns:cx5="http://schemas.microsoft.com/office/drawing/2016/5/11/chartex" xmlns:cx6="http://schemas.microsoft.com/office/drawing/2016/5/12/chartex" xmlns:cx7="http://schemas.microsoft.com/office/drawing/2016/5/13/chartex" xmlns:cx8="http://schemas.microsoft.com/office/drawing/2016/5/14/chartex" xmlns:mc="http://schemas.openxmlformats.org/markup-compatibility/2006" xmlns:aink="http://schemas.microsoft.com/office/drawing/2016/ink" xmlns:am3d="http://schemas.microsoft.com/office/drawing/2017/model3d" xmlns:o="urn:schemas-microsoft-com:office:office" xmlns:oel="http://schemas.microsoft.com/office/2019/extlst" xmlns:r="http://schemas.openxmlformats.org/officeDocument/2006/relationships" xmlns:m="http://schemas.openxmlformats.org/officeDocument/2006/math" xmlns:v="urn:schemas-microsoft-com:vml" xmlns:wp14="http://schemas.microsoft.com/office/word/2010/wordprocessingDrawing" xmlns:wp="http://schemas.openxmlformats.org/drawingml/2006/wordprocessingDrawing" xmlns:w10="urn:schemas-microsoft-com:office:word" xmlns:w="http://schemas.openxmlformats.org/wordprocessingml/2006/main" xmlns:w14="http://schemas.microsoft.com/office/word/2010/wordml" xmlns:w15="http://schemas.microsoft.com/office/word/2012/wordml" xmlns:w16cex="http://schemas.microsoft.com/office/word/2018/wordml/cex" xmlns:w16cid="http://schemas.microsoft.com/office/word/2016/wordml/cid" xmlns:w16="http://schemas.microsoft.com/office/word/2018/wordml" xmlns:w16du="http://schemas.microsoft.com/office/word/2023/wordml/word16du" xmlns:w16sdtdh="http://schemas.microsoft.com/office/word/2020/wordml/sdtdatahash" xmlns:w16sdtfl="http://schemas.microsoft.com/office/word/2024/wordml/sdtformatlock" xmlns:w16se="http://schemas.microsoft.com/office/word/2015/wordml/symex" xmlns:wpg="http://schemas.microsoft.com/office/word/2010/wordprocessingGroup" xmlns:wpi="http://schemas.microsoft.com/office/word/2010/wordprocessingInk" xmlns:wne="http://schemas.microsoft.com/office/word/2006/wordml" xmlns:wps="http://schemas.microsoft.com/office/word/2010/wordprocessingShape" mc:Ignorable="w14 w15 w16se w16cid w16 w16cex w16sdtdh w16sdtfl w16du wp14">
   <w:p>
     <w:pPr>
       <w:pStyle w:val="En-tte"/>
@@ -5655,7 +9210,7 @@
 </file>
 
 <file path=word/numbering.xml><?xml version="1.0" encoding="utf-8"?>
-<w:numbering xmlns:wpc="http://schemas.microsoft.com/office/word/2010/wordprocessingCanvas" xmlns:cx="http://schemas.microsoft.com/office/drawing/2014/chartex" xmlns:cx1="http://schemas.microsoft.com/office/drawing/2015/9/8/chartex" xmlns:cx2="http://schemas.microsoft.com/office/drawing/2015/10/21/chartex" xmlns:cx3="http://schemas.microsoft.com/office/drawing/2016/5/9/chartex" xmlns:cx4="http://schemas.microsoft.com/office/drawing/2016/5/10/chartex" xmlns:cx5="http://schemas.microsoft.com/office/drawing/2016/5/11/chartex" xmlns:cx6="http://schemas.microsoft.com/office/drawing/2016/5/12/chartex" xmlns:cx7="http://schemas.microsoft.com/office/drawing/2016/5/13/chartex" xmlns:cx8="http://schemas.microsoft.com/office/drawing/2016/5/14/chartex" xmlns:mc="http://schemas.openxmlformats.org/markup-compatibility/2006" xmlns:aink="http://schemas.microsoft.com/office/drawing/2016/ink" xmlns:am3d="http://schemas.microsoft.com/office/drawing/2017/model3d" xmlns:o="urn:schemas-microsoft-com:office:office" xmlns:oel="http://schemas.microsoft.com/office/2019/extlst" xmlns:r="http://schemas.openxmlformats.org/officeDocument/2006/relationships" xmlns:m="http://schemas.openxmlformats.org/officeDocument/2006/math" xmlns:v="urn:schemas-microsoft-com:vml" xmlns:wp14="http://schemas.microsoft.com/office/word/2010/wordprocessingDrawing" xmlns:wp="http://schemas.openxmlformats.org/drawingml/2006/wordprocessingDrawing" xmlns:w10="urn:schemas-microsoft-com:office:word" xmlns:w="http://schemas.openxmlformats.org/wordprocessingml/2006/main" xmlns:w14="http://schemas.microsoft.com/office/word/2010/wordml" xmlns:w15="http://schemas.microsoft.com/office/word/2012/wordml" xmlns:w16cex="http://schemas.microsoft.com/office/word/2018/wordml/cex" xmlns:w16cid="http://schemas.microsoft.com/office/word/2016/wordml/cid" xmlns:w16="http://schemas.microsoft.com/office/word/2018/wordml" xmlns:w16du="http://schemas.microsoft.com/office/word/2023/wordml/word16du" xmlns:w16sdtdh="http://schemas.microsoft.com/office/word/2020/wordml/sdtdatahash" xmlns:w16se="http://schemas.microsoft.com/office/word/2015/wordml/symex" xmlns:wpg="http://schemas.microsoft.com/office/word/2010/wordprocessingGroup" xmlns:wpi="http://schemas.microsoft.com/office/word/2010/wordprocessingInk" xmlns:wne="http://schemas.microsoft.com/office/word/2006/wordml" xmlns:wps="http://schemas.microsoft.com/office/word/2010/wordprocessingShape" mc:Ignorable="w14 w15 w16se w16cid w16 w16cex w16sdtdh wp14">
+<w:numbering xmlns:wpc="http://schemas.microsoft.com/office/word/2010/wordprocessingCanvas" xmlns:cx="http://schemas.microsoft.com/office/drawing/2014/chartex" xmlns:cx1="http://schemas.microsoft.com/office/drawing/2015/9/8/chartex" xmlns:cx2="http://schemas.microsoft.com/office/drawing/2015/10/21/chartex" xmlns:cx3="http://schemas.microsoft.com/office/drawing/2016/5/9/chartex" xmlns:cx4="http://schemas.microsoft.com/office/drawing/2016/5/10/chartex" xmlns:cx5="http://schemas.microsoft.com/office/drawing/2016/5/11/chartex" xmlns:cx6="http://schemas.microsoft.com/office/drawing/2016/5/12/chartex" xmlns:cx7="http://schemas.microsoft.com/office/drawing/2016/5/13/chartex" xmlns:cx8="http://schemas.microsoft.com/office/drawing/2016/5/14/chartex" xmlns:mc="http://schemas.openxmlformats.org/markup-compatibility/2006" xmlns:aink="http://schemas.microsoft.com/office/drawing/2016/ink" xmlns:am3d="http://schemas.microsoft.com/office/drawing/2017/model3d" xmlns:o="urn:schemas-microsoft-com:office:office" xmlns:oel="http://schemas.microsoft.com/office/2019/extlst" xmlns:r="http://schemas.openxmlformats.org/officeDocument/2006/relationships" xmlns:m="http://schemas.openxmlformats.org/officeDocument/2006/math" xmlns:v="urn:schemas-microsoft-com:vml" xmlns:wp14="http://schemas.microsoft.com/office/word/2010/wordprocessingDrawing" xmlns:wp="http://schemas.openxmlformats.org/drawingml/2006/wordprocessingDrawing" xmlns:w10="urn:schemas-microsoft-com:office:word" xmlns:w="http://schemas.openxmlformats.org/wordprocessingml/2006/main" xmlns:w14="http://schemas.microsoft.com/office/word/2010/wordml" xmlns:w15="http://schemas.microsoft.com/office/word/2012/wordml" xmlns:w16cex="http://schemas.microsoft.com/office/word/2018/wordml/cex" xmlns:w16cid="http://schemas.microsoft.com/office/word/2016/wordml/cid" xmlns:w16="http://schemas.microsoft.com/office/word/2018/wordml" xmlns:w16du="http://schemas.microsoft.com/office/word/2023/wordml/word16du" xmlns:w16sdtdh="http://schemas.microsoft.com/office/word/2020/wordml/sdtdatahash" xmlns:w16sdtfl="http://schemas.microsoft.com/office/word/2024/wordml/sdtformatlock" xmlns:w16se="http://schemas.microsoft.com/office/word/2015/wordml/symex" xmlns:wpg="http://schemas.microsoft.com/office/word/2010/wordprocessingGroup" xmlns:wpi="http://schemas.microsoft.com/office/word/2010/wordprocessingInk" xmlns:wne="http://schemas.microsoft.com/office/word/2006/wordml" xmlns:wps="http://schemas.microsoft.com/office/word/2010/wordprocessingShape" mc:Ignorable="w14 w15 w16se w16cid w16 w16cex w16sdtdh w16sdtfl w16du wp14">
   <w:abstractNum w:abstractNumId="0" w15:restartNumberingAfterBreak="0">
     <w:nsid w:val="06B863A5"/>
     <w:multiLevelType w:val="hybridMultilevel"/>
@@ -7223,6 +10778,119 @@
     </w:lvl>
   </w:abstractNum>
   <w:abstractNum w:abstractNumId="11" w15:restartNumberingAfterBreak="0">
+    <w:nsid w:val="6AA10044"/>
+    <w:multiLevelType w:val="hybridMultilevel"/>
+    <w:tmpl w:val="CAC8DE08"/>
+    <w:lvl w:ilvl="0" w:tplc="100C0001">
+      <w:start w:val="1"/>
+      <w:numFmt w:val="bullet"/>
+      <w:lvlText w:val=""/>
+      <w:lvlJc w:val="left"/>
+      <w:pPr>
+        <w:ind w:left="720" w:hanging="360"/>
+      </w:pPr>
+      <w:rPr>
+        <w:rFonts w:ascii="Symbol" w:hAnsi="Symbol" w:hint="default"/>
+      </w:rPr>
+    </w:lvl>
+    <w:lvl w:ilvl="1" w:tplc="100C0003" w:tentative="1">
+      <w:start w:val="1"/>
+      <w:numFmt w:val="bullet"/>
+      <w:lvlText w:val="o"/>
+      <w:lvlJc w:val="left"/>
+      <w:pPr>
+        <w:ind w:left="1440" w:hanging="360"/>
+      </w:pPr>
+      <w:rPr>
+        <w:rFonts w:ascii="Courier New" w:hAnsi="Courier New" w:cs="Courier New" w:hint="default"/>
+      </w:rPr>
+    </w:lvl>
+    <w:lvl w:ilvl="2" w:tplc="100C0005" w:tentative="1">
+      <w:start w:val="1"/>
+      <w:numFmt w:val="bullet"/>
+      <w:lvlText w:val=""/>
+      <w:lvlJc w:val="left"/>
+      <w:pPr>
+        <w:ind w:left="2160" w:hanging="360"/>
+      </w:pPr>
+      <w:rPr>
+        <w:rFonts w:ascii="Wingdings" w:hAnsi="Wingdings" w:hint="default"/>
+      </w:rPr>
+    </w:lvl>
+    <w:lvl w:ilvl="3" w:tplc="100C0001" w:tentative="1">
+      <w:start w:val="1"/>
+      <w:numFmt w:val="bullet"/>
+      <w:lvlText w:val=""/>
+      <w:lvlJc w:val="left"/>
+      <w:pPr>
+        <w:ind w:left="2880" w:hanging="360"/>
+      </w:pPr>
+      <w:rPr>
+        <w:rFonts w:ascii="Symbol" w:hAnsi="Symbol" w:hint="default"/>
+      </w:rPr>
+    </w:lvl>
+    <w:lvl w:ilvl="4" w:tplc="100C0003" w:tentative="1">
+      <w:start w:val="1"/>
+      <w:numFmt w:val="bullet"/>
+      <w:lvlText w:val="o"/>
+      <w:lvlJc w:val="left"/>
+      <w:pPr>
+        <w:ind w:left="3600" w:hanging="360"/>
+      </w:pPr>
+      <w:rPr>
+        <w:rFonts w:ascii="Courier New" w:hAnsi="Courier New" w:cs="Courier New" w:hint="default"/>
+      </w:rPr>
+    </w:lvl>
+    <w:lvl w:ilvl="5" w:tplc="100C0005" w:tentative="1">
+      <w:start w:val="1"/>
+      <w:numFmt w:val="bullet"/>
+      <w:lvlText w:val=""/>
+      <w:lvlJc w:val="left"/>
+      <w:pPr>
+        <w:ind w:left="4320" w:hanging="360"/>
+      </w:pPr>
+      <w:rPr>
+        <w:rFonts w:ascii="Wingdings" w:hAnsi="Wingdings" w:hint="default"/>
+      </w:rPr>
+    </w:lvl>
+    <w:lvl w:ilvl="6" w:tplc="100C0001" w:tentative="1">
+      <w:start w:val="1"/>
+      <w:numFmt w:val="bullet"/>
+      <w:lvlText w:val=""/>
+      <w:lvlJc w:val="left"/>
+      <w:pPr>
+        <w:ind w:left="5040" w:hanging="360"/>
+      </w:pPr>
+      <w:rPr>
+        <w:rFonts w:ascii="Symbol" w:hAnsi="Symbol" w:hint="default"/>
+      </w:rPr>
+    </w:lvl>
+    <w:lvl w:ilvl="7" w:tplc="100C0003" w:tentative="1">
+      <w:start w:val="1"/>
+      <w:numFmt w:val="bullet"/>
+      <w:lvlText w:val="o"/>
+      <w:lvlJc w:val="left"/>
+      <w:pPr>
+        <w:ind w:left="5760" w:hanging="360"/>
+      </w:pPr>
+      <w:rPr>
+        <w:rFonts w:ascii="Courier New" w:hAnsi="Courier New" w:cs="Courier New" w:hint="default"/>
+      </w:rPr>
+    </w:lvl>
+    <w:lvl w:ilvl="8" w:tplc="100C0005" w:tentative="1">
+      <w:start w:val="1"/>
+      <w:numFmt w:val="bullet"/>
+      <w:lvlText w:val=""/>
+      <w:lvlJc w:val="left"/>
+      <w:pPr>
+        <w:ind w:left="6480" w:hanging="360"/>
+      </w:pPr>
+      <w:rPr>
+        <w:rFonts w:ascii="Wingdings" w:hAnsi="Wingdings" w:hint="default"/>
+      </w:rPr>
+    </w:lvl>
+  </w:abstractNum>
+  <w:abstractNum w:abstractNumId="12" w15:restartNumberingAfterBreak="0">
     <w:nsid w:val="72DA7245"/>
     <w:multiLevelType w:val="multilevel"/>
     <w:tmpl w:val="083C4EFC"/>
@@ -7371,7 +11039,7 @@
       </w:rPr>
     </w:lvl>
   </w:abstractNum>
-  <w:abstractNum w:abstractNumId="12" w15:restartNumberingAfterBreak="0">
+  <w:abstractNum w:abstractNumId="13" w15:restartNumberingAfterBreak="0">
     <w:nsid w:val="7E6076AF"/>
     <w:multiLevelType w:val="multilevel"/>
     <w:tmpl w:val="E304AC48"/>
@@ -7521,7 +11189,7 @@
     </w:lvl>
   </w:abstractNum>
   <w:num w:numId="1" w16cid:durableId="1164856901">
-    <w:abstractNumId w:val="11"/>
+    <w:abstractNumId w:val="12"/>
   </w:num>
   <w:num w:numId="2" w16cid:durableId="954138969">
     <w:abstractNumId w:val="6"/>
@@ -7551,7 +11219,7 @@
     <w:abstractNumId w:val="9"/>
   </w:num>
   <w:num w:numId="11" w16cid:durableId="1848061187">
-    <w:abstractNumId w:val="12"/>
+    <w:abstractNumId w:val="13"/>
   </w:num>
   <w:num w:numId="12" w16cid:durableId="111218174">
     <w:abstractNumId w:val="0"/>
@@ -7559,11 +11227,14 @@
   <w:num w:numId="13" w16cid:durableId="841745497">
     <w:abstractNumId w:val="2"/>
   </w:num>
+  <w:num w:numId="14" w16cid:durableId="425269181">
+    <w:abstractNumId w:val="11"/>
+  </w:num>
 </w:numbering>
 </file>
 
 <file path=word/styles.xml><?xml version="1.0" encoding="utf-8"?>
-<w:styles xmlns:mc="http://schemas.openxmlformats.org/markup-compatibility/2006" xmlns:r="http://schemas.openxmlformats.org/officeDocument/2006/relationships" xmlns:w="http://schemas.openxmlformats.org/wordprocessingml/2006/main" xmlns:w14="http://schemas.microsoft.com/office/word/2010/wordml" xmlns:w15="http://schemas.microsoft.com/office/word/2012/wordml" xmlns:w16cex="http://schemas.microsoft.com/office/word/2018/wordml/cex" xmlns:w16cid="http://schemas.microsoft.com/office/word/2016/wordml/cid" xmlns:w16="http://schemas.microsoft.com/office/word/2018/wordml" xmlns:w16sdtdh="http://schemas.microsoft.com/office/word/2020/wordml/sdtdatahash" xmlns:w16se="http://schemas.microsoft.com/office/word/2015/wordml/symex" mc:Ignorable="w14 w15 w16se w16cid w16 w16cex w16sdtdh">
+<w:styles xmlns:mc="http://schemas.openxmlformats.org/markup-compatibility/2006" xmlns:r="http://schemas.openxmlformats.org/officeDocument/2006/relationships" xmlns:w="http://schemas.openxmlformats.org/wordprocessingml/2006/main" xmlns:w14="http://schemas.microsoft.com/office/word/2010/wordml" xmlns:w15="http://schemas.microsoft.com/office/word/2012/wordml" xmlns:w16cex="http://schemas.microsoft.com/office/word/2018/wordml/cex" xmlns:w16cid="http://schemas.microsoft.com/office/word/2016/wordml/cid" xmlns:w16="http://schemas.microsoft.com/office/word/2018/wordml" xmlns:w16du="http://schemas.microsoft.com/office/word/2023/wordml/word16du" xmlns:w16sdtdh="http://schemas.microsoft.com/office/word/2020/wordml/sdtdatahash" xmlns:w16sdtfl="http://schemas.microsoft.com/office/word/2024/wordml/sdtformatlock" xmlns:w16se="http://schemas.microsoft.com/office/word/2015/wordml/symex" mc:Ignorable="w14 w15 w16se w16cid w16 w16cex w16sdtdh w16sdtfl w16du">
   <w:docDefaults>
     <w:rPrDefault>
       <w:rPr>
@@ -7962,7 +11633,7 @@
   <w:style w:type="paragraph" w:default="1" w:styleId="Normal">
     <w:name w:val="Normal"/>
     <w:qFormat/>
-    <w:rsid w:val="002E1B37"/>
+    <w:rsid w:val="008B30E8"/>
   </w:style>
   <w:style w:type="paragraph" w:styleId="Titre1">
     <w:name w:val="heading 1"/>
@@ -8164,7 +11835,6 @@
   <w:style w:type="character" w:default="1" w:styleId="Policepardfaut">
     <w:name w:val="Default Paragraph Font"/>
     <w:uiPriority w:val="1"/>
-    <w:semiHidden/>
     <w:unhideWhenUsed/>
   </w:style>
   <w:style w:type="table" w:default="1" w:styleId="TableauNormal">

</xml_diff>